<commit_message>
Cancerfonden: hanging indent numbering, drop 'other articles' section
- Numbers now sit in left margin with text block aligned (hanging indent)
- Removed 'other articles' category from docx output (preprints, debate, etc.)
- Publication list now contains only: peer-reviewed originals + reviews
</commit_message>
<xml_diff>
--- a/output/cancerfonden_publist.docx
+++ b/output/cancerfonden_publist.docx
@@ -62,10 +62,18 @@
     </w:p>
     <w:p>
       <w:pPr>
-        <w:spacing w:after="40" w:before="20"/>
+        <w:spacing w:after="80" w:before="20"/>
+        <w:ind w:left="567" w:hanging="567"/>
+        <w:tabs>
+          <w:tab w:val="left" w:pos="566"/>
+        </w:tabs>
       </w:pPr>
       <w:r>
-        <w:t xml:space="preserve">1. </w:t>
+        <w:rPr>
+          <w:sz w:val="22"/>
+        </w:rPr>
+        <w:t>1.</w:t>
+        <w:tab/>
       </w:r>
       <w:r>
         <w:t xml:space="preserve">Sorjonen K, Melin M, Lager E, </w:t>
@@ -97,10 +105,18 @@
     </w:p>
     <w:p>
       <w:pPr>
-        <w:spacing w:after="40" w:before="20"/>
+        <w:spacing w:after="80" w:before="20"/>
+        <w:ind w:left="567" w:hanging="567"/>
+        <w:tabs>
+          <w:tab w:val="left" w:pos="566"/>
+        </w:tabs>
       </w:pPr>
       <w:r>
-        <w:t xml:space="preserve">2. </w:t>
+        <w:rPr>
+          <w:sz w:val="22"/>
+        </w:rPr>
+        <w:t>2.</w:t>
+        <w:tab/>
       </w:r>
       <w:r>
         <w:rPr>
@@ -129,10 +145,18 @@
     </w:p>
     <w:p>
       <w:pPr>
-        <w:spacing w:after="40" w:before="20"/>
+        <w:spacing w:after="80" w:before="20"/>
+        <w:ind w:left="567" w:hanging="567"/>
+        <w:tabs>
+          <w:tab w:val="left" w:pos="566"/>
+        </w:tabs>
       </w:pPr>
       <w:r>
-        <w:t xml:space="preserve">3. </w:t>
+        <w:rPr>
+          <w:sz w:val="22"/>
+        </w:rPr>
+        <w:t>3.</w:t>
+        <w:tab/>
       </w:r>
       <w:r>
         <w:t xml:space="preserve">Gould E, Fraser HS, Parker TH, Nakagawa S, Griffith SC, Vesk PA, Fidler F, Hamilton DG, Abbey-Lee RN, Abbott JK, Aguirre LA, Alcaraz C, Aloni I, Altschul D, Arekar K, Atkins JW, Atkinson J, Baker CM, Barrett M, Bell K, Bello SK, Beltrán I, Berauer BJ, Bertram MG, Billman PD, Blake CK, Blake S, Bliard L, Bonisoli-Alquati A, Bonnet T, Bordes CNM, Bose APH, Botterill-James T, Boyd MA, Boyle SA, Bradfer-Lawrence T, Bradham J, Brand JA, Brengdahl MI, Bulla M, Bussière L, Camerlenghi E, Campbell SE, Campos LLF, Caravaggi A, Cardoso P, Carroll CJW, Catanach TA, Chen X, Chik HYJ, Choy ES, Christie AP, Chuang A, Chunco AJ, Clark BL, Contina A, Covernton GA, Cox MP, Cressman KA, Crotti M, Crouch CD, D'Amelio PB, de Sousa AA, Döbert TF, Dobler R, Dobson AJ, Doherty TS, Drobniak SM, Duffy AG, Duncan AB, Dunn RP, Dunning J, Dutta T, Eberhart-Hertel L, Elmore JA, Elsherif MM, English HM, Ensminger DC, Ernst UR, Ferguson SM, Fernandez-Juricic E, Ferreira-Arruda T, Fieberg J, Finch EA, Fiorenza EA, Fisher DN, Fontaine A, Forstmeier W, Fourcade Y, Frank GS, Freund CA, Fuentes-Lillo E, Gandy SL, Gannon DG, García-Cervigón AI, Garretson AC, Ge X, Geary WL, Géron C, Gilles M, Girndt A, Gliksman D, Goldspiel HB, Gomes DGE, Good MK, Goslee SC, Gosnell JS, Grames EM, Gratton P, Grebe NM, Greenler SM, Griffioen M, Griffith DM, Griffith FJ, Grossman JJ, Güncan A, Haesen S, Hagan JG, Hager HA, Harris JP, Harrison ND, Hasnain SS, Havird JC, Heaton AJ, Herrera-Chaustre ML, Howard TJ, Hsu B-Y, Iannarilli F, Iranzo EC, Iverson ENK, Jimoh SO, Johnson DH, Johnsson M, Jorna J, Jucker T, Jung M, Kačergytė I, Kaltz O, Ke A, Kelly CD, Keogan K, Keppeler FW, Killion AK, Kim D, Kochan DP, Korsten P, Kothari S, Kuppler J, Kusch JM, Lagisz M, Lalla KM, Larkin DJ, Larson CL, Lauck KS, Lauterbur ME, Law A, Léandri-Breton D-J, Lembrechts JJ, L'Herpiniere K, Lievens EJP, de Lima DO, Lindsay S, Luquet M, MacLeod R, Macphie KH, Magellan K, Mair MM, Malm LE, Mammola S, Mandeville CP, Manhart M, Manrique-Garzon LM, Mäntylä E, Marchand P, Marshall BM, Martin CA, Martin DA, Martin JM, Martinig AR, McCallum ES, McCauley M, McNew SM, Meiners SJ, Merkling T, Michelangeli M, Moiron M, Moreira B, Mortensen J, Mos B, Muraina TO, Murphy PW, Nelli L, Niemelä P, Nightingale J, </w:t>
@@ -164,10 +188,18 @@
     </w:p>
     <w:p>
       <w:pPr>
-        <w:spacing w:after="40" w:before="20"/>
+        <w:spacing w:after="80" w:before="20"/>
+        <w:ind w:left="567" w:hanging="567"/>
+        <w:tabs>
+          <w:tab w:val="left" w:pos="566"/>
+        </w:tabs>
       </w:pPr>
       <w:r>
-        <w:t xml:space="preserve">4. </w:t>
+        <w:rPr>
+          <w:sz w:val="22"/>
+        </w:rPr>
+        <w:t>4.</w:t>
+        <w:tab/>
       </w:r>
       <w:r>
         <w:t xml:space="preserve">Sorjonen K, Melin B, </w:t>
@@ -196,10 +228,18 @@
     </w:p>
     <w:p>
       <w:pPr>
-        <w:spacing w:after="40" w:before="20"/>
+        <w:spacing w:after="80" w:before="20"/>
+        <w:ind w:left="567" w:hanging="567"/>
+        <w:tabs>
+          <w:tab w:val="left" w:pos="566"/>
+        </w:tabs>
       </w:pPr>
       <w:r>
-        <w:t xml:space="preserve">5. </w:t>
+        <w:rPr>
+          <w:sz w:val="22"/>
+        </w:rPr>
+        <w:t>5.</w:t>
+        <w:tab/>
       </w:r>
       <w:r>
         <w:t xml:space="preserve">Sorjonen K, Melin B, </w:t>
@@ -228,10 +268,18 @@
     </w:p>
     <w:p>
       <w:pPr>
-        <w:spacing w:after="40" w:before="20"/>
+        <w:spacing w:after="80" w:before="20"/>
+        <w:ind w:left="567" w:hanging="567"/>
+        <w:tabs>
+          <w:tab w:val="left" w:pos="566"/>
+        </w:tabs>
       </w:pPr>
       <w:r>
-        <w:t xml:space="preserve">6. </w:t>
+        <w:rPr>
+          <w:sz w:val="22"/>
+        </w:rPr>
+        <w:t>6.</w:t>
+        <w:tab/>
       </w:r>
       <w:r>
         <w:t xml:space="preserve">Sharma G, Fritz C, Baccigotti A, Stoev P, Alavi M, Škorić L, Papadopoulou Skarp F, Priess-Buchheit J, </w:t>
@@ -260,10 +308,18 @@
     </w:p>
     <w:p>
       <w:pPr>
-        <w:spacing w:after="40" w:before="20"/>
+        <w:spacing w:after="80" w:before="20"/>
+        <w:ind w:left="567" w:hanging="567"/>
+        <w:tabs>
+          <w:tab w:val="left" w:pos="566"/>
+        </w:tabs>
       </w:pPr>
       <w:r>
-        <w:t xml:space="preserve">7. </w:t>
+        <w:rPr>
+          <w:sz w:val="22"/>
+        </w:rPr>
+        <w:t>7.</w:t>
+        <w:tab/>
       </w:r>
       <w:r>
         <w:t xml:space="preserve">Trübutschek D, Yang Y-F, Gianelli C, Cesnaite E, Fischer NL, Vinding MC, Marshall TR, Algermissen J, Pascarella A, Puoliväli T, Vitale A, Busch NA, </w:t>
@@ -292,10 +348,18 @@
     </w:p>
     <w:p>
       <w:pPr>
-        <w:spacing w:after="40" w:before="20"/>
+        <w:spacing w:after="80" w:before="20"/>
+        <w:ind w:left="567" w:hanging="567"/>
+        <w:tabs>
+          <w:tab w:val="left" w:pos="566"/>
+        </w:tabs>
       </w:pPr>
       <w:r>
-        <w:t xml:space="preserve">8. </w:t>
+        <w:rPr>
+          <w:sz w:val="22"/>
+        </w:rPr>
+        <w:t>8.</w:t>
+        <w:tab/>
       </w:r>
       <w:r>
         <w:t xml:space="preserve">Poldrack RA, Markiewicz CJ, Appelhoff S, Ashar YK, Auer T, Baillet S, Bansal S, Beltrachini L, Benar CG, Bertazzoli G, Bhogawar S, Blair RW, Bortoletto M, Boudreau M, Brooks TL, Calhoun VD, Castelli FM, Clement P, Cohen AL, Cohen-Adad J, D'Ambrosio S, de Hollander G, de la Iglesia-Vayá M, de la Vega A, Delorme A, Devinsky O, Draschkow D, Duff EP, DuPre E, Earl E, Esteban O, Feingold FW, Flandin G, Galassi A, Gallitto G, Ganz M, Gau R, Gholam J, Ghosh SS, Giacomel A, Gillman AG, Gleeson P, Gramfort A, Guay S, Guidali G, Halchenko YO, Handwerker DA, Hardcastle N, Herholz P, Hermes D, Honey CJ, Innis RB, Ioanas H-I, Jahn A, Karakuzu A, Keator DB, Kiar G, Kincses B, Laird AR, Lau JC, Lazari A, Legarreta JH, Li A, Li X, Love BC, Lu H, Marcantoni E, Maumet C, Mazzamuto G, Meisler SL, Mikkelsen M, Mutsaerts H, Nichols TE, Nikolaidis A, </w:t>
@@ -327,10 +391,18 @@
     </w:p>
     <w:p>
       <w:pPr>
-        <w:spacing w:after="40" w:before="20"/>
+        <w:spacing w:after="80" w:before="20"/>
+        <w:ind w:left="567" w:hanging="567"/>
+        <w:tabs>
+          <w:tab w:val="left" w:pos="566"/>
+        </w:tabs>
       </w:pPr>
       <w:r>
-        <w:t xml:space="preserve">9. </w:t>
+        <w:rPr>
+          <w:sz w:val="22"/>
+        </w:rPr>
+        <w:t>9.</w:t>
+        <w:tab/>
       </w:r>
       <w:r>
         <w:t xml:space="preserve">Weissgerber TL, Gazda MA, </w:t>
@@ -359,10 +431,18 @@
     </w:p>
     <w:p>
       <w:pPr>
-        <w:spacing w:after="40" w:before="20"/>
+        <w:spacing w:after="80" w:before="20"/>
+        <w:ind w:left="567" w:hanging="567"/>
+        <w:tabs>
+          <w:tab w:val="left" w:pos="566"/>
+        </w:tabs>
       </w:pPr>
       <w:r>
-        <w:t xml:space="preserve">10. </w:t>
+        <w:rPr>
+          <w:sz w:val="22"/>
+        </w:rPr>
+        <w:t>10.</w:t>
+        <w:tab/>
       </w:r>
       <w:r>
         <w:t xml:space="preserve">Eriksson K, Sorjonen K, Falkstedt D, Melin B, </w:t>
@@ -391,10 +471,18 @@
     </w:p>
     <w:p>
       <w:pPr>
-        <w:spacing w:after="40" w:before="20"/>
+        <w:spacing w:after="80" w:before="20"/>
+        <w:ind w:left="567" w:hanging="567"/>
+        <w:tabs>
+          <w:tab w:val="left" w:pos="566"/>
+        </w:tabs>
       </w:pPr>
       <w:r>
-        <w:t xml:space="preserve">11. </w:t>
+        <w:rPr>
+          <w:sz w:val="22"/>
+        </w:rPr>
+        <w:t>11.</w:t>
+        <w:tab/>
       </w:r>
       <w:r>
         <w:t xml:space="preserve">Axfors C, </w:t>
@@ -423,10 +511,18 @@
     </w:p>
     <w:p>
       <w:pPr>
-        <w:spacing w:after="40" w:before="20"/>
+        <w:spacing w:after="80" w:before="20"/>
+        <w:ind w:left="567" w:hanging="567"/>
+        <w:tabs>
+          <w:tab w:val="left" w:pos="566"/>
+        </w:tabs>
       </w:pPr>
       <w:r>
-        <w:t xml:space="preserve">12. </w:t>
+        <w:rPr>
+          <w:sz w:val="22"/>
+        </w:rPr>
+        <w:t>12.</w:t>
+        <w:tab/>
       </w:r>
       <w:r>
         <w:t xml:space="preserve">Sarafoglou A, Hoogeveen S, van den Bergh D, Aczel B, Albers CJ, Althoff T, Botvinik-Nezer R, Busch NA, Cataldo AM, Devezer B, van Dongen NNN, Dreber A, Fried EI, Hoekstra R, Hoffman S, Holzmeister F, Huber J, Huntington-Klein N, Ioannidis J, Johannesson M, Kirchler M, Loken E, Mangin J-F, Matzke D, Menkveld AJ, </w:t>
@@ -458,10 +554,18 @@
     </w:p>
     <w:p>
       <w:pPr>
-        <w:spacing w:after="40" w:before="20"/>
+        <w:spacing w:after="80" w:before="20"/>
+        <w:ind w:left="567" w:hanging="567"/>
+        <w:tabs>
+          <w:tab w:val="left" w:pos="566"/>
+        </w:tabs>
       </w:pPr>
       <w:r>
-        <w:t xml:space="preserve">13. </w:t>
+        <w:rPr>
+          <w:sz w:val="22"/>
+        </w:rPr>
+        <w:t>13.</w:t>
+        <w:tab/>
       </w:r>
       <w:r>
         <w:t xml:space="preserve">Mushtaq F, Welke D, Gallagher A, Pavlov YG, Kouara L, Bosch-Bayard J, van den Bosch JJF, Arvaneh M, Bland AR, Chaumon M, Borck C, He X, Luck SJ, Machizawa MG, Pernet C, Puce A, Segalowitz SJ, Rogers C, Awais M, Babiloni C, Bailey NW, Baillet S, Bendall RCA, Brady D, Bringas-Vega ML, Busch NA, Calzada-Reyes A, Chatard A, Clayson PE, Cohen MX, Cole J, Constant M, Corneyllie A, Coyle D, Cruse D, Delis I, Delorme A, Fair D, Falk TH, Gamer M, Ganis G, Gloy K, Gregory S, Hassall CD, Hiley KE, Ivry RB, Jerbi K, Jenkins M, Kaiser J, Keil A, Knight RT, Kochen S, Kotchoubey B, Krigolson OE, Langer N, Liesefeld HR, Lippé S, London RE, MacNamara A, Makeig S, Marinovic W, Martínez-Montes E, Marzuki AA, Mathew RK, Michel C, Millán JDR, Mon-Williams M, Morales-Chacón L, Naar R, </w:t>
@@ -493,10 +597,18 @@
     </w:p>
     <w:p>
       <w:pPr>
-        <w:spacing w:after="40" w:before="20"/>
+        <w:spacing w:after="80" w:before="20"/>
+        <w:ind w:left="567" w:hanging="567"/>
+        <w:tabs>
+          <w:tab w:val="left" w:pos="566"/>
+        </w:tabs>
       </w:pPr>
       <w:r>
-        <w:t xml:space="preserve">14. </w:t>
+        <w:rPr>
+          <w:sz w:val="22"/>
+        </w:rPr>
+        <w:t>14.</w:t>
+        <w:tab/>
       </w:r>
       <w:r>
         <w:t xml:space="preserve">Doell KC, Todorova B, Vlasceanu M, Bak Coleman JB, Pronizius E, Schumann P, Azevedo F, Patel Y, Berkebile-Wineberg MM, Brick C, Lange F, Grayson SJ, Pei Y, Chakroff A, van den Broek KL, Lamm C, Vlasceanu D, Constantino SM, Rathje S, Goldwert D, Fang K, Aglioti SM, Alfano M, Alvarado-Yepez AJ, Andersen A, Anseel F, Apps MAJ, Asadli C, Awuor FJ, Basaglia P, Bélanger JJ, Berger S, Bertin P, Białek M, Bialobrzeska O, Blaya-Burgo M, Bleize DNM, Bø S, Boecker L, Boggio PS, Borau S, Borau S, Bos B, Bouguettaya A, Brauer M, Brik T, Briker R, Brosch T, Buchel O, Buonauro D, Butalia R, Carvacho H, Chamberlain SAE, Chan H-Y, Chow D, Chung D, Cian L, Cohen-Eick N, Contreras-Huerta LS, Contu D, Cristea V, Cutler J, D'Ottone S, De Keersmaecker J, Delcourt S, Delouvée S, Diel K, Douglas BD, Drupp MA, Dubey S, Ekmanis J, Elbaek CT, Elsherif M, Engelhard IM, Escher YA, Etienne TW, Farage L, Farias AR, Feuerriegel S, Findor A, Freira L, Friese M, Gains NP, Gallyamova A, Geiger SJ, Genschow O, Gjoneska B, Gkinopoulos T, Goldberg B, Goldenberg A, Gradidge S, Grassini S, Gray K, Grelle S, Griffin SM, Grigoryan L, Grigoryan A, Grigoryev D, Gruber J, Guilaran J, Hadar B, Hahnel UJJ, Halperin E, Harvey AJ, Haugestad CAP, Herman AM, Hershfield HE, Himichi T, Hine DW, Hofmann W, Howe L, Huaman-Chulluncuy ET, Huang G, Ishii T, Ito A, Jia F, Jost JT, Jovanović V, Jurgiel D, Kácha O, Kankaanpää R, Kantorowicz J, Kantorowicz-Reznichenko E, Mintz KK, Kaya I, Kaya O, Khachatryan N, Klas A, Klein C, Klöckner CA, Koppel L, Kosachenko AI, Kothe EJ, Krebs R, Krosch AR, Krouwel APM, Kyrychenko Y, Lagomarsino M, Cunningham JL, Lees J, Leung TY, Levy N, Lockwood PL, Longoni C, Ortega AL, Loschelder DD, Lu JG, Luo Y, Luomba J, Lutz AE, Majer JM, Markowitz E, Marsh AA, Mascarenhas KL, Mbilingi B, Mbungu W, McHugh C, Meijers MHC, Mercier H, Mhagama FL, Michalaki K, Mikus N, Milliron SG, Mitkidis P, Monge-Rodríguez FS, Mora YL, Morais MJ, Moreau D, Motoki K, Moyano M, Mus M, Navajas J, Nguyen TL, Nguyen DM, Nguyen T, Niemi L, Nijssen SRR, </w:t>
@@ -528,10 +640,18 @@
     </w:p>
     <w:p>
       <w:pPr>
-        <w:spacing w:after="40" w:before="20"/>
+        <w:spacing w:after="80" w:before="20"/>
+        <w:ind w:left="567" w:hanging="567"/>
+        <w:tabs>
+          <w:tab w:val="left" w:pos="566"/>
+        </w:tabs>
       </w:pPr>
       <w:r>
-        <w:t xml:space="preserve">15. </w:t>
+        <w:rPr>
+          <w:sz w:val="22"/>
+        </w:rPr>
+        <w:t>15.</w:t>
+        <w:tab/>
       </w:r>
       <w:r>
         <w:t>Lindberg O</w:t>
@@ -554,10 +674,18 @@
     </w:p>
     <w:p>
       <w:pPr>
-        <w:spacing w:after="40" w:before="20"/>
+        <w:spacing w:after="80" w:before="20"/>
+        <w:ind w:left="567" w:hanging="567"/>
+        <w:tabs>
+          <w:tab w:val="left" w:pos="566"/>
+        </w:tabs>
       </w:pPr>
       <w:r>
-        <w:t xml:space="preserve">16. </w:t>
+        <w:rPr>
+          <w:sz w:val="22"/>
+        </w:rPr>
+        <w:t>16.</w:t>
+        <w:tab/>
       </w:r>
       <w:r>
         <w:t xml:space="preserve">Sennerstam V, Hedman-Lagerlöf E, </w:t>
@@ -589,10 +717,18 @@
     </w:p>
     <w:p>
       <w:pPr>
-        <w:spacing w:after="40" w:before="20"/>
+        <w:spacing w:after="80" w:before="20"/>
+        <w:ind w:left="567" w:hanging="567"/>
+        <w:tabs>
+          <w:tab w:val="left" w:pos="566"/>
+        </w:tabs>
       </w:pPr>
       <w:r>
-        <w:t xml:space="preserve">17. </w:t>
+        <w:rPr>
+          <w:sz w:val="22"/>
+        </w:rPr>
+        <w:t>17.</w:t>
+        <w:tab/>
       </w:r>
       <w:r>
         <w:t xml:space="preserve">Sorjonen K, </w:t>
@@ -624,10 +760,18 @@
     </w:p>
     <w:p>
       <w:pPr>
-        <w:spacing w:after="40" w:before="20"/>
+        <w:spacing w:after="80" w:before="20"/>
+        <w:ind w:left="567" w:hanging="567"/>
+        <w:tabs>
+          <w:tab w:val="left" w:pos="566"/>
+        </w:tabs>
       </w:pPr>
       <w:r>
-        <w:t xml:space="preserve">18. </w:t>
+        <w:rPr>
+          <w:sz w:val="22"/>
+        </w:rPr>
+        <w:t>18.</w:t>
+        <w:tab/>
       </w:r>
       <w:r>
         <w:t xml:space="preserve">Buchanan EM, Lewis SC, Paris B, Forscher PS, Pavlacic JM, Beshears JE, Drexler SM, Gourdon-Kanhukamwe A, Mallik PR, Silan MAA, Miller JK, IJzerman H, Moshontz H, Beaudry JL, Suchow JW, Chartier CR, Coles NA, Sharifian M, Todsen AL, Levitan CA, Azevedo F, Legate N, Heller B, Rothman AJ, Dorison CA, Gill BP, Wang K, Rees VW, Gibbs N, Goldenberg A, Thi Nguyen T-V, Gross JJ, Kaminski G, von Bastian CC, Paruzel-Czachura M, Mosannenzadeh F, Azouaghe S, Bran A, Ruiz-Fernandez S, Santos AC, Reggev N, Zickfeld JH, Akkas H, Pantazi M, Ropovik I, Korbmacher M, Arriaga P, Gjoneska B, Warmelink L, Alves SG, de Holanda Coelho GL, Stieger S, Schei V, Hanel PHP, Szaszi B, Fedotov M, Antfolk J, Marcu G-M, Schrötter J, Kunst JR, Geiger SJ, Adetula A, Kocalar HE, Kielińska J, Kačmár P, Bokkour A, Galindo-Caballero OJ, Djamai I, Pöntinen SJ, Agesin BE, Jernsäther T, Urooj A, Rachev NR, Koptjevskaja-Tamm M, Kurfalı M, Pit IL, Li R, Çoksan S, Dubrov D, Paltrow TE, Baník G, Korobova T, Studzinska A, Jiang X, Aruta JJBR, Vintr J, Chiu F, Kaliska L, Berkessel JB, Tümer M, Morales-Izquierdo S, Chuan-Peng H, Vezirian K, Rosa AD, Bialobrzeska O, Vasilev MR, Beitner J, Kácha O, Žuro B, Westerlund M, Nedelcheva-Datsova M, Findor A, Krupić D, Kowal M, Askelund AD, Pourafshari R, Đorđević JM, Schmidt N-D, Baklanova E, Szala A, Zakharov I, Vranka MA, Ihaya K, Grano C, Cellini N, Białek M, Anton-Boicuk L, Dalgar I, Adıgüzel A, Verharen JPH, Maturan PLG, Kassianos AP, Oliveira R, Čadek M, Adoric VC, Özdoğru AA, Sverdrup TE, Aczel B, Zambrano D, Ahmed A, Tamnes CK, Yamada Y, Volz L, Sunami N, Suter L, Vieira L, Groyecka-Bernard A, Kamburidis JA, Reips U-D, Harutyunyan M, Adetula GA, Allred TB, Barzykowski K, Antazo BG, Zsido AN, Šakan DD, Cyrus-Lai W, Ahlgren LP, Hruška M, Vega D, Manunta E, Mokady A, Capizzi M, Martončik M, Say N, Filip K, Vilar R, Staniaszek K, Vdovic M, Adamkovic M, Johannes N, Hajdu N, Cohen N, Overkott C, Krupić D, Hubena B, </w:t>
@@ -659,10 +803,18 @@
     </w:p>
     <w:p>
       <w:pPr>
-        <w:spacing w:after="40" w:before="20"/>
+        <w:spacing w:after="80" w:before="20"/>
+        <w:ind w:left="567" w:hanging="567"/>
+        <w:tabs>
+          <w:tab w:val="left" w:pos="566"/>
+        </w:tabs>
       </w:pPr>
       <w:r>
-        <w:t xml:space="preserve">19. </w:t>
+        <w:rPr>
+          <w:sz w:val="22"/>
+        </w:rPr>
+        <w:t>19.</w:t>
+        <w:tab/>
       </w:r>
       <w:r>
         <w:t xml:space="preserve">Sorjonen K, Ingre M, </w:t>
@@ -694,10 +846,18 @@
     </w:p>
     <w:p>
       <w:pPr>
-        <w:spacing w:after="40" w:before="20"/>
+        <w:spacing w:after="80" w:before="20"/>
+        <w:ind w:left="567" w:hanging="567"/>
+        <w:tabs>
+          <w:tab w:val="left" w:pos="566"/>
+        </w:tabs>
       </w:pPr>
       <w:r>
-        <w:t xml:space="preserve">20. </w:t>
+        <w:rPr>
+          <w:sz w:val="22"/>
+        </w:rPr>
+        <w:t>20.</w:t>
+        <w:tab/>
       </w:r>
       <w:r>
         <w:rPr>
@@ -726,10 +886,18 @@
     </w:p>
     <w:p>
       <w:pPr>
-        <w:spacing w:after="40" w:before="20"/>
+        <w:spacing w:after="80" w:before="20"/>
+        <w:ind w:left="567" w:hanging="567"/>
+        <w:tabs>
+          <w:tab w:val="left" w:pos="566"/>
+        </w:tabs>
       </w:pPr>
       <w:r>
-        <w:t xml:space="preserve">21. </w:t>
+        <w:rPr>
+          <w:sz w:val="22"/>
+        </w:rPr>
+        <w:t>21.</w:t>
+        <w:tab/>
       </w:r>
       <w:r>
         <w:t xml:space="preserve">Brembs B, Huneman P, Schönbrodt F, </w:t>
@@ -761,10 +929,18 @@
     </w:p>
     <w:p>
       <w:pPr>
-        <w:spacing w:after="40" w:before="20"/>
+        <w:spacing w:after="80" w:before="20"/>
+        <w:ind w:left="567" w:hanging="567"/>
+        <w:tabs>
+          <w:tab w:val="left" w:pos="566"/>
+        </w:tabs>
       </w:pPr>
       <w:r>
-        <w:t xml:space="preserve">22. </w:t>
+        <w:rPr>
+          <w:sz w:val="22"/>
+        </w:rPr>
+        <w:t>22.</w:t>
+        <w:tab/>
       </w:r>
       <w:r>
         <w:t xml:space="preserve">Sorjonen K, Ingre M, Melin B, </w:t>
@@ -793,10 +969,18 @@
     </w:p>
     <w:p>
       <w:pPr>
-        <w:spacing w:after="40" w:before="20"/>
+        <w:spacing w:after="80" w:before="20"/>
+        <w:ind w:left="567" w:hanging="567"/>
+        <w:tabs>
+          <w:tab w:val="left" w:pos="566"/>
+        </w:tabs>
       </w:pPr>
       <w:r>
-        <w:t xml:space="preserve">23. </w:t>
+        <w:rPr>
+          <w:sz w:val="22"/>
+        </w:rPr>
+        <w:t>23.</w:t>
+        <w:tab/>
       </w:r>
       <w:r>
         <w:t xml:space="preserve">Sorjonen K, Melin B, </w:t>
@@ -825,10 +1009,18 @@
     </w:p>
     <w:p>
       <w:pPr>
-        <w:spacing w:after="40" w:before="20"/>
+        <w:spacing w:after="80" w:before="20"/>
+        <w:ind w:left="567" w:hanging="567"/>
+        <w:tabs>
+          <w:tab w:val="left" w:pos="566"/>
+        </w:tabs>
       </w:pPr>
       <w:r>
-        <w:t xml:space="preserve">24. </w:t>
+        <w:rPr>
+          <w:sz w:val="22"/>
+        </w:rPr>
+        <w:t>24.</w:t>
+        <w:tab/>
       </w:r>
       <w:r>
         <w:t xml:space="preserve">Sorjonen K, Melin B, </w:t>
@@ -857,10 +1049,18 @@
     </w:p>
     <w:p>
       <w:pPr>
-        <w:spacing w:after="40" w:before="20"/>
+        <w:spacing w:after="80" w:before="20"/>
+        <w:ind w:left="567" w:hanging="567"/>
+        <w:tabs>
+          <w:tab w:val="left" w:pos="566"/>
+        </w:tabs>
       </w:pPr>
       <w:r>
-        <w:t xml:space="preserve">25. </w:t>
+        <w:rPr>
+          <w:sz w:val="22"/>
+        </w:rPr>
+        <w:t>25.</w:t>
+        <w:tab/>
       </w:r>
       <w:r>
         <w:t xml:space="preserve">Sorjonen K, </w:t>
@@ -892,10 +1092,18 @@
     </w:p>
     <w:p>
       <w:pPr>
-        <w:spacing w:after="40" w:before="20"/>
+        <w:spacing w:after="80" w:before="20"/>
+        <w:ind w:left="567" w:hanging="567"/>
+        <w:tabs>
+          <w:tab w:val="left" w:pos="566"/>
+        </w:tabs>
       </w:pPr>
       <w:r>
-        <w:t xml:space="preserve">26. </w:t>
+        <w:rPr>
+          <w:sz w:val="22"/>
+        </w:rPr>
+        <w:t>26.</w:t>
+        <w:tab/>
       </w:r>
       <w:r>
         <w:t xml:space="preserve">Sorjonen K, Melin B, </w:t>
@@ -924,10 +1132,18 @@
     </w:p>
     <w:p>
       <w:pPr>
-        <w:spacing w:after="40" w:before="20"/>
+        <w:spacing w:after="80" w:before="20"/>
+        <w:ind w:left="567" w:hanging="567"/>
+        <w:tabs>
+          <w:tab w:val="left" w:pos="566"/>
+        </w:tabs>
       </w:pPr>
       <w:r>
-        <w:t xml:space="preserve">27. </w:t>
+        <w:rPr>
+          <w:sz w:val="22"/>
+        </w:rPr>
+        <w:t>27.</w:t>
+        <w:tab/>
       </w:r>
       <w:r>
         <w:t xml:space="preserve">Sorjonen K, </w:t>
@@ -959,10 +1175,18 @@
     </w:p>
     <w:p>
       <w:pPr>
-        <w:spacing w:after="40" w:before="20"/>
+        <w:spacing w:after="80" w:before="20"/>
+        <w:ind w:left="567" w:hanging="567"/>
+        <w:tabs>
+          <w:tab w:val="left" w:pos="566"/>
+        </w:tabs>
       </w:pPr>
       <w:r>
-        <w:t xml:space="preserve">28. </w:t>
+        <w:rPr>
+          <w:sz w:val="22"/>
+        </w:rPr>
+        <w:t>28.</w:t>
+        <w:tab/>
       </w:r>
       <w:r>
         <w:t>Delios A, Clemente EG, Wu T, Tan H, Wang Y, Gordon M, Viganola D, Chen Z, Dreber A, Johannesson M, Pfeiffer T, Generalizability Tests Forecasting Collaboration, Uhlmann E</w:t>
@@ -985,10 +1209,18 @@
     </w:p>
     <w:p>
       <w:pPr>
-        <w:spacing w:after="40" w:before="20"/>
+        <w:spacing w:after="80" w:before="20"/>
+        <w:ind w:left="567" w:hanging="567"/>
+        <w:tabs>
+          <w:tab w:val="left" w:pos="566"/>
+        </w:tabs>
       </w:pPr>
       <w:r>
-        <w:t xml:space="preserve">29. </w:t>
+        <w:rPr>
+          <w:sz w:val="22"/>
+        </w:rPr>
+        <w:t>29.</w:t>
+        <w:tab/>
       </w:r>
       <w:r>
         <w:t xml:space="preserve">Bourget M-H, Kamentsky L, Ghosh S, Mazzamuto G, Lazari A, Markiewicz CJ, Oostenveld R, Niso G, Halchenko YO, Lipp I, Takerkart S, Toussaint P-J, Khan AR, </w:t>
@@ -1020,10 +1252,18 @@
     </w:p>
     <w:p>
       <w:pPr>
-        <w:spacing w:after="40" w:before="20"/>
+        <w:spacing w:after="80" w:before="20"/>
+        <w:ind w:left="567" w:hanging="567"/>
+        <w:tabs>
+          <w:tab w:val="left" w:pos="566"/>
+        </w:tabs>
       </w:pPr>
       <w:r>
-        <w:t xml:space="preserve">30. </w:t>
+        <w:rPr>
+          <w:sz w:val="22"/>
+        </w:rPr>
+        <w:t>30.</w:t>
+        <w:tab/>
       </w:r>
       <w:r>
         <w:t>Psychological Science Accelerator Self-Determination Theory Collaboration</w:t>
@@ -1046,10 +1286,18 @@
     </w:p>
     <w:p>
       <w:pPr>
-        <w:spacing w:after="40" w:before="20"/>
+        <w:spacing w:after="80" w:before="20"/>
+        <w:ind w:left="567" w:hanging="567"/>
+        <w:tabs>
+          <w:tab w:val="left" w:pos="566"/>
+        </w:tabs>
       </w:pPr>
       <w:r>
-        <w:t xml:space="preserve">31. </w:t>
+        <w:rPr>
+          <w:sz w:val="22"/>
+        </w:rPr>
+        <w:t>31.</w:t>
+        <w:tab/>
       </w:r>
       <w:r>
         <w:t xml:space="preserve">Sorjonen K, </w:t>
@@ -1081,10 +1329,18 @@
     </w:p>
     <w:p>
       <w:pPr>
-        <w:spacing w:after="40" w:before="20"/>
+        <w:spacing w:after="80" w:before="20"/>
+        <w:ind w:left="567" w:hanging="567"/>
+        <w:tabs>
+          <w:tab w:val="left" w:pos="566"/>
+        </w:tabs>
       </w:pPr>
       <w:r>
-        <w:t xml:space="preserve">32. </w:t>
+        <w:rPr>
+          <w:sz w:val="22"/>
+        </w:rPr>
+        <w:t>32.</w:t>
+        <w:tab/>
       </w:r>
       <w:r>
         <w:t xml:space="preserve">Dorison CA, Lerner JS, Heller BH, Rothman AJ, Kawachi II, Wang K, Rees VW, Gill BP, Gibbs N, Ebersole CR, Vally Z, Tajchman Z, Zsido AN, Zrimsek M, Chen Z, Ziano I, Gialitaki Z, Ceary CD, Lin Y, Kunisato Y, Yamada Y, Xiao Q, Jiang X, Du X, Yao E, Wilson JP, Cyrus-Lai W, Jimenez-Leal W, Law W, Collins WM, Richard KL, Vranka M, Ankushev V, Schei V, Križanić V, Kadreva VH, Adoric VC, Tran US, Yeung SK, Hassan W, Houston R, Lima TJS, Ostermann T, Frizzo T, Sverdrup TE, House T, Gill T, Fedotov M, Paltrow T, Jernsäther T, Koptjevskaja-Tamm M, Hostler TJ, Ishii T, Szaszi B, Adamus S, Suter L, Habib S, Studzinska A, Stojanovska D, Janssen SMJ, Stieger S, Schulenberg SE, Tatachari S, Azouaghe S, Sorokowski P, Sorokowska A, Song X, Lewis SC, Sinkolova S, Grigoryev D, Drexler SM, Daches S, Geniole SN, Vračar S, Massoni S, Zorjan S, Sarıoğuz E, Izquierdo SM, Alves SG, Pöntinen S, Solas SÁ, Ordoñez-Riaño S, Očovaj SB, Onie S, Lins S, Çoksan S, Sacakli A, Ruiz-Fernández S, Geiger SJ, FatahModares S, Walczak RB, Betlehem R, Vilar R, Cárcamo R, Ross RM, McCarthy R, Ballantyne T, Westgate EC, Afhami R, Ren D, Monteiro RP, Reips U-D, Reggev N, Calin-Jageman RJ, Pourafshari R, Oliveira R, Nedelcheva-Datsova M, Rahal R-M, Ribeiro RR, Radtke T, Searston R, Habte R, Zdybek P, Chen S-C, Maturan PLG, Perillo JT, Isager PM, Kačmár P, Macapagal PM, Szwed P, Hanel PHP, Forbes PAG, Arriaga P, Paris B, Papachristopoulos K, Correa PS, Kácha O, Bernardo M, Campos O, Bravo ON, Galindo-Caballero OJ, Ogbonnaya CE, Bialobrzeska O, Kiselnikova N, Simonovic N, Cohen N, Nock NL, Johannes N, Albayrak-Aydemir N, Say N, Torunsky N, Van Doren N, Sunami N, Rachev NR, Majeed NM, Schmidt N-D, Nadif K, Corral-Frías NS, Ouherrou N, Pantazi M, Lucas MY, Vasilev MR, Ortiz MV, Butt MM, Kabir M, Muda R, Tejada Rivera MDCM, Sirota M, Seehuus M, Parzuchowski M, Toro M, Hricova M, Maldonado MA, Marszalek M, Karekla M, Mioni G, Bosma MJ, Westerlund M, Vdovic M, Bialek M, Silan MA, Anne M, Misiak M, Grinberg M, Capizzi M, Espinoza Barría MF, Kurfali MA, Mensink MC, Harutyunyan M, Khosla M, Korbmacher M, Adamkovič M, Ribeiro MFF, Terskova M, Hruška M, Martončik M, Voracek M, Čadek M, Frías-Armenta M, Kowal M, Topor M, Roczniewska M, Oosterlinck M, Kohlová MB, Paruzel-Czachura M, Romanova M, Papadatou-Pastou M, Lund ML, Antoniadi M, Jones MV, Ortiz MS, Manavalan M, Muminov A, Kossowska M, Friedemann M, Wielgus M, Varella MAC, Colloff MF, Bradford M, Vaughn LA, Eudave L, Vieira L, Pineda LMS, Pérez LC, Lazarevic LB, Jaremka LM, Kushnir E, Anton-Boicuk L, de Holanda Coelho GL, Ahlgren L, Levitan CA, Micheli L, Volz L, Stojanovska M, Boucher L, Samojlenko L, Delgado LGJ, Kaliska L, Warmelink L, Rojas-Berscia LM, Yu K, Wachowicz J, Desai K, Barzykowski K, Kozma L, Evans K, Kirgizova K, Agesin BE, Koehn MA, Wolfe K, Korobova T, Klevjer K, van Schie K, Vezirian K, Damnjanović K, Thommesen KK, Schmidt K, Filip K, Grzech K, Hoyer K, Moon K, Rana K, Janjić K, Suchow JW, Kielińska J, Cruz Vásquez JE, Beitner J, Vargas-Nieto JC, Roxas JCT, Taber J, Urriago-Rayo J, Pavlacic JM, Bavolar J, Soto JA, Olofsson JK, Vilsmeier JK, Messerschmidt J, Czamanski-Cohen J, Boudesseul J, Lee JM, Kamburidis J, Zickfeld J, Miranda JF, Verharen JPH, Hristova E, Beshears JE, Đorđević JM, Bosch J, Valentova JV, Antfolk J, Berkessel JB, Schrötter J, Urban J, Röer JP, Norton JO, Silva JR, Pickering JS, Vintr J, Uttley J, Kunst JR, Ndukaihe ILG, Iyer A, Vilares I, Ivanov A, Ropovik I, Sula I, Sarieva I, Metin-Orta I, Prusova I, Pinto I, Bozdoc AI, Almeida IAT, Pit IL, Dalgar I, Zakharov I, Arinze AI, Ihaya K, Stephen ID, Gjoneska B, Brohmer H, Flowe H, Godbersen H, Kocalar HE, Hedgebeth MV, Chuan-Peng H, Sharifian M, Manley H, Akkas H, Hajdu N, Azab H, Kaminski G, </w:t>
@@ -1116,10 +1372,18 @@
     </w:p>
     <w:p>
       <w:pPr>
-        <w:spacing w:after="40" w:before="20"/>
+        <w:spacing w:after="80" w:before="20"/>
+        <w:ind w:left="567" w:hanging="567"/>
+        <w:tabs>
+          <w:tab w:val="left" w:pos="566"/>
+        </w:tabs>
       </w:pPr>
       <w:r>
-        <w:t xml:space="preserve">33. </w:t>
+        <w:rPr>
+          <w:sz w:val="22"/>
+        </w:rPr>
+        <w:t>33.</w:t>
+        <w:tab/>
       </w:r>
       <w:r>
         <w:t xml:space="preserve">Hoogeveen S, Sarafoglou A, Aczel B, Aditya Y, Alayan AJ, Allen PJ, Altay S, Alzahawi S, Amir Y, Anthony F-V, Appiah OK, Atkinson QD, Baimel A, Balkaya-Ince M, Balsamo M, Banker S, Bartos F, Becerra M, Beffara B, Beitner J, Bendixen T, Berkessel JB, Berniunas R, Billet MI, Billingsley J, Bortolini T, Breitsohl H, Bret A, Brown FL, Brown J, Brumbaugh CC, Buczny J, Bulbulia J, Caballero S, Carlucci L, Carmichael CL, Cattaneo MEGV, Charles SJ, Claessens S, Panagopoulos MC, Costa AB, Crone DL, Czoschke S, Czymara C, D'Urso ED, Dahlstrom O, Dalla Rosa A, Danielsson H, De Ron J, de Vries YA, Dean KK, Dik BJ, Disabato DJ, Doherty JK, Draws T, Drouhot L, Dujmovic M, Dunham Y, Ebert T, Edelsbrunner PA, Eerland A, Elbaek CT, Farahmand S, Farahmand H, Farias M, Feliccia AA, Fischer K, Fischer R, Fisher-Thompson D, Francis Z, Frick S, Frisch LK, Geraldes D, Gerdin E, Geven L, Ghasemi O, Gielens E, Gligoric V, Hagel K, Hajdu N, Hamilton HR, Hamzah I, Hanel PHP, Hawk CE, Himawan KK, Holding BC, Homman LE, Ingendahl M, Inkila H, Inman ML, Islam C-G, Isler O, Izydorczyk D, Jaeger B, Johnson KA, Jong J, Karl JA, Kaszubowski E, Katz BA, Keefer LA, Kelchtermans S, Kelly JM, Klein RA, Kleinberg B, Knowles ML, Kolczynska M, Koller D, Krasko J, Kritzler S, Krypotos A-M, Kyritsis T, Landes TL, Laukenmann R, Forsyth GAL, Lazar A, Lehman BJ, Levy N, Lo RF, Lodder P, Lorenz J, Lowicki P, Ly AL, Maassen E, Magyar-Russell GM, Maier M, Marsh DR, Martinez N, Martinie M, Martoyo I, Mason SE, Mauritsen AL, McAleer P, McCauley T, McCullough M, McKay R, McMahon CM, McNamara AA, Means KK, Mercier B, Mitkidis P, Monin B, Moon JW, Moreau D, Morgan J, Murphy J, Muscatt G, Nagel C, Nagy T, Nalborczyk L, </w:t>
@@ -1151,10 +1415,18 @@
     </w:p>
     <w:p>
       <w:pPr>
-        <w:spacing w:after="40" w:before="20"/>
+        <w:spacing w:after="80" w:before="20"/>
+        <w:ind w:left="567" w:hanging="567"/>
+        <w:tabs>
+          <w:tab w:val="left" w:pos="566"/>
+        </w:tabs>
       </w:pPr>
       <w:r>
-        <w:t xml:space="preserve">34. </w:t>
+        <w:rPr>
+          <w:sz w:val="22"/>
+        </w:rPr>
+        <w:t>34.</w:t>
+        <w:tab/>
       </w:r>
       <w:r>
         <w:t xml:space="preserve">Sorjonen K, </w:t>
@@ -1186,10 +1458,18 @@
     </w:p>
     <w:p>
       <w:pPr>
-        <w:spacing w:after="40" w:before="20"/>
+        <w:spacing w:after="80" w:before="20"/>
+        <w:ind w:left="567" w:hanging="567"/>
+        <w:tabs>
+          <w:tab w:val="left" w:pos="566"/>
+        </w:tabs>
       </w:pPr>
       <w:r>
-        <w:t xml:space="preserve">35. </w:t>
+        <w:rPr>
+          <w:sz w:val="22"/>
+        </w:rPr>
+        <w:t>35.</w:t>
+        <w:tab/>
       </w:r>
       <w:r>
         <w:t xml:space="preserve">Drude NI, Martinez-Gamboa L, Danziger M, Collazo A, Kniffert S, Wiebach J, </w:t>
@@ -1221,10 +1501,18 @@
     </w:p>
     <w:p>
       <w:pPr>
-        <w:spacing w:after="40" w:before="20"/>
+        <w:spacing w:after="80" w:before="20"/>
+        <w:ind w:left="567" w:hanging="567"/>
+        <w:tabs>
+          <w:tab w:val="left" w:pos="566"/>
+        </w:tabs>
       </w:pPr>
       <w:r>
-        <w:t xml:space="preserve">36. </w:t>
+        <w:rPr>
+          <w:sz w:val="22"/>
+        </w:rPr>
+        <w:t>36.</w:t>
+        <w:tab/>
       </w:r>
       <w:r>
         <w:t xml:space="preserve">Sorjonen K, Ingre M, </w:t>
@@ -1253,10 +1541,18 @@
     </w:p>
     <w:p>
       <w:pPr>
-        <w:spacing w:after="40" w:before="20"/>
+        <w:spacing w:after="80" w:before="20"/>
+        <w:ind w:left="567" w:hanging="567"/>
+        <w:tabs>
+          <w:tab w:val="left" w:pos="566"/>
+        </w:tabs>
       </w:pPr>
       <w:r>
-        <w:t xml:space="preserve">37. </w:t>
+        <w:rPr>
+          <w:sz w:val="22"/>
+        </w:rPr>
+        <w:t>37.</w:t>
+        <w:tab/>
       </w:r>
       <w:r>
         <w:t xml:space="preserve">Sorjonen K, </w:t>
@@ -1288,10 +1584,18 @@
     </w:p>
     <w:p>
       <w:pPr>
-        <w:spacing w:after="40" w:before="20"/>
+        <w:spacing w:after="80" w:before="20"/>
+        <w:ind w:left="567" w:hanging="567"/>
+        <w:tabs>
+          <w:tab w:val="left" w:pos="566"/>
+        </w:tabs>
       </w:pPr>
       <w:r>
-        <w:t xml:space="preserve">38. </w:t>
+        <w:rPr>
+          <w:sz w:val="22"/>
+        </w:rPr>
+        <w:t>38.</w:t>
+        <w:tab/>
       </w:r>
       <w:r>
         <w:t xml:space="preserve">Koenig J, Abler B, Agartz I, Åkerstedt T, Andreassen OA, Anthony M, Bär K-J, Bertsch K, Brown RC, Brunner R, Carnevali L, Critchley HD, Cullen KR, de Geus EJC, de la Cruz F, Dziobek I, Ferger MD, Fischer H, Flor H, Gaebler M, Gianaros PJ, Giummarra MJ, Greening SG, Guendelman S, Heathers JAJ, Herpertz SC, Hu MX, Jentschke S, Kaess M, Kaufmann T, Klimes-Dougan B, Koelsch S, Krauch M, Kumral D, Lamers F, Lee T-H, Lekander M, Lin F, Lotze M, Makovac E, Mancini M, Mancke F, Månsson KNT, Manuck SB, Mather M, Meeten F, Min J, Mueller B, Muench V, Nees F, Nga L, </w:t>
@@ -1323,10 +1627,18 @@
     </w:p>
     <w:p>
       <w:pPr>
-        <w:spacing w:after="40" w:before="20"/>
+        <w:spacing w:after="80" w:before="20"/>
+        <w:ind w:left="567" w:hanging="567"/>
+        <w:tabs>
+          <w:tab w:val="left" w:pos="566"/>
+        </w:tabs>
       </w:pPr>
       <w:r>
-        <w:t xml:space="preserve">39. </w:t>
+        <w:rPr>
+          <w:sz w:val="22"/>
+        </w:rPr>
+        <w:t>39.</w:t>
+        <w:tab/>
       </w:r>
       <w:r>
         <w:rPr>
@@ -1355,10 +1667,18 @@
     </w:p>
     <w:p>
       <w:pPr>
-        <w:spacing w:after="40" w:before="20"/>
+        <w:spacing w:after="80" w:before="20"/>
+        <w:ind w:left="567" w:hanging="567"/>
+        <w:tabs>
+          <w:tab w:val="left" w:pos="566"/>
+        </w:tabs>
       </w:pPr>
       <w:r>
-        <w:t xml:space="preserve">40. </w:t>
+        <w:rPr>
+          <w:sz w:val="22"/>
+        </w:rPr>
+        <w:t>40.</w:t>
+        <w:tab/>
       </w:r>
       <w:r>
         <w:t xml:space="preserve">Pavlov YG, Adamian N, Appelhoff S, Arvaneh M, Christopher Benwell PD, Beste C, Bland A, Bradford DE, Bublatzky F, Busch N, Clayson PE, Cruse D, Czeszumski A, Almenberg AD, Dumas G, Ehinger BV, Ganis G, He X, Hinojosa JA, Huber-Huber C, Inzlicht M, Jack BN, Johannesson M, Jones R, Kaltwasser L, Karimi-Rouzbahani H, Keil A, König P, Kouara L, Kulke L, Ladouceur C, Langer N, Liesefeld HR, Luque D, MacNamara A, Mudrik L, Muthuraman M, Neal L, </w:t>
@@ -1390,10 +1710,18 @@
     </w:p>
     <w:p>
       <w:pPr>
-        <w:spacing w:after="40" w:before="20"/>
+        <w:spacing w:after="80" w:before="20"/>
+        <w:ind w:left="567" w:hanging="567"/>
+        <w:tabs>
+          <w:tab w:val="left" w:pos="566"/>
+        </w:tabs>
       </w:pPr>
       <w:r>
-        <w:t xml:space="preserve">41. </w:t>
+        <w:rPr>
+          <w:sz w:val="22"/>
+        </w:rPr>
+        <w:t>41.</w:t>
+        <w:tab/>
       </w:r>
       <w:r>
         <w:t>Gau R, Noble S, Heuer K, Bottenhorn KL, Bilgin IP, Yang Y-F, Huntenburg JM, Bayer JMM, Bethlehem RAI, Rhoads SA, Vogelbacher C, Borghesani V, Levitis E, Wang H-T, Van Den Bossche S, Kobeleva X, Legarreta JH, Guay S, Atay SM, Varoquaux GP, Huijser DC, Sandström MS, Herholz P, Nastase SA, Badhwar A, Dumas G, Schwab S, Moia S, Dayan M, Bassil Y, Brooks PP, Mancini M, Shine JM, O'Connor D, Xie X, Poggiali D, Friedrich P, Heinsfeld AS, Riedl L, Toro R, Caballero-Gaudes C, Eklund A, Garner KG, Nolan CR, Demeter DV, Barrios FA, Merchant JS, McDevitt EA, Oostenveld R, Craddock RC, Rokem A, Doyle A, Ghosh SS, Nikolaidis A, Stanley OW, Uruñuela E, Brainhack Community</w:t>
@@ -1416,10 +1744,18 @@
     </w:p>
     <w:p>
       <w:pPr>
-        <w:spacing w:after="40" w:before="20"/>
+        <w:spacing w:after="80" w:before="20"/>
+        <w:ind w:left="567" w:hanging="567"/>
+        <w:tabs>
+          <w:tab w:val="left" w:pos="566"/>
+        </w:tabs>
       </w:pPr>
       <w:r>
-        <w:t xml:space="preserve">42. </w:t>
+        <w:rPr>
+          <w:sz w:val="22"/>
+        </w:rPr>
+        <w:t>42.</w:t>
+        <w:tab/>
       </w:r>
       <w:r>
         <w:t xml:space="preserve">Hallinan D, Bernier A, Cambon-Thomsen A, Crawley F P, Dimitrova D, Medeiros C, </w:t>
@@ -1451,10 +1787,18 @@
     </w:p>
     <w:p>
       <w:pPr>
-        <w:spacing w:after="40" w:before="20"/>
+        <w:spacing w:after="80" w:before="20"/>
+        <w:ind w:left="567" w:hanging="567"/>
+        <w:tabs>
+          <w:tab w:val="left" w:pos="566"/>
+        </w:tabs>
       </w:pPr>
       <w:r>
-        <w:t xml:space="preserve">43. </w:t>
+        <w:rPr>
+          <w:sz w:val="22"/>
+        </w:rPr>
+        <w:t>43.</w:t>
+        <w:tab/>
       </w:r>
       <w:r>
         <w:t xml:space="preserve">Schweinsberg M, Feldman M, Staub N, van den Akker OR, van Aert RCM, van Assen MALM, Liu Y, Althoff T, Heer J, Kale A, Mohamed Z, Amireh H, Prasad VV, Bernstein A, Robinson E, Snellman K, Sommer SA, Otner SMG, Robinson D, Madan N, Silberzahn R, Goldstein P, Tierney W, Murase T, Mandl B, Viganola D, Strobl C, Schaumans CBC, Kelchtermans S, Naseeb C, Garrison SM, Yarkoni T, Chan CSR, Adie P, Alaburda P, Albers C, Alspaugh S, Alstott J, Nelson AA, de la Rubia EA, Arzi A, Bahnik S, Baik J, Balling LW, Banker S, Baranger DAA, Barr DJ, Barros-Rivera B, Bauer M, Blaise E, Boelen L, Carbonell KB, Briers RA, Burkhard O, Canela M-A, Castrillo L, Catlett T, Chen O, Clark M, Cohn B, Coppock A, Cuguero-Escofet N, Curran PG, Cyrus-Lai W, Dai D, Dalla Riva GV, Danielsson H, Russo RDFSM, de Silva N, Derungs C, Dondelinger F, de Souza CD, Dube BT, Dubova M, Dunn BM, Edelsbrunner PA, Finley S, Fox N, Gnambs T, Gong Y, Grand E, Greenawalt B, Han D, Hanel PHP, Hong AB, Hood D, Hsueh J, Huang L, Hui KN, Hultman KA, Javaid A, Jiang LJ, Jong J, Kamdar J, Kane D, Kappler G, Kaszubowski E, Kavanagh CM, Khabsa M, Kleinberg B, Kouros J, Krause H, Krypotos A-M, Lavbic D, Lee RL, Leffel T, Lim WY, Liverani S, Loh B, Lonsmann D, Low JW, Lu A, MacDonald K, Madan CR, Madsen LH, Maimone C, Mangold A, Marshall A, Matskewich HE, Mavon K, McLain KL, McNamara AA, McNeill M, Mertens U, Miller D, Moore B, Moore A, Nantz E, Nasrullah Z, Nejkovic V, Nell CS, Nelson AA, </w:t>
@@ -1486,10 +1830,18 @@
     </w:p>
     <w:p>
       <w:pPr>
-        <w:spacing w:after="40" w:before="20"/>
+        <w:spacing w:after="80" w:before="20"/>
+        <w:ind w:left="567" w:hanging="567"/>
+        <w:tabs>
+          <w:tab w:val="left" w:pos="566"/>
+        </w:tabs>
       </w:pPr>
       <w:r>
-        <w:t xml:space="preserve">44. </w:t>
+        <w:rPr>
+          <w:sz w:val="22"/>
+        </w:rPr>
+        <w:t>44.</w:t>
+        <w:tab/>
       </w:r>
       <w:r>
         <w:t xml:space="preserve">Wang K, Goldenberg A, Dorison CA, Miller JK, Uusberg A, Lerner JS, Gross JJ, Agesin BB, Bernardo M, Campos O, Eudave L, Grzech K, Ozery DH, Jackson EA, Garcia EOL, Drexler SM, Jurković AP, Rana K, Wilson JP, Antoniadi M, Desai K, Gialitaki Z, Kushnir E, Nadif K, Bravo ON, Nauman R, Oosterlinck M, Pantazi M, Pilecka N, Szabelska A, van Steenkiste IMM, Filip K, Bozdoc AI, Marcu GM, Agadullina E, Adamkovič M, Roczniewska M, Reyna C, Kassianos AP, Westerlund M, Ahlgren L, Pöntinen S, Adetula GA, Dursun P, Arinze AI, Arinze NC, Ogbonnaya CE, Ndukaihe ILG, Dalgar I, Akkas H, Macapagal PM, Lewis S, Metin-Orta I, Foroni F, Willis M, Santos AC, Mokady A, Reggev N, Kurfali MA, Vasilev MR, Nock NL, Parzuchowski M, Espinoza Barría MF, Vranka M, Kohlová MB, Ropovik I, Harutyunyan M, Wang C, Yao E, Becker M, Manunta E, Kaminski G, Boudesseu J, Marko D, Evans K, Lewis DMG, Findor A, Landry AT, Aruta JJB, Ortiz MS, Vally Z, Pronizius E, Voracek M, Lamm C, Grinberg M, Li R, Valentova JV, Mioni G, Cellini N, Chen S-C, Zickfeld J, Moon K, Azab H, Levy N, Karababa A, Beaudry JL, Boucher L, Collins WM, Todsen AL, van Schie K, Vintr J, Bavolar J, Kaliska L, Križanić V, Samojlenko L, Pourafshari R, Geiger SJ, Beitner J, Warmelink L, Ross RM, Stephen ID, Hostler TJ, Azouaghe S, McCarthy R, Szala A, Grano C, Solorzano CS, Anjum G, Jimenez-Leal W, Bradford M, Pérez LC, Cruz Vásquez JE, Galindo-Caballero OJ, Vargas-Nieto JC, Kácha O, Arvanitis A, Xiao Q, Cárcamo R, Zorjan S, Tajchman Z, Vilares I, Pavlacic JM, Kunst JR, Tamnes CK, von Bastian CC, Atari M, Sharifian M, Hricova M, Kačmár P, Schrötter J, Rahal R-M, Cohen N, FatahModares S, Zrimsek M, Zakharov I, Koehn MA, Esteban-Serna C, Calin-Jageman RJ, Krafnick AJ, Štrukelj E, Isager PM, Urban J, Silva JR, Martončik M, Očovaj SB, Šakan D, Kuzminska AO, Djordjevic JM, Almeida IAT, Ferreira A, Lazarevic LB, Manley H, Ricaurte DZ, Monteiro RP, Etabari Z, Musser E, Dunleavy D, Chou W, Godbersen H, Ruiz-Fernández S, Reeck C, Batres C, Kirgizova K, Muminov A, Azevedo F, Alvarez DS, Butt MM, Lee JM, Chen Z, Verbruggen F, Ziano I, Tümer M, Charyate ACA, Dubrov D, Tejada Rivera MDCMC, Aberson C, Pálfi B, Maldonado MA, Hubena B, Sacakli A, Ceary CD, Richard KL, Singer G, Perillo JT, Ballantyne T, Cyrus-Lai W, Fedotov M, Du H, Wielgus M, Pit IL, Hruška M, Sousa D, Aczel B, Hajdu N, Szaszi B, Adamus S, Barzykowski K, Micheli L, Schmidt N-D, Zsido AN, Paruzel-Czachura M, Muda R, Bialek M, Kowal M, Sorokowska A, Misiak M, Mola D, Ortiz MV, Correa PS, Belaus A, Muchembled F, Ribeiro RR, Arriaga P, Oliveira R, Vaughn LA, Szwed P, Kossowska M, Czarnek G, Kielińska J, Antazo B, Betlehem R, Stieger S, </w:t>
@@ -1521,10 +1873,18 @@
     </w:p>
     <w:p>
       <w:pPr>
-        <w:spacing w:after="40" w:before="20"/>
+        <w:spacing w:after="80" w:before="20"/>
+        <w:ind w:left="567" w:hanging="567"/>
+        <w:tabs>
+          <w:tab w:val="left" w:pos="566"/>
+        </w:tabs>
       </w:pPr>
       <w:r>
-        <w:t xml:space="preserve">45. </w:t>
+        <w:rPr>
+          <w:sz w:val="22"/>
+        </w:rPr>
+        <w:t>45.</w:t>
+        <w:tab/>
       </w:r>
       <w:r>
         <w:t xml:space="preserve">Austin CC, Bernier A, Bezuidenhout L, Bicarregui J, Biro T, Cambon-Thomsen A, Russo Carroll S, Cournia Z, Dabrowski PW, Diallo G, Duflot T, Garcia L, Gesing S, Gonzalez-Beltran A, Gururaj A, Harrower N, Lin D, Medeiros C, Méndez E, Meyers N, Mietchen D, Nagrani R, </w:t>
@@ -1556,10 +1916,18 @@
     </w:p>
     <w:p>
       <w:pPr>
-        <w:spacing w:after="40" w:before="20"/>
+        <w:spacing w:after="80" w:before="20"/>
+        <w:ind w:left="567" w:hanging="567"/>
+        <w:tabs>
+          <w:tab w:val="left" w:pos="566"/>
+        </w:tabs>
       </w:pPr>
       <w:r>
-        <w:t xml:space="preserve">46. </w:t>
+        <w:rPr>
+          <w:sz w:val="22"/>
+        </w:rPr>
+        <w:t>46.</w:t>
+        <w:tab/>
       </w:r>
       <w:r>
         <w:t xml:space="preserve">Sorjonen K, Falkstedt D, Wallin AS, Melin B, </w:t>
@@ -1588,10 +1956,18 @@
     </w:p>
     <w:p>
       <w:pPr>
-        <w:spacing w:after="40" w:before="20"/>
+        <w:spacing w:after="80" w:before="20"/>
+        <w:ind w:left="567" w:hanging="567"/>
+        <w:tabs>
+          <w:tab w:val="left" w:pos="566"/>
+        </w:tabs>
       </w:pPr>
       <w:r>
-        <w:t xml:space="preserve">47. </w:t>
+        <w:rPr>
+          <w:sz w:val="22"/>
+        </w:rPr>
+        <w:t>47.</w:t>
+        <w:tab/>
       </w:r>
       <w:r>
         <w:t xml:space="preserve">Aczel B, Szaszi B, </w:t>
@@ -1623,10 +1999,18 @@
     </w:p>
     <w:p>
       <w:pPr>
-        <w:spacing w:after="40" w:before="20"/>
+        <w:spacing w:after="80" w:before="20"/>
+        <w:ind w:left="567" w:hanging="567"/>
+        <w:tabs>
+          <w:tab w:val="left" w:pos="566"/>
+        </w:tabs>
       </w:pPr>
       <w:r>
-        <w:t xml:space="preserve">48. </w:t>
+        <w:rPr>
+          <w:sz w:val="22"/>
+        </w:rPr>
+        <w:t>48.</w:t>
+        <w:tab/>
       </w:r>
       <w:r>
         <w:t xml:space="preserve">Åkerstedt T, Lekander M, </w:t>
@@ -1658,10 +2042,18 @@
     </w:p>
     <w:p>
       <w:pPr>
-        <w:spacing w:after="40" w:before="20"/>
+        <w:spacing w:after="80" w:before="20"/>
+        <w:ind w:left="567" w:hanging="567"/>
+        <w:tabs>
+          <w:tab w:val="left" w:pos="566"/>
+        </w:tabs>
       </w:pPr>
       <w:r>
-        <w:t xml:space="preserve">49. </w:t>
+        <w:rPr>
+          <w:sz w:val="22"/>
+        </w:rPr>
+        <w:t>49.</w:t>
+        <w:tab/>
       </w:r>
       <w:r>
         <w:t xml:space="preserve">Evans T, Johannes N, Winska J, Glińska-Neweś A, van Stekelenburg A, </w:t>
@@ -1693,10 +2085,18 @@
     </w:p>
     <w:p>
       <w:pPr>
-        <w:spacing w:after="40" w:before="20"/>
+        <w:spacing w:after="80" w:before="20"/>
+        <w:ind w:left="567" w:hanging="567"/>
+        <w:tabs>
+          <w:tab w:val="left" w:pos="566"/>
+        </w:tabs>
       </w:pPr>
       <w:r>
-        <w:t xml:space="preserve">50. </w:t>
+        <w:rPr>
+          <w:sz w:val="22"/>
+        </w:rPr>
+        <w:t>50.</w:t>
+        <w:tab/>
       </w:r>
       <w:r>
         <w:t xml:space="preserve">Botvinik-Nezer R, Holzmeister F, Camerer CF, Dreber A, Huber J, Johannesson M, Kirchler M, Iwanir R, Mumford JA, Adcock RA, Avesani P, Baczkowski BM, Bajracharya A, Bakst L, Ball S, Barilari M, Bault N, Beaton D, Beitner J, Benoit RG, Berkers RMWJ, Bhanji JP, Biswal BB, Bobadilla-Suarez S, Bortolini T, Bottenhorn KL, Bowring A, Braem S, Brooks HR, Brudner EG, Calderon CB, Camilleri JA, Castrellon JJ, Cecchetti L, Cieslik EC, Cole ZJ, Collignon O, Cox RW, Cunningham WA, Czoschke S, Dadi K, Davis CP, Luca AD, Delgado MR, Demetriou L, Dennison JB, Di X, Dickie EW, Dobryakova E, Donnat CL, Dukart J, Duncan NW, Durnez J, Eed A, Eickhoff SB, Erhart A, Fontanesi L, Fricke GM, Fu S, Galván A, Gau R, Genon S, Glatard T, Glerean E, Goeman JJ, Golowin SAE, González-García C, Gorgolewski KJ, Grady CL, Green MA, Guassi Moreira JF, Guest O, Hakimi S, Hamilton JP, Hancock R, Handjaras G, Harry BB, Hawco C, Herholz P, Herman G, Heunis S, Hoffstaedter F, Hogeveen J, Holmes S, Hu C-P, Huettel SA, Hughes ME, Iacovella V, Iordan AD, Isager PM, Isik AI, Jahn A, Johnson MR, Johnstone T, Joseph MJE, Juliano AC, Kable JW, Kassinopoulos M, Koba C, Kong X-Z, Koscik TR, Kucukboyaci NE, Kuhl BA, Kupek S, Laird AR, Lamm C, Langner R, Lauharatanahirun N, Lee H, Lee S, Leemans A, Leo A, Lesage E, Li F, Li MYC, Lim PC, Lintz EN, Liphardt SW, Losecaat Vermeer AB, Love BC, Mack ML, Malpica N, Marins T, Maumet C, McDonald K, McGuire JT, Melero H, Méndez Leal AS, Meyer B, Meyer KN, Mihai G, Mitsis GD, Moll J, Nielson DM, </w:t>
@@ -1728,10 +2128,18 @@
     </w:p>
     <w:p>
       <w:pPr>
-        <w:spacing w:after="40" w:before="20"/>
+        <w:spacing w:after="80" w:before="20"/>
+        <w:ind w:left="567" w:hanging="567"/>
+        <w:tabs>
+          <w:tab w:val="left" w:pos="566"/>
+        </w:tabs>
       </w:pPr>
       <w:r>
-        <w:t xml:space="preserve">51. </w:t>
+        <w:rPr>
+          <w:sz w:val="22"/>
+        </w:rPr>
+        <w:t>51.</w:t>
+        <w:tab/>
       </w:r>
       <w:r>
         <w:t>Tierney W, Hardy J, Ebersole C, Viganola D, Clemente E, Gordon M, Hoogeveen S, Haaf J, Dreber A, Johannesson M, Pfeiffer T, Huang J L, Vaugh L A, DeMarree K G, Igou E, Chapman H, Gantman A, Vanaman M, Wylie J, Storbeck J, Andreychik M R, McPhetres J Culture and Work Forecasting Collaboration, Uhlmann E L</w:t>
@@ -1754,10 +2162,18 @@
     </w:p>
     <w:p>
       <w:pPr>
-        <w:spacing w:after="40" w:before="20"/>
+        <w:spacing w:after="80" w:before="20"/>
+        <w:ind w:left="567" w:hanging="567"/>
+        <w:tabs>
+          <w:tab w:val="left" w:pos="566"/>
+        </w:tabs>
       </w:pPr>
       <w:r>
-        <w:t xml:space="preserve">52. </w:t>
+        <w:rPr>
+          <w:sz w:val="22"/>
+        </w:rPr>
+        <w:t>52.</w:t>
+        <w:tab/>
       </w:r>
       <w:r>
         <w:t xml:space="preserve">Tamm S, Schwarz J, Thuné H, Kecklund G, Petrovic P, Åkerstedt T, Fischer H, Lekander M, </w:t>
@@ -1786,10 +2202,18 @@
     </w:p>
     <w:p>
       <w:pPr>
-        <w:spacing w:after="40" w:before="20"/>
+        <w:spacing w:after="80" w:before="20"/>
+        <w:ind w:left="567" w:hanging="567"/>
+        <w:tabs>
+          <w:tab w:val="left" w:pos="566"/>
+        </w:tabs>
       </w:pPr>
       <w:r>
-        <w:t xml:space="preserve">53. </w:t>
+        <w:rPr>
+          <w:sz w:val="22"/>
+        </w:rPr>
+        <w:t>53.</w:t>
+        <w:tab/>
       </w:r>
       <w:r>
         <w:t xml:space="preserve">Sorjonen K, </w:t>
@@ -1821,10 +2245,18 @@
     </w:p>
     <w:p>
       <w:pPr>
-        <w:spacing w:after="40" w:before="20"/>
+        <w:spacing w:after="80" w:before="20"/>
+        <w:ind w:left="567" w:hanging="567"/>
+        <w:tabs>
+          <w:tab w:val="left" w:pos="566"/>
+        </w:tabs>
       </w:pPr>
       <w:r>
-        <w:t xml:space="preserve">54. </w:t>
+        <w:rPr>
+          <w:sz w:val="22"/>
+        </w:rPr>
+        <w:t>54.</w:t>
+        <w:tab/>
       </w:r>
       <w:r>
         <w:t>Tierney W, Hardy JH, Ebersole CR, Leavitt K, Viganola D, Clemente EG, Gordon M, Dreber A, Johannesson M, Pfeiffer T, Hiring Decisions Forecasting Collaboration, Uhlmann EL</w:t>
@@ -1847,10 +2279,18 @@
     </w:p>
     <w:p>
       <w:pPr>
-        <w:spacing w:after="40" w:before="20"/>
+        <w:spacing w:after="80" w:before="20"/>
+        <w:ind w:left="567" w:hanging="567"/>
+        <w:tabs>
+          <w:tab w:val="left" w:pos="566"/>
+        </w:tabs>
       </w:pPr>
       <w:r>
-        <w:t xml:space="preserve">55. </w:t>
+        <w:rPr>
+          <w:sz w:val="22"/>
+        </w:rPr>
+        <w:t>55.</w:t>
+        <w:tab/>
       </w:r>
       <w:r>
         <w:t xml:space="preserve">Koba C, Notaro G, Tamm S, </w:t>
@@ -1882,10 +2322,18 @@
     </w:p>
     <w:p>
       <w:pPr>
-        <w:spacing w:after="40" w:before="20"/>
+        <w:spacing w:after="80" w:before="20"/>
+        <w:ind w:left="567" w:hanging="567"/>
+        <w:tabs>
+          <w:tab w:val="left" w:pos="566"/>
+        </w:tabs>
       </w:pPr>
       <w:r>
-        <w:t xml:space="preserve">56. </w:t>
+        <w:rPr>
+          <w:sz w:val="22"/>
+        </w:rPr>
+        <w:t>56.</w:t>
+        <w:tab/>
       </w:r>
       <w:r>
         <w:t xml:space="preserve">Tamm S, </w:t>
@@ -1917,10 +2365,18 @@
     </w:p>
     <w:p>
       <w:pPr>
-        <w:spacing w:after="40" w:before="20"/>
+        <w:spacing w:after="80" w:before="20"/>
+        <w:ind w:left="567" w:hanging="567"/>
+        <w:tabs>
+          <w:tab w:val="left" w:pos="566"/>
+        </w:tabs>
       </w:pPr>
       <w:r>
-        <w:t xml:space="preserve">57. </w:t>
+        <w:rPr>
+          <w:sz w:val="22"/>
+        </w:rPr>
+        <w:t>57.</w:t>
+        <w:tab/>
       </w:r>
       <w:r>
         <w:t xml:space="preserve">Lodin K, Lekander M, Petrovic P, </w:t>
@@ -1952,10 +2408,18 @@
     </w:p>
     <w:p>
       <w:pPr>
-        <w:spacing w:after="40" w:before="20"/>
+        <w:spacing w:after="80" w:before="20"/>
+        <w:ind w:left="567" w:hanging="567"/>
+        <w:tabs>
+          <w:tab w:val="left" w:pos="566"/>
+        </w:tabs>
       </w:pPr>
       <w:r>
-        <w:t xml:space="preserve">58. </w:t>
+        <w:rPr>
+          <w:sz w:val="22"/>
+        </w:rPr>
+        <w:t>58.</w:t>
+        <w:tab/>
       </w:r>
       <w:r>
         <w:t xml:space="preserve">Månsson KNT, Lindqvist D, Yang L, Svanborg C, Isung J, </w:t>
@@ -1987,10 +2451,18 @@
     </w:p>
     <w:p>
       <w:pPr>
-        <w:spacing w:after="40" w:before="20"/>
+        <w:spacing w:after="80" w:before="20"/>
+        <w:ind w:left="567" w:hanging="567"/>
+        <w:tabs>
+          <w:tab w:val="left" w:pos="566"/>
+        </w:tabs>
       </w:pPr>
       <w:r>
-        <w:t xml:space="preserve">59. </w:t>
+        <w:rPr>
+          <w:sz w:val="22"/>
+        </w:rPr>
+        <w:t>59.</w:t>
+        <w:tab/>
       </w:r>
       <w:r>
         <w:t xml:space="preserve">Lakens D, Adolfi FG, Albers CJ, Anvari F, Apps MAJ, Argamon SE, Baguley T, Becker RB, Benning SD, Bradford DE, Buchanan EM, Caldwell AR, Van Calster B, Carlsson R, Chen S-C, Chung B, Colling LJ, Collins GS, Crook Z, Cross ES, Daniels S, Danielsson H, DeBruine L, Dunleavy DJ, Earp BD, Feist MI, Ferrell JD, Field JG, Fox NW, Friesen A, Gomes C, Gonzalez-Marquez M, Grange JA, Grieve AP, Guggenberger R, Grist J, van Harmelen A-L, Hasselman F, Hochard KD, Hoffarth MR, Holmes NP, Ingre M, Isager PM, Isotalus HK, Johansson C, Juszczyk K, Kenny DA, Khalil AA, Konat B, Lao J, Larsen EG, Lodder GMA, Lukavsky J, Madan CR, Manheim D, Martin SR, Martin AE, Mayo DG, McCarthy RJ, McConway K, McFarland C, Nio AQX, </w:t>
@@ -2022,10 +2494,18 @@
     </w:p>
     <w:p>
       <w:pPr>
-        <w:spacing w:after="40" w:before="20"/>
+        <w:spacing w:after="80" w:before="20"/>
+        <w:ind w:left="567" w:hanging="567"/>
+        <w:tabs>
+          <w:tab w:val="left" w:pos="566"/>
+        </w:tabs>
       </w:pPr>
       <w:r>
-        <w:t xml:space="preserve">60. </w:t>
+        <w:rPr>
+          <w:sz w:val="22"/>
+        </w:rPr>
+        <w:t>60.</w:t>
+        <w:tab/>
       </w:r>
       <w:r>
         <w:t xml:space="preserve">Radun I, </w:t>
@@ -2057,10 +2537,18 @@
     </w:p>
     <w:p>
       <w:pPr>
-        <w:spacing w:after="40" w:before="20"/>
+        <w:spacing w:after="80" w:before="20"/>
+        <w:ind w:left="567" w:hanging="567"/>
+        <w:tabs>
+          <w:tab w:val="left" w:pos="566"/>
+        </w:tabs>
       </w:pPr>
       <w:r>
-        <w:t xml:space="preserve">61. </w:t>
+        <w:rPr>
+          <w:sz w:val="22"/>
+        </w:rPr>
+        <w:t>61.</w:t>
+        <w:tab/>
       </w:r>
       <w:r>
         <w:t xml:space="preserve">McGrath C, </w:t>
@@ -2101,10 +2589,18 @@
     </w:p>
     <w:p>
       <w:pPr>
-        <w:spacing w:after="40" w:before="20"/>
+        <w:spacing w:after="80" w:before="20"/>
+        <w:ind w:left="567" w:hanging="567"/>
+        <w:tabs>
+          <w:tab w:val="left" w:pos="566"/>
+        </w:tabs>
       </w:pPr>
       <w:r>
-        <w:t xml:space="preserve">1. </w:t>
+        <w:rPr>
+          <w:sz w:val="22"/>
+        </w:rPr>
+        <w:t>1.</w:t>
+        <w:tab/>
       </w:r>
       <w:r>
         <w:t xml:space="preserve">Sorjonen K, Ingre M, Melin B, </w:t>
@@ -2133,10 +2629,18 @@
     </w:p>
     <w:p>
       <w:pPr>
-        <w:spacing w:after="40" w:before="20"/>
+        <w:spacing w:after="80" w:before="20"/>
+        <w:ind w:left="567" w:hanging="567"/>
+        <w:tabs>
+          <w:tab w:val="left" w:pos="566"/>
+        </w:tabs>
       </w:pPr>
       <w:r>
-        <w:t xml:space="preserve">2. </w:t>
+        <w:rPr>
+          <w:sz w:val="22"/>
+        </w:rPr>
+        <w:t>2.</w:t>
+        <w:tab/>
       </w:r>
       <w:r>
         <w:t xml:space="preserve">Sorjonen K, </w:t>
@@ -2168,10 +2672,18 @@
     </w:p>
     <w:p>
       <w:pPr>
-        <w:spacing w:after="40" w:before="20"/>
+        <w:spacing w:after="80" w:before="20"/>
+        <w:ind w:left="567" w:hanging="567"/>
+        <w:tabs>
+          <w:tab w:val="left" w:pos="566"/>
+        </w:tabs>
       </w:pPr>
       <w:r>
-        <w:t xml:space="preserve">3. </w:t>
+        <w:rPr>
+          <w:sz w:val="22"/>
+        </w:rPr>
+        <w:t>3.</w:t>
+        <w:tab/>
       </w:r>
       <w:r>
         <w:t xml:space="preserve">Lindsäter E, Svärdman F, Wallert J, Ivanova EN, Söderholm A, Fondberg R, </w:t>
@@ -2199,1201 +2711,6 @@
       </w:r>
       <w:r>
         <w:t>,8:e159, 2022.</w:t>
-      </w:r>
-    </w:p>
-    <w:p>
-      <w:pPr>
-        <w:pStyle w:val="Heading3"/>
-      </w:pPr>
-      <w:r>
-        <w:rPr>
-          <w:rFonts w:ascii="Times New Roman" w:hAnsi="Times New Roman"/>
-          <w:color w:val="000000"/>
-        </w:rPr>
-        <w:t>Other articles</w:t>
-      </w:r>
-    </w:p>
-    <w:p>
-      <w:pPr>
-        <w:spacing w:after="40" w:before="20"/>
-      </w:pPr>
-      <w:r>
-        <w:t xml:space="preserve">1. </w:t>
-      </w:r>
-      <w:r>
-        <w:t xml:space="preserve">Ahnström L, Bruckner T, Aspromonti DA, Caquelin L, Cummins J, DeVito NJ, Axfors C, Ioannidis JPA, </w:t>
-      </w:r>
-      <w:r>
-        <w:rPr>
-          <w:b/>
-        </w:rPr>
-        <w:t>Nilsonne G</w:t>
-      </w:r>
-      <w:r>
-        <w:t xml:space="preserve">: </w:t>
-      </w:r>
-      <w:r>
-        <w:t xml:space="preserve">TrialScout links published results to trial registrations using a large language model. </w:t>
-      </w:r>
-      <w:r>
-        <w:t>, 2026.</w:t>
-      </w:r>
-    </w:p>
-    <w:p>
-      <w:pPr>
-        <w:spacing w:after="40" w:before="20"/>
-      </w:pPr>
-      <w:r>
-        <w:t xml:space="preserve">2. </w:t>
-      </w:r>
-      <w:r>
-        <w:t xml:space="preserve">Curtin M, Wiltshire A, </w:t>
-      </w:r>
-      <w:r>
-        <w:rPr>
-          <w:b/>
-        </w:rPr>
-        <w:t>Nilsonne G</w:t>
-      </w:r>
-      <w:r>
-        <w:t>, Siebert M</w:t>
-      </w:r>
-      <w:r>
-        <w:t xml:space="preserve">: </w:t>
-      </w:r>
-      <w:r>
-        <w:t xml:space="preserve">Assessing the Compliance and Timeliness of Results Reporting for Clinical Trials on Antimicrobial Agents. </w:t>
-      </w:r>
-      <w:r>
-        <w:t>, 2025.</w:t>
-      </w:r>
-    </w:p>
-    <w:p>
-      <w:pPr>
-        <w:spacing w:after="40" w:before="20"/>
-      </w:pPr>
-      <w:r>
-        <w:t xml:space="preserve">3. </w:t>
-      </w:r>
-      <w:r>
-        <w:t xml:space="preserve">Alavi M, Koch P, MacDonald L, Miller K, </w:t>
-      </w:r>
-      <w:r>
-        <w:rPr>
-          <w:b/>
-        </w:rPr>
-        <w:t>Nilsonne G</w:t>
-      </w:r>
-      <w:r>
-        <w:t>, Priess-Buchheit J, Scherer J, Škorić L, Stoev P, Vrkic D, Wyber S, Yovcheva N, Yucebalkan C</w:t>
-      </w:r>
-      <w:r>
-        <w:t xml:space="preserve">: </w:t>
-      </w:r>
-      <w:r>
-        <w:t xml:space="preserve">Unpacking the Possibilities of Intellectual Properties for Open Science. </w:t>
-      </w:r>
-      <w:r>
-        <w:t>, 2025.</w:t>
-      </w:r>
-    </w:p>
-    <w:p>
-      <w:pPr>
-        <w:spacing w:after="40" w:before="20"/>
-      </w:pPr>
-      <w:r>
-        <w:t xml:space="preserve">4. </w:t>
-      </w:r>
-      <w:r>
-        <w:t xml:space="preserve">Cesnaite E, vitale A, Pascarella A, Vinding MC, Algermissen J, Fischer NL, Puoliväli T, Gianelli C, Marshall CR, Trübutschek D, Yang Y-F, Busch N, </w:t>
-      </w:r>
-      <w:r>
-        <w:rPr>
-          <w:b/>
-        </w:rPr>
-        <w:t>Nilsonne G</w:t>
-      </w:r>
-      <w:r>
-        <w:t xml:space="preserve">: </w:t>
-      </w:r>
-      <w:r>
-        <w:t xml:space="preserve">The EEGManyPipelines Dataset: Metascientific Data on 168 Independent Analyses of a Single EEG Dataset. </w:t>
-      </w:r>
-      <w:r>
-        <w:t>, 2025.</w:t>
-      </w:r>
-    </w:p>
-    <w:p>
-      <w:pPr>
-        <w:spacing w:after="40" w:before="20"/>
-      </w:pPr>
-      <w:r>
-        <w:t xml:space="preserve">5. </w:t>
-      </w:r>
-      <w:r>
-        <w:t xml:space="preserve">Sorjonen K, Melin B, </w:t>
-      </w:r>
-      <w:r>
-        <w:rPr>
-          <w:b/>
-        </w:rPr>
-        <w:t>Nilsonne G</w:t>
-      </w:r>
-      <w:r>
-        <w:t>, Melin M</w:t>
-      </w:r>
-      <w:r>
-        <w:t xml:space="preserve">: </w:t>
-      </w:r>
-      <w:r>
-        <w:t xml:space="preserve">Multiverse analyses of meta-analytic data reveal no prospective effects between peer relationships and internet addiction. </w:t>
-      </w:r>
-      <w:r>
-        <w:t>, 2025.</w:t>
-      </w:r>
-    </w:p>
-    <w:p>
-      <w:pPr>
-        <w:spacing w:after="40" w:before="20"/>
-      </w:pPr>
-      <w:r>
-        <w:t xml:space="preserve">6. </w:t>
-      </w:r>
-      <w:r>
-        <w:t xml:space="preserve">Sorjonen K, </w:t>
-      </w:r>
-      <w:r>
-        <w:rPr>
-          <w:b/>
-        </w:rPr>
-        <w:t>Nilsonne G</w:t>
-      </w:r>
-      <w:r>
-        <w:t>, Melin B</w:t>
-      </w:r>
-      <w:r>
-        <w:t xml:space="preserve">: </w:t>
-      </w:r>
-      <w:r>
-        <w:t xml:space="preserve">Triangulation can be useful depending on what you wish to achieve: Further elaborations and a reply to Lucas et al. (2024). </w:t>
-      </w:r>
-      <w:r>
-        <w:t>, 2025.</w:t>
-      </w:r>
-    </w:p>
-    <w:p>
-      <w:pPr>
-        <w:spacing w:after="40" w:before="20"/>
-      </w:pPr>
-      <w:r>
-        <w:t xml:space="preserve">7. </w:t>
-      </w:r>
-      <w:r>
-        <w:t xml:space="preserve">Sorjonen K, Melin M, Lager E, </w:t>
-      </w:r>
-      <w:r>
-        <w:rPr>
-          <w:b/>
-        </w:rPr>
-        <w:t>Nilsonne G</w:t>
-      </w:r>
-      <w:r>
-        <w:t>, Melin B</w:t>
-      </w:r>
-      <w:r>
-        <w:t xml:space="preserve">: </w:t>
-      </w:r>
-      <w:r>
-        <w:t xml:space="preserve">A reversed interpretation of the Dunning-Kruger effect based on disturbance. </w:t>
-      </w:r>
-      <w:r>
-        <w:t>, 2025.</w:t>
-      </w:r>
-    </w:p>
-    <w:p>
-      <w:pPr>
-        <w:spacing w:after="40" w:before="20"/>
-      </w:pPr>
-      <w:r>
-        <w:t xml:space="preserve">8. </w:t>
-      </w:r>
-      <w:r>
-        <w:t xml:space="preserve">Sorjonen K, </w:t>
-      </w:r>
-      <w:r>
-        <w:rPr>
-          <w:b/>
-        </w:rPr>
-        <w:t>Nilsonne G</w:t>
-      </w:r>
-      <w:r>
-        <w:t>, Olsson A, Melin B</w:t>
-      </w:r>
-      <w:r>
-        <w:t xml:space="preserve">: </w:t>
-      </w:r>
-      <w:r>
-        <w:t xml:space="preserve">Inconclusive evidence for causal effects between beliefs in conspiracy theories: A reanalysis and comment on Williams et al. (2025). </w:t>
-      </w:r>
-      <w:r>
-        <w:t>, 2025.</w:t>
-      </w:r>
-    </w:p>
-    <w:p>
-      <w:pPr>
-        <w:spacing w:after="40" w:before="20"/>
-      </w:pPr>
-      <w:r>
-        <w:t xml:space="preserve">9. </w:t>
-      </w:r>
-      <w:r>
-        <w:t xml:space="preserve">Suditu I, Dittasiri N, Glasberg A, Alkattan D, Neumann S, Sorjonen K, Ahnström L, Bengtsson J, Olsson N, Lekander M, </w:t>
-      </w:r>
-      <w:r>
-        <w:rPr>
-          <w:b/>
-        </w:rPr>
-        <w:t>Nilsonne G</w:t>
-      </w:r>
-      <w:r>
-        <w:t xml:space="preserve">: </w:t>
-      </w:r>
-      <w:r>
-        <w:t xml:space="preserve">Interleukin-6 in Bipolar Disorder: A Systematic Review and Meta-analysis. </w:t>
-      </w:r>
-      <w:r>
-        <w:t>, 2025.</w:t>
-      </w:r>
-    </w:p>
-    <w:p>
-      <w:pPr>
-        <w:spacing w:after="40" w:before="20"/>
-      </w:pPr>
-      <w:r>
-        <w:t xml:space="preserve">10. </w:t>
-      </w:r>
-      <w:r>
-        <w:t xml:space="preserve">Sorjonen K, Melin B, </w:t>
-      </w:r>
-      <w:r>
-        <w:rPr>
-          <w:b/>
-        </w:rPr>
-        <w:t>Nilsonne G</w:t>
-      </w:r>
-      <w:r>
-        <w:t xml:space="preserve">: </w:t>
-      </w:r>
-      <w:r>
-        <w:t xml:space="preserve">Cross-lagged network models do not prove causality: Results from simulations and analyses of symptoms of depression and anxiety. </w:t>
-      </w:r>
-      <w:r>
-        <w:t>, 2025.</w:t>
-      </w:r>
-    </w:p>
-    <w:p>
-      <w:pPr>
-        <w:spacing w:after="40" w:before="20"/>
-      </w:pPr>
-      <w:r>
-        <w:t xml:space="preserve">11. </w:t>
-      </w:r>
-      <w:r>
-        <w:t xml:space="preserve">Custer RM, Lynch KM, Barisano G, Herting MM, Åkerstedt T, </w:t>
-      </w:r>
-      <w:r>
-        <w:rPr>
-          <w:b/>
-        </w:rPr>
-        <w:t>Nilsonne G</w:t>
-      </w:r>
-      <w:r>
-        <w:t>, Ahmadi H, Choupan J</w:t>
-      </w:r>
-      <w:r>
-        <w:t xml:space="preserve">: </w:t>
-      </w:r>
-      <w:r>
-        <w:t xml:space="preserve">Effects of one-night partial sleep deprivation on perivascular space volume fraction: Findings from the Stockholm Sleepy Brain Study. </w:t>
-      </w:r>
-      <w:r>
-        <w:t>, 2024.</w:t>
-      </w:r>
-    </w:p>
-    <w:p>
-      <w:pPr>
-        <w:spacing w:after="40" w:before="20"/>
-      </w:pPr>
-      <w:r>
-        <w:t xml:space="preserve">12. </w:t>
-      </w:r>
-      <w:r>
-        <w:t xml:space="preserve">Sorjonen K, Melin B, </w:t>
-      </w:r>
-      <w:r>
-        <w:rPr>
-          <w:b/>
-        </w:rPr>
-        <w:t>Nilsonne G</w:t>
-      </w:r>
-      <w:r>
-        <w:t xml:space="preserve">: </w:t>
-      </w:r>
-      <w:r>
-        <w:t xml:space="preserve">Inconclusive evidence for a prospective effect of academic self-concept on achievement: A simulated reanalysis and comment on Marsh et al. (2024). </w:t>
-      </w:r>
-      <w:r>
-        <w:t>, 2024.</w:t>
-      </w:r>
-    </w:p>
-    <w:p>
-      <w:pPr>
-        <w:spacing w:after="40" w:before="20"/>
-      </w:pPr>
-      <w:r>
-        <w:t xml:space="preserve">13. </w:t>
-      </w:r>
-      <w:r>
-        <w:t xml:space="preserve">Sorjonen K, </w:t>
-      </w:r>
-      <w:r>
-        <w:rPr>
-          <w:b/>
-        </w:rPr>
-        <w:t>Nilsonne G</w:t>
-      </w:r>
-      <w:r>
-        <w:t>, Melin B</w:t>
-      </w:r>
-      <w:r>
-        <w:t xml:space="preserve">: </w:t>
-      </w:r>
-      <w:r>
-        <w:t xml:space="preserve">Triangulation can be useful depending on what you wish to achieve: A reply to Lucas et al. (2024). </w:t>
-      </w:r>
-      <w:r>
-        <w:t>, 2024.</w:t>
-      </w:r>
-    </w:p>
-    <w:p>
-      <w:pPr>
-        <w:spacing w:after="40" w:before="20"/>
-      </w:pPr>
-      <w:r>
-        <w:t xml:space="preserve">14. </w:t>
-      </w:r>
-      <w:r>
-        <w:t xml:space="preserve">Hoven MV, Asaduzzaman M, Evans N, Ike C, Kalichman M, Kniffert S, Löfström E, van Loon M, Moran R, </w:t>
-      </w:r>
-      <w:r>
-        <w:rPr>
-          <w:b/>
-        </w:rPr>
-        <w:t>Nilsonne G</w:t>
-      </w:r>
-      <w:r>
-        <w:t xml:space="preserve">: </w:t>
-      </w:r>
-      <w:r>
-        <w:t xml:space="preserve">Seven challenges for research integrity education: current status and recommendations. </w:t>
-      </w:r>
-      <w:r>
-        <w:t>, 2023.</w:t>
-      </w:r>
-    </w:p>
-    <w:p>
-      <w:pPr>
-        <w:spacing w:after="40" w:before="20"/>
-      </w:pPr>
-      <w:r>
-        <w:t xml:space="preserve">15. </w:t>
-      </w:r>
-      <w:r>
-        <w:t xml:space="preserve">Sorjonen K, </w:t>
-      </w:r>
-      <w:r>
-        <w:rPr>
-          <w:b/>
-        </w:rPr>
-        <w:t>Nilsonne G</w:t>
-      </w:r>
-      <w:r>
-        <w:t>, Ghaderi A, Melin B</w:t>
-      </w:r>
-      <w:r>
-        <w:t xml:space="preserve">: </w:t>
-      </w:r>
-      <w:r>
-        <w:t xml:space="preserve">Spurious effects in random-intercept cross-lagged panel models: Results from simulations and reanalyses of data on self-esteem and problematic eating behaviors used by Beckers et al. (2023). </w:t>
-      </w:r>
-      <w:r>
-        <w:t>, 2023.</w:t>
-      </w:r>
-    </w:p>
-    <w:p>
-      <w:pPr>
-        <w:spacing w:after="40" w:before="20"/>
-      </w:pPr>
-      <w:r>
-        <w:t xml:space="preserve">16. </w:t>
-      </w:r>
-      <w:r>
-        <w:rPr>
-          <w:b/>
-        </w:rPr>
-        <w:t>Nilsonne G</w:t>
-      </w:r>
-      <w:r>
-        <w:t>, Ahnström L</w:t>
-      </w:r>
-      <w:r>
-        <w:t xml:space="preserve">: </w:t>
-      </w:r>
-      <w:r>
-        <w:t xml:space="preserve">Digitization of data from published plots v1.0 v1. </w:t>
-      </w:r>
-      <w:r>
-        <w:t>, 2023.</w:t>
-      </w:r>
-    </w:p>
-    <w:p>
-      <w:pPr>
-        <w:spacing w:after="40" w:before="20"/>
-      </w:pPr>
-      <w:r>
-        <w:t xml:space="preserve">17. </w:t>
-      </w:r>
-      <w:r>
-        <w:t xml:space="preserve">Sorjonen K, Ingre M, Melin B, </w:t>
-      </w:r>
-      <w:r>
-        <w:rPr>
-          <w:b/>
-        </w:rPr>
-        <w:t>Nilsonne G</w:t>
-      </w:r>
-      <w:r>
-        <w:t xml:space="preserve">: </w:t>
-      </w:r>
-      <w:r>
-        <w:t xml:space="preserve">Prospective associations between self-esteem and quality of social relations may be spurious: Reanalysis of a meta-analysis of longitudinal studies. </w:t>
-      </w:r>
-      <w:r>
-        <w:t>, 2022.</w:t>
-      </w:r>
-    </w:p>
-    <w:p>
-      <w:pPr>
-        <w:spacing w:after="40" w:before="20"/>
-      </w:pPr>
-      <w:r>
-        <w:t xml:space="preserve">18. </w:t>
-      </w:r>
-      <w:r>
-        <w:t xml:space="preserve">Tennant J, Agarwal R, Baždarić K, Brassard D, Crick T, Dunleavy DJ, Evans TR, Gardner N, Gonzalez-Marquez M, Graziotin D, Greshake Tzovaras B, Gunnarsson D, Havemann J, Hosseini M, Katz DS, Knöchelmann M, Madan CR, Manghi P, Marocchino A, Masuzzo P, Murray-Rust P, Narayanaswamy S, </w:t>
-      </w:r>
-      <w:r>
-        <w:rPr>
-          <w:b/>
-        </w:rPr>
-        <w:t>Nilsonne G</w:t>
-      </w:r>
-      <w:r>
-        <w:t>, Pacheco-Mendoza J, Penders B, Pourret O, Rera M, Samuel J, Steiner T, Stojanovski J, Uribe-Tirado A, Vos R, Worthington S, Yarkoni T</w:t>
-      </w:r>
-      <w:r>
-        <w:t xml:space="preserve">: </w:t>
-      </w:r>
-      <w:r>
-        <w:t xml:space="preserve">A tale of two “opens”: Intersections between Free and Open Source Software and Open Scholarship. </w:t>
-      </w:r>
-      <w:r>
-        <w:rPr>
-          <w:i/>
-        </w:rPr>
-        <w:t>SocArXiv</w:t>
-      </w:r>
-      <w:r>
-        <w:t>, 2020.</w:t>
-      </w:r>
-    </w:p>
-    <w:p>
-      <w:pPr>
-        <w:spacing w:after="40" w:before="20"/>
-      </w:pPr>
-      <w:r>
-        <w:t xml:space="preserve">19. </w:t>
-      </w:r>
-      <w:r>
-        <w:t xml:space="preserve">Tikkanen KW, </w:t>
-      </w:r>
-      <w:r>
-        <w:rPr>
-          <w:b/>
-        </w:rPr>
-        <w:t>Nilsonne G</w:t>
-      </w:r>
-      <w:r>
-        <w:t xml:space="preserve">: </w:t>
-      </w:r>
-      <w:r>
-        <w:t xml:space="preserve">Delning av forskningsdata – att göra humanistisk forskning nåbar för fler. </w:t>
-      </w:r>
-      <w:r>
-        <w:t>, 2024.</w:t>
-      </w:r>
-    </w:p>
-    <w:p>
-      <w:pPr>
-        <w:spacing w:after="40" w:before="20"/>
-      </w:pPr>
-      <w:r>
-        <w:t xml:space="preserve">20. </w:t>
-      </w:r>
-      <w:r>
-        <w:t>Bishop D</w:t>
-      </w:r>
-      <w:r>
-        <w:t xml:space="preserve">: </w:t>
-      </w:r>
-      <w:r>
-        <w:t xml:space="preserve">An open letter regarding Scientific Reports. </w:t>
-      </w:r>
-      <w:r>
-        <w:t>, 2024.</w:t>
-      </w:r>
-    </w:p>
-    <w:p>
-      <w:pPr>
-        <w:spacing w:after="40" w:before="20"/>
-      </w:pPr>
-      <w:r>
-        <w:t xml:space="preserve">21. </w:t>
-      </w:r>
-      <w:r>
-        <w:t xml:space="preserve">Axfors C, </w:t>
-      </w:r>
-      <w:r>
-        <w:rPr>
-          <w:b/>
-        </w:rPr>
-        <w:t>Nilsonne G</w:t>
-      </w:r>
-      <w:r>
-        <w:t xml:space="preserve">: </w:t>
-      </w:r>
-      <w:r>
-        <w:t xml:space="preserve">Registration and reporting of results from clinical trials in Nordic countries - there is scope for improvement. </w:t>
-      </w:r>
-      <w:r>
-        <w:rPr>
-          <w:i/>
-        </w:rPr>
-        <w:t>Lakartidningen</w:t>
-      </w:r>
-      <w:r>
-        <w:t>, 2024.</w:t>
-      </w:r>
-    </w:p>
-    <w:p>
-      <w:pPr>
-        <w:spacing w:after="40" w:before="20"/>
-      </w:pPr>
-      <w:r>
-        <w:t xml:space="preserve">22. </w:t>
-      </w:r>
-      <w:r>
-        <w:rPr>
-          <w:b/>
-        </w:rPr>
-        <w:t>Nilsonne G</w:t>
-      </w:r>
-      <w:r>
-        <w:t xml:space="preserve">: </w:t>
-      </w:r>
-      <w:r>
-        <w:t xml:space="preserve">Replikeringskrisen hotar vetenskapens trovärdighet. </w:t>
-      </w:r>
-      <w:r>
-        <w:rPr>
-          <w:i/>
-        </w:rPr>
-        <w:t>Folkvett</w:t>
-      </w:r>
-      <w:r>
-        <w:t>, 2023.</w:t>
-      </w:r>
-    </w:p>
-    <w:p>
-      <w:pPr>
-        <w:spacing w:after="40" w:before="20"/>
-      </w:pPr>
-      <w:r>
-        <w:t xml:space="preserve">23. </w:t>
-      </w:r>
-      <w:r>
-        <w:t xml:space="preserve">Axfors C, </w:t>
-      </w:r>
-      <w:r>
-        <w:rPr>
-          <w:b/>
-        </w:rPr>
-        <w:t>Nilsonne G</w:t>
-      </w:r>
-      <w:r>
-        <w:t xml:space="preserve">: </w:t>
-      </w:r>
-      <w:r>
-        <w:t xml:space="preserve">Ofullständig rapportering av studier försämrar kunskapsläget. </w:t>
-      </w:r>
-      <w:r>
-        <w:rPr>
-          <w:i/>
-        </w:rPr>
-        <w:t>Läkartidningen</w:t>
-      </w:r>
-      <w:r>
-        <w:t>, 2023.</w:t>
-      </w:r>
-    </w:p>
-    <w:p>
-      <w:pPr>
-        <w:spacing w:after="40" w:before="20"/>
-      </w:pPr>
-      <w:r>
-        <w:t xml:space="preserve">24. </w:t>
-      </w:r>
-      <w:r>
-        <w:t xml:space="preserve">Open Science Community Sverige. </w:t>
-      </w:r>
-      <w:r>
-        <w:rPr>
-          <w:i/>
-        </w:rPr>
-        <w:t>Svenska Dagbladet</w:t>
-      </w:r>
-      <w:r>
-        <w:t>, 2023.</w:t>
-      </w:r>
-    </w:p>
-    <w:p>
-      <w:pPr>
-        <w:spacing w:after="40" w:before="20"/>
-      </w:pPr>
-      <w:r>
-        <w:t xml:space="preserve">25. </w:t>
-      </w:r>
-      <w:r>
-        <w:rPr>
-          <w:b/>
-        </w:rPr>
-        <w:t>Nilsonne G</w:t>
-      </w:r>
-      <w:r>
-        <w:t>, Axfors C, Zavalis E</w:t>
-      </w:r>
-      <w:r>
-        <w:t xml:space="preserve">: </w:t>
-      </w:r>
-      <w:r>
-        <w:t xml:space="preserve">Utmaningar för den forskande läkaren. </w:t>
-      </w:r>
-      <w:r>
-        <w:rPr>
-          <w:i/>
-        </w:rPr>
-        <w:t>Läkartidningen</w:t>
-      </w:r>
-      <w:r>
-        <w:t>, 2023.</w:t>
-      </w:r>
-    </w:p>
-    <w:p>
-      <w:pPr>
-        <w:spacing w:after="40" w:before="20"/>
-      </w:pPr>
-      <w:r>
-        <w:t xml:space="preserve">26. </w:t>
-      </w:r>
-      <w:r>
-        <w:rPr>
-          <w:b/>
-        </w:rPr>
-        <w:t>Nilsonne G</w:t>
-      </w:r>
-      <w:r>
-        <w:t xml:space="preserve">: </w:t>
-      </w:r>
-      <w:r>
-        <w:t xml:space="preserve">”Vetenskapliga tidskrifter har spelat ut sin roll”. </w:t>
-      </w:r>
-      <w:r>
-        <w:rPr>
-          <w:i/>
-        </w:rPr>
-        <w:t>Svenska Dagbladet</w:t>
-      </w:r>
-      <w:r>
-        <w:t>, 2023.</w:t>
-      </w:r>
-    </w:p>
-    <w:p>
-      <w:pPr>
-        <w:spacing w:after="40" w:before="20"/>
-      </w:pPr>
-      <w:r>
-        <w:t xml:space="preserve">27. </w:t>
-      </w:r>
-      <w:r>
-        <w:rPr>
-          <w:b/>
-        </w:rPr>
-        <w:t>Nilsonne G</w:t>
-      </w:r>
-      <w:r>
-        <w:t xml:space="preserve">: </w:t>
-      </w:r>
-      <w:r>
-        <w:t xml:space="preserve">Uppföljning av öppen vetenskap – hur gör vi?. </w:t>
-      </w:r>
-      <w:r>
-        <w:rPr>
-          <w:i/>
-        </w:rPr>
-        <w:t>SND Nätverks-nytt</w:t>
-      </w:r>
-      <w:r>
-        <w:t>, 2023.</w:t>
-      </w:r>
-    </w:p>
-    <w:p>
-      <w:pPr>
-        <w:spacing w:after="40" w:before="20"/>
-      </w:pPr>
-      <w:r>
-        <w:t xml:space="preserve">28. </w:t>
-      </w:r>
-      <w:r>
-        <w:rPr>
-          <w:b/>
-        </w:rPr>
-        <w:t>Nilsonne G</w:t>
-      </w:r>
-      <w:r>
-        <w:t xml:space="preserve">: </w:t>
-      </w:r>
-      <w:r>
-        <w:t xml:space="preserve">Riktlinjer för öppen vetenskap en besvikelse. </w:t>
-      </w:r>
-      <w:r>
-        <w:rPr>
-          <w:i/>
-        </w:rPr>
-        <w:t>Upsala Nya Tidning</w:t>
-      </w:r>
-      <w:r>
-        <w:t>, 2023.</w:t>
-      </w:r>
-    </w:p>
-    <w:p>
-      <w:pPr>
-        <w:spacing w:after="40" w:before="20"/>
-      </w:pPr>
-      <w:r>
-        <w:t xml:space="preserve">29. </w:t>
-      </w:r>
-      <w:r>
-        <w:rPr>
-          <w:b/>
-        </w:rPr>
-        <w:t>Nilsonne G</w:t>
-      </w:r>
-      <w:r>
-        <w:t>, O'Neill G, Dahle S, Gaillard V, Priess-Buchheit J, Schmidt B, Psomopoulos F</w:t>
-      </w:r>
-      <w:r>
-        <w:t xml:space="preserve">: </w:t>
-      </w:r>
-      <w:r>
-        <w:t xml:space="preserve">EOSC as an Enabler of Research Assessment Reform: Position Paper from Task Force on Research Careers, Recognition, and Credit. </w:t>
-      </w:r>
-      <w:r>
-        <w:t>, 2023.</w:t>
-      </w:r>
-    </w:p>
-    <w:p>
-      <w:pPr>
-        <w:spacing w:after="40" w:before="20"/>
-      </w:pPr>
-      <w:r>
-        <w:t xml:space="preserve">30. </w:t>
-      </w:r>
-      <w:r>
-        <w:t xml:space="preserve">Brembs B, </w:t>
-      </w:r>
-      <w:r>
-        <w:rPr>
-          <w:b/>
-        </w:rPr>
-        <w:t>Nilsonne G</w:t>
-      </w:r>
-      <w:r>
-        <w:t>, Susi T</w:t>
-      </w:r>
-      <w:r>
-        <w:t xml:space="preserve">: </w:t>
-      </w:r>
-      <w:r>
-        <w:t xml:space="preserve">How to reclaim ownership of scholarly publishing. </w:t>
-      </w:r>
-      <w:r>
-        <w:rPr>
-          <w:i/>
-        </w:rPr>
-        <w:t>Research Europe</w:t>
-      </w:r>
-      <w:r>
-        <w:t>, 2022.</w:t>
-      </w:r>
-    </w:p>
-    <w:p>
-      <w:pPr>
-        <w:spacing w:after="40" w:before="20"/>
-      </w:pPr>
-      <w:r>
-        <w:t xml:space="preserve">31. </w:t>
-      </w:r>
-      <w:r>
-        <w:t xml:space="preserve">Brembs B, Huneman P, Schönbrodt F, </w:t>
-      </w:r>
-      <w:r>
-        <w:rPr>
-          <w:b/>
-        </w:rPr>
-        <w:t>Nilsonne G</w:t>
-      </w:r>
-      <w:r>
-        <w:t>, Susi T, Siems R, Perakakis P, Trachana V, Ma L, Rodriguez-Cuadrado S</w:t>
-      </w:r>
-      <w:r>
-        <w:t xml:space="preserve">: </w:t>
-      </w:r>
-      <w:r>
-        <w:t xml:space="preserve">Creating a market to replace publisher monopolies. </w:t>
-      </w:r>
-      <w:r>
-        <w:rPr>
-          <w:i/>
-        </w:rPr>
-        <w:t>sOApbox</w:t>
-      </w:r>
-      <w:r>
-        <w:t>, 2022.</w:t>
-      </w:r>
-    </w:p>
-    <w:p>
-      <w:pPr>
-        <w:spacing w:after="40" w:before="20"/>
-      </w:pPr>
-      <w:r>
-        <w:t xml:space="preserve">32. </w:t>
-      </w:r>
-      <w:r>
-        <w:t xml:space="preserve">Widmark W, Anderberg S, Holmgren S, Lindvall J, </w:t>
-      </w:r>
-      <w:r>
-        <w:rPr>
-          <w:b/>
-        </w:rPr>
-        <w:t>Nilsonne G</w:t>
-      </w:r>
-      <w:r>
-        <w:t xml:space="preserve">: </w:t>
-      </w:r>
-      <w:r>
-        <w:t xml:space="preserve">Sverige får inte missa tåget när EU satsar på öppen vetenskap. </w:t>
-      </w:r>
-      <w:r>
-        <w:rPr>
-          <w:i/>
-        </w:rPr>
-        <w:t>Curie</w:t>
-      </w:r>
-      <w:r>
-        <w:t>, 2022.</w:t>
-      </w:r>
-    </w:p>
-    <w:p>
-      <w:pPr>
-        <w:spacing w:after="40" w:before="20"/>
-      </w:pPr>
-      <w:r>
-        <w:t xml:space="preserve">33. </w:t>
-      </w:r>
-      <w:r>
-        <w:t xml:space="preserve">Widmark W, Anderberg S, Holmgren S, Lindvall J, </w:t>
-      </w:r>
-      <w:r>
-        <w:rPr>
-          <w:b/>
-        </w:rPr>
-        <w:t>Nilsonne G</w:t>
-      </w:r>
-      <w:r>
-        <w:t xml:space="preserve">: </w:t>
-      </w:r>
-      <w:r>
-        <w:t xml:space="preserve">Forskningsbibliotek viktiga för Europasatsning på öppna data. </w:t>
-      </w:r>
-      <w:r>
-        <w:rPr>
-          <w:i/>
-        </w:rPr>
-        <w:t>Biblioteksbladet</w:t>
-      </w:r>
-      <w:r>
-        <w:t>, 2022.</w:t>
-      </w:r>
-    </w:p>
-    <w:p>
-      <w:pPr>
-        <w:spacing w:after="40" w:before="20"/>
-      </w:pPr>
-      <w:r>
-        <w:t xml:space="preserve">34. </w:t>
-      </w:r>
-      <w:r>
-        <w:rPr>
-          <w:b/>
-        </w:rPr>
-        <w:t>Nilsonne G</w:t>
-      </w:r>
-      <w:r>
-        <w:t xml:space="preserve">: </w:t>
-      </w:r>
-      <w:r>
-        <w:t xml:space="preserve">Dags att överge traditionella tidskrifter. </w:t>
-      </w:r>
-      <w:r>
-        <w:rPr>
-          <w:i/>
-        </w:rPr>
-        <w:t>Svenska Dagbladet</w:t>
-      </w:r>
-      <w:r>
-        <w:t>, 2022.</w:t>
-      </w:r>
-    </w:p>
-    <w:p>
-      <w:pPr>
-        <w:spacing w:after="40" w:before="20"/>
-      </w:pPr>
-      <w:r>
-        <w:t xml:space="preserve">35. </w:t>
-      </w:r>
-      <w:r>
-        <w:rPr>
-          <w:b/>
-        </w:rPr>
-        <w:t>Nilsonne G</w:t>
-      </w:r>
-      <w:r>
-        <w:t>, Jönsson JI, Söderbergh Widding A</w:t>
-      </w:r>
-      <w:r>
-        <w:t xml:space="preserve">: </w:t>
-      </w:r>
-      <w:r>
-        <w:t xml:space="preserve">Dags att förnya hur forskning bedöms. </w:t>
-      </w:r>
-      <w:r>
-        <w:rPr>
-          <w:i/>
-        </w:rPr>
-        <w:t>Curie</w:t>
-      </w:r>
-      <w:r>
-        <w:t>, 2022.</w:t>
-      </w:r>
-    </w:p>
-    <w:p>
-      <w:pPr>
-        <w:spacing w:after="40" w:before="20"/>
-      </w:pPr>
-      <w:r>
-        <w:t xml:space="preserve">36. </w:t>
-      </w:r>
-      <w:r>
-        <w:rPr>
-          <w:b/>
-        </w:rPr>
-        <w:t>Nilsonne G</w:t>
-      </w:r>
-      <w:r>
-        <w:t xml:space="preserve">: </w:t>
-      </w:r>
-      <w:r>
-        <w:t xml:space="preserve">Bakvägsidentifiering av forskningsdata med personuppgifter: riskbedömning och riskminskande åtgärder. </w:t>
-      </w:r>
-      <w:r>
-        <w:rPr>
-          <w:i/>
-        </w:rPr>
-        <w:t>Svepet: medlemsblad för Svensk epidemiologisk förening (SVEP)</w:t>
-      </w:r>
-      <w:r>
-        <w:t>, 2022.</w:t>
-      </w:r>
-    </w:p>
-    <w:p>
-      <w:pPr>
-        <w:spacing w:after="40" w:before="20"/>
-      </w:pPr>
-      <w:r>
-        <w:t xml:space="preserve">37. </w:t>
-      </w:r>
-      <w:r>
-        <w:rPr>
-          <w:b/>
-        </w:rPr>
-        <w:t>Nilsonne G</w:t>
-      </w:r>
-      <w:r>
-        <w:t xml:space="preserve">: </w:t>
-      </w:r>
-      <w:r>
-        <w:t xml:space="preserve">Stor variation i resultat när olika forskare analyserade samma data. </w:t>
-      </w:r>
-      <w:r>
-        <w:rPr>
-          <w:i/>
-        </w:rPr>
-        <w:t>Läkartidningen</w:t>
-      </w:r>
-      <w:r>
-        <w:t>, 2020.</w:t>
-      </w:r>
-    </w:p>
-    <w:p>
-      <w:pPr>
-        <w:spacing w:after="40" w:before="20"/>
-      </w:pPr>
-      <w:r>
-        <w:t xml:space="preserve">38. </w:t>
-      </w:r>
-      <w:r>
-        <w:rPr>
-          <w:b/>
-        </w:rPr>
-        <w:t>Nilsonne G</w:t>
-      </w:r>
-      <w:r>
-        <w:t xml:space="preserve">: </w:t>
-      </w:r>
-      <w:r>
-        <w:t xml:space="preserve">Rekommendationer om Covid-19-data från Research Data Alliance (RDA). </w:t>
-      </w:r>
-      <w:r>
-        <w:rPr>
-          <w:i/>
-        </w:rPr>
-        <w:t>SND nyhetsbrev</w:t>
-      </w:r>
-      <w:r>
-        <w:t>, 2020.</w:t>
-      </w:r>
-    </w:p>
-    <w:p>
-      <w:pPr>
-        <w:spacing w:after="40" w:before="20"/>
-      </w:pPr>
-      <w:r>
-        <w:t xml:space="preserve">39. </w:t>
-      </w:r>
-      <w:r>
-        <w:t xml:space="preserve">Appelhoff S, Bates JF, Ghosh S, Keator DB, Kennedy DN, Poldrack R, Poline JB, Steffener J, Nichols BN, Feingold F, Pernet C, </w:t>
-      </w:r>
-      <w:r>
-        <w:rPr>
-          <w:b/>
-        </w:rPr>
-        <w:t>Nilsonne G</w:t>
-      </w:r>
-      <w:r>
-        <w:t>, Maumet C, Flandin G, Gau R, Oostenveld R, Dupre E, Delorme A, Markiewicz CJ, Perez N, Helmer KG, Jarecka D, Grethe JS, Patterson D, Auer T, Bartsch H, Nichols TE, Calhoun V</w:t>
-      </w:r>
-      <w:r>
-        <w:t xml:space="preserve">: </w:t>
-      </w:r>
-      <w:r>
-        <w:t xml:space="preserve">BIDS and the NeuroImaging Data Model (NIDM). </w:t>
-      </w:r>
-      <w:r>
-        <w:rPr>
-          <w:i/>
-        </w:rPr>
-        <w:t>F1000Research</w:t>
-      </w:r>
-      <w:r>
-        <w:t>, 2019.</w:t>
-      </w:r>
-    </w:p>
-    <w:p>
-      <w:pPr>
-        <w:spacing w:after="40" w:before="20"/>
-      </w:pPr>
-      <w:r>
-        <w:t xml:space="preserve">40. </w:t>
-      </w:r>
-      <w:r>
-        <w:rPr>
-          <w:b/>
-        </w:rPr>
-        <w:t>Nilsonne G</w:t>
-      </w:r>
-      <w:r>
-        <w:t xml:space="preserve">: </w:t>
-      </w:r>
-      <w:r>
-        <w:t xml:space="preserve">Dyrköpt avtal med Elsevier. </w:t>
-      </w:r>
-      <w:r>
-        <w:rPr>
-          <w:i/>
-        </w:rPr>
-        <w:t>Curie</w:t>
-      </w:r>
-      <w:r>
-        <w:t>, 2019.</w:t>
-      </w:r>
-    </w:p>
-    <w:p>
-      <w:pPr>
-        <w:spacing w:after="40" w:before="20"/>
-      </w:pPr>
-      <w:r>
-        <w:t xml:space="preserve">41. </w:t>
-      </w:r>
-      <w:r>
-        <w:rPr>
-          <w:b/>
-        </w:rPr>
-        <w:t>Nilsonne G</w:t>
-      </w:r>
-      <w:r>
-        <w:t xml:space="preserve">: </w:t>
-      </w:r>
-      <w:r>
-        <w:t xml:space="preserve">Replik: Befria forskningen från tidskrifternas tvångströja. </w:t>
-      </w:r>
-      <w:r>
-        <w:rPr>
-          <w:i/>
-        </w:rPr>
-        <w:t>Curie</w:t>
-      </w:r>
-      <w:r>
-        <w:t>, 2018.</w:t>
       </w:r>
     </w:p>
     <w:sectPr>

</xml_diff>

<commit_message>
Fix DOIs, add full Lindberg authors, hyperlink DOIs in docx
DOI fixes:
- sorjonen_2023_distorted: 110.1016/... -> 10.1016/j.heliyon.2023.e21458
- tahmasian_nd_enigma: short DOI 'gjtqz6' -> 10.1111/jsr.13347, year=2021
- sorjonen_2023_unmasking: added 10.1016/j.heliyon.2023.e20397
- weissgerber_2024_understanding: added 10.1038/s41591-024-02879-x
- lindberg_2024_altered: preprint DOI -> 10.1001/jamanetworkopen.2024.48601
  Full 20-author list from Crossref, volume/issue/pages added
  Preprint DOI moved to links.preprint
- nilsonne_2023_olika, axfors_2024_registrering: Läkartidningen, no DOI exists

Docx improvements:
- DOIs now rendered as clickable hyperlinks (blue, underlined, 9pt)
</commit_message>
<xml_diff>
--- a/output/cancerfonden_publist.docx
+++ b/output/cancerfonden_publist.docx
@@ -25,39 +25,6 @@
           <w:color w:val="000000"/>
         </w:rPr>
         <w:t>10 most important publications for this project</w:t>
-      </w:r>
-    </w:p>
-    <w:p>
-      <w:r>
-        <w:rPr>
-          <w:i/>
-          <w:color w:val="969696"/>
-        </w:rPr>
-        <w:t>[Configure selected_publications in cancerfonden_config.yaml with 10 DOIs]</w:t>
-      </w:r>
-    </w:p>
-    <w:p>
-      <w:pPr>
-        <w:pStyle w:val="Heading2"/>
-      </w:pPr>
-      <w:r>
-        <w:rPr>
-          <w:rFonts w:ascii="Times New Roman" w:hAnsi="Times New Roman"/>
-          <w:color w:val="000000"/>
-        </w:rPr>
-        <w:t>Complete publication list 2018–2026</w:t>
-      </w:r>
-    </w:p>
-    <w:p>
-      <w:pPr>
-        <w:pStyle w:val="Heading3"/>
-      </w:pPr>
-      <w:r>
-        <w:rPr>
-          <w:rFonts w:ascii="Times New Roman" w:hAnsi="Times New Roman"/>
-          <w:color w:val="000000"/>
-        </w:rPr>
-        <w:t>Peer-reviewed original research articles</w:t>
       </w:r>
     </w:p>
     <w:p>
@@ -76,31 +43,65 @@
         <w:tab/>
       </w:r>
       <w:r>
-        <w:t xml:space="preserve">Sorjonen K, Melin M, Lager E, </w:t>
-      </w:r>
-      <w:r>
         <w:rPr>
           <w:b/>
         </w:rPr>
         <w:t>Nilsonne G</w:t>
       </w:r>
       <w:r>
-        <w:t>, Melin B</w:t>
+        <w:t>, Sun X, Nyström C, Rundlöf A-K, Fernandes A, Björnstedt M, Dobra K</w:t>
       </w:r>
       <w:r>
         <w:t xml:space="preserve">: </w:t>
       </w:r>
       <w:r>
-        <w:t xml:space="preserve">Low validity of lower ability test scores can mimic the Dunning-Kruger effect. </w:t>
+        <w:t xml:space="preserve">Selenite induces apoptosis in sarcomatoid malignant mesothelioma cells through oxidative stress. </w:t>
       </w:r>
       <w:r>
         <w:rPr>
           <w:i/>
         </w:rPr>
-        <w:t>Intelligence</w:t>
-      </w:r>
-      <w:r>
-        <w:t>,114:101985-101985, 2026.</w:t>
+        <w:t>Free Radical Biology and Medicine</w:t>
+      </w:r>
+      <w:r>
+        <w:t>,41:874-885, 2006.</w:t>
+      </w:r>
+      <w:r>
+        <w:t xml:space="preserve"> </w:t>
+      </w:r>
+      <w:hyperlink r:id="rId9">
+        <w:r>
+          <w:rPr>
+            <w:color w:val="0000EE"/>
+            <w:u w:val="single"/>
+            <w:sz w:val="18"/>
+          </w:rPr>
+          <w:t>doi:10.1016/j.freeradbiomed.2006.04.031</w:t>
+        </w:r>
+      </w:hyperlink>
+    </w:p>
+    <w:p>
+      <w:pPr>
+        <w:pStyle w:val="Heading2"/>
+      </w:pPr>
+      <w:r>
+        <w:rPr>
+          <w:rFonts w:ascii="Times New Roman" w:hAnsi="Times New Roman"/>
+          <w:color w:val="000000"/>
+        </w:rPr>
+        <w:t>Complete publication list 2018–2026</w:t>
+      </w:r>
+    </w:p>
+    <w:p>
+      <w:pPr>
+        <w:pStyle w:val="Heading3"/>
+      </w:pPr>
+      <w:r>
+        <w:rPr>
+          <w:rFonts w:ascii="Times New Roman" w:hAnsi="Times New Roman"/>
+          <w:color w:val="000000"/>
+        </w:rPr>
+        <w:t>Peer-reviewed original research articles</w:t>
       </w:r>
     </w:p>
     <w:p>
@@ -115,8 +116,11 @@
         <w:rPr>
           <w:sz w:val="22"/>
         </w:rPr>
-        <w:t>2.</w:t>
+        <w:t>1.</w:t>
         <w:tab/>
+      </w:r>
+      <w:r>
+        <w:t xml:space="preserve">Sorjonen K, Melin M, Lager E, </w:t>
       </w:r>
       <w:r>
         <w:rPr>
@@ -125,23 +129,36 @@
         <w:t>Nilsonne G</w:t>
       </w:r>
       <w:r>
-        <w:t>, Wieschowski S, DeVito NJ, Salholz-Hillel M, Ahnström L, Bruckner T, Klas K, Suljic T, Yerunkar S, Olsson N, Cruz C, Strzebonska K, Småbrekke L, Wasylewski MT, Bengtsson J, Ringsten M, Schuster A, Krawczyk T, Paraskevas T, Raittio E, Herczeg L, Hesselberg J-O, Karlsson S, Borana R, Bruschettini M, Mulinari S, Lizárraga K, Siebert M, Hildebrand N, Ramakrishnan S, Janiaud P, Zavalis E, Franzen D, Boesen K, Hemkens LG, Naudet F, Possmark S, Willén RM, Ioannidis JPA, Strech D, Axfors C</w:t>
+        <w:t>, Melin B</w:t>
       </w:r>
       <w:r>
         <w:t xml:space="preserve">: </w:t>
       </w:r>
       <w:r>
-        <w:t xml:space="preserve">Results reporting for clinical trials led by medical universities and university hospitals in the Nordic countries was often missing or delayed. </w:t>
+        <w:t xml:space="preserve">Low validity of lower ability test scores can mimic the Dunning-Kruger effect. </w:t>
       </w:r>
       <w:r>
         <w:rPr>
           <w:i/>
         </w:rPr>
-        <w:t>Journal of Clinical Epidemiology</w:t>
-      </w:r>
-      <w:r>
-        <w:t>,181:111710-111710, 2025.</w:t>
-      </w:r>
+        <w:t>Intelligence</w:t>
+      </w:r>
+      <w:r>
+        <w:t>,114:101985-101985, 2026.</w:t>
+      </w:r>
+      <w:r>
+        <w:t xml:space="preserve"> </w:t>
+      </w:r>
+      <w:hyperlink r:id="rId10">
+        <w:r>
+          <w:rPr>
+            <w:color w:val="0000EE"/>
+            <w:u w:val="single"/>
+            <w:sz w:val="18"/>
+          </w:rPr>
+          <w:t>doi:10.1016/j.intell.2025.101985</w:t>
+        </w:r>
+      </w:hyperlink>
     </w:p>
     <w:p>
       <w:pPr>
@@ -155,11 +172,8 @@
         <w:rPr>
           <w:sz w:val="22"/>
         </w:rPr>
-        <w:t>3.</w:t>
+        <w:t>2.</w:t>
         <w:tab/>
-      </w:r>
-      <w:r>
-        <w:t xml:space="preserve">Gould E, Fraser HS, Parker TH, Nakagawa S, Griffith SC, Vesk PA, Fidler F, Hamilton DG, Abbey-Lee RN, Abbott JK, Aguirre LA, Alcaraz C, Aloni I, Altschul D, Arekar K, Atkins JW, Atkinson J, Baker CM, Barrett M, Bell K, Bello SK, Beltrán I, Berauer BJ, Bertram MG, Billman PD, Blake CK, Blake S, Bliard L, Bonisoli-Alquati A, Bonnet T, Bordes CNM, Bose APH, Botterill-James T, Boyd MA, Boyle SA, Bradfer-Lawrence T, Bradham J, Brand JA, Brengdahl MI, Bulla M, Bussière L, Camerlenghi E, Campbell SE, Campos LLF, Caravaggi A, Cardoso P, Carroll CJW, Catanach TA, Chen X, Chik HYJ, Choy ES, Christie AP, Chuang A, Chunco AJ, Clark BL, Contina A, Covernton GA, Cox MP, Cressman KA, Crotti M, Crouch CD, D'Amelio PB, de Sousa AA, Döbert TF, Dobler R, Dobson AJ, Doherty TS, Drobniak SM, Duffy AG, Duncan AB, Dunn RP, Dunning J, Dutta T, Eberhart-Hertel L, Elmore JA, Elsherif MM, English HM, Ensminger DC, Ernst UR, Ferguson SM, Fernandez-Juricic E, Ferreira-Arruda T, Fieberg J, Finch EA, Fiorenza EA, Fisher DN, Fontaine A, Forstmeier W, Fourcade Y, Frank GS, Freund CA, Fuentes-Lillo E, Gandy SL, Gannon DG, García-Cervigón AI, Garretson AC, Ge X, Geary WL, Géron C, Gilles M, Girndt A, Gliksman D, Goldspiel HB, Gomes DGE, Good MK, Goslee SC, Gosnell JS, Grames EM, Gratton P, Grebe NM, Greenler SM, Griffioen M, Griffith DM, Griffith FJ, Grossman JJ, Güncan A, Haesen S, Hagan JG, Hager HA, Harris JP, Harrison ND, Hasnain SS, Havird JC, Heaton AJ, Herrera-Chaustre ML, Howard TJ, Hsu B-Y, Iannarilli F, Iranzo EC, Iverson ENK, Jimoh SO, Johnson DH, Johnsson M, Jorna J, Jucker T, Jung M, Kačergytė I, Kaltz O, Ke A, Kelly CD, Keogan K, Keppeler FW, Killion AK, Kim D, Kochan DP, Korsten P, Kothari S, Kuppler J, Kusch JM, Lagisz M, Lalla KM, Larkin DJ, Larson CL, Lauck KS, Lauterbur ME, Law A, Léandri-Breton D-J, Lembrechts JJ, L'Herpiniere K, Lievens EJP, de Lima DO, Lindsay S, Luquet M, MacLeod R, Macphie KH, Magellan K, Mair MM, Malm LE, Mammola S, Mandeville CP, Manhart M, Manrique-Garzon LM, Mäntylä E, Marchand P, Marshall BM, Martin CA, Martin DA, Martin JM, Martinig AR, McCallum ES, McCauley M, McNew SM, Meiners SJ, Merkling T, Michelangeli M, Moiron M, Moreira B, Mortensen J, Mos B, Muraina TO, Murphy PW, Nelli L, Niemelä P, Nightingale J, </w:t>
       </w:r>
       <w:r>
         <w:rPr>
@@ -168,23 +182,36 @@
         <w:t>Nilsonne G</w:t>
       </w:r>
       <w:r>
-        <w:t>, Nolazco S, Nooten SS, Novotny JL, Olin AB, Organ CL, Ostevik KL, Palacio FX, Paquet M, Parker DJ, Pascall DJ, Pasquarella VJ, Paterson JH, Payo-Payo A, Pedersen KM, Perez G, Perry KI, Pottier P, Proulx MJ, Proulx R, Pruett JL, Ramananjato V, Randimbiarison FT, Razafindratsima OH, Rennison DJ, Riva F, Riyahi S, Roast MJ, Rocha FP, Roche DG, Román-Palacios C, Rosenberg MS, Ross J, Rowland FE, Rugemalila D, Russell AL, Ruuskanen S, Saccone P, Sadeh A, Salazar SM, Sales K, Salmón P, Sánchez-Tójar A, Santos LP, Santostefano F, Schilling HT, Schmidt M, Schmoll T, Schneider AC, Schrock AE, Schroeder J, Schtickzelle N, Schultz NL, Scott DA, Scroggie MP, Shapiro JT, Sharma N, Shearer CL, Simón D, Sitvarin MI, Skupien FL, Slinn HL, Smith GP, Smith JA, Sollmann R, Whitney KS, Still SM, Stuber EF, Sutton GF, Swallow B, Taff CC, Takola E, Tanentzap AJ, Tarjuelo R, Telford RJ, Thawley CJ, Thierry H, Thomson J, Tidau S, Tompkins EM, Tortorelli CM, Trlica A, Turnell BR, Urban L, Van de Vondel S, van der Wal JEM, Van Eeckhoven J, van Oordt F, Vanderwel KM, Vanderwel MC, Vanderwolf KJ, Vélez J, Vergara-Florez DC, Verrelli BC, Vieira MV, Villamil N, Vitali V, Vollering J, Walker J, Walker XJ, Walter JA, Waryszak P, Weaver RJ, Wedegärtner REM, Weller DL, Whelan S, White RL, Wolfson DW, Wood A, Yanco SW, Yen JDL, Youngflesh C, Zilio G, Zimmer C, Zimmerman GM, Zitomer RA</w:t>
+        <w:t>, Wieschowski S, DeVito NJ, Salholz-Hillel M, Ahnström L, Bruckner T, Klas K, Suljic T, Yerunkar S, Olsson N, Cruz C, Strzebonska K, Småbrekke L, Wasylewski MT, Bengtsson J, Ringsten M, Schuster A, Krawczyk T, Paraskevas T, Raittio E, Herczeg L, Hesselberg J-O, Karlsson S, Borana R, Bruschettini M, Mulinari S, Lizárraga K, Siebert M, Hildebrand N, Ramakrishnan S, Janiaud P, Zavalis E, Franzen D, Boesen K, Hemkens LG, Naudet F, Possmark S, Willén RM, Ioannidis JPA, Strech D, Axfors C</w:t>
       </w:r>
       <w:r>
         <w:t xml:space="preserve">: </w:t>
       </w:r>
       <w:r>
-        <w:t xml:space="preserve">Same data, different analysts: variation in effect sizes due to analytical decisions in ecology and evolutionary biology. </w:t>
+        <w:t xml:space="preserve">Results reporting for clinical trials led by medical universities and university hospitals in the Nordic countries was often missing or delayed. </w:t>
       </w:r>
       <w:r>
         <w:rPr>
           <w:i/>
         </w:rPr>
-        <w:t>BMC Biology</w:t>
-      </w:r>
-      <w:r>
-        <w:t>,23:35, 2025.</w:t>
-      </w:r>
+        <w:t>Journal of Clinical Epidemiology</w:t>
+      </w:r>
+      <w:r>
+        <w:t>,181:111710-111710, 2025.</w:t>
+      </w:r>
+      <w:r>
+        <w:t xml:space="preserve"> </w:t>
+      </w:r>
+      <w:hyperlink r:id="rId11">
+        <w:r>
+          <w:rPr>
+            <w:color w:val="0000EE"/>
+            <w:u w:val="single"/>
+            <w:sz w:val="18"/>
+          </w:rPr>
+          <w:t>doi:10.1016/j.jclinepi.2025.111710</w:t>
+        </w:r>
+      </w:hyperlink>
     </w:p>
     <w:p>
       <w:pPr>
@@ -198,11 +225,11 @@
         <w:rPr>
           <w:sz w:val="22"/>
         </w:rPr>
-        <w:t>4.</w:t>
+        <w:t>3.</w:t>
         <w:tab/>
       </w:r>
       <w:r>
-        <w:t xml:space="preserve">Sorjonen K, Melin B, </w:t>
+        <w:t xml:space="preserve">Gould E, Fraser HS, Parker TH, Nakagawa S, Griffith SC, Vesk PA, Fidler F, Hamilton DG, Abbey-Lee RN, Abbott JK, Aguirre LA, Alcaraz C, Aloni I, Altschul D, Arekar K, Atkins JW, Atkinson J, Baker CM, Barrett M, Bell K, Bello SK, Beltrán I, Berauer BJ, Bertram MG, Billman PD, Blake CK, Blake S, Bliard L, Bonisoli-Alquati A, Bonnet T, Bordes CNM, Bose APH, Botterill-James T, Boyd MA, Boyle SA, Bradfer-Lawrence T, Bradham J, Brand JA, Brengdahl MI, Bulla M, Bussière L, Camerlenghi E, Campbell SE, Campos LLF, Caravaggi A, Cardoso P, Carroll CJW, Catanach TA, Chen X, Chik HYJ, Choy ES, Christie AP, Chuang A, Chunco AJ, Clark BL, Contina A, Covernton GA, Cox MP, Cressman KA, Crotti M, Crouch CD, D'Amelio PB, de Sousa AA, Döbert TF, Dobler R, Dobson AJ, Doherty TS, Drobniak SM, Duffy AG, Duncan AB, Dunn RP, Dunning J, Dutta T, Eberhart-Hertel L, Elmore JA, Elsherif MM, English HM, Ensminger DC, Ernst UR, Ferguson SM, Fernandez-Juricic E, Ferreira-Arruda T, Fieberg J, Finch EA, Fiorenza EA, Fisher DN, Fontaine A, Forstmeier W, Fourcade Y, Frank GS, Freund CA, Fuentes-Lillo E, Gandy SL, Gannon DG, García-Cervigón AI, Garretson AC, Ge X, Geary WL, Géron C, Gilles M, Girndt A, Gliksman D, Goldspiel HB, Gomes DGE, Good MK, Goslee SC, Gosnell JS, Grames EM, Gratton P, Grebe NM, Greenler SM, Griffioen M, Griffith DM, Griffith FJ, Grossman JJ, Güncan A, Haesen S, Hagan JG, Hager HA, Harris JP, Harrison ND, Hasnain SS, Havird JC, Heaton AJ, Herrera-Chaustre ML, Howard TJ, Hsu B-Y, Iannarilli F, Iranzo EC, Iverson ENK, Jimoh SO, Johnson DH, Johnsson M, Jorna J, Jucker T, Jung M, Kačergytė I, Kaltz O, Ke A, Kelly CD, Keogan K, Keppeler FW, Killion AK, Kim D, Kochan DP, Korsten P, Kothari S, Kuppler J, Kusch JM, Lagisz M, Lalla KM, Larkin DJ, Larson CL, Lauck KS, Lauterbur ME, Law A, Léandri-Breton D-J, Lembrechts JJ, L'Herpiniere K, Lievens EJP, de Lima DO, Lindsay S, Luquet M, MacLeod R, Macphie KH, Magellan K, Mair MM, Malm LE, Mammola S, Mandeville CP, Manhart M, Manrique-Garzon LM, Mäntylä E, Marchand P, Marshall BM, Martin CA, Martin DA, Martin JM, Martinig AR, McCallum ES, McCauley M, McNew SM, Meiners SJ, Merkling T, Michelangeli M, Moiron M, Moreira B, Mortensen J, Mos B, Muraina TO, Murphy PW, Nelli L, Niemelä P, Nightingale J, </w:t>
       </w:r>
       <w:r>
         <w:rPr>
@@ -211,20 +238,36 @@
         <w:t>Nilsonne G</w:t>
       </w:r>
       <w:r>
+        <w:t>, Nolazco S, Nooten SS, Novotny JL, Olin AB, Organ CL, Ostevik KL, Palacio FX, Paquet M, Parker DJ, Pascall DJ, Pasquarella VJ, Paterson JH, Payo-Payo A, Pedersen KM, Perez G, Perry KI, Pottier P, Proulx MJ, Proulx R, Pruett JL, Ramananjato V, Randimbiarison FT, Razafindratsima OH, Rennison DJ, Riva F, Riyahi S, Roast MJ, Rocha FP, Roche DG, Román-Palacios C, Rosenberg MS, Ross J, Rowland FE, Rugemalila D, Russell AL, Ruuskanen S, Saccone P, Sadeh A, Salazar SM, Sales K, Salmón P, Sánchez-Tójar A, Santos LP, Santostefano F, Schilling HT, Schmidt M, Schmoll T, Schneider AC, Schrock AE, Schroeder J, Schtickzelle N, Schultz NL, Scott DA, Scroggie MP, Shapiro JT, Sharma N, Shearer CL, Simón D, Sitvarin MI, Skupien FL, Slinn HL, Smith GP, Smith JA, Sollmann R, Whitney KS, Still SM, Stuber EF, Sutton GF, Swallow B, Taff CC, Takola E, Tanentzap AJ, Tarjuelo R, Telford RJ, Thawley CJ, Thierry H, Thomson J, Tidau S, Tompkins EM, Tortorelli CM, Trlica A, Turnell BR, Urban L, Van de Vondel S, van der Wal JEM, Van Eeckhoven J, van Oordt F, Vanderwel KM, Vanderwel MC, Vanderwolf KJ, Vélez J, Vergara-Florez DC, Verrelli BC, Vieira MV, Villamil N, Vitali V, Vollering J, Walker J, Walker XJ, Walter JA, Waryszak P, Weaver RJ, Wedegärtner REM, Weller DL, Whelan S, White RL, Wolfson DW, Wood A, Yanco SW, Yen JDL, Youngflesh C, Zilio G, Zimmer C, Zimmerman GM, Zitomer RA</w:t>
+      </w:r>
+      <w:r>
         <w:t xml:space="preserve">: </w:t>
       </w:r>
       <w:r>
-        <w:t xml:space="preserve">Still No Convincing Evidence for a Causal Effect of Academic Self-Concept on Achievement: A Reply to Núñez-Regueiro et al., 2025. </w:t>
+        <w:t xml:space="preserve">Same data, different analysts: variation in effect sizes due to analytical decisions in ecology and evolutionary biology. </w:t>
       </w:r>
       <w:r>
         <w:rPr>
           <w:i/>
         </w:rPr>
-        <w:t>Educational Psychology Review</w:t>
-      </w:r>
-      <w:r>
-        <w:t>,37:98, 2025.</w:t>
-      </w:r>
+        <w:t>BMC Biology</w:t>
+      </w:r>
+      <w:r>
+        <w:t>,23:35, 2025.</w:t>
+      </w:r>
+      <w:r>
+        <w:t xml:space="preserve"> </w:t>
+      </w:r>
+      <w:hyperlink r:id="rId12">
+        <w:r>
+          <w:rPr>
+            <w:color w:val="0000EE"/>
+            <w:u w:val="single"/>
+            <w:sz w:val="18"/>
+          </w:rPr>
+          <w:t>doi:10.1186/s12915-024-02101-x</w:t>
+        </w:r>
+      </w:hyperlink>
     </w:p>
     <w:p>
       <w:pPr>
@@ -238,7 +281,7 @@
         <w:rPr>
           <w:sz w:val="22"/>
         </w:rPr>
-        <w:t>5.</w:t>
+        <w:t>4.</w:t>
         <w:tab/>
       </w:r>
       <w:r>
@@ -254,17 +297,30 @@
         <w:t xml:space="preserve">: </w:t>
       </w:r>
       <w:r>
-        <w:t xml:space="preserve">Cross-lagged network models do not prove causality and may be evaluated through triangulation. </w:t>
+        <w:t xml:space="preserve">Still No Convincing Evidence for a Causal Effect of Academic Self-Concept on Achievement: A Reply to Núñez-Regueiro et al., 2025. </w:t>
       </w:r>
       <w:r>
         <w:rPr>
           <w:i/>
         </w:rPr>
-        <w:t>Acta Psychologica</w:t>
-      </w:r>
-      <w:r>
-        <w:t>,260:105562, 2025.</w:t>
-      </w:r>
+        <w:t>Educational Psychology Review</w:t>
+      </w:r>
+      <w:r>
+        <w:t>,37:98, 2025.</w:t>
+      </w:r>
+      <w:r>
+        <w:t xml:space="preserve"> </w:t>
+      </w:r>
+      <w:hyperlink r:id="rId13">
+        <w:r>
+          <w:rPr>
+            <w:color w:val="0000EE"/>
+            <w:u w:val="single"/>
+            <w:sz w:val="18"/>
+          </w:rPr>
+          <w:t>doi:10.1007/s10648-025-10083-7</w:t>
+        </w:r>
+      </w:hyperlink>
     </w:p>
     <w:p>
       <w:pPr>
@@ -278,11 +334,11 @@
         <w:rPr>
           <w:sz w:val="22"/>
         </w:rPr>
-        <w:t>6.</w:t>
+        <w:t>5.</w:t>
         <w:tab/>
       </w:r>
       <w:r>
-        <w:t xml:space="preserve">Sharma G, Fritz C, Baccigotti A, Stoev P, Alavi M, Škorić L, Papadopoulou Skarp F, Priess-Buchheit J, </w:t>
+        <w:t xml:space="preserve">Sorjonen K, Melin B, </w:t>
       </w:r>
       <w:r>
         <w:rPr>
@@ -294,17 +350,30 @@
         <w:t xml:space="preserve">: </w:t>
       </w:r>
       <w:r>
-        <w:t xml:space="preserve">Stakeholders’ perceptions of the synergy between intellectual property and open science: A cross-sectional survey. </w:t>
+        <w:t xml:space="preserve">Cross-lagged network models do not prove causality and may be evaluated through triangulation. </w:t>
       </w:r>
       <w:r>
         <w:rPr>
           <w:i/>
         </w:rPr>
-        <w:t>Open Research Europe</w:t>
-      </w:r>
-      <w:r>
-        <w:t>,5:229-229, 2025.</w:t>
-      </w:r>
+        <w:t>Acta Psychologica</w:t>
+      </w:r>
+      <w:r>
+        <w:t>,260:105562, 2025.</w:t>
+      </w:r>
+      <w:r>
+        <w:t xml:space="preserve"> </w:t>
+      </w:r>
+      <w:hyperlink r:id="rId14">
+        <w:r>
+          <w:rPr>
+            <w:color w:val="0000EE"/>
+            <w:u w:val="single"/>
+            <w:sz w:val="18"/>
+          </w:rPr>
+          <w:t>doi:10.1016/j.actpsy.2025.105562</w:t>
+        </w:r>
+      </w:hyperlink>
     </w:p>
     <w:p>
       <w:pPr>
@@ -318,11 +387,11 @@
         <w:rPr>
           <w:sz w:val="22"/>
         </w:rPr>
-        <w:t>7.</w:t>
+        <w:t>6.</w:t>
         <w:tab/>
       </w:r>
       <w:r>
-        <w:t xml:space="preserve">Trübutschek D, Yang Y-F, Gianelli C, Cesnaite E, Fischer NL, Vinding MC, Marshall TR, Algermissen J, Pascarella A, Puoliväli T, Vitale A, Busch NA, </w:t>
+        <w:t xml:space="preserve">Sharma G, Fritz C, Baccigotti A, Stoev P, Alavi M, Škorić L, Papadopoulou Skarp F, Priess-Buchheit J, </w:t>
       </w:r>
       <w:r>
         <w:rPr>
@@ -334,17 +403,30 @@
         <w:t xml:space="preserve">: </w:t>
       </w:r>
       <w:r>
-        <w:t xml:space="preserve">EEGManyPipelines: A Large-scale, Grassroots Multi-analyst Study of Electroencephalography Analysis Practices in the Wild. </w:t>
+        <w:t xml:space="preserve">Stakeholders’ perceptions of the synergy between intellectual property and open science: A cross-sectional survey. </w:t>
       </w:r>
       <w:r>
         <w:rPr>
           <w:i/>
         </w:rPr>
-        <w:t>Journal of Cognitive Neuroscience</w:t>
-      </w:r>
-      <w:r>
-        <w:t>,36:217-224, 2024.</w:t>
-      </w:r>
+        <w:t>Open Research Europe</w:t>
+      </w:r>
+      <w:r>
+        <w:t>,5:229-229, 2025.</w:t>
+      </w:r>
+      <w:r>
+        <w:t xml:space="preserve"> </w:t>
+      </w:r>
+      <w:hyperlink r:id="rId15">
+        <w:r>
+          <w:rPr>
+            <w:color w:val="0000EE"/>
+            <w:u w:val="single"/>
+            <w:sz w:val="18"/>
+          </w:rPr>
+          <w:t>doi:10.12688/openreseurope.20782.1</w:t>
+        </w:r>
+      </w:hyperlink>
     </w:p>
     <w:p>
       <w:pPr>
@@ -358,11 +440,11 @@
         <w:rPr>
           <w:sz w:val="22"/>
         </w:rPr>
-        <w:t>8.</w:t>
+        <w:t>7.</w:t>
         <w:tab/>
       </w:r>
       <w:r>
-        <w:t xml:space="preserve">Poldrack RA, Markiewicz CJ, Appelhoff S, Ashar YK, Auer T, Baillet S, Bansal S, Beltrachini L, Benar CG, Bertazzoli G, Bhogawar S, Blair RW, Bortoletto M, Boudreau M, Brooks TL, Calhoun VD, Castelli FM, Clement P, Cohen AL, Cohen-Adad J, D'Ambrosio S, de Hollander G, de la Iglesia-Vayá M, de la Vega A, Delorme A, Devinsky O, Draschkow D, Duff EP, DuPre E, Earl E, Esteban O, Feingold FW, Flandin G, Galassi A, Gallitto G, Ganz M, Gau R, Gholam J, Ghosh SS, Giacomel A, Gillman AG, Gleeson P, Gramfort A, Guay S, Guidali G, Halchenko YO, Handwerker DA, Hardcastle N, Herholz P, Hermes D, Honey CJ, Innis RB, Ioanas H-I, Jahn A, Karakuzu A, Keator DB, Kiar G, Kincses B, Laird AR, Lau JC, Lazari A, Legarreta JH, Li A, Li X, Love BC, Lu H, Marcantoni E, Maumet C, Mazzamuto G, Meisler SL, Mikkelsen M, Mutsaerts H, Nichols TE, Nikolaidis A, </w:t>
+        <w:t xml:space="preserve">Trübutschek D, Yang Y-F, Gianelli C, Cesnaite E, Fischer NL, Vinding MC, Marshall TR, Algermissen J, Pascarella A, Puoliväli T, Vitale A, Busch NA, </w:t>
       </w:r>
       <w:r>
         <w:rPr>
@@ -371,23 +453,33 @@
         <w:t>Nilsonne G</w:t>
       </w:r>
       <w:r>
-        <w:t>, Niso G, Norgaard M, Okell TW, Oostenveld R, Ort E, Park PJ, Pawlik M, Pernet CR, Pestilli F, Petr J, Phillips C, Poline J-B, Pollonini L, Raamana PR, Ritter P, Rizzo G, Robbins KA, Rockhill AP, Rogers C, Rokem A, Rorden C, Routier A, Saborit-Torres JM, Salo T, Schirner M, Smith RE, Spisak T, Sprenger J, Swann NC, Szinte M, Takerkart S, Thirion B, Thomas AG, Torabian S, Varoquaux G, Voytek B, Welzel J, Wilson M, Yarkoni T, Gorgolewski KJ</w:t>
-      </w:r>
-      <w:r>
         <w:t xml:space="preserve">: </w:t>
       </w:r>
       <w:r>
-        <w:t xml:space="preserve">The past, present, and future of the brain imaging data structure (BIDS). </w:t>
+        <w:t xml:space="preserve">EEGManyPipelines: A Large-scale, Grassroots Multi-analyst Study of Electroencephalography Analysis Practices in the Wild. </w:t>
       </w:r>
       <w:r>
         <w:rPr>
           <w:i/>
         </w:rPr>
-        <w:t>Imaging Neuroscience</w:t>
-      </w:r>
-      <w:r>
-        <w:t>,2:1-19, 2024.</w:t>
-      </w:r>
+        <w:t>Journal of Cognitive Neuroscience</w:t>
+      </w:r>
+      <w:r>
+        <w:t>,36:217-224, 2024.</w:t>
+      </w:r>
+      <w:r>
+        <w:t xml:space="preserve"> </w:t>
+      </w:r>
+      <w:hyperlink r:id="rId16">
+        <w:r>
+          <w:rPr>
+            <w:color w:val="0000EE"/>
+            <w:u w:val="single"/>
+            <w:sz w:val="18"/>
+          </w:rPr>
+          <w:t>doi:10.1162/jocn_a_02087</w:t>
+        </w:r>
+      </w:hyperlink>
     </w:p>
     <w:p>
       <w:pPr>
@@ -401,11 +493,11 @@
         <w:rPr>
           <w:sz w:val="22"/>
         </w:rPr>
-        <w:t>9.</w:t>
+        <w:t>8.</w:t>
         <w:tab/>
       </w:r>
       <w:r>
-        <w:t xml:space="preserve">Weissgerber TL, Gazda MA, </w:t>
+        <w:t xml:space="preserve">Poldrack RA, Markiewicz CJ, Appelhoff S, Ashar YK, Auer T, Baillet S, Bansal S, Beltrachini L, Benar CG, Bertazzoli G, Bhogawar S, Blair RW, Bortoletto M, Boudreau M, Brooks TL, Calhoun VD, Castelli FM, Clement P, Cohen AL, Cohen-Adad J, D'Ambrosio S, de Hollander G, de la Iglesia-Vayá M, de la Vega A, Delorme A, Devinsky O, Draschkow D, Duff EP, DuPre E, Earl E, Esteban O, Feingold FW, Flandin G, Galassi A, Gallitto G, Ganz M, Gau R, Gholam J, Ghosh SS, Giacomel A, Gillman AG, Gleeson P, Gramfort A, Guay S, Guidali G, Halchenko YO, Handwerker DA, Hardcastle N, Herholz P, Hermes D, Honey CJ, Innis RB, Ioanas H-I, Jahn A, Karakuzu A, Keator DB, Kiar G, Kincses B, Laird AR, Lau JC, Lazari A, Legarreta JH, Li A, Li X, Love BC, Lu H, Marcantoni E, Maumet C, Mazzamuto G, Meisler SL, Mikkelsen M, Mutsaerts H, Nichols TE, Nikolaidis A, </w:t>
       </w:r>
       <w:r>
         <w:rPr>
@@ -414,20 +506,36 @@
         <w:t>Nilsonne G</w:t>
       </w:r>
       <w:r>
+        <w:t>, Niso G, Norgaard M, Okell TW, Oostenveld R, Ort E, Park PJ, Pawlik M, Pernet CR, Pestilli F, Petr J, Phillips C, Poline J-B, Pollonini L, Raamana PR, Ritter P, Rizzo G, Robbins KA, Rockhill AP, Rogers C, Rokem A, Rorden C, Routier A, Saborit-Torres JM, Salo T, Schirner M, Smith RE, Spisak T, Sprenger J, Swann NC, Szinte M, Takerkart S, Thirion B, Thomas AG, Torabian S, Varoquaux G, Voytek B, Welzel J, Wilson M, Yarkoni T, Gorgolewski KJ</w:t>
+      </w:r>
+      <w:r>
         <w:t xml:space="preserve">: </w:t>
       </w:r>
       <w:r>
-        <w:t xml:space="preserve">Understanding the provenance and quality of methods is essential for responsible reuse of FAIR data. </w:t>
+        <w:t xml:space="preserve">The past, present, and future of the brain imaging data structure (BIDS). </w:t>
       </w:r>
       <w:r>
         <w:rPr>
           <w:i/>
         </w:rPr>
-        <w:t>Nature Medicine</w:t>
-      </w:r>
-      <w:r>
-        <w:t>, 2024.</w:t>
-      </w:r>
+        <w:t>Imaging Neuroscience</w:t>
+      </w:r>
+      <w:r>
+        <w:t>,2:1-19, 2024.</w:t>
+      </w:r>
+      <w:r>
+        <w:t xml:space="preserve"> </w:t>
+      </w:r>
+      <w:hyperlink r:id="rId17">
+        <w:r>
+          <w:rPr>
+            <w:color w:val="0000EE"/>
+            <w:u w:val="single"/>
+            <w:sz w:val="18"/>
+          </w:rPr>
+          <w:t>doi:10.1162/imag_a_00103</w:t>
+        </w:r>
+      </w:hyperlink>
     </w:p>
     <w:p>
       <w:pPr>
@@ -441,11 +549,11 @@
         <w:rPr>
           <w:sz w:val="22"/>
         </w:rPr>
-        <w:t>10.</w:t>
+        <w:t>9.</w:t>
         <w:tab/>
       </w:r>
       <w:r>
-        <w:t xml:space="preserve">Eriksson K, Sorjonen K, Falkstedt D, Melin B, </w:t>
+        <w:t xml:space="preserve">Weissgerber TL, Gazda MA, </w:t>
       </w:r>
       <w:r>
         <w:rPr>
@@ -457,17 +565,30 @@
         <w:t xml:space="preserve">: </w:t>
       </w:r>
       <w:r>
-        <w:t xml:space="preserve">A formal model accounting for measurement reliability shows attenuated effect of higher education on intelligence in longitudinal data. </w:t>
+        <w:t xml:space="preserve">Understanding the provenance and quality of methods is essential for responsible reuse of FAIR data. </w:t>
       </w:r>
       <w:r>
         <w:rPr>
           <w:i/>
         </w:rPr>
-        <w:t>Royal Society Open Science</w:t>
-      </w:r>
-      <w:r>
-        <w:t>,11:230513, 2024.</w:t>
-      </w:r>
+        <w:t>Nature Medicine</w:t>
+      </w:r>
+      <w:r>
+        <w:t>, 2024.</w:t>
+      </w:r>
+      <w:r>
+        <w:t xml:space="preserve"> </w:t>
+      </w:r>
+      <w:hyperlink r:id="rId18">
+        <w:r>
+          <w:rPr>
+            <w:color w:val="0000EE"/>
+            <w:u w:val="single"/>
+            <w:sz w:val="18"/>
+          </w:rPr>
+          <w:t>doi:10.1038/s41591-024-02879-x</w:t>
+        </w:r>
+      </w:hyperlink>
     </w:p>
     <w:p>
       <w:pPr>
@@ -481,11 +602,11 @@
         <w:rPr>
           <w:sz w:val="22"/>
         </w:rPr>
-        <w:t>11.</w:t>
+        <w:t>10.</w:t>
         <w:tab/>
       </w:r>
       <w:r>
-        <w:t xml:space="preserve">Axfors C, </w:t>
+        <w:t xml:space="preserve">Eriksson K, Sorjonen K, Falkstedt D, Melin B, </w:t>
       </w:r>
       <w:r>
         <w:rPr>
@@ -497,17 +618,30 @@
         <w:t xml:space="preserve">: </w:t>
       </w:r>
       <w:r>
-        <w:t xml:space="preserve">Registrering och rapportering av kliniska studier kan bli bättre. </w:t>
+        <w:t xml:space="preserve">A formal model accounting for measurement reliability shows attenuated effect of higher education on intelligence in longitudinal data. </w:t>
       </w:r>
       <w:r>
         <w:rPr>
           <w:i/>
         </w:rPr>
-        <w:t>Läkartidningen</w:t>
-      </w:r>
-      <w:r>
-        <w:t>, 2024.</w:t>
-      </w:r>
+        <w:t>Royal Society Open Science</w:t>
+      </w:r>
+      <w:r>
+        <w:t>,11:230513, 2024.</w:t>
+      </w:r>
+      <w:r>
+        <w:t xml:space="preserve"> </w:t>
+      </w:r>
+      <w:hyperlink r:id="rId19">
+        <w:r>
+          <w:rPr>
+            <w:color w:val="0000EE"/>
+            <w:u w:val="single"/>
+            <w:sz w:val="18"/>
+          </w:rPr>
+          <w:t>doi:10.1098/rsos.230513</w:t>
+        </w:r>
+      </w:hyperlink>
     </w:p>
     <w:p>
       <w:pPr>
@@ -521,11 +655,11 @@
         <w:rPr>
           <w:sz w:val="22"/>
         </w:rPr>
-        <w:t>12.</w:t>
+        <w:t>11.</w:t>
         <w:tab/>
       </w:r>
       <w:r>
-        <w:t xml:space="preserve">Sarafoglou A, Hoogeveen S, van den Bergh D, Aczel B, Albers CJ, Althoff T, Botvinik-Nezer R, Busch NA, Cataldo AM, Devezer B, van Dongen NNN, Dreber A, Fried EI, Hoekstra R, Hoffman S, Holzmeister F, Huber J, Huntington-Klein N, Ioannidis J, Johannesson M, Kirchler M, Loken E, Mangin J-F, Matzke D, Menkveld AJ, </w:t>
+        <w:t xml:space="preserve">Axfors C, </w:t>
       </w:r>
       <w:r>
         <w:rPr>
@@ -534,22 +668,19 @@
         <w:t>Nilsonne G</w:t>
       </w:r>
       <w:r>
-        <w:t>, van Ravenzwaaij D, Schweinsberg M, Schulz-Kuempel H, Shanks DR, Simons DJ, Spellman BA, Stoevenbelt AH, Szaszi B, Trübutschek D, Tuerlinckx F, Uhlmann EL, Vanpaemel W, Wicherts J, Wagenmakers E-J</w:t>
-      </w:r>
-      <w:r>
         <w:t xml:space="preserve">: </w:t>
       </w:r>
       <w:r>
-        <w:t xml:space="preserve">Subjective Evidence Evaluation Survey For Multi-Analyst Studies. </w:t>
+        <w:t xml:space="preserve">Registrering och rapportering av kliniska studier kan bli bättre. </w:t>
       </w:r>
       <w:r>
         <w:rPr>
           <w:i/>
         </w:rPr>
-        <w:t>Royal Society Open Science</w:t>
-      </w:r>
-      <w:r>
-        <w:t>,11:240125, 2024.</w:t>
+        <w:t>Läkartidningen</w:t>
+      </w:r>
+      <w:r>
+        <w:t>, 2024.</w:t>
       </w:r>
     </w:p>
     <w:p>
@@ -564,11 +695,11 @@
         <w:rPr>
           <w:sz w:val="22"/>
         </w:rPr>
-        <w:t>13.</w:t>
+        <w:t>12.</w:t>
         <w:tab/>
       </w:r>
       <w:r>
-        <w:t xml:space="preserve">Mushtaq F, Welke D, Gallagher A, Pavlov YG, Kouara L, Bosch-Bayard J, van den Bosch JJF, Arvaneh M, Bland AR, Chaumon M, Borck C, He X, Luck SJ, Machizawa MG, Pernet C, Puce A, Segalowitz SJ, Rogers C, Awais M, Babiloni C, Bailey NW, Baillet S, Bendall RCA, Brady D, Bringas-Vega ML, Busch NA, Calzada-Reyes A, Chatard A, Clayson PE, Cohen MX, Cole J, Constant M, Corneyllie A, Coyle D, Cruse D, Delis I, Delorme A, Fair D, Falk TH, Gamer M, Ganis G, Gloy K, Gregory S, Hassall CD, Hiley KE, Ivry RB, Jerbi K, Jenkins M, Kaiser J, Keil A, Knight RT, Kochen S, Kotchoubey B, Krigolson OE, Langer N, Liesefeld HR, Lippé S, London RE, MacNamara A, Makeig S, Marinovic W, Martínez-Montes E, Marzuki AA, Mathew RK, Michel C, Millán JDR, Mon-Williams M, Morales-Chacón L, Naar R, </w:t>
+        <w:t xml:space="preserve">Sarafoglou A, Hoogeveen S, van den Bergh D, Aczel B, Albers CJ, Althoff T, Botvinik-Nezer R, Busch NA, Cataldo AM, Devezer B, van Dongen NNN, Dreber A, Fried EI, Hoekstra R, Hoffman S, Holzmeister F, Huber J, Huntington-Klein N, Ioannidis J, Johannesson M, Kirchler M, Loken E, Mangin J-F, Matzke D, Menkveld AJ, </w:t>
       </w:r>
       <w:r>
         <w:rPr>
@@ -577,23 +708,36 @@
         <w:t>Nilsonne G</w:t>
       </w:r>
       <w:r>
-        <w:t>, Niso G, Nyhus E, Oostenveld R, Paul K, Paulus W, Pfabigan DM, Pourtois G, Rampp S, Rausch M, Robbins K, Rossini PM, Ruzzoli M, Schmidt B, Senderecka M, Srinivasan N, Stegmann Y, Thompson PM, Valdes-Sosa M, van der Molen MJW, Veniero D, Verona E, Voytek B, Yao D, Evans AC, Valdes-Sosa P</w:t>
+        <w:t>, van Ravenzwaaij D, Schweinsberg M, Schulz-Kuempel H, Shanks DR, Simons DJ, Spellman BA, Stoevenbelt AH, Szaszi B, Trübutschek D, Tuerlinckx F, Uhlmann EL, Vanpaemel W, Wicherts J, Wagenmakers E-J</w:t>
       </w:r>
       <w:r>
         <w:t xml:space="preserve">: </w:t>
       </w:r>
       <w:r>
-        <w:t xml:space="preserve">One hundred years of EEG for brain and behaviour research. </w:t>
+        <w:t xml:space="preserve">Subjective Evidence Evaluation Survey For Multi-Analyst Studies. </w:t>
       </w:r>
       <w:r>
         <w:rPr>
           <w:i/>
         </w:rPr>
-        <w:t>Nature Human Behaviour</w:t>
-      </w:r>
-      <w:r>
-        <w:t>,8:1437-1443, 2024.</w:t>
-      </w:r>
+        <w:t>Royal Society Open Science</w:t>
+      </w:r>
+      <w:r>
+        <w:t>,11:240125, 2024.</w:t>
+      </w:r>
+      <w:r>
+        <w:t xml:space="preserve"> </w:t>
+      </w:r>
+      <w:hyperlink r:id="rId20">
+        <w:r>
+          <w:rPr>
+            <w:color w:val="0000EE"/>
+            <w:u w:val="single"/>
+            <w:sz w:val="18"/>
+          </w:rPr>
+          <w:t>doi:10.1098/rsos.240125</w:t>
+        </w:r>
+      </w:hyperlink>
     </w:p>
     <w:p>
       <w:pPr>
@@ -607,11 +751,11 @@
         <w:rPr>
           <w:sz w:val="22"/>
         </w:rPr>
-        <w:t>14.</w:t>
+        <w:t>13.</w:t>
         <w:tab/>
       </w:r>
       <w:r>
-        <w:t xml:space="preserve">Doell KC, Todorova B, Vlasceanu M, Bak Coleman JB, Pronizius E, Schumann P, Azevedo F, Patel Y, Berkebile-Wineberg MM, Brick C, Lange F, Grayson SJ, Pei Y, Chakroff A, van den Broek KL, Lamm C, Vlasceanu D, Constantino SM, Rathje S, Goldwert D, Fang K, Aglioti SM, Alfano M, Alvarado-Yepez AJ, Andersen A, Anseel F, Apps MAJ, Asadli C, Awuor FJ, Basaglia P, Bélanger JJ, Berger S, Bertin P, Białek M, Bialobrzeska O, Blaya-Burgo M, Bleize DNM, Bø S, Boecker L, Boggio PS, Borau S, Borau S, Bos B, Bouguettaya A, Brauer M, Brik T, Briker R, Brosch T, Buchel O, Buonauro D, Butalia R, Carvacho H, Chamberlain SAE, Chan H-Y, Chow D, Chung D, Cian L, Cohen-Eick N, Contreras-Huerta LS, Contu D, Cristea V, Cutler J, D'Ottone S, De Keersmaecker J, Delcourt S, Delouvée S, Diel K, Douglas BD, Drupp MA, Dubey S, Ekmanis J, Elbaek CT, Elsherif M, Engelhard IM, Escher YA, Etienne TW, Farage L, Farias AR, Feuerriegel S, Findor A, Freira L, Friese M, Gains NP, Gallyamova A, Geiger SJ, Genschow O, Gjoneska B, Gkinopoulos T, Goldberg B, Goldenberg A, Gradidge S, Grassini S, Gray K, Grelle S, Griffin SM, Grigoryan L, Grigoryan A, Grigoryev D, Gruber J, Guilaran J, Hadar B, Hahnel UJJ, Halperin E, Harvey AJ, Haugestad CAP, Herman AM, Hershfield HE, Himichi T, Hine DW, Hofmann W, Howe L, Huaman-Chulluncuy ET, Huang G, Ishii T, Ito A, Jia F, Jost JT, Jovanović V, Jurgiel D, Kácha O, Kankaanpää R, Kantorowicz J, Kantorowicz-Reznichenko E, Mintz KK, Kaya I, Kaya O, Khachatryan N, Klas A, Klein C, Klöckner CA, Koppel L, Kosachenko AI, Kothe EJ, Krebs R, Krosch AR, Krouwel APM, Kyrychenko Y, Lagomarsino M, Cunningham JL, Lees J, Leung TY, Levy N, Lockwood PL, Longoni C, Ortega AL, Loschelder DD, Lu JG, Luo Y, Luomba J, Lutz AE, Majer JM, Markowitz E, Marsh AA, Mascarenhas KL, Mbilingi B, Mbungu W, McHugh C, Meijers MHC, Mercier H, Mhagama FL, Michalaki K, Mikus N, Milliron SG, Mitkidis P, Monge-Rodríguez FS, Mora YL, Morais MJ, Moreau D, Motoki K, Moyano M, Mus M, Navajas J, Nguyen TL, Nguyen DM, Nguyen T, Niemi L, Nijssen SRR, </w:t>
+        <w:t xml:space="preserve">Mushtaq F, Welke D, Gallagher A, Pavlov YG, Kouara L, Bosch-Bayard J, van den Bosch JJF, Arvaneh M, Bland AR, Chaumon M, Borck C, He X, Luck SJ, Machizawa MG, Pernet C, Puce A, Segalowitz SJ, Rogers C, Awais M, Babiloni C, Bailey NW, Baillet S, Bendall RCA, Brady D, Bringas-Vega ML, Busch NA, Calzada-Reyes A, Chatard A, Clayson PE, Cohen MX, Cole J, Constant M, Corneyllie A, Coyle D, Cruse D, Delis I, Delorme A, Fair D, Falk TH, Gamer M, Ganis G, Gloy K, Gregory S, Hassall CD, Hiley KE, Ivry RB, Jerbi K, Jenkins M, Kaiser J, Keil A, Knight RT, Kochen S, Kotchoubey B, Krigolson OE, Langer N, Liesefeld HR, Lippé S, London RE, MacNamara A, Makeig S, Marinovic W, Martínez-Montes E, Marzuki AA, Mathew RK, Michel C, Millán JDR, Mon-Williams M, Morales-Chacón L, Naar R, </w:t>
       </w:r>
       <w:r>
         <w:rPr>
@@ -620,23 +764,36 @@
         <w:t>Nilsonne G</w:t>
       </w:r>
       <w:r>
-        <w:t>, Nitschke JP, Nockur L, Okura R, Öner S, Özdoğru AA, Palumbo H, Panagopoulos C, Panasiti MS, Pärnamets P, Paruzel-Czachura M, Pavlov YG, Payán-Gómez C, Pearson AR, da Costa LP, Petrowsky HM, Pfattheicher S, Pham NT, Ponizovskiy V, Pretus C, Rêgo GG, Reimann R, Rhoads SA, Riano-Moreno J, Richter I, Röer JP, Rosa-Sullivan J, Ross RM, Sabherwal A, Saito T, Sarrasin O, Say N, Schmid K, Schmitt MT, Schoenegger P, Scholz C, Schug MG, Schulreich S, Shreedhar G, Shuman E, Sivan S, Sjåstad H, Soliman M, Soud K, Spampatti T, Sparkman G, Spasovski O, Stanley SK, Stern JA, Strahm N, Suko Y, Sul S, Syropoulos S, Taylor NC, Tedaldi E, Tinghög G, Huynh LDT, Travaglino GA, Tsakiris M, Tüter İ, Tyrala M, Uluğ ÖM, Urbanek A, Valko D, van der Linden S, van Schie K, van Stekelenburg A, Vanags E, Västfjäll D, Vesely S, Vintr J, Vranka M, Wanguche PO, Willer R, Wojcik AD, Xu R, Yadav A, Zawisza M, Zhao X, Zhao J, Żuk D, Van Bavel JJ</w:t>
+        <w:t>, Niso G, Nyhus E, Oostenveld R, Paul K, Paulus W, Pfabigan DM, Pourtois G, Rampp S, Rausch M, Robbins K, Rossini PM, Ruzzoli M, Schmidt B, Senderecka M, Srinivasan N, Stegmann Y, Thompson PM, Valdes-Sosa M, van der Molen MJW, Veniero D, Verona E, Voytek B, Yao D, Evans AC, Valdes-Sosa P</w:t>
       </w:r>
       <w:r>
         <w:t xml:space="preserve">: </w:t>
       </w:r>
       <w:r>
-        <w:t xml:space="preserve">The International Climate Psychology Collaboration: Climate change-related data collected from 63 countries. </w:t>
+        <w:t xml:space="preserve">One hundred years of EEG for brain and behaviour research. </w:t>
       </w:r>
       <w:r>
         <w:rPr>
           <w:i/>
         </w:rPr>
-        <w:t>Scientific Data</w:t>
-      </w:r>
-      <w:r>
-        <w:t>,11:1066, 2024.</w:t>
-      </w:r>
+        <w:t>Nature Human Behaviour</w:t>
+      </w:r>
+      <w:r>
+        <w:t>,8:1437-1443, 2024.</w:t>
+      </w:r>
+      <w:r>
+        <w:t xml:space="preserve"> </w:t>
+      </w:r>
+      <w:hyperlink r:id="rId21">
+        <w:r>
+          <w:rPr>
+            <w:color w:val="0000EE"/>
+            <w:u w:val="single"/>
+            <w:sz w:val="18"/>
+          </w:rPr>
+          <w:t>doi:10.1038/s41562-024-01941-5</w:t>
+        </w:r>
+      </w:hyperlink>
     </w:p>
     <w:p>
       <w:pPr>
@@ -650,27 +807,49 @@
         <w:rPr>
           <w:sz w:val="22"/>
         </w:rPr>
-        <w:t>15.</w:t>
+        <w:t>14.</w:t>
         <w:tab/>
       </w:r>
       <w:r>
-        <w:t>Lindberg O</w:t>
+        <w:t xml:space="preserve">Doell KC, Todorova B, Vlasceanu M, Bak Coleman JB, Pronizius E, Schumann P, Azevedo F, Patel Y, Berkebile-Wineberg MM, Brick C, Lange F, Grayson SJ, Pei Y, Chakroff A, van den Broek KL, Lamm C, Vlasceanu D, Constantino SM, Rathje S, Goldwert D, Fang K, Aglioti SM, Alfano M, Alvarado-Yepez AJ, Andersen A, Anseel F, Apps MAJ, Asadli C, Awuor FJ, Basaglia P, Bélanger JJ, Berger S, Bertin P, Białek M, Bialobrzeska O, Blaya-Burgo M, Bleize DNM, Bø S, Boecker L, Boggio PS, Borau S, Borau S, Bos B, Bouguettaya A, Brauer M, Brik T, Briker R, Brosch T, Buchel O, Buonauro D, Butalia R, Carvacho H, Chamberlain SAE, Chan H-Y, Chow D, Chung D, Cian L, Cohen-Eick N, Contreras-Huerta LS, Contu D, Cristea V, Cutler J, D'Ottone S, De Keersmaecker J, Delcourt S, Delouvée S, Diel K, Douglas BD, Drupp MA, Dubey S, Ekmanis J, Elbaek CT, Elsherif M, Engelhard IM, Escher YA, Etienne TW, Farage L, Farias AR, Feuerriegel S, Findor A, Freira L, Friese M, Gains NP, Gallyamova A, Geiger SJ, Genschow O, Gjoneska B, Gkinopoulos T, Goldberg B, Goldenberg A, Gradidge S, Grassini S, Gray K, Grelle S, Griffin SM, Grigoryan L, Grigoryan A, Grigoryev D, Gruber J, Guilaran J, Hadar B, Hahnel UJJ, Halperin E, Harvey AJ, Haugestad CAP, Herman AM, Hershfield HE, Himichi T, Hine DW, Hofmann W, Howe L, Huaman-Chulluncuy ET, Huang G, Ishii T, Ito A, Jia F, Jost JT, Jovanović V, Jurgiel D, Kácha O, Kankaanpää R, Kantorowicz J, Kantorowicz-Reznichenko E, Mintz KK, Kaya I, Kaya O, Khachatryan N, Klas A, Klein C, Klöckner CA, Koppel L, Kosachenko AI, Kothe EJ, Krebs R, Krosch AR, Krouwel APM, Kyrychenko Y, Lagomarsino M, Cunningham JL, Lees J, Leung TY, Levy N, Lockwood PL, Longoni C, Ortega AL, Loschelder DD, Lu JG, Luo Y, Luomba J, Lutz AE, Majer JM, Markowitz E, Marsh AA, Mascarenhas KL, Mbilingi B, Mbungu W, McHugh C, Meijers MHC, Mercier H, Mhagama FL, Michalaki K, Mikus N, Milliron SG, Mitkidis P, Monge-Rodríguez FS, Mora YL, Morais MJ, Moreau D, Motoki K, Moyano M, Mus M, Navajas J, Nguyen TL, Nguyen DM, Nguyen T, Niemi L, Nijssen SRR, </w:t>
+      </w:r>
+      <w:r>
+        <w:rPr>
+          <w:b/>
+        </w:rPr>
+        <w:t>Nilsonne G</w:t>
+      </w:r>
+      <w:r>
+        <w:t>, Nitschke JP, Nockur L, Okura R, Öner S, Özdoğru AA, Palumbo H, Panagopoulos C, Panasiti MS, Pärnamets P, Paruzel-Czachura M, Pavlov YG, Payán-Gómez C, Pearson AR, da Costa LP, Petrowsky HM, Pfattheicher S, Pham NT, Ponizovskiy V, Pretus C, Rêgo GG, Reimann R, Rhoads SA, Riano-Moreno J, Richter I, Röer JP, Rosa-Sullivan J, Ross RM, Sabherwal A, Saito T, Sarrasin O, Say N, Schmid K, Schmitt MT, Schoenegger P, Scholz C, Schug MG, Schulreich S, Shreedhar G, Shuman E, Sivan S, Sjåstad H, Soliman M, Soud K, Spampatti T, Sparkman G, Spasovski O, Stanley SK, Stern JA, Strahm N, Suko Y, Sul S, Syropoulos S, Taylor NC, Tedaldi E, Tinghög G, Huynh LDT, Travaglino GA, Tsakiris M, Tüter İ, Tyrala M, Uluğ ÖM, Urbanek A, Valko D, van der Linden S, van Schie K, van Stekelenburg A, Vanags E, Västfjäll D, Vesely S, Vintr J, Vranka M, Wanguche PO, Willer R, Wojcik AD, Xu R, Yadav A, Zawisza M, Zhao X, Zhao J, Żuk D, Van Bavel JJ</w:t>
       </w:r>
       <w:r>
         <w:t xml:space="preserve">: </w:t>
       </w:r>
       <w:r>
-        <w:t xml:space="preserve">Altered Empathy Processing in Frontotemporal Dementia. </w:t>
+        <w:t xml:space="preserve">The International Climate Psychology Collaboration: Climate change-related data collected from 63 countries. </w:t>
       </w:r>
       <w:r>
         <w:rPr>
           <w:i/>
         </w:rPr>
-        <w:t>JAMA Network Open</w:t>
-      </w:r>
-      <w:r>
-        <w:t>, 2024.</w:t>
-      </w:r>
+        <w:t>Scientific Data</w:t>
+      </w:r>
+      <w:r>
+        <w:t>,11:1066, 2024.</w:t>
+      </w:r>
+      <w:r>
+        <w:t xml:space="preserve"> </w:t>
+      </w:r>
+      <w:hyperlink r:id="rId22">
+        <w:r>
+          <w:rPr>
+            <w:color w:val="0000EE"/>
+            <w:u w:val="single"/>
+            <w:sz w:val="18"/>
+          </w:rPr>
+          <w:t>doi:10.1038/s41597-024-03865-1</w:t>
+        </w:r>
+      </w:hyperlink>
     </w:p>
     <w:p>
       <w:pPr>
@@ -684,11 +863,11 @@
         <w:rPr>
           <w:sz w:val="22"/>
         </w:rPr>
-        <w:t>16.</w:t>
+        <w:t>15.</w:t>
         <w:tab/>
       </w:r>
       <w:r>
-        <w:t xml:space="preserve">Sennerstam V, Hedman-Lagerlöf E, </w:t>
+        <w:t xml:space="preserve">Lindberg O, Li T-Q, Lind C, Vestberg S, Almkvist O, Stiernstedt M, Ericson A, Bogdanovic N, Hansson O, Harper L, Westman E, Graff C, Tsevis T, Mannfolk P, Fischer H, </w:t>
       </w:r>
       <w:r>
         <w:rPr>
@@ -697,23 +876,36 @@
         <w:t>Nilsonne G</w:t>
       </w:r>
       <w:r>
-        <w:t>, Lekander M, Rück C, Wallert J, Axelsson E, Lindsäter E</w:t>
+        <w:t>, Petrovic P, Nyberg L, Wahlund L-O, Santillo AF</w:t>
       </w:r>
       <w:r>
         <w:t xml:space="preserve">: </w:t>
       </w:r>
       <w:r>
-        <w:t xml:space="preserve">Exhaustion Disorder in Primary Care: A Comparison With Major Depressive Disorder and Adjustment Disorder. </w:t>
+        <w:t xml:space="preserve">Altered Empathy Processing in Frontotemporal Dementia. </w:t>
       </w:r>
       <w:r>
         <w:rPr>
           <w:i/>
         </w:rPr>
-        <w:t>Scandinavian Journal of Psychology</w:t>
-      </w:r>
-      <w:r>
-        <w:t>,66:315-326, 2024.</w:t>
-      </w:r>
+        <w:t>JAMA Network Open</w:t>
+      </w:r>
+      <w:r>
+        <w:t>,7:e2448601, 2024.</w:t>
+      </w:r>
+      <w:r>
+        <w:t xml:space="preserve"> </w:t>
+      </w:r>
+      <w:hyperlink r:id="rId23">
+        <w:r>
+          <w:rPr>
+            <w:color w:val="0000EE"/>
+            <w:u w:val="single"/>
+            <w:sz w:val="18"/>
+          </w:rPr>
+          <w:t>doi:10.1001/jamanetworkopen.2024.48601</w:t>
+        </w:r>
+      </w:hyperlink>
     </w:p>
     <w:p>
       <w:pPr>
@@ -727,11 +919,11 @@
         <w:rPr>
           <w:sz w:val="22"/>
         </w:rPr>
-        <w:t>17.</w:t>
+        <w:t>16.</w:t>
         <w:tab/>
       </w:r>
       <w:r>
-        <w:t xml:space="preserve">Sorjonen K, </w:t>
+        <w:t xml:space="preserve">Sennerstam V, Hedman-Lagerlöf E, </w:t>
       </w:r>
       <w:r>
         <w:rPr>
@@ -740,23 +932,36 @@
         <w:t>Nilsonne G</w:t>
       </w:r>
       <w:r>
-        <w:t>, Melin B, Ingre M</w:t>
+        <w:t>, Lekander M, Rück C, Wallert J, Axelsson E, Lindsäter E</w:t>
       </w:r>
       <w:r>
         <w:t xml:space="preserve">: </w:t>
       </w:r>
       <w:r>
-        <w:t xml:space="preserve">Uncertain inference in random intercept cross-lagged panel models: An example involving need for cognition and anxiety and depression symptoms. </w:t>
+        <w:t xml:space="preserve">Exhaustion Disorder in Primary Care: A Comparison With Major Depressive Disorder and Adjustment Disorder. </w:t>
       </w:r>
       <w:r>
         <w:rPr>
           <w:i/>
         </w:rPr>
-        <w:t>Personality and Individual Differences</w:t>
-      </w:r>
-      <w:r>
-        <w:t>,201:111925-111925, 2023.</w:t>
-      </w:r>
+        <w:t>Scandinavian Journal of Psychology</w:t>
+      </w:r>
+      <w:r>
+        <w:t>,66:315-326, 2024.</w:t>
+      </w:r>
+      <w:r>
+        <w:t xml:space="preserve"> </w:t>
+      </w:r>
+      <w:hyperlink r:id="rId24">
+        <w:r>
+          <w:rPr>
+            <w:color w:val="0000EE"/>
+            <w:u w:val="single"/>
+            <w:sz w:val="18"/>
+          </w:rPr>
+          <w:t>doi:10.1111/sjop.13087</w:t>
+        </w:r>
+      </w:hyperlink>
     </w:p>
     <w:p>
       <w:pPr>
@@ -770,11 +975,11 @@
         <w:rPr>
           <w:sz w:val="22"/>
         </w:rPr>
-        <w:t>18.</w:t>
+        <w:t>17.</w:t>
         <w:tab/>
       </w:r>
       <w:r>
-        <w:t xml:space="preserve">Buchanan EM, Lewis SC, Paris B, Forscher PS, Pavlacic JM, Beshears JE, Drexler SM, Gourdon-Kanhukamwe A, Mallik PR, Silan MAA, Miller JK, IJzerman H, Moshontz H, Beaudry JL, Suchow JW, Chartier CR, Coles NA, Sharifian M, Todsen AL, Levitan CA, Azevedo F, Legate N, Heller B, Rothman AJ, Dorison CA, Gill BP, Wang K, Rees VW, Gibbs N, Goldenberg A, Thi Nguyen T-V, Gross JJ, Kaminski G, von Bastian CC, Paruzel-Czachura M, Mosannenzadeh F, Azouaghe S, Bran A, Ruiz-Fernandez S, Santos AC, Reggev N, Zickfeld JH, Akkas H, Pantazi M, Ropovik I, Korbmacher M, Arriaga P, Gjoneska B, Warmelink L, Alves SG, de Holanda Coelho GL, Stieger S, Schei V, Hanel PHP, Szaszi B, Fedotov M, Antfolk J, Marcu G-M, Schrötter J, Kunst JR, Geiger SJ, Adetula A, Kocalar HE, Kielińska J, Kačmár P, Bokkour A, Galindo-Caballero OJ, Djamai I, Pöntinen SJ, Agesin BE, Jernsäther T, Urooj A, Rachev NR, Koptjevskaja-Tamm M, Kurfalı M, Pit IL, Li R, Çoksan S, Dubrov D, Paltrow TE, Baník G, Korobova T, Studzinska A, Jiang X, Aruta JJBR, Vintr J, Chiu F, Kaliska L, Berkessel JB, Tümer M, Morales-Izquierdo S, Chuan-Peng H, Vezirian K, Rosa AD, Bialobrzeska O, Vasilev MR, Beitner J, Kácha O, Žuro B, Westerlund M, Nedelcheva-Datsova M, Findor A, Krupić D, Kowal M, Askelund AD, Pourafshari R, Đorđević JM, Schmidt N-D, Baklanova E, Szala A, Zakharov I, Vranka MA, Ihaya K, Grano C, Cellini N, Białek M, Anton-Boicuk L, Dalgar I, Adıgüzel A, Verharen JPH, Maturan PLG, Kassianos AP, Oliveira R, Čadek M, Adoric VC, Özdoğru AA, Sverdrup TE, Aczel B, Zambrano D, Ahmed A, Tamnes CK, Yamada Y, Volz L, Sunami N, Suter L, Vieira L, Groyecka-Bernard A, Kamburidis JA, Reips U-D, Harutyunyan M, Adetula GA, Allred TB, Barzykowski K, Antazo BG, Zsido AN, Šakan DD, Cyrus-Lai W, Ahlgren LP, Hruška M, Vega D, Manunta E, Mokady A, Capizzi M, Martončik M, Say N, Filip K, Vilar R, Staniaszek K, Vdovic M, Adamkovic M, Johannes N, Hajdu N, Cohen N, Overkott C, Krupić D, Hubena B, </w:t>
+        <w:t xml:space="preserve">Sorjonen K, </w:t>
       </w:r>
       <w:r>
         <w:rPr>
@@ -783,23 +988,36 @@
         <w:t>Nilsonne G</w:t>
       </w:r>
       <w:r>
-        <w:t>, Mioni G, Solorzano CS, Ishii T, Chen Z, Kushnir E, Karaarslan C, Ribeiro RR, Khaoudi A, Kossowska M, Bavolar J, Hoyer K, Roczniewska M, Karababa A, Becker M, Monteiro RP, Kunisato Y, Metin-Orta I, Adamus S, Kozma L, Czarnek G, Domurat A, Štrukelj E, Alvarez DS, Parzuchowski M, Massoni S, Czamanski-Cohen J, Pronizius E, Muchembled F, van Schie K, Saçaklı A, Hristova E, Kuzminska AO, Charyate A, Bijlstra G, Afhami R, Majeed NM, Musser ED, Sirota M, Ross RM, Yeung SK, Papadatou-Pastou M, Foroni F, Almeida IAT, Grigoryev D, Lewis DMG, Holford DL, Janssen SMJ, Tatachari S, Batres C, Olofsson JK, Daches S, Belaus A, Pfuhl G, Corral-Frias NS, Sousa D, Röer JP, Isager PM, Godbersen H, Walczak RB, Van Doren N, Ren D, Gill T, Voracek M, DeBruine LM, Anne M, Očovaj SB, Thomas AG, Arvanitis A, Ostermann T, Wolfe K, Arinze NC, Bundt C, Lamm C, Calin-Jageman RJ, Davis WE, Karekla M, Zorjan S, Jaremka LM, Uttley J, Hricova M, Koehn MA, Kiselnikova N, Bai H, Krafnick AJ, Balci BB, Ballantyne T, Lins S, Vally Z, Esteban-Serna C, Schmidt K, Macapagal PML, Szwed P, Zdybek PM, Moreau D, Collins WM, Joy-Gaba JA, Vilares I, Tran US, Boudesseul J, Albayrak-Aydemir N, Dixson BJW, Perillo JT, Ferreira A, Westgate EC, Aberson CL, Arinze AI, Jaeger B, Butt MM, Silva JR, Storage DS, Janak AP, Jiménez-Leal W, Soto JA, Sorokowska A, McCarthy R, Tullett AM, Frias-Armenta M, Ribeiro MFF, Hartanto A, Forbes PAG, Willis ML, Del Carmen Tejada R M, Torres AJO, Stephen ID, Vaidis DC, de la Rosa-Gómez A, Yu K, Sutherland CAM, Manavalan M, Behzadnia B, Urban J, Baskin E, McFall JP, Ogbonnaya CE, Fu CHY, Rahal R-M, Ndukaihe ILG, Hostler TJ, Kappes HB, Sorokowski P, Khosla M, Lazarevic LB, Eudave L, Vilsmeier JK, Luis EO, Muda R, Agadullina E, Cárcamo RA, Reeck C, Anjum G, Venegas MCT, Misiak M, Ryan RM, Nock NL, Travaglino GA, Mensink MC, Feldman G, Wichman AL, Chou W, Ziano I, Seehuus M, Chopik WJ, Kung FYH, Carpentier J, Vaughn LA, Du H, Xiao Q, Lima TJS, Noone C, Onie S, Verbruggen F, Radtke T, Primbs MA</w:t>
+        <w:t>, Melin B, Ingre M</w:t>
       </w:r>
       <w:r>
         <w:t xml:space="preserve">: </w:t>
       </w:r>
       <w:r>
-        <w:t xml:space="preserve">The Psychological Science Accelerator’s COVID-19 rapid-response dataset. </w:t>
+        <w:t xml:space="preserve">Uncertain inference in random intercept cross-lagged panel models: An example involving need for cognition and anxiety and depression symptoms. </w:t>
       </w:r>
       <w:r>
         <w:rPr>
           <w:i/>
         </w:rPr>
-        <w:t>Scientific Data</w:t>
-      </w:r>
-      <w:r>
-        <w:t>,10:87, 2023.</w:t>
-      </w:r>
+        <w:t>Personality and Individual Differences</w:t>
+      </w:r>
+      <w:r>
+        <w:t>,201:111925-111925, 2023.</w:t>
+      </w:r>
+      <w:r>
+        <w:t xml:space="preserve"> </w:t>
+      </w:r>
+      <w:hyperlink r:id="rId25">
+        <w:r>
+          <w:rPr>
+            <w:color w:val="0000EE"/>
+            <w:u w:val="single"/>
+            <w:sz w:val="18"/>
+          </w:rPr>
+          <w:t>doi:10.1016/j.paid.2022.111925</w:t>
+        </w:r>
+      </w:hyperlink>
     </w:p>
     <w:p>
       <w:pPr>
@@ -813,11 +1031,11 @@
         <w:rPr>
           <w:sz w:val="22"/>
         </w:rPr>
-        <w:t>19.</w:t>
+        <w:t>18.</w:t>
         <w:tab/>
       </w:r>
       <w:r>
-        <w:t xml:space="preserve">Sorjonen K, Ingre M, </w:t>
+        <w:t xml:space="preserve">Buchanan EM, Lewis SC, Paris B, Forscher PS, Pavlacic JM, Beshears JE, Drexler SM, Gourdon-Kanhukamwe A, Mallik PR, Silan MAA, Miller JK, IJzerman H, Moshontz H, Beaudry JL, Suchow JW, Chartier CR, Coles NA, Sharifian M, Todsen AL, Levitan CA, Azevedo F, Legate N, Heller B, Rothman AJ, Dorison CA, Gill BP, Wang K, Rees VW, Gibbs N, Goldenberg A, Thi Nguyen T-V, Gross JJ, Kaminski G, von Bastian CC, Paruzel-Czachura M, Mosannenzadeh F, Azouaghe S, Bran A, Ruiz-Fernandez S, Santos AC, Reggev N, Zickfeld JH, Akkas H, Pantazi M, Ropovik I, Korbmacher M, Arriaga P, Gjoneska B, Warmelink L, Alves SG, de Holanda Coelho GL, Stieger S, Schei V, Hanel PHP, Szaszi B, Fedotov M, Antfolk J, Marcu G-M, Schrötter J, Kunst JR, Geiger SJ, Adetula A, Kocalar HE, Kielińska J, Kačmár P, Bokkour A, Galindo-Caballero OJ, Djamai I, Pöntinen SJ, Agesin BE, Jernsäther T, Urooj A, Rachev NR, Koptjevskaja-Tamm M, Kurfalı M, Pit IL, Li R, Çoksan S, Dubrov D, Paltrow TE, Baník G, Korobova T, Studzinska A, Jiang X, Aruta JJBR, Vintr J, Chiu F, Kaliska L, Berkessel JB, Tümer M, Morales-Izquierdo S, Chuan-Peng H, Vezirian K, Rosa AD, Bialobrzeska O, Vasilev MR, Beitner J, Kácha O, Žuro B, Westerlund M, Nedelcheva-Datsova M, Findor A, Krupić D, Kowal M, Askelund AD, Pourafshari R, Đorđević JM, Schmidt N-D, Baklanova E, Szala A, Zakharov I, Vranka MA, Ihaya K, Grano C, Cellini N, Białek M, Anton-Boicuk L, Dalgar I, Adıgüzel A, Verharen JPH, Maturan PLG, Kassianos AP, Oliveira R, Čadek M, Adoric VC, Özdoğru AA, Sverdrup TE, Aczel B, Zambrano D, Ahmed A, Tamnes CK, Yamada Y, Volz L, Sunami N, Suter L, Vieira L, Groyecka-Bernard A, Kamburidis JA, Reips U-D, Harutyunyan M, Adetula GA, Allred TB, Barzykowski K, Antazo BG, Zsido AN, Šakan DD, Cyrus-Lai W, Ahlgren LP, Hruška M, Vega D, Manunta E, Mokady A, Capizzi M, Martončik M, Say N, Filip K, Vilar R, Staniaszek K, Vdovic M, Adamkovic M, Johannes N, Hajdu N, Cohen N, Overkott C, Krupić D, Hubena B, </w:t>
       </w:r>
       <w:r>
         <w:rPr>
@@ -826,23 +1044,36 @@
         <w:t>Nilsonne G</w:t>
       </w:r>
       <w:r>
-        <w:t>, Melin B</w:t>
+        <w:t>, Mioni G, Solorzano CS, Ishii T, Chen Z, Kushnir E, Karaarslan C, Ribeiro RR, Khaoudi A, Kossowska M, Bavolar J, Hoyer K, Roczniewska M, Karababa A, Becker M, Monteiro RP, Kunisato Y, Metin-Orta I, Adamus S, Kozma L, Czarnek G, Domurat A, Štrukelj E, Alvarez DS, Parzuchowski M, Massoni S, Czamanski-Cohen J, Pronizius E, Muchembled F, van Schie K, Saçaklı A, Hristova E, Kuzminska AO, Charyate A, Bijlstra G, Afhami R, Majeed NM, Musser ED, Sirota M, Ross RM, Yeung SK, Papadatou-Pastou M, Foroni F, Almeida IAT, Grigoryev D, Lewis DMG, Holford DL, Janssen SMJ, Tatachari S, Batres C, Olofsson JK, Daches S, Belaus A, Pfuhl G, Corral-Frias NS, Sousa D, Röer JP, Isager PM, Godbersen H, Walczak RB, Van Doren N, Ren D, Gill T, Voracek M, DeBruine LM, Anne M, Očovaj SB, Thomas AG, Arvanitis A, Ostermann T, Wolfe K, Arinze NC, Bundt C, Lamm C, Calin-Jageman RJ, Davis WE, Karekla M, Zorjan S, Jaremka LM, Uttley J, Hricova M, Koehn MA, Kiselnikova N, Bai H, Krafnick AJ, Balci BB, Ballantyne T, Lins S, Vally Z, Esteban-Serna C, Schmidt K, Macapagal PML, Szwed P, Zdybek PM, Moreau D, Collins WM, Joy-Gaba JA, Vilares I, Tran US, Boudesseul J, Albayrak-Aydemir N, Dixson BJW, Perillo JT, Ferreira A, Westgate EC, Aberson CL, Arinze AI, Jaeger B, Butt MM, Silva JR, Storage DS, Janak AP, Jiménez-Leal W, Soto JA, Sorokowska A, McCarthy R, Tullett AM, Frias-Armenta M, Ribeiro MFF, Hartanto A, Forbes PAG, Willis ML, Del Carmen Tejada R M, Torres AJO, Stephen ID, Vaidis DC, de la Rosa-Gómez A, Yu K, Sutherland CAM, Manavalan M, Behzadnia B, Urban J, Baskin E, McFall JP, Ogbonnaya CE, Fu CHY, Rahal R-M, Ndukaihe ILG, Hostler TJ, Kappes HB, Sorokowski P, Khosla M, Lazarevic LB, Eudave L, Vilsmeier JK, Luis EO, Muda R, Agadullina E, Cárcamo RA, Reeck C, Anjum G, Venegas MCT, Misiak M, Ryan RM, Nock NL, Travaglino GA, Mensink MC, Feldman G, Wichman AL, Chou W, Ziano I, Seehuus M, Chopik WJ, Kung FYH, Carpentier J, Vaughn LA, Du H, Xiao Q, Lima TJS, Noone C, Onie S, Verbruggen F, Radtke T, Primbs MA</w:t>
       </w:r>
       <w:r>
         <w:t xml:space="preserve">: </w:t>
       </w:r>
       <w:r>
-        <w:t xml:space="preserve">Dangers of including outcome at baseline as a covariate in latent change score models: Results from simulations and empirical re-analyses. </w:t>
+        <w:t xml:space="preserve">The Psychological Science Accelerator’s COVID-19 rapid-response dataset. </w:t>
       </w:r>
       <w:r>
         <w:rPr>
           <w:i/>
         </w:rPr>
-        <w:t>Heliyon</w:t>
-      </w:r>
-      <w:r>
-        <w:t>,9:e15746-e15746, 2023.</w:t>
-      </w:r>
+        <w:t>Scientific Data</w:t>
+      </w:r>
+      <w:r>
+        <w:t>,10:87, 2023.</w:t>
+      </w:r>
+      <w:r>
+        <w:t xml:space="preserve"> </w:t>
+      </w:r>
+      <w:hyperlink r:id="rId26">
+        <w:r>
+          <w:rPr>
+            <w:color w:val="0000EE"/>
+            <w:u w:val="single"/>
+            <w:sz w:val="18"/>
+          </w:rPr>
+          <w:t>doi:10.1038/s41597-022-01811-7</w:t>
+        </w:r>
+      </w:hyperlink>
     </w:p>
     <w:p>
       <w:pPr>
@@ -856,8 +1087,11 @@
         <w:rPr>
           <w:sz w:val="22"/>
         </w:rPr>
-        <w:t>20.</w:t>
+        <w:t>19.</w:t>
         <w:tab/>
+      </w:r>
+      <w:r>
+        <w:t xml:space="preserve">Sorjonen K, Ingre M, </w:t>
       </w:r>
       <w:r>
         <w:rPr>
@@ -866,23 +1100,36 @@
         <w:t>Nilsonne G</w:t>
       </w:r>
       <w:r>
-        <w:t>, Johannesson M, Dreber A</w:t>
+        <w:t>, Melin B</w:t>
       </w:r>
       <w:r>
         <w:t xml:space="preserve">: </w:t>
       </w:r>
       <w:r>
-        <w:t xml:space="preserve">Olika slutsatser från samma data. </w:t>
+        <w:t xml:space="preserve">Dangers of including outcome at baseline as a covariate in latent change score models: Results from simulations and empirical re-analyses. </w:t>
       </w:r>
       <w:r>
         <w:rPr>
           <w:i/>
         </w:rPr>
-        <w:t>Läkartidningen</w:t>
-      </w:r>
-      <w:r>
-        <w:t>, 2023.</w:t>
-      </w:r>
+        <w:t>Heliyon</w:t>
+      </w:r>
+      <w:r>
+        <w:t>,9:e15746-e15746, 2023.</w:t>
+      </w:r>
+      <w:r>
+        <w:t xml:space="preserve"> </w:t>
+      </w:r>
+      <w:hyperlink r:id="rId27">
+        <w:r>
+          <w:rPr>
+            <w:color w:val="0000EE"/>
+            <w:u w:val="single"/>
+            <w:sz w:val="18"/>
+          </w:rPr>
+          <w:t>doi:10.1016/j.heliyon.2023.e15746</w:t>
+        </w:r>
+      </w:hyperlink>
     </w:p>
     <w:p>
       <w:pPr>
@@ -896,11 +1143,8 @@
         <w:rPr>
           <w:sz w:val="22"/>
         </w:rPr>
-        <w:t>21.</w:t>
+        <w:t>20.</w:t>
         <w:tab/>
-      </w:r>
-      <w:r>
-        <w:t xml:space="preserve">Brembs B, Huneman P, Schönbrodt F, </w:t>
       </w:r>
       <w:r>
         <w:rPr>
@@ -909,22 +1153,22 @@
         <w:t>Nilsonne G</w:t>
       </w:r>
       <w:r>
-        <w:t>, Susi T, Siems R, Perakakis P, Trachana V, Ma L, Rodriguez-Cuadrado S</w:t>
+        <w:t>, Johannesson M, Dreber A</w:t>
       </w:r>
       <w:r>
         <w:t xml:space="preserve">: </w:t>
       </w:r>
       <w:r>
-        <w:t xml:space="preserve">Replacing academic journals. </w:t>
+        <w:t xml:space="preserve">Olika slutsatser från samma data. </w:t>
       </w:r>
       <w:r>
         <w:rPr>
           <w:i/>
         </w:rPr>
-        <w:t>Royal Society Open Science</w:t>
-      </w:r>
-      <w:r>
-        <w:t>,10:230206, 2023.</w:t>
+        <w:t>Läkartidningen</w:t>
+      </w:r>
+      <w:r>
+        <w:t>, 2023.</w:t>
       </w:r>
     </w:p>
     <w:p>
@@ -939,11 +1183,11 @@
         <w:rPr>
           <w:sz w:val="22"/>
         </w:rPr>
-        <w:t>22.</w:t>
+        <w:t>21.</w:t>
         <w:tab/>
       </w:r>
       <w:r>
-        <w:t xml:space="preserve">Sorjonen K, Ingre M, Melin B, </w:t>
+        <w:t xml:space="preserve">Brembs B, Huneman P, Schönbrodt F, </w:t>
       </w:r>
       <w:r>
         <w:rPr>
@@ -952,20 +1196,36 @@
         <w:t>Nilsonne G</w:t>
       </w:r>
       <w:r>
+        <w:t>, Susi T, Siems R, Perakakis P, Trachana V, Ma L, Rodriguez-Cuadrado S</w:t>
+      </w:r>
+      <w:r>
         <w:t xml:space="preserve">: </w:t>
       </w:r>
       <w:r>
-        <w:t xml:space="preserve">Unmasking artifactual links: A reanalysis reveals No direct causal relationship between self-esteem and quality of social relations. </w:t>
+        <w:t xml:space="preserve">Replacing academic journals. </w:t>
       </w:r>
       <w:r>
         <w:rPr>
           <w:i/>
         </w:rPr>
-        <w:t>Heliyon</w:t>
-      </w:r>
-      <w:r>
-        <w:t>, 2023.</w:t>
-      </w:r>
+        <w:t>Royal Society Open Science</w:t>
+      </w:r>
+      <w:r>
+        <w:t>,10:230206, 2023.</w:t>
+      </w:r>
+      <w:r>
+        <w:t xml:space="preserve"> </w:t>
+      </w:r>
+      <w:hyperlink r:id="rId28">
+        <w:r>
+          <w:rPr>
+            <w:color w:val="0000EE"/>
+            <w:u w:val="single"/>
+            <w:sz w:val="18"/>
+          </w:rPr>
+          <w:t>doi:10.1098/rsos.230206</w:t>
+        </w:r>
+      </w:hyperlink>
     </w:p>
     <w:p>
       <w:pPr>
@@ -979,11 +1239,11 @@
         <w:rPr>
           <w:sz w:val="22"/>
         </w:rPr>
-        <w:t>23.</w:t>
+        <w:t>22.</w:t>
         <w:tab/>
       </w:r>
       <w:r>
-        <w:t xml:space="preserve">Sorjonen K, Melin B, </w:t>
+        <w:t xml:space="preserve">Sorjonen K, Ingre M, Melin B, </w:t>
       </w:r>
       <w:r>
         <w:rPr>
@@ -995,17 +1255,30 @@
         <w:t xml:space="preserve">: </w:t>
       </w:r>
       <w:r>
-        <w:t xml:space="preserve">Spurious heritability of ability tilts: A comment on Coyle et al. (2023). </w:t>
+        <w:t xml:space="preserve">Unmasking artifactual links: A reanalysis reveals No direct causal relationship between self-esteem and quality of social relations. </w:t>
       </w:r>
       <w:r>
         <w:rPr>
           <w:i/>
         </w:rPr>
-        <w:t>Personality and Individual Differences</w:t>
+        <w:t>Heliyon</w:t>
       </w:r>
       <w:r>
         <w:t>, 2023.</w:t>
       </w:r>
+      <w:r>
+        <w:t xml:space="preserve"> </w:t>
+      </w:r>
+      <w:hyperlink r:id="rId29">
+        <w:r>
+          <w:rPr>
+            <w:color w:val="0000EE"/>
+            <w:u w:val="single"/>
+            <w:sz w:val="18"/>
+          </w:rPr>
+          <w:t>doi:10.1016/j.heliyon.2023.e20397</w:t>
+        </w:r>
+      </w:hyperlink>
     </w:p>
     <w:p>
       <w:pPr>
@@ -1019,7 +1292,7 @@
         <w:rPr>
           <w:sz w:val="22"/>
         </w:rPr>
-        <w:t>24.</w:t>
+        <w:t>23.</w:t>
         <w:tab/>
       </w:r>
       <w:r>
@@ -1035,17 +1308,30 @@
         <w:t xml:space="preserve">: </w:t>
       </w:r>
       <w:r>
-        <w:t xml:space="preserve">Inconclusive evidence for an increasing effect of maternal supportiveness on childhood intelligence in Dunkel et al. (2023): A simulated reanalysis. </w:t>
+        <w:t xml:space="preserve">Spurious heritability of ability tilts: A comment on Coyle et al. (2023). </w:t>
       </w:r>
       <w:r>
         <w:rPr>
           <w:i/>
         </w:rPr>
-        <w:t>Intelligence</w:t>
-      </w:r>
-      <w:r>
-        <w:t>,104:101815-101815, 2023.</w:t>
-      </w:r>
+        <w:t>Personality and Individual Differences</w:t>
+      </w:r>
+      <w:r>
+        <w:t>, 2023.</w:t>
+      </w:r>
+      <w:r>
+        <w:t xml:space="preserve"> </w:t>
+      </w:r>
+      <w:hyperlink r:id="rId30">
+        <w:r>
+          <w:rPr>
+            <w:color w:val="0000EE"/>
+            <w:u w:val="single"/>
+            <w:sz w:val="18"/>
+          </w:rPr>
+          <w:t>doi:10.31234/osf.io/kds5c</w:t>
+        </w:r>
+      </w:hyperlink>
     </w:p>
     <w:p>
       <w:pPr>
@@ -1059,11 +1345,11 @@
         <w:rPr>
           <w:sz w:val="22"/>
         </w:rPr>
-        <w:t>25.</w:t>
+        <w:t>24.</w:t>
         <w:tab/>
       </w:r>
       <w:r>
-        <w:t xml:space="preserve">Sorjonen K, </w:t>
+        <w:t xml:space="preserve">Sorjonen K, Melin B, </w:t>
       </w:r>
       <w:r>
         <w:rPr>
@@ -1072,23 +1358,33 @@
         <w:t>Nilsonne G</w:t>
       </w:r>
       <w:r>
-        <w:t>, Ingre M, Melin B</w:t>
-      </w:r>
-      <w:r>
         <w:t xml:space="preserve">: </w:t>
       </w:r>
       <w:r>
-        <w:t xml:space="preserve">Spurious correlations in research on ability tilt. </w:t>
+        <w:t xml:space="preserve">Inconclusive evidence for an increasing effect of maternal supportiveness on childhood intelligence in Dunkel et al. (2023): A simulated reanalysis. </w:t>
       </w:r>
       <w:r>
         <w:rPr>
           <w:i/>
         </w:rPr>
-        <w:t>Personality and Individual Differences</w:t>
-      </w:r>
-      <w:r>
-        <w:t>,185:111268-111268, 2022.</w:t>
-      </w:r>
+        <w:t>Intelligence</w:t>
+      </w:r>
+      <w:r>
+        <w:t>,104:101815-101815, 2023.</w:t>
+      </w:r>
+      <w:r>
+        <w:t xml:space="preserve"> </w:t>
+      </w:r>
+      <w:hyperlink r:id="rId31">
+        <w:r>
+          <w:rPr>
+            <w:color w:val="0000EE"/>
+            <w:u w:val="single"/>
+            <w:sz w:val="18"/>
+          </w:rPr>
+          <w:t>doi:10.1016/j.intell.2024.101815</w:t>
+        </w:r>
+      </w:hyperlink>
     </w:p>
     <w:p>
       <w:pPr>
@@ -1102,11 +1398,11 @@
         <w:rPr>
           <w:sz w:val="22"/>
         </w:rPr>
-        <w:t>26.</w:t>
+        <w:t>25.</w:t>
         <w:tab/>
       </w:r>
       <w:r>
-        <w:t xml:space="preserve">Sorjonen K, Melin B, </w:t>
+        <w:t xml:space="preserve">Sorjonen K, </w:t>
       </w:r>
       <w:r>
         <w:rPr>
@@ -1115,10 +1411,13 @@
         <w:t>Nilsonne G</w:t>
       </w:r>
       <w:r>
+        <w:t>, Ingre M, Melin B</w:t>
+      </w:r>
+      <w:r>
         <w:t xml:space="preserve">: </w:t>
       </w:r>
       <w:r>
-        <w:t xml:space="preserve">Lord’s paradox in latent change score modeling: an example involving facilitating longitudinal effects between intelligence and academic achievement. </w:t>
+        <w:t xml:space="preserve">Spurious correlations in research on ability tilt. </w:t>
       </w:r>
       <w:r>
         <w:rPr>
@@ -1127,8 +1426,21 @@
         <w:t>Personality and Individual Differences</w:t>
       </w:r>
       <w:r>
-        <w:t>, 2022.</w:t>
-      </w:r>
+        <w:t>,185:111268-111268, 2022.</w:t>
+      </w:r>
+      <w:r>
+        <w:t xml:space="preserve"> </w:t>
+      </w:r>
+      <w:hyperlink r:id="rId32">
+        <w:r>
+          <w:rPr>
+            <w:color w:val="0000EE"/>
+            <w:u w:val="single"/>
+            <w:sz w:val="18"/>
+          </w:rPr>
+          <w:t>doi:10.1016/j.paid.2021.111268</w:t>
+        </w:r>
+      </w:hyperlink>
     </w:p>
     <w:p>
       <w:pPr>
@@ -1142,11 +1454,11 @@
         <w:rPr>
           <w:sz w:val="22"/>
         </w:rPr>
-        <w:t>27.</w:t>
+        <w:t>26.</w:t>
         <w:tab/>
       </w:r>
       <w:r>
-        <w:t xml:space="preserve">Sorjonen K, </w:t>
+        <w:t xml:space="preserve">Sorjonen K, Melin B, </w:t>
       </w:r>
       <w:r>
         <w:rPr>
@@ -1155,23 +1467,33 @@
         <w:t>Nilsonne G</w:t>
       </w:r>
       <w:r>
-        <w:t>, Ingre M, Melin B</w:t>
-      </w:r>
-      <w:r>
         <w:t xml:space="preserve">: </w:t>
       </w:r>
       <w:r>
-        <w:t xml:space="preserve">Curiosity might not help after all: Predicted trajectories for need for cognition and anxiety and depression symptoms based on findings by Zainal and Newman (2022). </w:t>
+        <w:t xml:space="preserve">Lord’s paradox in latent change score modeling: an example involving facilitating longitudinal effects between intelligence and academic achievement. </w:t>
       </w:r>
       <w:r>
         <w:rPr>
           <w:i/>
         </w:rPr>
-        <w:t>Journal of Affective Disorders</w:t>
-      </w:r>
-      <w:r>
-        <w:t>,302:412-414, 2022.</w:t>
-      </w:r>
+        <w:t>Personality and Individual Differences</w:t>
+      </w:r>
+      <w:r>
+        <w:t>, 2022.</w:t>
+      </w:r>
+      <w:r>
+        <w:t xml:space="preserve"> </w:t>
+      </w:r>
+      <w:hyperlink r:id="rId33">
+        <w:r>
+          <w:rPr>
+            <w:color w:val="0000EE"/>
+            <w:u w:val="single"/>
+            <w:sz w:val="18"/>
+          </w:rPr>
+          <w:t>doi:10.1016/j.paid.2021.111520</w:t>
+        </w:r>
+      </w:hyperlink>
     </w:p>
     <w:p>
       <w:pPr>
@@ -1185,27 +1507,49 @@
         <w:rPr>
           <w:sz w:val="22"/>
         </w:rPr>
-        <w:t>28.</w:t>
+        <w:t>27.</w:t>
         <w:tab/>
       </w:r>
       <w:r>
-        <w:t>Delios A, Clemente EG, Wu T, Tan H, Wang Y, Gordon M, Viganola D, Chen Z, Dreber A, Johannesson M, Pfeiffer T, Generalizability Tests Forecasting Collaboration, Uhlmann E</w:t>
+        <w:t xml:space="preserve">Sorjonen K, </w:t>
+      </w:r>
+      <w:r>
+        <w:rPr>
+          <w:b/>
+        </w:rPr>
+        <w:t>Nilsonne G</w:t>
+      </w:r>
+      <w:r>
+        <w:t>, Ingre M, Melin B</w:t>
       </w:r>
       <w:r>
         <w:t xml:space="preserve">: </w:t>
       </w:r>
       <w:r>
-        <w:t xml:space="preserve">Examining the generalizability of research findings from archival data. </w:t>
+        <w:t xml:space="preserve">Curiosity might not help after all: Predicted trajectories for need for cognition and anxiety and depression symptoms based on findings by Zainal and Newman (2022). </w:t>
       </w:r>
       <w:r>
         <w:rPr>
           <w:i/>
         </w:rPr>
-        <w:t>Proceedings of the National Academy of Sciences</w:t>
-      </w:r>
-      <w:r>
-        <w:t>, 2022.</w:t>
-      </w:r>
+        <w:t>Journal of Affective Disorders</w:t>
+      </w:r>
+      <w:r>
+        <w:t>,302:412-414, 2022.</w:t>
+      </w:r>
+      <w:r>
+        <w:t xml:space="preserve"> </w:t>
+      </w:r>
+      <w:hyperlink r:id="rId34">
+        <w:r>
+          <w:rPr>
+            <w:color w:val="0000EE"/>
+            <w:u w:val="single"/>
+            <w:sz w:val="18"/>
+          </w:rPr>
+          <w:t>doi:10.1016/j.jad.2022.01.109</w:t>
+        </w:r>
+      </w:hyperlink>
     </w:p>
     <w:p>
       <w:pPr>
@@ -1219,36 +1563,40 @@
         <w:rPr>
           <w:sz w:val="22"/>
         </w:rPr>
-        <w:t>29.</w:t>
+        <w:t>28.</w:t>
         <w:tab/>
       </w:r>
       <w:r>
-        <w:t xml:space="preserve">Bourget M-H, Kamentsky L, Ghosh S, Mazzamuto G, Lazari A, Markiewicz CJ, Oostenveld R, Niso G, Halchenko YO, Lipp I, Takerkart S, Toussaint P-J, Khan AR, </w:t>
-      </w:r>
-      <w:r>
-        <w:rPr>
-          <w:b/>
-        </w:rPr>
-        <w:t>Nilsonne G</w:t>
-      </w:r>
-      <w:r>
-        <w:t>, Castelli FM, BIDS Maintainers, Cohen-Adad J</w:t>
+        <w:t>Delios A, Clemente EG, Wu T, Tan H, Wang Y, Gordon M, Viganola D, Chen Z, Dreber A, Johannesson M, Pfeiffer T, Generalizability Tests Forecasting Collaboration, Uhlmann E</w:t>
       </w:r>
       <w:r>
         <w:t xml:space="preserve">: </w:t>
       </w:r>
       <w:r>
-        <w:t xml:space="preserve">Microscopy-BIDS: an extension to the Brain Imaging Data Structure for Microscopy Data. </w:t>
+        <w:t xml:space="preserve">Examining the generalizability of research findings from archival data. </w:t>
       </w:r>
       <w:r>
         <w:rPr>
           <w:i/>
         </w:rPr>
-        <w:t>Frontiers in Neuroscience</w:t>
-      </w:r>
-      <w:r>
-        <w:t>,16:871228, 2022.</w:t>
-      </w:r>
+        <w:t>Proceedings of the National Academy of Sciences</w:t>
+      </w:r>
+      <w:r>
+        <w:t>, 2022.</w:t>
+      </w:r>
+      <w:r>
+        <w:t xml:space="preserve"> </w:t>
+      </w:r>
+      <w:hyperlink r:id="rId35">
+        <w:r>
+          <w:rPr>
+            <w:color w:val="0000EE"/>
+            <w:u w:val="single"/>
+            <w:sz w:val="18"/>
+          </w:rPr>
+          <w:t>doi:10.1073/pnas.2120377119</w:t>
+        </w:r>
+      </w:hyperlink>
     </w:p>
     <w:p>
       <w:pPr>
@@ -1262,27 +1610,49 @@
         <w:rPr>
           <w:sz w:val="22"/>
         </w:rPr>
-        <w:t>30.</w:t>
+        <w:t>29.</w:t>
         <w:tab/>
       </w:r>
       <w:r>
-        <w:t>Psychological Science Accelerator Self-Determination Theory Collaboration</w:t>
+        <w:t xml:space="preserve">Bourget M-H, Kamentsky L, Ghosh S, Mazzamuto G, Lazari A, Markiewicz CJ, Oostenveld R, Niso G, Halchenko YO, Lipp I, Takerkart S, Toussaint P-J, Khan AR, </w:t>
+      </w:r>
+      <w:r>
+        <w:rPr>
+          <w:b/>
+        </w:rPr>
+        <w:t>Nilsonne G</w:t>
+      </w:r>
+      <w:r>
+        <w:t>, Castelli FM, BIDS Maintainers, Cohen-Adad J</w:t>
       </w:r>
       <w:r>
         <w:t xml:space="preserve">: </w:t>
       </w:r>
       <w:r>
-        <w:t xml:space="preserve">A global experiment on motivating social distancing during the COVID-19 pandemic. </w:t>
+        <w:t xml:space="preserve">Microscopy-BIDS: an extension to the Brain Imaging Data Structure for Microscopy Data. </w:t>
       </w:r>
       <w:r>
         <w:rPr>
           <w:i/>
         </w:rPr>
-        <w:t>Proceedings of the National Academy of Sciences</w:t>
-      </w:r>
-      <w:r>
-        <w:t>,119:e2111091119, 2022.</w:t>
-      </w:r>
+        <w:t>Frontiers in Neuroscience</w:t>
+      </w:r>
+      <w:r>
+        <w:t>,16:871228, 2022.</w:t>
+      </w:r>
+      <w:r>
+        <w:t xml:space="preserve"> </w:t>
+      </w:r>
+      <w:hyperlink r:id="rId36">
+        <w:r>
+          <w:rPr>
+            <w:color w:val="0000EE"/>
+            <w:u w:val="single"/>
+            <w:sz w:val="18"/>
+          </w:rPr>
+          <w:t>doi:10.3389/fnins.2022.871228</w:t>
+        </w:r>
+      </w:hyperlink>
     </w:p>
     <w:p>
       <w:pPr>
@@ -1296,36 +1666,40 @@
         <w:rPr>
           <w:sz w:val="22"/>
         </w:rPr>
-        <w:t>31.</w:t>
+        <w:t>30.</w:t>
         <w:tab/>
       </w:r>
       <w:r>
-        <w:t xml:space="preserve">Sorjonen K, </w:t>
-      </w:r>
-      <w:r>
-        <w:rPr>
-          <w:b/>
-        </w:rPr>
-        <w:t>Nilsonne G</w:t>
-      </w:r>
-      <w:r>
-        <w:t>, Ingre M, Melin B</w:t>
+        <w:t>Psychological Science Accelerator Self-Determination Theory Collaboration</w:t>
       </w:r>
       <w:r>
         <w:t xml:space="preserve">: </w:t>
       </w:r>
       <w:r>
-        <w:t xml:space="preserve">Regression to the mean in latent change score models: an example involving breastfeeding and intelligence. </w:t>
+        <w:t xml:space="preserve">A global experiment on motivating social distancing during the COVID-19 pandemic. </w:t>
       </w:r>
       <w:r>
         <w:rPr>
           <w:i/>
         </w:rPr>
-        <w:t>BMC Pediatrics</w:t>
-      </w:r>
-      <w:r>
-        <w:t>,22:283, 2022.</w:t>
-      </w:r>
+        <w:t>Proceedings of the National Academy of Sciences</w:t>
+      </w:r>
+      <w:r>
+        <w:t>,119:e2111091119, 2022.</w:t>
+      </w:r>
+      <w:r>
+        <w:t xml:space="preserve"> </w:t>
+      </w:r>
+      <w:hyperlink r:id="rId37">
+        <w:r>
+          <w:rPr>
+            <w:color w:val="0000EE"/>
+            <w:u w:val="single"/>
+            <w:sz w:val="18"/>
+          </w:rPr>
+          <w:t>doi:10.1073/pnas.2111091119</w:t>
+        </w:r>
+      </w:hyperlink>
     </w:p>
     <w:p>
       <w:pPr>
@@ -1339,11 +1713,11 @@
         <w:rPr>
           <w:sz w:val="22"/>
         </w:rPr>
-        <w:t>32.</w:t>
+        <w:t>31.</w:t>
         <w:tab/>
       </w:r>
       <w:r>
-        <w:t xml:space="preserve">Dorison CA, Lerner JS, Heller BH, Rothman AJ, Kawachi II, Wang K, Rees VW, Gill BP, Gibbs N, Ebersole CR, Vally Z, Tajchman Z, Zsido AN, Zrimsek M, Chen Z, Ziano I, Gialitaki Z, Ceary CD, Lin Y, Kunisato Y, Yamada Y, Xiao Q, Jiang X, Du X, Yao E, Wilson JP, Cyrus-Lai W, Jimenez-Leal W, Law W, Collins WM, Richard KL, Vranka M, Ankushev V, Schei V, Križanić V, Kadreva VH, Adoric VC, Tran US, Yeung SK, Hassan W, Houston R, Lima TJS, Ostermann T, Frizzo T, Sverdrup TE, House T, Gill T, Fedotov M, Paltrow T, Jernsäther T, Koptjevskaja-Tamm M, Hostler TJ, Ishii T, Szaszi B, Adamus S, Suter L, Habib S, Studzinska A, Stojanovska D, Janssen SMJ, Stieger S, Schulenberg SE, Tatachari S, Azouaghe S, Sorokowski P, Sorokowska A, Song X, Lewis SC, Sinkolova S, Grigoryev D, Drexler SM, Daches S, Geniole SN, Vračar S, Massoni S, Zorjan S, Sarıoğuz E, Izquierdo SM, Alves SG, Pöntinen S, Solas SÁ, Ordoñez-Riaño S, Očovaj SB, Onie S, Lins S, Çoksan S, Sacakli A, Ruiz-Fernández S, Geiger SJ, FatahModares S, Walczak RB, Betlehem R, Vilar R, Cárcamo R, Ross RM, McCarthy R, Ballantyne T, Westgate EC, Afhami R, Ren D, Monteiro RP, Reips U-D, Reggev N, Calin-Jageman RJ, Pourafshari R, Oliveira R, Nedelcheva-Datsova M, Rahal R-M, Ribeiro RR, Radtke T, Searston R, Habte R, Zdybek P, Chen S-C, Maturan PLG, Perillo JT, Isager PM, Kačmár P, Macapagal PM, Szwed P, Hanel PHP, Forbes PAG, Arriaga P, Paris B, Papachristopoulos K, Correa PS, Kácha O, Bernardo M, Campos O, Bravo ON, Galindo-Caballero OJ, Ogbonnaya CE, Bialobrzeska O, Kiselnikova N, Simonovic N, Cohen N, Nock NL, Johannes N, Albayrak-Aydemir N, Say N, Torunsky N, Van Doren N, Sunami N, Rachev NR, Majeed NM, Schmidt N-D, Nadif K, Corral-Frías NS, Ouherrou N, Pantazi M, Lucas MY, Vasilev MR, Ortiz MV, Butt MM, Kabir M, Muda R, Tejada Rivera MDCM, Sirota M, Seehuus M, Parzuchowski M, Toro M, Hricova M, Maldonado MA, Marszalek M, Karekla M, Mioni G, Bosma MJ, Westerlund M, Vdovic M, Bialek M, Silan MA, Anne M, Misiak M, Grinberg M, Capizzi M, Espinoza Barría MF, Kurfali MA, Mensink MC, Harutyunyan M, Khosla M, Korbmacher M, Adamkovič M, Ribeiro MFF, Terskova M, Hruška M, Martončik M, Voracek M, Čadek M, Frías-Armenta M, Kowal M, Topor M, Roczniewska M, Oosterlinck M, Kohlová MB, Paruzel-Czachura M, Romanova M, Papadatou-Pastou M, Lund ML, Antoniadi M, Jones MV, Ortiz MS, Manavalan M, Muminov A, Kossowska M, Friedemann M, Wielgus M, Varella MAC, Colloff MF, Bradford M, Vaughn LA, Eudave L, Vieira L, Pineda LMS, Pérez LC, Lazarevic LB, Jaremka LM, Kushnir E, Anton-Boicuk L, de Holanda Coelho GL, Ahlgren L, Levitan CA, Micheli L, Volz L, Stojanovska M, Boucher L, Samojlenko L, Delgado LGJ, Kaliska L, Warmelink L, Rojas-Berscia LM, Yu K, Wachowicz J, Desai K, Barzykowski K, Kozma L, Evans K, Kirgizova K, Agesin BE, Koehn MA, Wolfe K, Korobova T, Klevjer K, van Schie K, Vezirian K, Damnjanović K, Thommesen KK, Schmidt K, Filip K, Grzech K, Hoyer K, Moon K, Rana K, Janjić K, Suchow JW, Kielińska J, Cruz Vásquez JE, Beitner J, Vargas-Nieto JC, Roxas JCT, Taber J, Urriago-Rayo J, Pavlacic JM, Bavolar J, Soto JA, Olofsson JK, Vilsmeier JK, Messerschmidt J, Czamanski-Cohen J, Boudesseul J, Lee JM, Kamburidis J, Zickfeld J, Miranda JF, Verharen JPH, Hristova E, Beshears JE, Đorđević JM, Bosch J, Valentova JV, Antfolk J, Berkessel JB, Schrötter J, Urban J, Röer JP, Norton JO, Silva JR, Pickering JS, Vintr J, Uttley J, Kunst JR, Ndukaihe ILG, Iyer A, Vilares I, Ivanov A, Ropovik I, Sula I, Sarieva I, Metin-Orta I, Prusova I, Pinto I, Bozdoc AI, Almeida IAT, Pit IL, Dalgar I, Zakharov I, Arinze AI, Ihaya K, Stephen ID, Gjoneska B, Brohmer H, Flowe H, Godbersen H, Kocalar HE, Hedgebeth MV, Chuan-Peng H, Sharifian M, Manley H, Akkas H, Hajdu N, Azab H, Kaminski G, </w:t>
+        <w:t xml:space="preserve">Sorjonen K, </w:t>
       </w:r>
       <w:r>
         <w:rPr>
@@ -1352,23 +1726,36 @@
         <w:t>Nilsonne G</w:t>
       </w:r>
       <w:r>
-        <w:t>, Anjum G, Travaglino GA, Feldman G, Pfuhl G, Czarnek G, Marcu GM, Hofer G, Banik G, Adetula GA, Bijlstra G, Verbruggen F, Kung FYH, Foroni F, Singer G, Muchembled F, Azevedo F, Mosannenzadeh F, Marinov E, Štrukelj E, Etebari Z, Baskin E, Garcia EOL, Musser E, van Steenkiste IMM, Ahn ER, Pronizius E, Jackson EA, Manunta E, Agadullina E, Šakan D, Dursun P, Dujols O, Dubrov D, Willis M, Tümer M, Beaudry JL, Popović D, Dunleavy D, Djamai I, Krupić D, Vega D, Du H, Mola D, Davis WE, Holford DL, Lewis DMG, Vaidis DC, Ozery DH, Ricaurte DZ, Storage D, Sousa D, Alvarez DS, Rosa AD, Krupić D, Marko D, Moreau D, Reeck C, Correia RC, Whitt CM, Lamm C, Solorzano CS, von Bastian CC, Sutherland CA, Overkott C, Aberson CL, Wang C, Karashiali C, Noone C, Chiu F, Picciocchi C, Karaarslan C, Cellini N, Esteban-Serna C, Reyna C, Batres C, Li R, Grano C, Carpentier J, Tamnes CK, Fu CHY, Ishkhanyan B, Bylinina L, Jaeger B, Bundt C, Allred TB, Bokkour A, Bogatyreva N, Chopik WJ, Antazo B, Behzadnia B, Becker M, Cocco B, Chou W-L, Hubena B, Žuro B, Aczel B, Baklanova E, Bai H, Balci BB, Babinčák P, Dixson BJW, Mokady A, Kappes HB, Atari M, Szala A, Szabelska A, Aruta JJB, Domurat A, Arinze NC, Modena A, Adiguzel A, Monajem A, Arabi KAE, Özdoğru AA, Olaya Torres AJ, Theodoropoulou A, Jurković AP, Kassianos AP, Findor A, Hartanto A, Thibault Landry A, Ferreira A, Santos AC, De la Rosa-Gomez A, Gourdon-Kanhukamwe A, Todsen AL, Karababa A, Janak A, Bran A, Tullett AM, Kuzminska AO, Krafnick AJ, Urooj A, Khaoudi A, Ahmed A, Groyecka-Bernard A, Askelund AD, Adetula A, Belaus A, Charyate AC, Wichman AL, Stoyanova A, Greenburgh A, Thomas AG, Arvanitis A, Forscher PS, Mallik PR, Primbs MA, Miller JK, Moshontz H, Urry HL, IJzerman H, Basnight-Brown DM, Chartier CR, Buchanan EM, Coles NA</w:t>
+        <w:t>, Ingre M, Melin B</w:t>
       </w:r>
       <w:r>
         <w:t xml:space="preserve">: </w:t>
       </w:r>
       <w:r>
-        <w:t xml:space="preserve">In COVID-19 health messaging, loss framing increases anxiety with little-to-no concomitant benefits: Experimental evidence from 84 countries. </w:t>
+        <w:t xml:space="preserve">Regression to the mean in latent change score models: an example involving breastfeeding and intelligence. </w:t>
       </w:r>
       <w:r>
         <w:rPr>
           <w:i/>
         </w:rPr>
-        <w:t>Affective science</w:t>
-      </w:r>
-      <w:r>
-        <w:t>,3:577-602, 2022.</w:t>
-      </w:r>
+        <w:t>BMC Pediatrics</w:t>
+      </w:r>
+      <w:r>
+        <w:t>,22:283, 2022.</w:t>
+      </w:r>
+      <w:r>
+        <w:t xml:space="preserve"> </w:t>
+      </w:r>
+      <w:hyperlink r:id="rId38">
+        <w:r>
+          <w:rPr>
+            <w:color w:val="0000EE"/>
+            <w:u w:val="single"/>
+            <w:sz w:val="18"/>
+          </w:rPr>
+          <w:t>doi:10.1186/s12887-022-03349-4</w:t>
+        </w:r>
+      </w:hyperlink>
     </w:p>
     <w:p>
       <w:pPr>
@@ -1382,11 +1769,11 @@
         <w:rPr>
           <w:sz w:val="22"/>
         </w:rPr>
-        <w:t>33.</w:t>
+        <w:t>32.</w:t>
         <w:tab/>
       </w:r>
       <w:r>
-        <w:t xml:space="preserve">Hoogeveen S, Sarafoglou A, Aczel B, Aditya Y, Alayan AJ, Allen PJ, Altay S, Alzahawi S, Amir Y, Anthony F-V, Appiah OK, Atkinson QD, Baimel A, Balkaya-Ince M, Balsamo M, Banker S, Bartos F, Becerra M, Beffara B, Beitner J, Bendixen T, Berkessel JB, Berniunas R, Billet MI, Billingsley J, Bortolini T, Breitsohl H, Bret A, Brown FL, Brown J, Brumbaugh CC, Buczny J, Bulbulia J, Caballero S, Carlucci L, Carmichael CL, Cattaneo MEGV, Charles SJ, Claessens S, Panagopoulos MC, Costa AB, Crone DL, Czoschke S, Czymara C, D'Urso ED, Dahlstrom O, Dalla Rosa A, Danielsson H, De Ron J, de Vries YA, Dean KK, Dik BJ, Disabato DJ, Doherty JK, Draws T, Drouhot L, Dujmovic M, Dunham Y, Ebert T, Edelsbrunner PA, Eerland A, Elbaek CT, Farahmand S, Farahmand H, Farias M, Feliccia AA, Fischer K, Fischer R, Fisher-Thompson D, Francis Z, Frick S, Frisch LK, Geraldes D, Gerdin E, Geven L, Ghasemi O, Gielens E, Gligoric V, Hagel K, Hajdu N, Hamilton HR, Hamzah I, Hanel PHP, Hawk CE, Himawan KK, Holding BC, Homman LE, Ingendahl M, Inkila H, Inman ML, Islam C-G, Isler O, Izydorczyk D, Jaeger B, Johnson KA, Jong J, Karl JA, Kaszubowski E, Katz BA, Keefer LA, Kelchtermans S, Kelly JM, Klein RA, Kleinberg B, Knowles ML, Kolczynska M, Koller D, Krasko J, Kritzler S, Krypotos A-M, Kyritsis T, Landes TL, Laukenmann R, Forsyth GAL, Lazar A, Lehman BJ, Levy N, Lo RF, Lodder P, Lorenz J, Lowicki P, Ly AL, Maassen E, Magyar-Russell GM, Maier M, Marsh DR, Martinez N, Martinie M, Martoyo I, Mason SE, Mauritsen AL, McAleer P, McCauley T, McCullough M, McKay R, McMahon CM, McNamara AA, Means KK, Mercier B, Mitkidis P, Monin B, Moon JW, Moreau D, Morgan J, Murphy J, Muscatt G, Nagel C, Nagy T, Nalborczyk L, </w:t>
+        <w:t xml:space="preserve">Dorison CA, Lerner JS, Heller BH, Rothman AJ, Kawachi II, Wang K, Rees VW, Gill BP, Gibbs N, Ebersole CR, Vally Z, Tajchman Z, Zsido AN, Zrimsek M, Chen Z, Ziano I, Gialitaki Z, Ceary CD, Lin Y, Kunisato Y, Yamada Y, Xiao Q, Jiang X, Du X, Yao E, Wilson JP, Cyrus-Lai W, Jimenez-Leal W, Law W, Collins WM, Richard KL, Vranka M, Ankushev V, Schei V, Križanić V, Kadreva VH, Adoric VC, Tran US, Yeung SK, Hassan W, Houston R, Lima TJS, Ostermann T, Frizzo T, Sverdrup TE, House T, Gill T, Fedotov M, Paltrow T, Jernsäther T, Koptjevskaja-Tamm M, Hostler TJ, Ishii T, Szaszi B, Adamus S, Suter L, Habib S, Studzinska A, Stojanovska D, Janssen SMJ, Stieger S, Schulenberg SE, Tatachari S, Azouaghe S, Sorokowski P, Sorokowska A, Song X, Lewis SC, Sinkolova S, Grigoryev D, Drexler SM, Daches S, Geniole SN, Vračar S, Massoni S, Zorjan S, Sarıoğuz E, Izquierdo SM, Alves SG, Pöntinen S, Solas SÁ, Ordoñez-Riaño S, Očovaj SB, Onie S, Lins S, Çoksan S, Sacakli A, Ruiz-Fernández S, Geiger SJ, FatahModares S, Walczak RB, Betlehem R, Vilar R, Cárcamo R, Ross RM, McCarthy R, Ballantyne T, Westgate EC, Afhami R, Ren D, Monteiro RP, Reips U-D, Reggev N, Calin-Jageman RJ, Pourafshari R, Oliveira R, Nedelcheva-Datsova M, Rahal R-M, Ribeiro RR, Radtke T, Searston R, Habte R, Zdybek P, Chen S-C, Maturan PLG, Perillo JT, Isager PM, Kačmár P, Macapagal PM, Szwed P, Hanel PHP, Forbes PAG, Arriaga P, Paris B, Papachristopoulos K, Correa PS, Kácha O, Bernardo M, Campos O, Bravo ON, Galindo-Caballero OJ, Ogbonnaya CE, Bialobrzeska O, Kiselnikova N, Simonovic N, Cohen N, Nock NL, Johannes N, Albayrak-Aydemir N, Say N, Torunsky N, Van Doren N, Sunami N, Rachev NR, Majeed NM, Schmidt N-D, Nadif K, Corral-Frías NS, Ouherrou N, Pantazi M, Lucas MY, Vasilev MR, Ortiz MV, Butt MM, Kabir M, Muda R, Tejada Rivera MDCM, Sirota M, Seehuus M, Parzuchowski M, Toro M, Hricova M, Maldonado MA, Marszalek M, Karekla M, Mioni G, Bosma MJ, Westerlund M, Vdovic M, Bialek M, Silan MA, Anne M, Misiak M, Grinberg M, Capizzi M, Espinoza Barría MF, Kurfali MA, Mensink MC, Harutyunyan M, Khosla M, Korbmacher M, Adamkovič M, Ribeiro MFF, Terskova M, Hruška M, Martončik M, Voracek M, Čadek M, Frías-Armenta M, Kowal M, Topor M, Roczniewska M, Oosterlinck M, Kohlová MB, Paruzel-Czachura M, Romanova M, Papadatou-Pastou M, Lund ML, Antoniadi M, Jones MV, Ortiz MS, Manavalan M, Muminov A, Kossowska M, Friedemann M, Wielgus M, Varella MAC, Colloff MF, Bradford M, Vaughn LA, Eudave L, Vieira L, Pineda LMS, Pérez LC, Lazarevic LB, Jaremka LM, Kushnir E, Anton-Boicuk L, de Holanda Coelho GL, Ahlgren L, Levitan CA, Micheli L, Volz L, Stojanovska M, Boucher L, Samojlenko L, Delgado LGJ, Kaliska L, Warmelink L, Rojas-Berscia LM, Yu K, Wachowicz J, Desai K, Barzykowski K, Kozma L, Evans K, Kirgizova K, Agesin BE, Koehn MA, Wolfe K, Korobova T, Klevjer K, van Schie K, Vezirian K, Damnjanović K, Thommesen KK, Schmidt K, Filip K, Grzech K, Hoyer K, Moon K, Rana K, Janjić K, Suchow JW, Kielińska J, Cruz Vásquez JE, Beitner J, Vargas-Nieto JC, Roxas JCT, Taber J, Urriago-Rayo J, Pavlacic JM, Bavolar J, Soto JA, Olofsson JK, Vilsmeier JK, Messerschmidt J, Czamanski-Cohen J, Boudesseul J, Lee JM, Kamburidis J, Zickfeld J, Miranda JF, Verharen JPH, Hristova E, Beshears JE, Đorđević JM, Bosch J, Valentova JV, Antfolk J, Berkessel JB, Schrötter J, Urban J, Röer JP, Norton JO, Silva JR, Pickering JS, Vintr J, Uttley J, Kunst JR, Ndukaihe ILG, Iyer A, Vilares I, Ivanov A, Ropovik I, Sula I, Sarieva I, Metin-Orta I, Prusova I, Pinto I, Bozdoc AI, Almeida IAT, Pit IL, Dalgar I, Zakharov I, Arinze AI, Ihaya K, Stephen ID, Gjoneska B, Brohmer H, Flowe H, Godbersen H, Kocalar HE, Hedgebeth MV, Chuan-Peng H, Sharifian M, Manley H, Akkas H, Hajdu N, Azab H, Kaminski G, </w:t>
       </w:r>
       <w:r>
         <w:rPr>
@@ -1395,23 +1782,36 @@
         <w:t>Nilsonne G</w:t>
       </w:r>
       <w:r>
-        <w:t>, Noack P, Norenzayan A, Nuijten MB, Olsson-Collentine A, Oviedo L, Pavlov YG, Pawelski JO, Pearson HI, Pedder H, Peetz HK, Pinus M, Pirutinsky S, Polito V, Porubanova M, Poulin MJ, Prenoveau JM, Prince MA, Protzko J, Pryor C, Purzycki BG, Qiu L, Putter JQ, Rabelo A, Radell ML, Ramsay JE, Reid G, Roberts AJ, Luna LMR, Ross RM, Roszak P, Roy N, Saarelainen S-MK, Sasaki JY, Schaumans C, Schivinski B, Schmitt MC, Schnitker SA, Schnuerch M, Schreiner MR, Schuttengruber V, Sebben S, Segerstrom SC, Seryczynska B, Shjoedt U, Simsek M, Sleegers WWA, Smith ER, Sowden WJ, Spath M, Sporlein C, Stedden W, Stoevenbelt AH, Stuber S, Sulik J, Suwartono C, Syropoulos S, Szaszi B, Szecsi P, Tappin BM, Tay L, Thibault RT, Thompson B, Thurn CM, Torralba J, Tuthill SD, Ullein A-M, Van Aert RCM, van Assen MALM, Van Cappellen P, van den Akker OR, Van der Cruyssen I, Van der Noll J, van Dongen NNN, Van Lissa CJ, van Mulukom V, van Ravenzwaaij D, van Zyl CJJ, Vaughn LA, Verschuere B, Vianello M, Vilanova F, Vishkin A, Vogel V, Vogelsmeier LVDE, Watanabe S, White CJM, Wiebels K, Wiechert S, Willett ZZ, Witkowiak M, Witvliet CVO, Wiwad D, Wuyts R, Xygalatas D, Yang X, Yeo DJ, Yilmaz O, Zarzeczna N, Zhao Y, Zijlmans J, van Elk M, Wagenmakers E-J</w:t>
+        <w:t>, Anjum G, Travaglino GA, Feldman G, Pfuhl G, Czarnek G, Marcu GM, Hofer G, Banik G, Adetula GA, Bijlstra G, Verbruggen F, Kung FYH, Foroni F, Singer G, Muchembled F, Azevedo F, Mosannenzadeh F, Marinov E, Štrukelj E, Etebari Z, Baskin E, Garcia EOL, Musser E, van Steenkiste IMM, Ahn ER, Pronizius E, Jackson EA, Manunta E, Agadullina E, Šakan D, Dursun P, Dujols O, Dubrov D, Willis M, Tümer M, Beaudry JL, Popović D, Dunleavy D, Djamai I, Krupić D, Vega D, Du H, Mola D, Davis WE, Holford DL, Lewis DMG, Vaidis DC, Ozery DH, Ricaurte DZ, Storage D, Sousa D, Alvarez DS, Rosa AD, Krupić D, Marko D, Moreau D, Reeck C, Correia RC, Whitt CM, Lamm C, Solorzano CS, von Bastian CC, Sutherland CA, Overkott C, Aberson CL, Wang C, Karashiali C, Noone C, Chiu F, Picciocchi C, Karaarslan C, Cellini N, Esteban-Serna C, Reyna C, Batres C, Li R, Grano C, Carpentier J, Tamnes CK, Fu CHY, Ishkhanyan B, Bylinina L, Jaeger B, Bundt C, Allred TB, Bokkour A, Bogatyreva N, Chopik WJ, Antazo B, Behzadnia B, Becker M, Cocco B, Chou W-L, Hubena B, Žuro B, Aczel B, Baklanova E, Bai H, Balci BB, Babinčák P, Dixson BJW, Mokady A, Kappes HB, Atari M, Szala A, Szabelska A, Aruta JJB, Domurat A, Arinze NC, Modena A, Adiguzel A, Monajem A, Arabi KAE, Özdoğru AA, Olaya Torres AJ, Theodoropoulou A, Jurković AP, Kassianos AP, Findor A, Hartanto A, Thibault Landry A, Ferreira A, Santos AC, De la Rosa-Gomez A, Gourdon-Kanhukamwe A, Todsen AL, Karababa A, Janak A, Bran A, Tullett AM, Kuzminska AO, Krafnick AJ, Urooj A, Khaoudi A, Ahmed A, Groyecka-Bernard A, Askelund AD, Adetula A, Belaus A, Charyate AC, Wichman AL, Stoyanova A, Greenburgh A, Thomas AG, Arvanitis A, Forscher PS, Mallik PR, Primbs MA, Miller JK, Moshontz H, Urry HL, IJzerman H, Basnight-Brown DM, Chartier CR, Buchanan EM, Coles NA</w:t>
       </w:r>
       <w:r>
         <w:t xml:space="preserve">: </w:t>
       </w:r>
       <w:r>
-        <w:t xml:space="preserve">A many-analysts approach to the relation between religiosity and well-being. </w:t>
+        <w:t xml:space="preserve">In COVID-19 health messaging, loss framing increases anxiety with little-to-no concomitant benefits: Experimental evidence from 84 countries. </w:t>
       </w:r>
       <w:r>
         <w:rPr>
           <w:i/>
         </w:rPr>
-        <w:t>Religion, Brain &amp; Behavior</w:t>
-      </w:r>
-      <w:r>
-        <w:t>,13:237-283, 2022.</w:t>
-      </w:r>
+        <w:t>Affective science</w:t>
+      </w:r>
+      <w:r>
+        <w:t>,3:577-602, 2022.</w:t>
+      </w:r>
+      <w:r>
+        <w:t xml:space="preserve"> </w:t>
+      </w:r>
+      <w:hyperlink r:id="rId39">
+        <w:r>
+          <w:rPr>
+            <w:color w:val="0000EE"/>
+            <w:u w:val="single"/>
+            <w:sz w:val="18"/>
+          </w:rPr>
+          <w:t>doi:10.1007/s42761-022-00128-3</w:t>
+        </w:r>
+      </w:hyperlink>
     </w:p>
     <w:p>
       <w:pPr>
@@ -1425,11 +1825,11 @@
         <w:rPr>
           <w:sz w:val="22"/>
         </w:rPr>
-        <w:t>34.</w:t>
+        <w:t>33.</w:t>
         <w:tab/>
       </w:r>
       <w:r>
-        <w:t xml:space="preserve">Sorjonen K, </w:t>
+        <w:t xml:space="preserve">Hoogeveen S, Sarafoglou A, Aczel B, Aditya Y, Alayan AJ, Allen PJ, Altay S, Alzahawi S, Amir Y, Anthony F-V, Appiah OK, Atkinson QD, Baimel A, Balkaya-Ince M, Balsamo M, Banker S, Bartos F, Becerra M, Beffara B, Beitner J, Bendixen T, Berkessel JB, Berniunas R, Billet MI, Billingsley J, Bortolini T, Breitsohl H, Bret A, Brown FL, Brown J, Brumbaugh CC, Buczny J, Bulbulia J, Caballero S, Carlucci L, Carmichael CL, Cattaneo MEGV, Charles SJ, Claessens S, Panagopoulos MC, Costa AB, Crone DL, Czoschke S, Czymara C, D'Urso ED, Dahlstrom O, Dalla Rosa A, Danielsson H, De Ron J, de Vries YA, Dean KK, Dik BJ, Disabato DJ, Doherty JK, Draws T, Drouhot L, Dujmovic M, Dunham Y, Ebert T, Edelsbrunner PA, Eerland A, Elbaek CT, Farahmand S, Farahmand H, Farias M, Feliccia AA, Fischer K, Fischer R, Fisher-Thompson D, Francis Z, Frick S, Frisch LK, Geraldes D, Gerdin E, Geven L, Ghasemi O, Gielens E, Gligoric V, Hagel K, Hajdu N, Hamilton HR, Hamzah I, Hanel PHP, Hawk CE, Himawan KK, Holding BC, Homman LE, Ingendahl M, Inkila H, Inman ML, Islam C-G, Isler O, Izydorczyk D, Jaeger B, Johnson KA, Jong J, Karl JA, Kaszubowski E, Katz BA, Keefer LA, Kelchtermans S, Kelly JM, Klein RA, Kleinberg B, Knowles ML, Kolczynska M, Koller D, Krasko J, Kritzler S, Krypotos A-M, Kyritsis T, Landes TL, Laukenmann R, Forsyth GAL, Lazar A, Lehman BJ, Levy N, Lo RF, Lodder P, Lorenz J, Lowicki P, Ly AL, Maassen E, Magyar-Russell GM, Maier M, Marsh DR, Martinez N, Martinie M, Martoyo I, Mason SE, Mauritsen AL, McAleer P, McCauley T, McCullough M, McKay R, McMahon CM, McNamara AA, Means KK, Mercier B, Mitkidis P, Monin B, Moon JW, Moreau D, Morgan J, Murphy J, Muscatt G, Nagel C, Nagy T, Nalborczyk L, </w:t>
       </w:r>
       <w:r>
         <w:rPr>
@@ -1438,23 +1838,36 @@
         <w:t>Nilsonne G</w:t>
       </w:r>
       <w:r>
-        <w:t>, Ingre M, Melin B</w:t>
+        <w:t>, Noack P, Norenzayan A, Nuijten MB, Olsson-Collentine A, Oviedo L, Pavlov YG, Pawelski JO, Pearson HI, Pedder H, Peetz HK, Pinus M, Pirutinsky S, Polito V, Porubanova M, Poulin MJ, Prenoveau JM, Prince MA, Protzko J, Pryor C, Purzycki BG, Qiu L, Putter JQ, Rabelo A, Radell ML, Ramsay JE, Reid G, Roberts AJ, Luna LMR, Ross RM, Roszak P, Roy N, Saarelainen S-MK, Sasaki JY, Schaumans C, Schivinski B, Schmitt MC, Schnitker SA, Schnuerch M, Schreiner MR, Schuttengruber V, Sebben S, Segerstrom SC, Seryczynska B, Shjoedt U, Simsek M, Sleegers WWA, Smith ER, Sowden WJ, Spath M, Sporlein C, Stedden W, Stoevenbelt AH, Stuber S, Sulik J, Suwartono C, Syropoulos S, Szaszi B, Szecsi P, Tappin BM, Tay L, Thibault RT, Thompson B, Thurn CM, Torralba J, Tuthill SD, Ullein A-M, Van Aert RCM, van Assen MALM, Van Cappellen P, van den Akker OR, Van der Cruyssen I, Van der Noll J, van Dongen NNN, Van Lissa CJ, van Mulukom V, van Ravenzwaaij D, van Zyl CJJ, Vaughn LA, Verschuere B, Vianello M, Vilanova F, Vishkin A, Vogel V, Vogelsmeier LVDE, Watanabe S, White CJM, Wiebels K, Wiechert S, Willett ZZ, Witkowiak M, Witvliet CVO, Wiwad D, Wuyts R, Xygalatas D, Yang X, Yeo DJ, Yilmaz O, Zarzeczna N, Zhao Y, Zijlmans J, van Elk M, Wagenmakers E-J</w:t>
       </w:r>
       <w:r>
         <w:t xml:space="preserve">: </w:t>
       </w:r>
       <w:r>
-        <w:t xml:space="preserve">Questioning the vulnerability model: Prospective associations between low self-esteem and subsequent degree of depression may be spurious. </w:t>
+        <w:t xml:space="preserve">A many-analysts approach to the relation between religiosity and well-being. </w:t>
       </w:r>
       <w:r>
         <w:rPr>
           <w:i/>
         </w:rPr>
-        <w:t>Journal of Affective Disorders</w:t>
-      </w:r>
-      <w:r>
-        <w:t>,315:259-266, 2022.</w:t>
-      </w:r>
+        <w:t>Religion, Brain &amp; Behavior</w:t>
+      </w:r>
+      <w:r>
+        <w:t>,13:237-283, 2022.</w:t>
+      </w:r>
+      <w:r>
+        <w:t xml:space="preserve"> </w:t>
+      </w:r>
+      <w:hyperlink r:id="rId40">
+        <w:r>
+          <w:rPr>
+            <w:color w:val="0000EE"/>
+            <w:u w:val="single"/>
+            <w:sz w:val="18"/>
+          </w:rPr>
+          <w:t>doi:10.1080/2153599X.2022.2070255</w:t>
+        </w:r>
+      </w:hyperlink>
     </w:p>
     <w:p>
       <w:pPr>
@@ -1468,11 +1881,11 @@
         <w:rPr>
           <w:sz w:val="22"/>
         </w:rPr>
-        <w:t>35.</w:t>
+        <w:t>34.</w:t>
         <w:tab/>
       </w:r>
       <w:r>
-        <w:t xml:space="preserve">Drude NI, Martinez-Gamboa L, Danziger M, Collazo A, Kniffert S, Wiebach J, </w:t>
+        <w:t xml:space="preserve">Sorjonen K, </w:t>
       </w:r>
       <w:r>
         <w:rPr>
@@ -1481,23 +1894,36 @@
         <w:t>Nilsonne G</w:t>
       </w:r>
       <w:r>
-        <w:t>, Konietschke F, Piper SK, Pawel S, Micheloud C, Held L, Frommlet F, Segelcke D, Pogatzki-Zahn EM, Voelkl B, Friede T, Brunner E, Dempfle A, Haller B, Jung MJ, Riecken LB, Kuhn H-G, Tenbusch M, Higuita LMS, Remarque EJ, Grüninger-Egli SL, Manske K, Kobold S, Rivalan M, Wedekind L, Wilcke JC, Boulesteix A-L, Meinhardt MW, Spanagel R, Hettmer S, von Lüttichau I, Regina C, Dirnagl U, Toelch U</w:t>
+        <w:t>, Ingre M, Melin B</w:t>
       </w:r>
       <w:r>
         <w:t xml:space="preserve">: </w:t>
       </w:r>
       <w:r>
-        <w:t xml:space="preserve">Planning preclinical confirmatory multicenter trials to strengthen translation from basic to clinical research – a multi-stakeholder workshop report. </w:t>
+        <w:t xml:space="preserve">Questioning the vulnerability model: Prospective associations between low self-esteem and subsequent degree of depression may be spurious. </w:t>
       </w:r>
       <w:r>
         <w:rPr>
           <w:i/>
         </w:rPr>
-        <w:t>Translational Medicine Communications</w:t>
-      </w:r>
-      <w:r>
-        <w:t>,7:24, 2022.</w:t>
-      </w:r>
+        <w:t>Journal of Affective Disorders</w:t>
+      </w:r>
+      <w:r>
+        <w:t>,315:259-266, 2022.</w:t>
+      </w:r>
+      <w:r>
+        <w:t xml:space="preserve"> </w:t>
+      </w:r>
+      <w:hyperlink r:id="rId41">
+        <w:r>
+          <w:rPr>
+            <w:color w:val="0000EE"/>
+            <w:u w:val="single"/>
+            <w:sz w:val="18"/>
+          </w:rPr>
+          <w:t>doi:10.1016/j.jad.2022.08.003</w:t>
+        </w:r>
+      </w:hyperlink>
     </w:p>
     <w:p>
       <w:pPr>
@@ -1511,11 +1937,11 @@
         <w:rPr>
           <w:sz w:val="22"/>
         </w:rPr>
-        <w:t>36.</w:t>
+        <w:t>35.</w:t>
         <w:tab/>
       </w:r>
       <w:r>
-        <w:t xml:space="preserve">Sorjonen K, Ingre M, </w:t>
+        <w:t xml:space="preserve">Drude NI, Martinez-Gamboa L, Danziger M, Collazo A, Kniffert S, Wiebach J, </w:t>
       </w:r>
       <w:r>
         <w:rPr>
@@ -1524,20 +1950,36 @@
         <w:t>Nilsonne G</w:t>
       </w:r>
       <w:r>
+        <w:t>, Konietschke F, Piper SK, Pawel S, Micheloud C, Held L, Frommlet F, Segelcke D, Pogatzki-Zahn EM, Voelkl B, Friede T, Brunner E, Dempfle A, Haller B, Jung MJ, Riecken LB, Kuhn H-G, Tenbusch M, Higuita LMS, Remarque EJ, Grüninger-Egli SL, Manske K, Kobold S, Rivalan M, Wedekind L, Wilcke JC, Boulesteix A-L, Meinhardt MW, Spanagel R, Hettmer S, von Lüttichau I, Regina C, Dirnagl U, Toelch U</w:t>
+      </w:r>
+      <w:r>
         <w:t xml:space="preserve">: </w:t>
       </w:r>
       <w:r>
-        <w:t xml:space="preserve">Melin B. Further arguments that ability tilt correlations are spurious: A reply to Coyle (2022). </w:t>
+        <w:t xml:space="preserve">Planning preclinical confirmatory multicenter trials to strengthen translation from basic to clinical research – a multi-stakeholder workshop report. </w:t>
       </w:r>
       <w:r>
         <w:rPr>
           <w:i/>
         </w:rPr>
-        <w:t>Intelligence</w:t>
-      </w:r>
-      <w:r>
-        <w:t>,98:101706-101706, 2022.</w:t>
-      </w:r>
+        <w:t>Translational Medicine Communications</w:t>
+      </w:r>
+      <w:r>
+        <w:t>,7:24, 2022.</w:t>
+      </w:r>
+      <w:r>
+        <w:t xml:space="preserve"> </w:t>
+      </w:r>
+      <w:hyperlink r:id="rId42">
+        <w:r>
+          <w:rPr>
+            <w:color w:val="0000EE"/>
+            <w:u w:val="single"/>
+            <w:sz w:val="18"/>
+          </w:rPr>
+          <w:t>doi:10.1186/s41231-022-00130-8</w:t>
+        </w:r>
+      </w:hyperlink>
     </w:p>
     <w:p>
       <w:pPr>
@@ -1551,11 +1993,11 @@
         <w:rPr>
           <w:sz w:val="22"/>
         </w:rPr>
-        <w:t>37.</w:t>
+        <w:t>36.</w:t>
         <w:tab/>
       </w:r>
       <w:r>
-        <w:t xml:space="preserve">Sorjonen K, </w:t>
+        <w:t xml:space="preserve">Sorjonen K, Ingre M, </w:t>
       </w:r>
       <w:r>
         <w:rPr>
@@ -1564,23 +2006,33 @@
         <w:t>Nilsonne G</w:t>
       </w:r>
       <w:r>
-        <w:t>, Ingre M, Melin B</w:t>
-      </w:r>
-      <w:r>
         <w:t xml:space="preserve">: </w:t>
       </w:r>
       <w:r>
-        <w:t xml:space="preserve">Breastfeeding, cognitive ability, and residual confounding: A comment on Pereyra-Elìas et al. (2022). </w:t>
+        <w:t xml:space="preserve">Melin B. Further arguments that ability tilt correlations are spurious: A reply to Coyle (2022). </w:t>
       </w:r>
       <w:r>
         <w:rPr>
           <w:i/>
         </w:rPr>
-        <w:t>PLoS ONE</w:t>
-      </w:r>
-      <w:r>
-        <w:t>,19:e0297216-e0297216, 2022.</w:t>
-      </w:r>
+        <w:t>Intelligence</w:t>
+      </w:r>
+      <w:r>
+        <w:t>,98:101706-101706, 2022.</w:t>
+      </w:r>
+      <w:r>
+        <w:t xml:space="preserve"> </w:t>
+      </w:r>
+      <w:hyperlink r:id="rId43">
+        <w:r>
+          <w:rPr>
+            <w:color w:val="0000EE"/>
+            <w:u w:val="single"/>
+            <w:sz w:val="18"/>
+          </w:rPr>
+          <w:t>doi:10.1016/j.intell.2022.101706</w:t>
+        </w:r>
+      </w:hyperlink>
     </w:p>
     <w:p>
       <w:pPr>
@@ -1594,11 +2046,11 @@
         <w:rPr>
           <w:sz w:val="22"/>
         </w:rPr>
-        <w:t>38.</w:t>
+        <w:t>37.</w:t>
         <w:tab/>
       </w:r>
       <w:r>
-        <w:t xml:space="preserve">Koenig J, Abler B, Agartz I, Åkerstedt T, Andreassen OA, Anthony M, Bär K-J, Bertsch K, Brown RC, Brunner R, Carnevali L, Critchley HD, Cullen KR, de Geus EJC, de la Cruz F, Dziobek I, Ferger MD, Fischer H, Flor H, Gaebler M, Gianaros PJ, Giummarra MJ, Greening SG, Guendelman S, Heathers JAJ, Herpertz SC, Hu MX, Jentschke S, Kaess M, Kaufmann T, Klimes-Dougan B, Koelsch S, Krauch M, Kumral D, Lamers F, Lee T-H, Lekander M, Lin F, Lotze M, Makovac E, Mancini M, Mancke F, Månsson KNT, Manuck SB, Mather M, Meeten F, Min J, Mueller B, Muench V, Nees F, Nga L, </w:t>
+        <w:t xml:space="preserve">Sorjonen K, </w:t>
       </w:r>
       <w:r>
         <w:rPr>
@@ -1607,23 +2059,36 @@
         <w:t>Nilsonne G</w:t>
       </w:r>
       <w:r>
-        <w:t>, Ordonez Acuna D, Osnes B, Ottaviani C, Penninx BWJH, Ponzio A, Poudel GR, Reinelt J, Ren P, Sakaki M, Schumann A, Sørensen L, Specht K, Straub J, Tamm S, Thai M, Thayer JF, Ubani B, van der Mee DJ, van Velzen LS, Ventura-Bort C, Villringer A, Watson DR, Wei L, Wendt J, Schreiner MW, Westlye LT, Weymar M, Winkelmann T, Wu G-R, Yoo HJ, Quintana DS</w:t>
+        <w:t>, Ingre M, Melin B</w:t>
       </w:r>
       <w:r>
         <w:t xml:space="preserve">: </w:t>
       </w:r>
       <w:r>
-        <w:t xml:space="preserve">Cortical Thickness and Resting State Cardiac Function Across the Lifespan: A Cross-Sectional Pooled Mega Analysis. </w:t>
+        <w:t xml:space="preserve">Breastfeeding, cognitive ability, and residual confounding: A comment on Pereyra-Elìas et al. (2022). </w:t>
       </w:r>
       <w:r>
         <w:rPr>
           <w:i/>
         </w:rPr>
-        <w:t>Psychophysiology</w:t>
-      </w:r>
-      <w:r>
-        <w:t>,58:e13688, 2021.</w:t>
-      </w:r>
+        <w:t>PLoS ONE</w:t>
+      </w:r>
+      <w:r>
+        <w:t>,19:e0297216-e0297216, 2022.</w:t>
+      </w:r>
+      <w:r>
+        <w:t xml:space="preserve"> </w:t>
+      </w:r>
+      <w:hyperlink r:id="rId44">
+        <w:r>
+          <w:rPr>
+            <w:color w:val="0000EE"/>
+            <w:u w:val="single"/>
+            <w:sz w:val="18"/>
+          </w:rPr>
+          <w:t>doi:10.1371/journal.pone.0297216</w:t>
+        </w:r>
+      </w:hyperlink>
     </w:p>
     <w:p>
       <w:pPr>
@@ -1637,8 +2102,11 @@
         <w:rPr>
           <w:sz w:val="22"/>
         </w:rPr>
-        <w:t>39.</w:t>
+        <w:t>38.</w:t>
         <w:tab/>
+      </w:r>
+      <w:r>
+        <w:t xml:space="preserve">Koenig J, Abler B, Agartz I, Åkerstedt T, Andreassen OA, Anthony M, Bär K-J, Bertsch K, Brown RC, Brunner R, Carnevali L, Critchley HD, Cullen KR, de Geus EJC, de la Cruz F, Dziobek I, Ferger MD, Fischer H, Flor H, Gaebler M, Gianaros PJ, Giummarra MJ, Greening SG, Guendelman S, Heathers JAJ, Herpertz SC, Hu MX, Jentschke S, Kaess M, Kaufmann T, Klimes-Dougan B, Koelsch S, Krauch M, Kumral D, Lamers F, Lee T-H, Lekander M, Lin F, Lotze M, Makovac E, Mancini M, Mancke F, Månsson KNT, Manuck SB, Mather M, Meeten F, Min J, Mueller B, Muench V, Nees F, Nga L, </w:t>
       </w:r>
       <w:r>
         <w:rPr>
@@ -1647,23 +2115,36 @@
         <w:t>Nilsonne G</w:t>
       </w:r>
       <w:r>
-        <w:t>, Harrell F</w:t>
+        <w:t>, Ordonez Acuna D, Osnes B, Ottaviani C, Penninx BWJH, Ponzio A, Poudel GR, Reinelt J, Ren P, Sakaki M, Schumann A, Sørensen L, Specht K, Straub J, Tamm S, Thai M, Thayer JF, Ubani B, van der Mee DJ, van Velzen LS, Ventura-Bort C, Villringer A, Watson DR, Wei L, Wendt J, Schreiner MW, Westlye LT, Weymar M, Winkelmann T, Wu G-R, Yoo HJ, Quintana DS</w:t>
       </w:r>
       <w:r>
         <w:t xml:space="preserve">: </w:t>
       </w:r>
       <w:r>
-        <w:t xml:space="preserve">EEG-based model and antidepressant response. </w:t>
+        <w:t xml:space="preserve">Cortical Thickness and Resting State Cardiac Function Across the Lifespan: A Cross-Sectional Pooled Mega Analysis. </w:t>
       </w:r>
       <w:r>
         <w:rPr>
           <w:i/>
         </w:rPr>
-        <w:t>Nature Biotechnology</w:t>
-      </w:r>
-      <w:r>
-        <w:t>,39:27-27, 2021.</w:t>
-      </w:r>
+        <w:t>Psychophysiology</w:t>
+      </w:r>
+      <w:r>
+        <w:t>,58:e13688, 2021.</w:t>
+      </w:r>
+      <w:r>
+        <w:t xml:space="preserve"> </w:t>
+      </w:r>
+      <w:hyperlink r:id="rId45">
+        <w:r>
+          <w:rPr>
+            <w:color w:val="0000EE"/>
+            <w:u w:val="single"/>
+            <w:sz w:val="18"/>
+          </w:rPr>
+          <w:t>doi:10.1111/psyp.13688</w:t>
+        </w:r>
+      </w:hyperlink>
     </w:p>
     <w:p>
       <w:pPr>
@@ -1677,11 +2158,8 @@
         <w:rPr>
           <w:sz w:val="22"/>
         </w:rPr>
-        <w:t>40.</w:t>
+        <w:t>39.</w:t>
         <w:tab/>
-      </w:r>
-      <w:r>
-        <w:t xml:space="preserve">Pavlov YG, Adamian N, Appelhoff S, Arvaneh M, Christopher Benwell PD, Beste C, Bland A, Bradford DE, Bublatzky F, Busch N, Clayson PE, Cruse D, Czeszumski A, Almenberg AD, Dumas G, Ehinger BV, Ganis G, He X, Hinojosa JA, Huber-Huber C, Inzlicht M, Jack BN, Johannesson M, Jones R, Kaltwasser L, Karimi-Rouzbahani H, Keil A, König P, Kouara L, Kulke L, Ladouceur C, Langer N, Liesefeld HR, Luque D, MacNamara A, Mudrik L, Muthuraman M, Neal L, </w:t>
       </w:r>
       <w:r>
         <w:rPr>
@@ -1690,23 +2168,36 @@
         <w:t>Nilsonne G</w:t>
       </w:r>
       <w:r>
-        <w:t>, Galán JGN, Ocklenburg S, Oostenveld R, Pernet DC, Pourtois G, Ruzzoli M, Sass S, Schaefer A, Senderecka M, Snyder JS, Tamnes CK, Tognoli E, Vugt MK van, Verona E, Vloeberghs R, Welke D, Wessel J, Zakharov I, Mushtaq F</w:t>
+        <w:t>, Harrell F</w:t>
       </w:r>
       <w:r>
         <w:t xml:space="preserve">: </w:t>
       </w:r>
       <w:r>
-        <w:t xml:space="preserve">#EEGManyLabs: Investigating the Replicability of Influential EEG Experiments. </w:t>
+        <w:t xml:space="preserve">EEG-based model and antidepressant response. </w:t>
       </w:r>
       <w:r>
         <w:rPr>
           <w:i/>
         </w:rPr>
-        <w:t>Cortex</w:t>
-      </w:r>
-      <w:r>
-        <w:t>,144:213-229, 2021.</w:t>
-      </w:r>
+        <w:t>Nature Biotechnology</w:t>
+      </w:r>
+      <w:r>
+        <w:t>,39:27-27, 2021.</w:t>
+      </w:r>
+      <w:r>
+        <w:t xml:space="preserve"> </w:t>
+      </w:r>
+      <w:hyperlink r:id="rId46">
+        <w:r>
+          <w:rPr>
+            <w:color w:val="0000EE"/>
+            <w:u w:val="single"/>
+            <w:sz w:val="18"/>
+          </w:rPr>
+          <w:t>doi:10.1038/s41587-020-00768-5</w:t>
+        </w:r>
+      </w:hyperlink>
     </w:p>
     <w:p>
       <w:pPr>
@@ -1720,27 +2211,49 @@
         <w:rPr>
           <w:sz w:val="22"/>
         </w:rPr>
-        <w:t>41.</w:t>
+        <w:t>40.</w:t>
         <w:tab/>
       </w:r>
       <w:r>
-        <w:t>Gau R, Noble S, Heuer K, Bottenhorn KL, Bilgin IP, Yang Y-F, Huntenburg JM, Bayer JMM, Bethlehem RAI, Rhoads SA, Vogelbacher C, Borghesani V, Levitis E, Wang H-T, Van Den Bossche S, Kobeleva X, Legarreta JH, Guay S, Atay SM, Varoquaux GP, Huijser DC, Sandström MS, Herholz P, Nastase SA, Badhwar A, Dumas G, Schwab S, Moia S, Dayan M, Bassil Y, Brooks PP, Mancini M, Shine JM, O'Connor D, Xie X, Poggiali D, Friedrich P, Heinsfeld AS, Riedl L, Toro R, Caballero-Gaudes C, Eklund A, Garner KG, Nolan CR, Demeter DV, Barrios FA, Merchant JS, McDevitt EA, Oostenveld R, Craddock RC, Rokem A, Doyle A, Ghosh SS, Nikolaidis A, Stanley OW, Uruñuela E, Brainhack Community</w:t>
+        <w:t xml:space="preserve">Pavlov YG, Adamian N, Appelhoff S, Arvaneh M, Christopher Benwell PD, Beste C, Bland A, Bradford DE, Bublatzky F, Busch N, Clayson PE, Cruse D, Czeszumski A, Almenberg AD, Dumas G, Ehinger BV, Ganis G, He X, Hinojosa JA, Huber-Huber C, Inzlicht M, Jack BN, Johannesson M, Jones R, Kaltwasser L, Karimi-Rouzbahani H, Keil A, König P, Kouara L, Kulke L, Ladouceur C, Langer N, Liesefeld HR, Luque D, MacNamara A, Mudrik L, Muthuraman M, Neal L, </w:t>
+      </w:r>
+      <w:r>
+        <w:rPr>
+          <w:b/>
+        </w:rPr>
+        <w:t>Nilsonne G</w:t>
+      </w:r>
+      <w:r>
+        <w:t>, Galán JGN, Ocklenburg S, Oostenveld R, Pernet DC, Pourtois G, Ruzzoli M, Sass S, Schaefer A, Senderecka M, Snyder JS, Tamnes CK, Tognoli E, Vugt MK van, Verona E, Vloeberghs R, Welke D, Wessel J, Zakharov I, Mushtaq F</w:t>
       </w:r>
       <w:r>
         <w:t xml:space="preserve">: </w:t>
       </w:r>
       <w:r>
-        <w:t xml:space="preserve">Brainhack: Developing a culture of open, inclusive, community-driven neuroscience. </w:t>
+        <w:t xml:space="preserve">#EEGManyLabs: Investigating the Replicability of Influential EEG Experiments. </w:t>
       </w:r>
       <w:r>
         <w:rPr>
           <w:i/>
         </w:rPr>
-        <w:t>Neuron</w:t>
-      </w:r>
-      <w:r>
-        <w:t>,109:1769-1775, 2021.</w:t>
-      </w:r>
+        <w:t>Cortex</w:t>
+      </w:r>
+      <w:r>
+        <w:t>,144:213-229, 2021.</w:t>
+      </w:r>
+      <w:r>
+        <w:t xml:space="preserve"> </w:t>
+      </w:r>
+      <w:hyperlink r:id="rId47">
+        <w:r>
+          <w:rPr>
+            <w:color w:val="0000EE"/>
+            <w:u w:val="single"/>
+            <w:sz w:val="18"/>
+          </w:rPr>
+          <w:t>doi:10.1016/j.cortex.2021.03.013</w:t>
+        </w:r>
+      </w:hyperlink>
     </w:p>
     <w:p>
       <w:pPr>
@@ -1754,36 +2267,40 @@
         <w:rPr>
           <w:sz w:val="22"/>
         </w:rPr>
-        <w:t>42.</w:t>
+        <w:t>41.</w:t>
         <w:tab/>
       </w:r>
       <w:r>
-        <w:t xml:space="preserve">Hallinan D, Bernier A, Cambon-Thomsen A, Crawley F P, Dimitrova D, Medeiros C, </w:t>
-      </w:r>
-      <w:r>
-        <w:rPr>
-          <w:b/>
-        </w:rPr>
-        <w:t>Nilsonne G</w:t>
-      </w:r>
-      <w:r>
-        <w:t>, Parker S, Pickering B, Rennes S</w:t>
+        <w:t>Gau R, Noble S, Heuer K, Bottenhorn KL, Bilgin IP, Yang Y-F, Huntenburg JM, Bayer JMM, Bethlehem RAI, Rhoads SA, Vogelbacher C, Borghesani V, Levitis E, Wang H-T, Van Den Bossche S, Kobeleva X, Legarreta JH, Guay S, Atay SM, Varoquaux GP, Huijser DC, Sandström MS, Herholz P, Nastase SA, Badhwar A, Dumas G, Schwab S, Moia S, Dayan M, Bassil Y, Brooks PP, Mancini M, Shine JM, O'Connor D, Xie X, Poggiali D, Friedrich P, Heinsfeld AS, Riedl L, Toro R, Caballero-Gaudes C, Eklund A, Garner KG, Nolan CR, Demeter DV, Barrios FA, Merchant JS, McDevitt EA, Oostenveld R, Craddock RC, Rokem A, Doyle A, Ghosh SS, Nikolaidis A, Stanley OW, Uruñuela E, Brainhack Community</w:t>
       </w:r>
       <w:r>
         <w:t xml:space="preserve">: </w:t>
       </w:r>
       <w:r>
-        <w:t xml:space="preserve">International Transfers of Health Research Data Following Schrems II: A Problem in Need of a Solution. </w:t>
+        <w:t xml:space="preserve">Brainhack: Developing a culture of open, inclusive, community-driven neuroscience. </w:t>
       </w:r>
       <w:r>
         <w:rPr>
           <w:i/>
         </w:rPr>
-        <w:t>European Journal of Human Genetics</w:t>
-      </w:r>
-      <w:r>
-        <w:t>,29:1502-1509, 2021.</w:t>
-      </w:r>
+        <w:t>Neuron</w:t>
+      </w:r>
+      <w:r>
+        <w:t>,109:1769-1775, 2021.</w:t>
+      </w:r>
+      <w:r>
+        <w:t xml:space="preserve"> </w:t>
+      </w:r>
+      <w:hyperlink r:id="rId48">
+        <w:r>
+          <w:rPr>
+            <w:color w:val="0000EE"/>
+            <w:u w:val="single"/>
+            <w:sz w:val="18"/>
+          </w:rPr>
+          <w:t>doi:10.1016/j.neuron.2021.04.001</w:t>
+        </w:r>
+      </w:hyperlink>
     </w:p>
     <w:p>
       <w:pPr>
@@ -1797,11 +2314,11 @@
         <w:rPr>
           <w:sz w:val="22"/>
         </w:rPr>
-        <w:t>43.</w:t>
+        <w:t>42.</w:t>
         <w:tab/>
       </w:r>
       <w:r>
-        <w:t xml:space="preserve">Schweinsberg M, Feldman M, Staub N, van den Akker OR, van Aert RCM, van Assen MALM, Liu Y, Althoff T, Heer J, Kale A, Mohamed Z, Amireh H, Prasad VV, Bernstein A, Robinson E, Snellman K, Sommer SA, Otner SMG, Robinson D, Madan N, Silberzahn R, Goldstein P, Tierney W, Murase T, Mandl B, Viganola D, Strobl C, Schaumans CBC, Kelchtermans S, Naseeb C, Garrison SM, Yarkoni T, Chan CSR, Adie P, Alaburda P, Albers C, Alspaugh S, Alstott J, Nelson AA, de la Rubia EA, Arzi A, Bahnik S, Baik J, Balling LW, Banker S, Baranger DAA, Barr DJ, Barros-Rivera B, Bauer M, Blaise E, Boelen L, Carbonell KB, Briers RA, Burkhard O, Canela M-A, Castrillo L, Catlett T, Chen O, Clark M, Cohn B, Coppock A, Cuguero-Escofet N, Curran PG, Cyrus-Lai W, Dai D, Dalla Riva GV, Danielsson H, Russo RDFSM, de Silva N, Derungs C, Dondelinger F, de Souza CD, Dube BT, Dubova M, Dunn BM, Edelsbrunner PA, Finley S, Fox N, Gnambs T, Gong Y, Grand E, Greenawalt B, Han D, Hanel PHP, Hong AB, Hood D, Hsueh J, Huang L, Hui KN, Hultman KA, Javaid A, Jiang LJ, Jong J, Kamdar J, Kane D, Kappler G, Kaszubowski E, Kavanagh CM, Khabsa M, Kleinberg B, Kouros J, Krause H, Krypotos A-M, Lavbic D, Lee RL, Leffel T, Lim WY, Liverani S, Loh B, Lonsmann D, Low JW, Lu A, MacDonald K, Madan CR, Madsen LH, Maimone C, Mangold A, Marshall A, Matskewich HE, Mavon K, McLain KL, McNamara AA, McNeill M, Mertens U, Miller D, Moore B, Moore A, Nantz E, Nasrullah Z, Nejkovic V, Nell CS, Nelson AA, </w:t>
+        <w:t xml:space="preserve">Hallinan D, Bernier A, Cambon-Thomsen A, Crawley F P, Dimitrova D, Medeiros C, </w:t>
       </w:r>
       <w:r>
         <w:rPr>
@@ -1810,23 +2327,36 @@
         <w:t>Nilsonne G</w:t>
       </w:r>
       <w:r>
-        <w:t>, Nolan R, O'Brien CE, O'Neil P, O'Shea K, Olita T, Otterbacher J, Palsetia D, Pereira B, Pozdniakov I, Protzko J, Reyt J-N, Riddle T, Ali AARO, Ropovik I, Rosenberg JM, Rothen S, Schulte-Mecklenbeck M, Sharma N, Shotwell G, Skarzynski M, Stedden W, Stodden V, Stoffel MA, Stoltzman S, Subbaiah S, Tatman R, Thibodeau PH, Tomkins S, Valdivia A, van de Woestijne GB, Viana L, Villeseche F, Wadsworth WD, Wanders F, Watts K, Wells JD, Whelpley CE, Won A, Wu L, Yip A, Youngflesh C, Yu J-C, Zandian A, Zhang L, Zibman C, Uhlmann EL</w:t>
+        <w:t>, Parker S, Pickering B, Rennes S</w:t>
       </w:r>
       <w:r>
         <w:t xml:space="preserve">: </w:t>
       </w:r>
       <w:r>
-        <w:t xml:space="preserve">Same data, different conclusions: Radical dispersion in empirical results when independent analysts operationalize and test the same hypothesis. </w:t>
+        <w:t xml:space="preserve">International Transfers of Health Research Data Following Schrems II: A Problem in Need of a Solution. </w:t>
       </w:r>
       <w:r>
         <w:rPr>
           <w:i/>
         </w:rPr>
-        <w:t>Organizational Behavior and Human Decision Processes</w:t>
-      </w:r>
-      <w:r>
-        <w:t>,165:228-249, 2021.</w:t>
-      </w:r>
+        <w:t>European Journal of Human Genetics</w:t>
+      </w:r>
+      <w:r>
+        <w:t>,29:1502-1509, 2021.</w:t>
+      </w:r>
+      <w:r>
+        <w:t xml:space="preserve"> </w:t>
+      </w:r>
+      <w:hyperlink r:id="rId49">
+        <w:r>
+          <w:rPr>
+            <w:color w:val="0000EE"/>
+            <w:u w:val="single"/>
+            <w:sz w:val="18"/>
+          </w:rPr>
+          <w:t>doi:10.1038/s41431-021-00893-y</w:t>
+        </w:r>
+      </w:hyperlink>
     </w:p>
     <w:p>
       <w:pPr>
@@ -1840,11 +2370,11 @@
         <w:rPr>
           <w:sz w:val="22"/>
         </w:rPr>
-        <w:t>44.</w:t>
+        <w:t>43.</w:t>
         <w:tab/>
       </w:r>
       <w:r>
-        <w:t xml:space="preserve">Wang K, Goldenberg A, Dorison CA, Miller JK, Uusberg A, Lerner JS, Gross JJ, Agesin BB, Bernardo M, Campos O, Eudave L, Grzech K, Ozery DH, Jackson EA, Garcia EOL, Drexler SM, Jurković AP, Rana K, Wilson JP, Antoniadi M, Desai K, Gialitaki Z, Kushnir E, Nadif K, Bravo ON, Nauman R, Oosterlinck M, Pantazi M, Pilecka N, Szabelska A, van Steenkiste IMM, Filip K, Bozdoc AI, Marcu GM, Agadullina E, Adamkovič M, Roczniewska M, Reyna C, Kassianos AP, Westerlund M, Ahlgren L, Pöntinen S, Adetula GA, Dursun P, Arinze AI, Arinze NC, Ogbonnaya CE, Ndukaihe ILG, Dalgar I, Akkas H, Macapagal PM, Lewis S, Metin-Orta I, Foroni F, Willis M, Santos AC, Mokady A, Reggev N, Kurfali MA, Vasilev MR, Nock NL, Parzuchowski M, Espinoza Barría MF, Vranka M, Kohlová MB, Ropovik I, Harutyunyan M, Wang C, Yao E, Becker M, Manunta E, Kaminski G, Boudesseu J, Marko D, Evans K, Lewis DMG, Findor A, Landry AT, Aruta JJB, Ortiz MS, Vally Z, Pronizius E, Voracek M, Lamm C, Grinberg M, Li R, Valentova JV, Mioni G, Cellini N, Chen S-C, Zickfeld J, Moon K, Azab H, Levy N, Karababa A, Beaudry JL, Boucher L, Collins WM, Todsen AL, van Schie K, Vintr J, Bavolar J, Kaliska L, Križanić V, Samojlenko L, Pourafshari R, Geiger SJ, Beitner J, Warmelink L, Ross RM, Stephen ID, Hostler TJ, Azouaghe S, McCarthy R, Szala A, Grano C, Solorzano CS, Anjum G, Jimenez-Leal W, Bradford M, Pérez LC, Cruz Vásquez JE, Galindo-Caballero OJ, Vargas-Nieto JC, Kácha O, Arvanitis A, Xiao Q, Cárcamo R, Zorjan S, Tajchman Z, Vilares I, Pavlacic JM, Kunst JR, Tamnes CK, von Bastian CC, Atari M, Sharifian M, Hricova M, Kačmár P, Schrötter J, Rahal R-M, Cohen N, FatahModares S, Zrimsek M, Zakharov I, Koehn MA, Esteban-Serna C, Calin-Jageman RJ, Krafnick AJ, Štrukelj E, Isager PM, Urban J, Silva JR, Martončik M, Očovaj SB, Šakan D, Kuzminska AO, Djordjevic JM, Almeida IAT, Ferreira A, Lazarevic LB, Manley H, Ricaurte DZ, Monteiro RP, Etabari Z, Musser E, Dunleavy D, Chou W, Godbersen H, Ruiz-Fernández S, Reeck C, Batres C, Kirgizova K, Muminov A, Azevedo F, Alvarez DS, Butt MM, Lee JM, Chen Z, Verbruggen F, Ziano I, Tümer M, Charyate ACA, Dubrov D, Tejada Rivera MDCMC, Aberson C, Pálfi B, Maldonado MA, Hubena B, Sacakli A, Ceary CD, Richard KL, Singer G, Perillo JT, Ballantyne T, Cyrus-Lai W, Fedotov M, Du H, Wielgus M, Pit IL, Hruška M, Sousa D, Aczel B, Hajdu N, Szaszi B, Adamus S, Barzykowski K, Micheli L, Schmidt N-D, Zsido AN, Paruzel-Czachura M, Muda R, Bialek M, Kowal M, Sorokowska A, Misiak M, Mola D, Ortiz MV, Correa PS, Belaus A, Muchembled F, Ribeiro RR, Arriaga P, Oliveira R, Vaughn LA, Szwed P, Kossowska M, Czarnek G, Kielińska J, Antazo B, Betlehem R, Stieger S, </w:t>
+        <w:t xml:space="preserve">Schweinsberg M, Feldman M, Staub N, van den Akker OR, van Aert RCM, van Assen MALM, Liu Y, Althoff T, Heer J, Kale A, Mohamed Z, Amireh H, Prasad VV, Bernstein A, Robinson E, Snellman K, Sommer SA, Otner SMG, Robinson D, Madan N, Silberzahn R, Goldstein P, Tierney W, Murase T, Mandl B, Viganola D, Strobl C, Schaumans CBC, Kelchtermans S, Naseeb C, Garrison SM, Yarkoni T, Chan CSR, Adie P, Alaburda P, Albers C, Alspaugh S, Alstott J, Nelson AA, de la Rubia EA, Arzi A, Bahnik S, Baik J, Balling LW, Banker S, Baranger DAA, Barr DJ, Barros-Rivera B, Bauer M, Blaise E, Boelen L, Carbonell KB, Briers RA, Burkhard O, Canela M-A, Castrillo L, Catlett T, Chen O, Clark M, Cohn B, Coppock A, Cuguero-Escofet N, Curran PG, Cyrus-Lai W, Dai D, Dalla Riva GV, Danielsson H, Russo RDFSM, de Silva N, Derungs C, Dondelinger F, de Souza CD, Dube BT, Dubova M, Dunn BM, Edelsbrunner PA, Finley S, Fox N, Gnambs T, Gong Y, Grand E, Greenawalt B, Han D, Hanel PHP, Hong AB, Hood D, Hsueh J, Huang L, Hui KN, Hultman KA, Javaid A, Jiang LJ, Jong J, Kamdar J, Kane D, Kappler G, Kaszubowski E, Kavanagh CM, Khabsa M, Kleinberg B, Kouros J, Krause H, Krypotos A-M, Lavbic D, Lee RL, Leffel T, Lim WY, Liverani S, Loh B, Lonsmann D, Low JW, Lu A, MacDonald K, Madan CR, Madsen LH, Maimone C, Mangold A, Marshall A, Matskewich HE, Mavon K, McLain KL, McNamara AA, McNeill M, Mertens U, Miller D, Moore B, Moore A, Nantz E, Nasrullah Z, Nejkovic V, Nell CS, Nelson AA, </w:t>
       </w:r>
       <w:r>
         <w:rPr>
@@ -1853,23 +2383,36 @@
         <w:t>Nilsonne G</w:t>
       </w:r>
       <w:r>
-        <w:t>, Simonovic N, Taber J, Gourdon-Kanhukamwe A, Domurat A, Ihaya K, Yamada Y, Urooj A, Gill T, Čadek M, Bylinina L, Messerschmidt J, Kurfalı M, Adetula A, Baklanova E, Albayrak-Aydemir N, Kappes HB, Gjoneska B, House T, Jones MV, Berkessel JB, Chopik WJ, Çoksan S, Seehuus M, Khaoudi A, Bokkour A, El Arabi KA, Djamai I, Iyer A, Parashar N, Adiguzel A, Kocalar HE, Bundt C, Norton JO, Papadatou-Pastou M, De la Rosa-Gomez A, Ankushev V, Bogatyreva N, Grigoryev D, Ivanov A, Prusova I, Romanova M, Sarieva I, Terskova M, Hristova E, Kadreva VH, Janak A, Schei V, Sverdrup TE, Askelund AD, Pineda LMS, Krupić D, Levitan CA, Johannes N, Ouherrou N, Say N, Sinkolova S, Janjić K, Stojanovska M, Stojanovska D, Khosla M, Thomas AG, Kung FYH, Bijlstra G, Mosannenzadeh F, Balci BB, Reips U-D, Baskin E, Ishkhanyan B, Czamanski-Cohen J, Dixson BJW, Moreau D, Sutherland CAM, Chuan-Peng H, Noone C, Flowe H, Anne M, Janssen SMJ, Topor M, Majeed NM, Kunisato Y, Yu K, Daches S, Hartanto A, Vdovic M, Anton-Boicuk L, Forbes PAG, Kamburidis J, Marinova E, Nedelcheva-Datsova M, Rachev NR, Stoyanova A, Schmidt K, Suchow JW, Koptjevskaja-Tamm M, Jernsäther T, Olofsson JK, Bialobrzeska O, Marszalek M, Tatachari S, Afhami R, Law W, Antfolk J, Žuro B, Van Doren N, Soto JA, Searston R, Miranda J, Damnjanović K, Yeung SK, Krupić D, Hoyer K, Jaeger B, Ren D, Pfuhl G, Klevjer K, Corral-Frías NS, Frias-Armenta M, Lucas MY, Torres AO, Toro M, Delgado LGJ, Vega D, Solas SÁ, Vilar R, Massoni S, Frizzo T, Bran A, Vaidis DC, Vieira L, Paris B, Capizzi M, Coelho GLDH, Greenburgh A, Whitt CM, Tullett AM, Du X, Volz L, Bosma MJ, Karaarslan C, Sarıoğuz E, Allred TB, Korbmacher M, Colloff MF, Lima TJS, Ribeiro MFF, Verharen JPH, Karekla M, Karashiali C, Sunami N, Jaremka LM, Storage D, Habib S, Studzinska A, Hanel PHP, Holford DL, Sirota M, Wolfe K, Chiu F, Theodoropoulou A, Ahn ER, Lin Y, Westgate EC, Brohmer H, Hofer G, Dujols O, Vezirian K, Feldman G, Travaglino GA, Ahmed A, Li M, Bosch J, Torunsky N, Bai H, Manavalan M, Song X, Walczak RB, Zdybek P, Friedemann M, Rosa AD, Kozma L, Alves SG, Lins S, Pinto IR, Correia RC, Babinčák P, Banik G, Rojas-Berscia LM, Varella MAC, Uttley J, Beshears JE, Thommesen KK, Behzadnia B, Geniole SN, Silan MA, Maturan PLG, Vilsmeier JK, Tran US, Izquierdo SM, Mensink MC, Sorokowski P, Groyecka-Bernard A, Radtke T, Adoric VC, Carpentier J, Özdoğru AA, Joy-Gaba JA, Hedgebeth MV, Ishii T, Wichman AL, Röer JP, Ostermann T, Davis WE, Suter L, Papachristopoulos K, Zabel C, Onie S, Ebersole CR, Chartier CR, Mallik PR, Urry HL, Buchanan EM, Coles NA, Primbs MA, Basnight-Brown DM, IJzerman H, Forscher PS, Moshontz H</w:t>
+        <w:t>, Nolan R, O'Brien CE, O'Neil P, O'Shea K, Olita T, Otterbacher J, Palsetia D, Pereira B, Pozdniakov I, Protzko J, Reyt J-N, Riddle T, Ali AARO, Ropovik I, Rosenberg JM, Rothen S, Schulte-Mecklenbeck M, Sharma N, Shotwell G, Skarzynski M, Stedden W, Stodden V, Stoffel MA, Stoltzman S, Subbaiah S, Tatman R, Thibodeau PH, Tomkins S, Valdivia A, van de Woestijne GB, Viana L, Villeseche F, Wadsworth WD, Wanders F, Watts K, Wells JD, Whelpley CE, Won A, Wu L, Yip A, Youngflesh C, Yu J-C, Zandian A, Zhang L, Zibman C, Uhlmann EL</w:t>
       </w:r>
       <w:r>
         <w:t xml:space="preserve">: </w:t>
       </w:r>
       <w:r>
-        <w:t xml:space="preserve">A multi-country test of brief reappraisal interventions on emotions during the COVID-19 pandemic. </w:t>
+        <w:t xml:space="preserve">Same data, different conclusions: Radical dispersion in empirical results when independent analysts operationalize and test the same hypothesis. </w:t>
       </w:r>
       <w:r>
         <w:rPr>
           <w:i/>
         </w:rPr>
-        <w:t>Nature Human Behavior</w:t>
-      </w:r>
-      <w:r>
-        <w:t>,5:1089-1110, 2021.</w:t>
-      </w:r>
+        <w:t>Organizational Behavior and Human Decision Processes</w:t>
+      </w:r>
+      <w:r>
+        <w:t>,165:228-249, 2021.</w:t>
+      </w:r>
+      <w:r>
+        <w:t xml:space="preserve"> </w:t>
+      </w:r>
+      <w:hyperlink r:id="rId50">
+        <w:r>
+          <w:rPr>
+            <w:color w:val="0000EE"/>
+            <w:u w:val="single"/>
+            <w:sz w:val="18"/>
+          </w:rPr>
+          <w:t>doi:10.1016/j.obhdp.2021.02.003</w:t>
+        </w:r>
+      </w:hyperlink>
     </w:p>
     <w:p>
       <w:pPr>
@@ -1883,11 +2426,11 @@
         <w:rPr>
           <w:sz w:val="22"/>
         </w:rPr>
-        <w:t>45.</w:t>
+        <w:t>44.</w:t>
         <w:tab/>
       </w:r>
       <w:r>
-        <w:t xml:space="preserve">Austin CC, Bernier A, Bezuidenhout L, Bicarregui J, Biro T, Cambon-Thomsen A, Russo Carroll S, Cournia Z, Dabrowski PW, Diallo G, Duflot T, Garcia L, Gesing S, Gonzalez-Beltran A, Gururaj A, Harrower N, Lin D, Medeiros C, Méndez E, Meyers N, Mietchen D, Nagrani R, </w:t>
+        <w:t xml:space="preserve">Tahmasian M, Aleman A, Andreassen OA, Arab Z, Baillet M, Benedetti F, Bresser T, Bright J, Chee MWL, Chylinski D, Cheng W, Deantoni M, Dresler M, Eickhoff SB, Eickhoff CR, Elvsåshagen T, Feng J, Foster‐Dingley JC, Ganjgahi H, Grabe HJ, Groenewold NA, Ho TC, Hong SB, Houenou J, Irungu B, Jahanshad N, Khazaie H, Kim H, Koshmanova E, Kocevska D, Kochunov P, Lakbila‐Kamal O, Leerssen J, Li M, Luik AI, Muto V, Narbutas J, </w:t>
       </w:r>
       <w:r>
         <w:rPr>
@@ -1896,23 +2439,36 @@
         <w:t>Nilsonne G</w:t>
       </w:r>
       <w:r>
-        <w:t>, Parker S, Pickering B, Pienta A, Polydoratou P, Psomopoulos F, Rennes S, Rowe R, Sansone S-A, Shanahan H, Sitz L, Stocks J, Tovani-Palone MR, Uhlmansiek M</w:t>
+        <w:t>, O’Callaghan VS, Olsen A, Osorio RS, Poletti S, Poudel G, Reesen JE, Reneman L, Reyt M, Riemann D, Rosenzweig I, Rostampour M, Saberi A, Schiel J, Schmidt C, Schrantee A, Sciberras E, Silk TJ, Sim K, Smevik H, Soares JC, Spiegelhalder K, Stein DJ, Talwar P, Tamm S, Teresi G l, Valk SL, Someren EV, Vandewalle G, Egroo MV, Völzke H, Walter M, Wassing R, Weber FD, Weihs A, Westlye LT, Wright MJ, Wu M-J, Zak N, Zarei M</w:t>
       </w:r>
       <w:r>
         <w:t xml:space="preserve">: </w:t>
       </w:r>
       <w:r>
-        <w:t xml:space="preserve">Fostering global data sharing: highlighting the recommendations of the Research Data Alliance COVID-19 working group. </w:t>
+        <w:t xml:space="preserve">ENIGMA-Sleep: Challenges, opportunities, and the road map. </w:t>
       </w:r>
       <w:r>
         <w:rPr>
           <w:i/>
         </w:rPr>
-        <w:t>Wellcome Open Research</w:t>
-      </w:r>
-      <w:r>
-        <w:t>,5:267-267, 2021.</w:t>
-      </w:r>
+        <w:t>Journal of Sleep Research</w:t>
+      </w:r>
+      <w:r>
+        <w:t>, 2021.</w:t>
+      </w:r>
+      <w:r>
+        <w:t xml:space="preserve"> </w:t>
+      </w:r>
+      <w:hyperlink r:id="rId51">
+        <w:r>
+          <w:rPr>
+            <w:color w:val="0000EE"/>
+            <w:u w:val="single"/>
+            <w:sz w:val="18"/>
+          </w:rPr>
+          <w:t>doi:10.1111/jsr.13347</w:t>
+        </w:r>
+      </w:hyperlink>
     </w:p>
     <w:p>
       <w:pPr>
@@ -1926,11 +2482,11 @@
         <w:rPr>
           <w:sz w:val="22"/>
         </w:rPr>
-        <w:t>46.</w:t>
+        <w:t>45.</w:t>
         <w:tab/>
       </w:r>
       <w:r>
-        <w:t xml:space="preserve">Sorjonen K, Falkstedt D, Wallin AS, Melin B, </w:t>
+        <w:t xml:space="preserve">Wang K, Goldenberg A, Dorison CA, Miller JK, Uusberg A, Lerner JS, Gross JJ, Agesin BB, Bernardo M, Campos O, Eudave L, Grzech K, Ozery DH, Jackson EA, Garcia EOL, Drexler SM, Jurković AP, Rana K, Wilson JP, Antoniadi M, Desai K, Gialitaki Z, Kushnir E, Nadif K, Bravo ON, Nauman R, Oosterlinck M, Pantazi M, Pilecka N, Szabelska A, van Steenkiste IMM, Filip K, Bozdoc AI, Marcu GM, Agadullina E, Adamkovič M, Roczniewska M, Reyna C, Kassianos AP, Westerlund M, Ahlgren L, Pöntinen S, Adetula GA, Dursun P, Arinze AI, Arinze NC, Ogbonnaya CE, Ndukaihe ILG, Dalgar I, Akkas H, Macapagal PM, Lewis S, Metin-Orta I, Foroni F, Willis M, Santos AC, Mokady A, Reggev N, Kurfali MA, Vasilev MR, Nock NL, Parzuchowski M, Espinoza Barría MF, Vranka M, Kohlová MB, Ropovik I, Harutyunyan M, Wang C, Yao E, Becker M, Manunta E, Kaminski G, Boudesseu J, Marko D, Evans K, Lewis DMG, Findor A, Landry AT, Aruta JJB, Ortiz MS, Vally Z, Pronizius E, Voracek M, Lamm C, Grinberg M, Li R, Valentova JV, Mioni G, Cellini N, Chen S-C, Zickfeld J, Moon K, Azab H, Levy N, Karababa A, Beaudry JL, Boucher L, Collins WM, Todsen AL, van Schie K, Vintr J, Bavolar J, Kaliska L, Križanić V, Samojlenko L, Pourafshari R, Geiger SJ, Beitner J, Warmelink L, Ross RM, Stephen ID, Hostler TJ, Azouaghe S, McCarthy R, Szala A, Grano C, Solorzano CS, Anjum G, Jimenez-Leal W, Bradford M, Pérez LC, Cruz Vásquez JE, Galindo-Caballero OJ, Vargas-Nieto JC, Kácha O, Arvanitis A, Xiao Q, Cárcamo R, Zorjan S, Tajchman Z, Vilares I, Pavlacic JM, Kunst JR, Tamnes CK, von Bastian CC, Atari M, Sharifian M, Hricova M, Kačmár P, Schrötter J, Rahal R-M, Cohen N, FatahModares S, Zrimsek M, Zakharov I, Koehn MA, Esteban-Serna C, Calin-Jageman RJ, Krafnick AJ, Štrukelj E, Isager PM, Urban J, Silva JR, Martončik M, Očovaj SB, Šakan D, Kuzminska AO, Djordjevic JM, Almeida IAT, Ferreira A, Lazarevic LB, Manley H, Ricaurte DZ, Monteiro RP, Etabari Z, Musser E, Dunleavy D, Chou W, Godbersen H, Ruiz-Fernández S, Reeck C, Batres C, Kirgizova K, Muminov A, Azevedo F, Alvarez DS, Butt MM, Lee JM, Chen Z, Verbruggen F, Ziano I, Tümer M, Charyate ACA, Dubrov D, Tejada Rivera MDCMC, Aberson C, Pálfi B, Maldonado MA, Hubena B, Sacakli A, Ceary CD, Richard KL, Singer G, Perillo JT, Ballantyne T, Cyrus-Lai W, Fedotov M, Du H, Wielgus M, Pit IL, Hruška M, Sousa D, Aczel B, Hajdu N, Szaszi B, Adamus S, Barzykowski K, Micheli L, Schmidt N-D, Zsido AN, Paruzel-Czachura M, Muda R, Bialek M, Kowal M, Sorokowska A, Misiak M, Mola D, Ortiz MV, Correa PS, Belaus A, Muchembled F, Ribeiro RR, Arriaga P, Oliveira R, Vaughn LA, Szwed P, Kossowska M, Czarnek G, Kielińska J, Antazo B, Betlehem R, Stieger S, </w:t>
       </w:r>
       <w:r>
         <w:rPr>
@@ -1939,20 +2495,36 @@
         <w:t>Nilsonne G</w:t>
       </w:r>
       <w:r>
+        <w:t>, Simonovic N, Taber J, Gourdon-Kanhukamwe A, Domurat A, Ihaya K, Yamada Y, Urooj A, Gill T, Čadek M, Bylinina L, Messerschmidt J, Kurfalı M, Adetula A, Baklanova E, Albayrak-Aydemir N, Kappes HB, Gjoneska B, House T, Jones MV, Berkessel JB, Chopik WJ, Çoksan S, Seehuus M, Khaoudi A, Bokkour A, El Arabi KA, Djamai I, Iyer A, Parashar N, Adiguzel A, Kocalar HE, Bundt C, Norton JO, Papadatou-Pastou M, De la Rosa-Gomez A, Ankushev V, Bogatyreva N, Grigoryev D, Ivanov A, Prusova I, Romanova M, Sarieva I, Terskova M, Hristova E, Kadreva VH, Janak A, Schei V, Sverdrup TE, Askelund AD, Pineda LMS, Krupić D, Levitan CA, Johannes N, Ouherrou N, Say N, Sinkolova S, Janjić K, Stojanovska M, Stojanovska D, Khosla M, Thomas AG, Kung FYH, Bijlstra G, Mosannenzadeh F, Balci BB, Reips U-D, Baskin E, Ishkhanyan B, Czamanski-Cohen J, Dixson BJW, Moreau D, Sutherland CAM, Chuan-Peng H, Noone C, Flowe H, Anne M, Janssen SMJ, Topor M, Majeed NM, Kunisato Y, Yu K, Daches S, Hartanto A, Vdovic M, Anton-Boicuk L, Forbes PAG, Kamburidis J, Marinova E, Nedelcheva-Datsova M, Rachev NR, Stoyanova A, Schmidt K, Suchow JW, Koptjevskaja-Tamm M, Jernsäther T, Olofsson JK, Bialobrzeska O, Marszalek M, Tatachari S, Afhami R, Law W, Antfolk J, Žuro B, Van Doren N, Soto JA, Searston R, Miranda J, Damnjanović K, Yeung SK, Krupić D, Hoyer K, Jaeger B, Ren D, Pfuhl G, Klevjer K, Corral-Frías NS, Frias-Armenta M, Lucas MY, Torres AO, Toro M, Delgado LGJ, Vega D, Solas SÁ, Vilar R, Massoni S, Frizzo T, Bran A, Vaidis DC, Vieira L, Paris B, Capizzi M, Coelho GLDH, Greenburgh A, Whitt CM, Tullett AM, Du X, Volz L, Bosma MJ, Karaarslan C, Sarıoğuz E, Allred TB, Korbmacher M, Colloff MF, Lima TJS, Ribeiro MFF, Verharen JPH, Karekla M, Karashiali C, Sunami N, Jaremka LM, Storage D, Habib S, Studzinska A, Hanel PHP, Holford DL, Sirota M, Wolfe K, Chiu F, Theodoropoulou A, Ahn ER, Lin Y, Westgate EC, Brohmer H, Hofer G, Dujols O, Vezirian K, Feldman G, Travaglino GA, Ahmed A, Li M, Bosch J, Torunsky N, Bai H, Manavalan M, Song X, Walczak RB, Zdybek P, Friedemann M, Rosa AD, Kozma L, Alves SG, Lins S, Pinto IR, Correia RC, Babinčák P, Banik G, Rojas-Berscia LM, Varella MAC, Uttley J, Beshears JE, Thommesen KK, Behzadnia B, Geniole SN, Silan MA, Maturan PLG, Vilsmeier JK, Tran US, Izquierdo SM, Mensink MC, Sorokowski P, Groyecka-Bernard A, Radtke T, Adoric VC, Carpentier J, Özdoğru AA, Joy-Gaba JA, Hedgebeth MV, Ishii T, Wichman AL, Röer JP, Ostermann T, Davis WE, Suter L, Papachristopoulos K, Zabel C, Onie S, Ebersole CR, Chartier CR, Mallik PR, Urry HL, Buchanan EM, Coles NA, Primbs MA, Basnight-Brown DM, IJzerman H, Forscher PS, Moshontz H</w:t>
+      </w:r>
+      <w:r>
         <w:t xml:space="preserve">: </w:t>
       </w:r>
       <w:r>
-        <w:t xml:space="preserve">Dangers of residual confounding: A cautionary tale featuring cognitive ability, socioeconomic background, and education. </w:t>
+        <w:t xml:space="preserve">A multi-country test of brief reappraisal interventions on emotions during the COVID-19 pandemic. </w:t>
       </w:r>
       <w:r>
         <w:rPr>
           <w:i/>
         </w:rPr>
-        <w:t>BMC Psychology</w:t>
-      </w:r>
-      <w:r>
-        <w:t>,9:145, 2021.</w:t>
-      </w:r>
+        <w:t>Nature Human Behavior</w:t>
+      </w:r>
+      <w:r>
+        <w:t>,5:1089-1110, 2021.</w:t>
+      </w:r>
+      <w:r>
+        <w:t xml:space="preserve"> </w:t>
+      </w:r>
+      <w:hyperlink r:id="rId52">
+        <w:r>
+          <w:rPr>
+            <w:color w:val="0000EE"/>
+            <w:u w:val="single"/>
+            <w:sz w:val="18"/>
+          </w:rPr>
+          <w:t>doi:10.1038/s41562-021-01173-x</w:t>
+        </w:r>
+      </w:hyperlink>
     </w:p>
     <w:p>
       <w:pPr>
@@ -1966,11 +2538,11 @@
         <w:rPr>
           <w:sz w:val="22"/>
         </w:rPr>
-        <w:t>47.</w:t>
+        <w:t>46.</w:t>
         <w:tab/>
       </w:r>
       <w:r>
-        <w:t xml:space="preserve">Aczel B, Szaszi B, </w:t>
+        <w:t xml:space="preserve">Austin CC, Bernier A, Bezuidenhout L, Bicarregui J, Biro T, Cambon-Thomsen A, Russo Carroll S, Cournia Z, Dabrowski PW, Diallo G, Duflot T, Garcia L, Gesing S, Gonzalez-Beltran A, Gururaj A, Harrower N, Lin D, Medeiros C, Méndez E, Meyers N, Mietchen D, Nagrani R, </w:t>
       </w:r>
       <w:r>
         <w:rPr>
@@ -1979,23 +2551,36 @@
         <w:t>Nilsonne G</w:t>
       </w:r>
       <w:r>
-        <w:t>, van den Akker OR, Albers CJ, van Assen MA, Bastiaansen JA, Benjamin D, Boehm U, Botvinik-Nezer R, Bringmann LF, Busch NA, Caruyer E, Cataldo AM, Cowan N, Delios A, van Dongen NN, Donkin C, van Doorn JB, Dreber A, Dutilh G, Egan GF, Gernsbacher MA, Hoekstra R, Hoffmann S, Holzmeister F, Huber J, Johannesson M, Jonas KJ, Kindel AT, Kirchler M, Kunkels YK, Lindsay DS, Mangin J-F, Matzke D, Munafò MR, Newell BR, Nosek BA, Poldrack RA, van Ravenzwaaij D, Rieskamp J, Salganik MJ, Sarafoglou A, Schonberg T, Schweinsberg M, Shanks D, Silberzahn R, Simons DJ, Spellman BA, St-Jean S, Starns JJ, Uhlmann EL, Wicherts J, Wagenmakers E-J</w:t>
+        <w:t>, Parker S, Pickering B, Pienta A, Polydoratou P, Psomopoulos F, Rennes S, Rowe R, Sansone S-A, Shanahan H, Sitz L, Stocks J, Tovani-Palone MR, Uhlmansiek M</w:t>
       </w:r>
       <w:r>
         <w:t xml:space="preserve">: </w:t>
       </w:r>
       <w:r>
-        <w:t xml:space="preserve">Consensus-based guidance for conducting and reporting multi-analyst studies. </w:t>
+        <w:t xml:space="preserve">Fostering global data sharing: highlighting the recommendations of the Research Data Alliance COVID-19 working group. </w:t>
       </w:r>
       <w:r>
         <w:rPr>
           <w:i/>
         </w:rPr>
-        <w:t>ELife</w:t>
-      </w:r>
-      <w:r>
-        <w:t>,10:e72185, 2021.</w:t>
-      </w:r>
+        <w:t>Wellcome Open Research</w:t>
+      </w:r>
+      <w:r>
+        <w:t>,5:267-267, 2021.</w:t>
+      </w:r>
+      <w:r>
+        <w:t xml:space="preserve"> </w:t>
+      </w:r>
+      <w:hyperlink r:id="rId53">
+        <w:r>
+          <w:rPr>
+            <w:color w:val="0000EE"/>
+            <w:u w:val="single"/>
+            <w:sz w:val="18"/>
+          </w:rPr>
+          <w:t>doi:10.12688/wellcomeopenres.16378.2</w:t>
+        </w:r>
+      </w:hyperlink>
     </w:p>
     <w:p>
       <w:pPr>
@@ -2009,11 +2594,11 @@
         <w:rPr>
           <w:sz w:val="22"/>
         </w:rPr>
-        <w:t>48.</w:t>
+        <w:t>47.</w:t>
         <w:tab/>
       </w:r>
       <w:r>
-        <w:t xml:space="preserve">Åkerstedt T, Lekander M, </w:t>
+        <w:t xml:space="preserve">Sorjonen K, Falkstedt D, Wallin AS, Melin B, </w:t>
       </w:r>
       <w:r>
         <w:rPr>
@@ -2022,23 +2607,33 @@
         <w:t>Nilsonne G</w:t>
       </w:r>
       <w:r>
-        <w:t>, Tamm S, d'Onofrio P, Kecklund G, Fischer H, Schwarz J, Petrovic P, Månsson KNT</w:t>
-      </w:r>
-      <w:r>
         <w:t xml:space="preserve">: </w:t>
       </w:r>
       <w:r>
-        <w:t xml:space="preserve">Gray matter volume correlates of sleepiness: a voxel–based morphometry study in younger and older adults. </w:t>
+        <w:t xml:space="preserve">Dangers of residual confounding: A cautionary tale featuring cognitive ability, socioeconomic background, and education. </w:t>
       </w:r>
       <w:r>
         <w:rPr>
           <w:i/>
         </w:rPr>
-        <w:t>Nature and Science of Sleep</w:t>
-      </w:r>
-      <w:r>
-        <w:t>,12:289-298, 2020.</w:t>
-      </w:r>
+        <w:t>BMC Psychology</w:t>
+      </w:r>
+      <w:r>
+        <w:t>,9:145, 2021.</w:t>
+      </w:r>
+      <w:r>
+        <w:t xml:space="preserve"> </w:t>
+      </w:r>
+      <w:hyperlink r:id="rId54">
+        <w:r>
+          <w:rPr>
+            <w:color w:val="0000EE"/>
+            <w:u w:val="single"/>
+            <w:sz w:val="18"/>
+          </w:rPr>
+          <w:t>doi:10.1186/s40359-021-00653-z</w:t>
+        </w:r>
+      </w:hyperlink>
     </w:p>
     <w:p>
       <w:pPr>
@@ -2052,11 +2647,11 @@
         <w:rPr>
           <w:sz w:val="22"/>
         </w:rPr>
-        <w:t>49.</w:t>
+        <w:t>48.</w:t>
         <w:tab/>
       </w:r>
       <w:r>
-        <w:t xml:space="preserve">Evans T, Johannes N, Winska J, Glińska-Neweś A, van Stekelenburg A, </w:t>
+        <w:t xml:space="preserve">Aczel B, Szaszi B, </w:t>
       </w:r>
       <w:r>
         <w:rPr>
@@ -2065,23 +2660,36 @@
         <w:t>Nilsonne G</w:t>
       </w:r>
       <w:r>
-        <w:t>, Dean L, Fido D, Galloway G, Jones S, Masson I, Soares A, Steptoe-Warren G, Thompson N, d'Angelo Ungson N</w:t>
+        <w:t>, van den Akker OR, Albers CJ, van Assen MA, Bastiaansen JA, Benjamin D, Boehm U, Botvinik-Nezer R, Bringmann LF, Busch NA, Caruyer E, Cataldo AM, Cowan N, Delios A, van Dongen NN, Donkin C, van Doorn JB, Dreber A, Dutilh G, Egan GF, Gernsbacher MA, Hoekstra R, Hoffmann S, Holzmeister F, Huber J, Johannesson M, Jonas KJ, Kindel AT, Kirchler M, Kunkels YK, Lindsay DS, Mangin J-F, Matzke D, Munafò MR, Newell BR, Nosek BA, Poldrack RA, van Ravenzwaaij D, Rieskamp J, Salganik MJ, Sarafoglou A, Schonberg T, Schweinsberg M, Shanks D, Silberzahn R, Simons DJ, Spellman BA, St-Jean S, Starns JJ, Uhlmann EL, Wicherts J, Wagenmakers E-J</w:t>
       </w:r>
       <w:r>
         <w:t xml:space="preserve">: </w:t>
       </w:r>
       <w:r>
-        <w:t xml:space="preserve">Exploring the Consistency and Value of Humour Style Clusters. </w:t>
+        <w:t xml:space="preserve">Consensus-based guidance for conducting and reporting multi-analyst studies. </w:t>
       </w:r>
       <w:r>
         <w:rPr>
           <w:i/>
         </w:rPr>
-        <w:t>Comprehensive Results in Social Psychology</w:t>
-      </w:r>
-      <w:r>
-        <w:t>,4:1-24, 2020.</w:t>
-      </w:r>
+        <w:t>ELife</w:t>
+      </w:r>
+      <w:r>
+        <w:t>,10:e72185, 2021.</w:t>
+      </w:r>
+      <w:r>
+        <w:t xml:space="preserve"> </w:t>
+      </w:r>
+      <w:hyperlink r:id="rId55">
+        <w:r>
+          <w:rPr>
+            <w:color w:val="0000EE"/>
+            <w:u w:val="single"/>
+            <w:sz w:val="18"/>
+          </w:rPr>
+          <w:t>doi:10.7554/eLife.72185</w:t>
+        </w:r>
+      </w:hyperlink>
     </w:p>
     <w:p>
       <w:pPr>
@@ -2095,11 +2703,11 @@
         <w:rPr>
           <w:sz w:val="22"/>
         </w:rPr>
-        <w:t>50.</w:t>
+        <w:t>49.</w:t>
         <w:tab/>
       </w:r>
       <w:r>
-        <w:t xml:space="preserve">Botvinik-Nezer R, Holzmeister F, Camerer CF, Dreber A, Huber J, Johannesson M, Kirchler M, Iwanir R, Mumford JA, Adcock RA, Avesani P, Baczkowski BM, Bajracharya A, Bakst L, Ball S, Barilari M, Bault N, Beaton D, Beitner J, Benoit RG, Berkers RMWJ, Bhanji JP, Biswal BB, Bobadilla-Suarez S, Bortolini T, Bottenhorn KL, Bowring A, Braem S, Brooks HR, Brudner EG, Calderon CB, Camilleri JA, Castrellon JJ, Cecchetti L, Cieslik EC, Cole ZJ, Collignon O, Cox RW, Cunningham WA, Czoschke S, Dadi K, Davis CP, Luca AD, Delgado MR, Demetriou L, Dennison JB, Di X, Dickie EW, Dobryakova E, Donnat CL, Dukart J, Duncan NW, Durnez J, Eed A, Eickhoff SB, Erhart A, Fontanesi L, Fricke GM, Fu S, Galván A, Gau R, Genon S, Glatard T, Glerean E, Goeman JJ, Golowin SAE, González-García C, Gorgolewski KJ, Grady CL, Green MA, Guassi Moreira JF, Guest O, Hakimi S, Hamilton JP, Hancock R, Handjaras G, Harry BB, Hawco C, Herholz P, Herman G, Heunis S, Hoffstaedter F, Hogeveen J, Holmes S, Hu C-P, Huettel SA, Hughes ME, Iacovella V, Iordan AD, Isager PM, Isik AI, Jahn A, Johnson MR, Johnstone T, Joseph MJE, Juliano AC, Kable JW, Kassinopoulos M, Koba C, Kong X-Z, Koscik TR, Kucukboyaci NE, Kuhl BA, Kupek S, Laird AR, Lamm C, Langner R, Lauharatanahirun N, Lee H, Lee S, Leemans A, Leo A, Lesage E, Li F, Li MYC, Lim PC, Lintz EN, Liphardt SW, Losecaat Vermeer AB, Love BC, Mack ML, Malpica N, Marins T, Maumet C, McDonald K, McGuire JT, Melero H, Méndez Leal AS, Meyer B, Meyer KN, Mihai G, Mitsis GD, Moll J, Nielson DM, </w:t>
+        <w:t xml:space="preserve">Åkerstedt T, Lekander M, </w:t>
       </w:r>
       <w:r>
         <w:rPr>
@@ -2108,23 +2716,36 @@
         <w:t>Nilsonne G</w:t>
       </w:r>
       <w:r>
-        <w:t>, Notter MP, Olivetti E, Onicas AI, Papale P, Patil KR, Peelle JE, Pérez A, Pischedda D, Poline J-B, Prystauka Y, Ray S, Reuter-Lorenz PA, Reynolds RC, Ricciardi E, Rieck JR, Rodriguez-Thompson AM, Romyn A, Salo T, Samanez-Larkin GR, Sanz-Morales E, Schlichting ML, Schultz DH, Shen Q, Sheridan MA, Silvers JA, Skagerlund K, Smith A, Smith DV, Sokol-Hessner P, Steinkamp SR, Tashjian SM, Thirion B, Thorp JN, Tinghög G, Tisdall L, Tompson SH, Toro-Serey C, Torre Tresols JJ, Tozzi L, Truong V, Turella L, van 't Veer AE, Verguts T, Vettel JM, Vijayarajah S, Vo K, Wall MB, Weeda WD, Weis S, White DJ, Wisniewski D, Xifra-Porxas A, Yearling EA, Yoon S, Yuan R, Yuen KSL, Zhang L, Zhang X, Zosky JE, Nichols TE, Poldrack RA, Schonberg T</w:t>
+        <w:t>, Tamm S, d'Onofrio P, Kecklund G, Fischer H, Schwarz J, Petrovic P, Månsson KNT</w:t>
       </w:r>
       <w:r>
         <w:t xml:space="preserve">: </w:t>
       </w:r>
       <w:r>
-        <w:t xml:space="preserve">Variability in the analysis of a single neuroimaging dataset by many teams. </w:t>
+        <w:t xml:space="preserve">Gray matter volume correlates of sleepiness: a voxel–based morphometry study in younger and older adults. </w:t>
       </w:r>
       <w:r>
         <w:rPr>
           <w:i/>
         </w:rPr>
-        <w:t>Nature</w:t>
-      </w:r>
-      <w:r>
-        <w:t>,582:84-88, 2020.</w:t>
-      </w:r>
+        <w:t>Nature and Science of Sleep</w:t>
+      </w:r>
+      <w:r>
+        <w:t>,12:289-298, 2020.</w:t>
+      </w:r>
+      <w:r>
+        <w:t xml:space="preserve"> </w:t>
+      </w:r>
+      <w:hyperlink r:id="rId56">
+        <w:r>
+          <w:rPr>
+            <w:color w:val="0000EE"/>
+            <w:u w:val="single"/>
+            <w:sz w:val="18"/>
+          </w:rPr>
+          <w:t>doi:10.2147/NSS.S240493</w:t>
+        </w:r>
+      </w:hyperlink>
     </w:p>
     <w:p>
       <w:pPr>
@@ -2138,27 +2759,49 @@
         <w:rPr>
           <w:sz w:val="22"/>
         </w:rPr>
-        <w:t>51.</w:t>
+        <w:t>50.</w:t>
         <w:tab/>
       </w:r>
       <w:r>
-        <w:t>Tierney W, Hardy J, Ebersole C, Viganola D, Clemente E, Gordon M, Hoogeveen S, Haaf J, Dreber A, Johannesson M, Pfeiffer T, Huang J L, Vaugh L A, DeMarree K G, Igou E, Chapman H, Gantman A, Vanaman M, Wylie J, Storbeck J, Andreychik M R, McPhetres J Culture and Work Forecasting Collaboration, Uhlmann E L</w:t>
+        <w:t xml:space="preserve">Evans T, Johannes N, Winska J, Glińska-Neweś A, van Stekelenburg A, </w:t>
+      </w:r>
+      <w:r>
+        <w:rPr>
+          <w:b/>
+        </w:rPr>
+        <w:t>Nilsonne G</w:t>
+      </w:r>
+      <w:r>
+        <w:t>, Dean L, Fido D, Galloway G, Jones S, Masson I, Soares A, Steptoe-Warren G, Thompson N, d'Angelo Ungson N</w:t>
       </w:r>
       <w:r>
         <w:t xml:space="preserve">: </w:t>
       </w:r>
       <w:r>
-        <w:t xml:space="preserve">A creative destruction approach to replication: Implicit work and sex morality across cultures. </w:t>
+        <w:t xml:space="preserve">Exploring the Consistency and Value of Humour Style Clusters. </w:t>
       </w:r>
       <w:r>
         <w:rPr>
           <w:i/>
         </w:rPr>
-        <w:t>Journal of Experimental Social Psychology</w:t>
-      </w:r>
-      <w:r>
-        <w:t>,161:291-309, 2020.</w:t>
-      </w:r>
+        <w:t>Comprehensive Results in Social Psychology</w:t>
+      </w:r>
+      <w:r>
+        <w:t>,4:1-24, 2020.</w:t>
+      </w:r>
+      <w:r>
+        <w:t xml:space="preserve"> </w:t>
+      </w:r>
+      <w:hyperlink r:id="rId57">
+        <w:r>
+          <w:rPr>
+            <w:color w:val="0000EE"/>
+            <w:u w:val="single"/>
+            <w:sz w:val="18"/>
+          </w:rPr>
+          <w:t>doi:10.1080/23743603.2020.1756239</w:t>
+        </w:r>
+      </w:hyperlink>
     </w:p>
     <w:p>
       <w:pPr>
@@ -2172,11 +2815,11 @@
         <w:rPr>
           <w:sz w:val="22"/>
         </w:rPr>
-        <w:t>52.</w:t>
+        <w:t>51.</w:t>
         <w:tab/>
       </w:r>
       <w:r>
-        <w:t xml:space="preserve">Tamm S, Schwarz J, Thuné H, Kecklund G, Petrovic P, Åkerstedt T, Fischer H, Lekander M, </w:t>
+        <w:t xml:space="preserve">Botvinik-Nezer R, Holzmeister F, Camerer CF, Dreber A, Huber J, Johannesson M, Kirchler M, Iwanir R, Mumford JA, Adcock RA, Avesani P, Baczkowski BM, Bajracharya A, Bakst L, Ball S, Barilari M, Bault N, Beaton D, Beitner J, Benoit RG, Berkers RMWJ, Bhanji JP, Biswal BB, Bobadilla-Suarez S, Bortolini T, Bottenhorn KL, Bowring A, Braem S, Brooks HR, Brudner EG, Calderon CB, Camilleri JA, Castrellon JJ, Cecchetti L, Cieslik EC, Cole ZJ, Collignon O, Cox RW, Cunningham WA, Czoschke S, Dadi K, Davis CP, Luca AD, Delgado MR, Demetriou L, Dennison JB, Di X, Dickie EW, Dobryakova E, Donnat CL, Dukart J, Duncan NW, Durnez J, Eed A, Eickhoff SB, Erhart A, Fontanesi L, Fricke GM, Fu S, Galván A, Gau R, Genon S, Glatard T, Glerean E, Goeman JJ, Golowin SAE, González-García C, Gorgolewski KJ, Grady CL, Green MA, Guassi Moreira JF, Guest O, Hakimi S, Hamilton JP, Hancock R, Handjaras G, Harry BB, Hawco C, Herholz P, Herman G, Heunis S, Hoffstaedter F, Hogeveen J, Holmes S, Hu C-P, Huettel SA, Hughes ME, Iacovella V, Iordan AD, Isager PM, Isik AI, Jahn A, Johnson MR, Johnstone T, Joseph MJE, Juliano AC, Kable JW, Kassinopoulos M, Koba C, Kong X-Z, Koscik TR, Kucukboyaci NE, Kuhl BA, Kupek S, Laird AR, Lamm C, Langner R, Lauharatanahirun N, Lee H, Lee S, Leemans A, Leo A, Lesage E, Li F, Li MYC, Lim PC, Lintz EN, Liphardt SW, Losecaat Vermeer AB, Love BC, Mack ML, Malpica N, Marins T, Maumet C, McDonald K, McGuire JT, Melero H, Méndez Leal AS, Meyer B, Meyer KN, Mihai G, Mitsis GD, Moll J, Nielson DM, </w:t>
       </w:r>
       <w:r>
         <w:rPr>
@@ -2185,20 +2828,36 @@
         <w:t>Nilsonne G</w:t>
       </w:r>
       <w:r>
+        <w:t>, Notter MP, Olivetti E, Onicas AI, Papale P, Patil KR, Peelle JE, Pérez A, Pischedda D, Poline J-B, Prystauka Y, Ray S, Reuter-Lorenz PA, Reynolds RC, Ricciardi E, Rieck JR, Rodriguez-Thompson AM, Romyn A, Salo T, Samanez-Larkin GR, Sanz-Morales E, Schlichting ML, Schultz DH, Shen Q, Sheridan MA, Silvers JA, Skagerlund K, Smith A, Smith DV, Sokol-Hessner P, Steinkamp SR, Tashjian SM, Thirion B, Thorp JN, Tinghög G, Tisdall L, Tompson SH, Toro-Serey C, Torre Tresols JJ, Tozzi L, Truong V, Turella L, van 't Veer AE, Verguts T, Vettel JM, Vijayarajah S, Vo K, Wall MB, Weeda WD, Weis S, White DJ, Wisniewski D, Xifra-Porxas A, Yearling EA, Yoon S, Yuan R, Yuen KSL, Zhang L, Zhang X, Zosky JE, Nichols TE, Poldrack RA, Schonberg T</w:t>
+      </w:r>
+      <w:r>
         <w:t xml:space="preserve">: </w:t>
       </w:r>
       <w:r>
-        <w:t xml:space="preserve">A combined fMRI and EMG study of emotional contagion following partial sleep deprivation in young and older humans. </w:t>
+        <w:t xml:space="preserve">Variability in the analysis of a single neuroimaging dataset by many teams. </w:t>
       </w:r>
       <w:r>
         <w:rPr>
           <w:i/>
         </w:rPr>
-        <w:t>Scientific Reports</w:t>
-      </w:r>
-      <w:r>
-        <w:t>,10:17944, 2020.</w:t>
-      </w:r>
+        <w:t>Nature</w:t>
+      </w:r>
+      <w:r>
+        <w:t>,582:84-88, 2020.</w:t>
+      </w:r>
+      <w:r>
+        <w:t xml:space="preserve"> </w:t>
+      </w:r>
+      <w:hyperlink r:id="rId58">
+        <w:r>
+          <w:rPr>
+            <w:color w:val="0000EE"/>
+            <w:u w:val="single"/>
+            <w:sz w:val="18"/>
+          </w:rPr>
+          <w:t>doi:10.1038/s41586-020-2314-9</w:t>
+        </w:r>
+      </w:hyperlink>
     </w:p>
     <w:p>
       <w:pPr>
@@ -2212,36 +2871,40 @@
         <w:rPr>
           <w:sz w:val="22"/>
         </w:rPr>
-        <w:t>53.</w:t>
+        <w:t>52.</w:t>
         <w:tab/>
       </w:r>
       <w:r>
-        <w:t xml:space="preserve">Sorjonen K, </w:t>
-      </w:r>
-      <w:r>
-        <w:rPr>
-          <w:b/>
-        </w:rPr>
-        <w:t>Nilsonne G</w:t>
-      </w:r>
-      <w:r>
-        <w:t>, Falkstedt D, Hemmingson T, Ingre M</w:t>
+        <w:t>Tierney W, Hardy J, Ebersole C, Viganola D, Clemente E, Gordon M, Hoogeveen S, Haaf J, Dreber A, Johannesson M, Pfeiffer T, Huang J L, Vaugh L A, DeMarree K G, Igou E, Chapman H, Gantman A, Vanaman M, Wylie J, Storbeck J, Andreychik M R, McPhetres J Culture and Work Forecasting Collaboration, Uhlmann E L</w:t>
       </w:r>
       <w:r>
         <w:t xml:space="preserve">: </w:t>
       </w:r>
       <w:r>
-        <w:t xml:space="preserve">A comparison of models with weight, height, and BMI as predictors of mortality. </w:t>
+        <w:t xml:space="preserve">A creative destruction approach to replication: Implicit work and sex morality across cultures. </w:t>
       </w:r>
       <w:r>
         <w:rPr>
           <w:i/>
         </w:rPr>
-        <w:t>Obesity Science and Practice</w:t>
-      </w:r>
-      <w:r>
-        <w:t>,7:168-175, 2020.</w:t>
-      </w:r>
+        <w:t>Journal of Experimental Social Psychology</w:t>
+      </w:r>
+      <w:r>
+        <w:t>,161:291-309, 2020.</w:t>
+      </w:r>
+      <w:r>
+        <w:t xml:space="preserve"> </w:t>
+      </w:r>
+      <w:hyperlink r:id="rId59">
+        <w:r>
+          <w:rPr>
+            <w:color w:val="0000EE"/>
+            <w:u w:val="single"/>
+            <w:sz w:val="18"/>
+          </w:rPr>
+          <w:t>doi:10.1016/j.obhdp.2020.07.002</w:t>
+        </w:r>
+      </w:hyperlink>
     </w:p>
     <w:p>
       <w:pPr>
@@ -2255,27 +2918,46 @@
         <w:rPr>
           <w:sz w:val="22"/>
         </w:rPr>
-        <w:t>54.</w:t>
+        <w:t>53.</w:t>
         <w:tab/>
       </w:r>
       <w:r>
-        <w:t>Tierney W, Hardy JH, Ebersole CR, Leavitt K, Viganola D, Clemente EG, Gordon M, Dreber A, Johannesson M, Pfeiffer T, Hiring Decisions Forecasting Collaboration, Uhlmann EL</w:t>
+        <w:t xml:space="preserve">Tamm S, Schwarz J, Thuné H, Kecklund G, Petrovic P, Åkerstedt T, Fischer H, Lekander M, </w:t>
+      </w:r>
+      <w:r>
+        <w:rPr>
+          <w:b/>
+        </w:rPr>
+        <w:t>Nilsonne G</w:t>
       </w:r>
       <w:r>
         <w:t xml:space="preserve">: </w:t>
       </w:r>
       <w:r>
-        <w:t xml:space="preserve">Creative destruction in science. </w:t>
+        <w:t xml:space="preserve">A combined fMRI and EMG study of emotional contagion following partial sleep deprivation in young and older humans. </w:t>
       </w:r>
       <w:r>
         <w:rPr>
           <w:i/>
         </w:rPr>
-        <w:t>Organizational Behavior and Human Decision Processes</w:t>
-      </w:r>
-      <w:r>
-        <w:t>,161:291-309, 2020.</w:t>
-      </w:r>
+        <w:t>Scientific Reports</w:t>
+      </w:r>
+      <w:r>
+        <w:t>,10:17944, 2020.</w:t>
+      </w:r>
+      <w:r>
+        <w:t xml:space="preserve"> </w:t>
+      </w:r>
+      <w:hyperlink r:id="rId60">
+        <w:r>
+          <w:rPr>
+            <w:color w:val="0000EE"/>
+            <w:u w:val="single"/>
+            <w:sz w:val="18"/>
+          </w:rPr>
+          <w:t>doi:10.1038/s41598-020-74489-9</w:t>
+        </w:r>
+      </w:hyperlink>
     </w:p>
     <w:p>
       <w:pPr>
@@ -2289,11 +2971,11 @@
         <w:rPr>
           <w:sz w:val="22"/>
         </w:rPr>
-        <w:t>55.</w:t>
+        <w:t>54.</w:t>
         <w:tab/>
       </w:r>
       <w:r>
-        <w:t xml:space="preserve">Koba C, Notaro G, Tamm S, </w:t>
+        <w:t xml:space="preserve">Sorjonen K, </w:t>
       </w:r>
       <w:r>
         <w:rPr>
@@ -2302,23 +2984,36 @@
         <w:t>Nilsonne G</w:t>
       </w:r>
       <w:r>
-        <w:t>, Hasson U</w:t>
+        <w:t>, Falkstedt D, Hemmingson T, Ingre M</w:t>
       </w:r>
       <w:r>
         <w:t xml:space="preserve">: </w:t>
       </w:r>
       <w:r>
-        <w:t xml:space="preserve">Spontaneous eye-movements during eyes-open rest reduce resting-state-network modularity by increasing visual-sensorimotor connectivity. </w:t>
+        <w:t xml:space="preserve">A comparison of models with weight, height, and BMI as predictors of mortality. </w:t>
       </w:r>
       <w:r>
         <w:rPr>
           <w:i/>
         </w:rPr>
-        <w:t>Network Neuroscience</w:t>
-      </w:r>
-      <w:r>
-        <w:t>,5:451-476, 2020.</w:t>
-      </w:r>
+        <w:t>Obesity Science and Practice</w:t>
+      </w:r>
+      <w:r>
+        <w:t>,7:168-175, 2020.</w:t>
+      </w:r>
+      <w:r>
+        <w:t xml:space="preserve"> </w:t>
+      </w:r>
+      <w:hyperlink r:id="rId61">
+        <w:r>
+          <w:rPr>
+            <w:color w:val="0000EE"/>
+            <w:u w:val="single"/>
+            <w:sz w:val="18"/>
+          </w:rPr>
+          <w:t>doi:10.1002/osp4.473</w:t>
+        </w:r>
+      </w:hyperlink>
     </w:p>
     <w:p>
       <w:pPr>
@@ -2332,36 +3027,40 @@
         <w:rPr>
           <w:sz w:val="22"/>
         </w:rPr>
-        <w:t>56.</w:t>
+        <w:t>55.</w:t>
         <w:tab/>
       </w:r>
       <w:r>
-        <w:t xml:space="preserve">Tamm S, </w:t>
-      </w:r>
-      <w:r>
-        <w:rPr>
-          <w:b/>
-        </w:rPr>
-        <w:t>Nilsonne G</w:t>
-      </w:r>
-      <w:r>
-        <w:t>, Schwarz J, Golkar A, Kecklund G, Petrovic P, Fischer H, Åkerstedt T, Lekander M</w:t>
+        <w:t>Tierney W, Hardy JH, Ebersole CR, Leavitt K, Viganola D, Clemente EG, Gordon M, Dreber A, Johannesson M, Pfeiffer T, Hiring Decisions Forecasting Collaboration, Uhlmann EL</w:t>
       </w:r>
       <w:r>
         <w:t xml:space="preserve">: </w:t>
       </w:r>
       <w:r>
-        <w:t xml:space="preserve">Sleep restriction caused impaired emotional regulation without detectable brain activation changes - a functional magnetic resonance imaging study. </w:t>
+        <w:t xml:space="preserve">Creative destruction in science. </w:t>
       </w:r>
       <w:r>
         <w:rPr>
           <w:i/>
         </w:rPr>
-        <w:t>Royal Society Open Science</w:t>
-      </w:r>
-      <w:r>
-        <w:t>,6:181704-181704, 2019.</w:t>
-      </w:r>
+        <w:t>Organizational Behavior and Human Decision Processes</w:t>
+      </w:r>
+      <w:r>
+        <w:t>,161:291-309, 2020.</w:t>
+      </w:r>
+      <w:r>
+        <w:t xml:space="preserve"> </w:t>
+      </w:r>
+      <w:hyperlink r:id="rId59">
+        <w:r>
+          <w:rPr>
+            <w:color w:val="0000EE"/>
+            <w:u w:val="single"/>
+            <w:sz w:val="18"/>
+          </w:rPr>
+          <w:t>doi:10.1016/j.obhdp.2020.07.002</w:t>
+        </w:r>
+      </w:hyperlink>
     </w:p>
     <w:p>
       <w:pPr>
@@ -2375,11 +3074,11 @@
         <w:rPr>
           <w:sz w:val="22"/>
         </w:rPr>
-        <w:t>57.</w:t>
+        <w:t>56.</w:t>
         <w:tab/>
       </w:r>
       <w:r>
-        <w:t xml:space="preserve">Lodin K, Lekander M, Petrovic P, </w:t>
+        <w:t xml:space="preserve">Koba C, Notaro G, Tamm S, </w:t>
       </w:r>
       <w:r>
         <w:rPr>
@@ -2388,23 +3087,36 @@
         <w:t>Nilsonne G</w:t>
       </w:r>
       <w:r>
-        <w:t>, Hedman-Lagerlöf E, Andreasson A</w:t>
+        <w:t>, Hasson U</w:t>
       </w:r>
       <w:r>
         <w:t xml:space="preserve">: </w:t>
       </w:r>
       <w:r>
-        <w:t xml:space="preserve">Cross-sectional associations between inflammation, sickness behaviour, health anxiety and self-rated health in a Swedish primary care population. </w:t>
+        <w:t xml:space="preserve">Spontaneous eye-movements during eyes-open rest reduce resting-state-network modularity by increasing visual-sensorimotor connectivity. </w:t>
       </w:r>
       <w:r>
         <w:rPr>
           <w:i/>
         </w:rPr>
-        <w:t>European Journal of Inflammation</w:t>
-      </w:r>
-      <w:r>
-        <w:t>,17:2058739219844357, 2019.</w:t>
-      </w:r>
+        <w:t>Network Neuroscience</w:t>
+      </w:r>
+      <w:r>
+        <w:t>,5:451-476, 2020.</w:t>
+      </w:r>
+      <w:r>
+        <w:t xml:space="preserve"> </w:t>
+      </w:r>
+      <w:hyperlink r:id="rId62">
+        <w:r>
+          <w:rPr>
+            <w:color w:val="0000EE"/>
+            <w:u w:val="single"/>
+            <w:sz w:val="18"/>
+          </w:rPr>
+          <w:t>doi:10.1162/netn_a_00186</w:t>
+        </w:r>
+      </w:hyperlink>
     </w:p>
     <w:p>
       <w:pPr>
@@ -2418,11 +3130,11 @@
         <w:rPr>
           <w:sz w:val="22"/>
         </w:rPr>
-        <w:t>58.</w:t>
+        <w:t>57.</w:t>
         <w:tab/>
       </w:r>
       <w:r>
-        <w:t xml:space="preserve">Månsson KNT, Lindqvist D, Yang L, Svanborg C, Isung J, </w:t>
+        <w:t xml:space="preserve">Tamm S, </w:t>
       </w:r>
       <w:r>
         <w:rPr>
@@ -2431,23 +3143,36 @@
         <w:t>Nilsonne G</w:t>
       </w:r>
       <w:r>
-        <w:t>, Bergman Nordgren L, El Alaou Si, Hedman-Lagerlöf E, Kraepelien M, Högström J, Andersson G, Boraxbekk C-J, Fischer H, Lavebratt C, Wolkowitz O, Furmark T</w:t>
+        <w:t>, Schwarz J, Golkar A, Kecklund G, Petrovic P, Fischer H, Åkerstedt T, Lekander M</w:t>
       </w:r>
       <w:r>
         <w:t xml:space="preserve">: </w:t>
       </w:r>
       <w:r>
-        <w:t xml:space="preserve">Improvement in indices of cellular protection after psychological treatment for social anxiety disorder. </w:t>
+        <w:t xml:space="preserve">Sleep restriction caused impaired emotional regulation without detectable brain activation changes - a functional magnetic resonance imaging study. </w:t>
       </w:r>
       <w:r>
         <w:rPr>
           <w:i/>
         </w:rPr>
-        <w:t>Translational Psychiatry</w:t>
-      </w:r>
-      <w:r>
-        <w:t>,9:340, 2019.</w:t>
-      </w:r>
+        <w:t>Royal Society Open Science</w:t>
+      </w:r>
+      <w:r>
+        <w:t>,6:181704-181704, 2019.</w:t>
+      </w:r>
+      <w:r>
+        <w:t xml:space="preserve"> </w:t>
+      </w:r>
+      <w:hyperlink r:id="rId63">
+        <w:r>
+          <w:rPr>
+            <w:color w:val="0000EE"/>
+            <w:u w:val="single"/>
+            <w:sz w:val="18"/>
+          </w:rPr>
+          <w:t>doi:10.1098/rsos.181704</w:t>
+        </w:r>
+      </w:hyperlink>
     </w:p>
     <w:p>
       <w:pPr>
@@ -2461,11 +3186,11 @@
         <w:rPr>
           <w:sz w:val="22"/>
         </w:rPr>
-        <w:t>59.</w:t>
+        <w:t>58.</w:t>
         <w:tab/>
       </w:r>
       <w:r>
-        <w:t xml:space="preserve">Lakens D, Adolfi FG, Albers CJ, Anvari F, Apps MAJ, Argamon SE, Baguley T, Becker RB, Benning SD, Bradford DE, Buchanan EM, Caldwell AR, Van Calster B, Carlsson R, Chen S-C, Chung B, Colling LJ, Collins GS, Crook Z, Cross ES, Daniels S, Danielsson H, DeBruine L, Dunleavy DJ, Earp BD, Feist MI, Ferrell JD, Field JG, Fox NW, Friesen A, Gomes C, Gonzalez-Marquez M, Grange JA, Grieve AP, Guggenberger R, Grist J, van Harmelen A-L, Hasselman F, Hochard KD, Hoffarth MR, Holmes NP, Ingre M, Isager PM, Isotalus HK, Johansson C, Juszczyk K, Kenny DA, Khalil AA, Konat B, Lao J, Larsen EG, Lodder GMA, Lukavsky J, Madan CR, Manheim D, Martin SR, Martin AE, Mayo DG, McCarthy RJ, McConway K, McFarland C, Nio AQX, </w:t>
+        <w:t xml:space="preserve">Lodin K, Lekander M, Petrovic P, </w:t>
       </w:r>
       <w:r>
         <w:rPr>
@@ -2474,23 +3199,36 @@
         <w:t>Nilsonne G</w:t>
       </w:r>
       <w:r>
-        <w:t>, de Oliveira CL, de Xivry J-JO, Parsons S, Pfuhl G, Quinn KA, Sakon JJ, Saribay SA, Schneider IK, Selvaraju M, Sjoerds Z, Smith SG, Smits T, Spies JR, Sreekumar V, Steltenpohl CN, Stenhouse N, Swiatkowski W, Vadillo MA, Van Assen MALM, Williams MN, Williams SE, Williams DR, Yarkoni T, Ziano I, Zwaan RA</w:t>
+        <w:t>, Hedman-Lagerlöf E, Andreasson A</w:t>
       </w:r>
       <w:r>
         <w:t xml:space="preserve">: </w:t>
       </w:r>
       <w:r>
-        <w:t xml:space="preserve">Justify Your Alpha: A Response to “Redefine Statistical Significance”. </w:t>
+        <w:t xml:space="preserve">Cross-sectional associations between inflammation, sickness behaviour, health anxiety and self-rated health in a Swedish primary care population. </w:t>
       </w:r>
       <w:r>
         <w:rPr>
           <w:i/>
         </w:rPr>
-        <w:t>Nature Human Behaviour</w:t>
-      </w:r>
-      <w:r>
-        <w:t>,2:168-171, 2018.</w:t>
-      </w:r>
+        <w:t>European Journal of Inflammation</w:t>
+      </w:r>
+      <w:r>
+        <w:t>,17:2058739219844357, 2019.</w:t>
+      </w:r>
+      <w:r>
+        <w:t xml:space="preserve"> </w:t>
+      </w:r>
+      <w:hyperlink r:id="rId64">
+        <w:r>
+          <w:rPr>
+            <w:color w:val="0000EE"/>
+            <w:u w:val="single"/>
+            <w:sz w:val="18"/>
+          </w:rPr>
+          <w:t>doi:10.1177/2058739219844357</w:t>
+        </w:r>
+      </w:hyperlink>
     </w:p>
     <w:p>
       <w:pPr>
@@ -2504,11 +3242,11 @@
         <w:rPr>
           <w:sz w:val="22"/>
         </w:rPr>
-        <w:t>60.</w:t>
+        <w:t>59.</w:t>
         <w:tab/>
       </w:r>
       <w:r>
-        <w:t xml:space="preserve">Radun I, </w:t>
+        <w:t xml:space="preserve">Månsson KNT, Lindqvist D, Yang L, Svanborg C, Isung J, </w:t>
       </w:r>
       <w:r>
         <w:rPr>
@@ -2517,23 +3255,36 @@
         <w:t>Nilsonne G</w:t>
       </w:r>
       <w:r>
-        <w:t>, Radun J, Helgesson G, Kecklund G</w:t>
+        <w:t>, Bergman Nordgren L, El Alaou Si, Hedman-Lagerlöf E, Kraepelien M, Högström J, Andersson G, Boraxbekk C-J, Fischer H, Lavebratt C, Wolkowitz O, Furmark T</w:t>
       </w:r>
       <w:r>
         <w:t xml:space="preserve">: </w:t>
       </w:r>
       <w:r>
-        <w:t xml:space="preserve">Company employees as experimental participants in traffic safety research: prevalence and implications. </w:t>
+        <w:t xml:space="preserve">Improvement in indices of cellular protection after psychological treatment for social anxiety disorder. </w:t>
       </w:r>
       <w:r>
         <w:rPr>
           <w:i/>
         </w:rPr>
-        <w:t>Transportation Research Part F: Psychology and Behaviour</w:t>
-      </w:r>
-      <w:r>
-        <w:t>,60:81-92, 2018.</w:t>
-      </w:r>
+        <w:t>Translational Psychiatry</w:t>
+      </w:r>
+      <w:r>
+        <w:t>,9:340, 2019.</w:t>
+      </w:r>
+      <w:r>
+        <w:t xml:space="preserve"> </w:t>
+      </w:r>
+      <w:hyperlink r:id="rId65">
+        <w:r>
+          <w:rPr>
+            <w:color w:val="0000EE"/>
+            <w:u w:val="single"/>
+            <w:sz w:val="18"/>
+          </w:rPr>
+          <w:t>doi:10.1038/s41398-019-0668-2</w:t>
+        </w:r>
+      </w:hyperlink>
     </w:p>
     <w:p>
       <w:pPr>
@@ -2547,11 +3298,11 @@
         <w:rPr>
           <w:sz w:val="22"/>
         </w:rPr>
-        <w:t>61.</w:t>
+        <w:t>60.</w:t>
         <w:tab/>
       </w:r>
       <w:r>
-        <w:t xml:space="preserve">McGrath C, </w:t>
+        <w:t xml:space="preserve">Lakens D, Adolfi FG, Albers CJ, Anvari F, Apps MAJ, Argamon SE, Baguley T, Becker RB, Benning SD, Bradford DE, Buchanan EM, Caldwell AR, Van Calster B, Carlsson R, Chen S-C, Chung B, Colling LJ, Collins GS, Crook Z, Cross ES, Daniels S, Danielsson H, DeBruine L, Dunleavy DJ, Earp BD, Feist MI, Ferrell JD, Field JG, Fox NW, Friesen A, Gomes C, Gonzalez-Marquez M, Grange JA, Grieve AP, Guggenberger R, Grist J, van Harmelen A-L, Hasselman F, Hochard KD, Hoffarth MR, Holmes NP, Ingre M, Isager PM, Isotalus HK, Johansson C, Juszczyk K, Kenny DA, Khalil AA, Konat B, Lao J, Larsen EG, Lodder GMA, Lukavsky J, Madan CR, Manheim D, Martin SR, Martin AE, Mayo DG, McCarthy RJ, McConway K, McFarland C, Nio AQX, </w:t>
       </w:r>
       <w:r>
         <w:rPr>
@@ -2560,32 +3311,36 @@
         <w:t>Nilsonne G</w:t>
       </w:r>
       <w:r>
+        <w:t>, de Oliveira CL, de Xivry J-JO, Parsons S, Pfuhl G, Quinn KA, Sakon JJ, Saribay SA, Schneider IK, Selvaraju M, Sjoerds Z, Smith SG, Smits T, Spies JR, Sreekumar V, Steltenpohl CN, Stenhouse N, Swiatkowski W, Vadillo MA, Van Assen MALM, Williams MN, Williams SE, Williams DR, Yarkoni T, Ziano I, Zwaan RA</w:t>
+      </w:r>
+      <w:r>
         <w:t xml:space="preserve">: </w:t>
       </w:r>
       <w:r>
-        <w:t xml:space="preserve">Data sharing in qualitative research: opportunities and concerns. </w:t>
+        <w:t xml:space="preserve">Justify Your Alpha: A Response to “Redefine Statistical Significance”. </w:t>
       </w:r>
       <w:r>
         <w:rPr>
           <w:i/>
         </w:rPr>
-        <w:t>MedEdPublish</w:t>
-      </w:r>
-      <w:r>
-        <w:t>,7:255-255, 2018.</w:t>
-      </w:r>
-    </w:p>
-    <w:p>
-      <w:pPr>
-        <w:pStyle w:val="Heading3"/>
-      </w:pPr>
-      <w:r>
-        <w:rPr>
-          <w:rFonts w:ascii="Times New Roman" w:hAnsi="Times New Roman"/>
-          <w:color w:val="000000"/>
-        </w:rPr>
-        <w:t>Review articles</w:t>
-      </w:r>
+        <w:t>Nature Human Behaviour</w:t>
+      </w:r>
+      <w:r>
+        <w:t>,2:168-171, 2018.</w:t>
+      </w:r>
+      <w:r>
+        <w:t xml:space="preserve"> </w:t>
+      </w:r>
+      <w:hyperlink r:id="rId66">
+        <w:r>
+          <w:rPr>
+            <w:color w:val="0000EE"/>
+            <w:u w:val="single"/>
+            <w:sz w:val="18"/>
+          </w:rPr>
+          <w:t>doi:10.1038/s41562-018-0311-x</w:t>
+        </w:r>
+      </w:hyperlink>
     </w:p>
     <w:p>
       <w:pPr>
@@ -2599,11 +3354,11 @@
         <w:rPr>
           <w:sz w:val="22"/>
         </w:rPr>
-        <w:t>1.</w:t>
+        <w:t>61.</w:t>
         <w:tab/>
       </w:r>
       <w:r>
-        <w:t xml:space="preserve">Sorjonen K, Ingre M, Melin B, </w:t>
+        <w:t xml:space="preserve">Radun I, </w:t>
       </w:r>
       <w:r>
         <w:rPr>
@@ -2612,20 +3367,36 @@
         <w:t>Nilsonne G</w:t>
       </w:r>
       <w:r>
+        <w:t>, Radun J, Helgesson G, Kecklund G</w:t>
+      </w:r>
+      <w:r>
         <w:t xml:space="preserve">: </w:t>
       </w:r>
       <w:r>
-        <w:t xml:space="preserve">Questioning the Reciprocal Effects Model of Academic Self-Concept and Achievement: A Reanalysis of a Meta-Analysis of Longitudinal Studies and a Simulation. </w:t>
+        <w:t xml:space="preserve">Company employees as experimental participants in traffic safety research: prevalence and implications. </w:t>
       </w:r>
       <w:r>
         <w:rPr>
           <w:i/>
         </w:rPr>
-        <w:t>Sage Open</w:t>
-      </w:r>
-      <w:r>
-        <w:t>,14:21582440241292826, 2024.</w:t>
-      </w:r>
+        <w:t>Transportation Research Part F: Psychology and Behaviour</w:t>
+      </w:r>
+      <w:r>
+        <w:t>,60:81-92, 2018.</w:t>
+      </w:r>
+      <w:r>
+        <w:t xml:space="preserve"> </w:t>
+      </w:r>
+      <w:hyperlink r:id="rId67">
+        <w:r>
+          <w:rPr>
+            <w:color w:val="0000EE"/>
+            <w:u w:val="single"/>
+            <w:sz w:val="18"/>
+          </w:rPr>
+          <w:t>doi:10.1016/j.trf.2018.10.008</w:t>
+        </w:r>
+      </w:hyperlink>
     </w:p>
     <w:p>
       <w:pPr>
@@ -2639,11 +3410,11 @@
         <w:rPr>
           <w:sz w:val="22"/>
         </w:rPr>
-        <w:t>2.</w:t>
+        <w:t>62.</w:t>
         <w:tab/>
       </w:r>
       <w:r>
-        <w:t xml:space="preserve">Sorjonen K, </w:t>
+        <w:t xml:space="preserve">McGrath C, </w:t>
       </w:r>
       <w:r>
         <w:rPr>
@@ -2652,22 +3423,44 @@
         <w:t>Nilsonne G</w:t>
       </w:r>
       <w:r>
-        <w:t>, Melin B</w:t>
-      </w:r>
-      <w:r>
         <w:t xml:space="preserve">: </w:t>
       </w:r>
       <w:r>
-        <w:t xml:space="preserve">Distorted meta-analytic findings on peer influence: A reanalysis. </w:t>
+        <w:t xml:space="preserve">Data sharing in qualitative research: opportunities and concerns. </w:t>
       </w:r>
       <w:r>
         <w:rPr>
           <w:i/>
         </w:rPr>
-        <w:t>Heliyon</w:t>
-      </w:r>
-      <w:r>
-        <w:t>, 2023.</w:t>
+        <w:t>MedEdPublish</w:t>
+      </w:r>
+      <w:r>
+        <w:t>,7:255-255, 2018.</w:t>
+      </w:r>
+      <w:r>
+        <w:t xml:space="preserve"> </w:t>
+      </w:r>
+      <w:hyperlink r:id="rId68">
+        <w:r>
+          <w:rPr>
+            <w:color w:val="0000EE"/>
+            <w:u w:val="single"/>
+            <w:sz w:val="18"/>
+          </w:rPr>
+          <w:t>doi:10.15694/mep.2018.0000255.1</w:t>
+        </w:r>
+      </w:hyperlink>
+    </w:p>
+    <w:p>
+      <w:pPr>
+        <w:pStyle w:val="Heading3"/>
+      </w:pPr>
+      <w:r>
+        <w:rPr>
+          <w:rFonts w:ascii="Times New Roman" w:hAnsi="Times New Roman"/>
+          <w:color w:val="000000"/>
+        </w:rPr>
+        <w:t>Review articles</w:t>
       </w:r>
     </w:p>
     <w:p>
@@ -2682,11 +3475,11 @@
         <w:rPr>
           <w:sz w:val="22"/>
         </w:rPr>
-        <w:t>3.</w:t>
+        <w:t>1.</w:t>
         <w:tab/>
       </w:r>
       <w:r>
-        <w:t xml:space="preserve">Lindsäter E, Svärdman F, Wallert J, Ivanova EN, Söderholm A, Fondberg R, </w:t>
+        <w:t xml:space="preserve">Sorjonen K, Ingre M, Melin B, </w:t>
       </w:r>
       <w:r>
         <w:rPr>
@@ -2695,6 +3488,115 @@
         <w:t>Nilsonne G</w:t>
       </w:r>
       <w:r>
+        <w:t xml:space="preserve">: </w:t>
+      </w:r>
+      <w:r>
+        <w:t xml:space="preserve">Questioning the Reciprocal Effects Model of Academic Self-Concept and Achievement: A Reanalysis of a Meta-Analysis of Longitudinal Studies and a Simulation. </w:t>
+      </w:r>
+      <w:r>
+        <w:rPr>
+          <w:i/>
+        </w:rPr>
+        <w:t>Sage Open</w:t>
+      </w:r>
+      <w:r>
+        <w:t>,14:21582440241292826, 2024.</w:t>
+      </w:r>
+      <w:r>
+        <w:t xml:space="preserve"> </w:t>
+      </w:r>
+      <w:hyperlink r:id="rId69">
+        <w:r>
+          <w:rPr>
+            <w:color w:val="0000EE"/>
+            <w:u w:val="single"/>
+            <w:sz w:val="18"/>
+          </w:rPr>
+          <w:t>doi:10.1177/21582440241292826</w:t>
+        </w:r>
+      </w:hyperlink>
+    </w:p>
+    <w:p>
+      <w:pPr>
+        <w:spacing w:after="80" w:before="20"/>
+        <w:ind w:left="567" w:hanging="567"/>
+        <w:tabs>
+          <w:tab w:val="left" w:pos="566"/>
+        </w:tabs>
+      </w:pPr>
+      <w:r>
+        <w:rPr>
+          <w:sz w:val="22"/>
+        </w:rPr>
+        <w:t>2.</w:t>
+        <w:tab/>
+      </w:r>
+      <w:r>
+        <w:t xml:space="preserve">Sorjonen K, </w:t>
+      </w:r>
+      <w:r>
+        <w:rPr>
+          <w:b/>
+        </w:rPr>
+        <w:t>Nilsonne G</w:t>
+      </w:r>
+      <w:r>
+        <w:t>, Melin B</w:t>
+      </w:r>
+      <w:r>
+        <w:t xml:space="preserve">: </w:t>
+      </w:r>
+      <w:r>
+        <w:t xml:space="preserve">Distorted meta-analytic findings on peer influence: A reanalysis. </w:t>
+      </w:r>
+      <w:r>
+        <w:rPr>
+          <w:i/>
+        </w:rPr>
+        <w:t>Heliyon</w:t>
+      </w:r>
+      <w:r>
+        <w:t>, 2023.</w:t>
+      </w:r>
+      <w:r>
+        <w:t xml:space="preserve"> </w:t>
+      </w:r>
+      <w:hyperlink r:id="rId70">
+        <w:r>
+          <w:rPr>
+            <w:color w:val="0000EE"/>
+            <w:u w:val="single"/>
+            <w:sz w:val="18"/>
+          </w:rPr>
+          <w:t>doi:10.1016/j.heliyon.2023.e21458</w:t>
+        </w:r>
+      </w:hyperlink>
+    </w:p>
+    <w:p>
+      <w:pPr>
+        <w:spacing w:after="80" w:before="20"/>
+        <w:ind w:left="567" w:hanging="567"/>
+        <w:tabs>
+          <w:tab w:val="left" w:pos="566"/>
+        </w:tabs>
+      </w:pPr>
+      <w:r>
+        <w:rPr>
+          <w:sz w:val="22"/>
+        </w:rPr>
+        <w:t>3.</w:t>
+        <w:tab/>
+      </w:r>
+      <w:r>
+        <w:t xml:space="preserve">Lindsäter E, Svärdman F, Wallert J, Ivanova EN, Söderholm A, Fondberg R, </w:t>
+      </w:r>
+      <w:r>
+        <w:rPr>
+          <w:b/>
+        </w:rPr>
+        <w:t>Nilsonne G</w:t>
+      </w:r>
+      <w:r>
         <w:t>, Cervenka S, Lekander M, Rück C</w:t>
       </w:r>
       <w:r>
@@ -2712,6 +3614,19 @@
       <w:r>
         <w:t>,8:e159, 2022.</w:t>
       </w:r>
+      <w:r>
+        <w:t xml:space="preserve"> </w:t>
+      </w:r>
+      <w:hyperlink r:id="rId71">
+        <w:r>
+          <w:rPr>
+            <w:color w:val="0000EE"/>
+            <w:u w:val="single"/>
+            <w:sz w:val="18"/>
+          </w:rPr>
+          <w:t>doi:10.1192/bjo.2022.559</w:t>
+        </w:r>
+      </w:hyperlink>
     </w:p>
     <w:sectPr>
       <w:pgSz w:w="12240" w:h="15840"/>

</xml_diff>

<commit_message>
Add open resource links to Cancerfonden docx [preprint | data | code | ...]
Same link types as main CV: preprint, data, code, materials, prereg, etc.
Rendered as clickable hyperlinks in brackets after the DOI.
</commit_message>
<xml_diff>
--- a/output/cancerfonden_publist.docx
+++ b/output/cancerfonden_publist.docx
@@ -79,6 +79,25 @@
           <w:t>doi:10.1016/j.freeradbiomed.2006.04.031</w:t>
         </w:r>
       </w:hyperlink>
+      <w:r>
+        <w:t xml:space="preserve"> [</w:t>
+      </w:r>
+      <w:hyperlink r:id="rId10">
+        <w:r>
+          <w:rPr>
+            <w:color w:val="0000EE"/>
+            <w:u w:val="single"/>
+            <w:sz w:val="18"/>
+          </w:rPr>
+          <w:t>preprint</w:t>
+        </w:r>
+      </w:hyperlink>
+      <w:r>
+        <w:rPr>
+          <w:sz w:val="18"/>
+        </w:rPr>
+        <w:t>]</w:t>
+      </w:r>
     </w:p>
     <w:p>
       <w:pPr>
@@ -149,7 +168,7 @@
       <w:r>
         <w:t xml:space="preserve"> </w:t>
       </w:r>
-      <w:hyperlink r:id="rId10">
+      <w:hyperlink r:id="rId11">
         <w:r>
           <w:rPr>
             <w:color w:val="0000EE"/>
@@ -202,7 +221,7 @@
       <w:r>
         <w:t xml:space="preserve"> </w:t>
       </w:r>
-      <w:hyperlink r:id="rId11">
+      <w:hyperlink r:id="rId12">
         <w:r>
           <w:rPr>
             <w:color w:val="0000EE"/>
@@ -212,6 +231,25 @@
           <w:t>doi:10.1016/j.jclinepi.2025.111710</w:t>
         </w:r>
       </w:hyperlink>
+      <w:r>
+        <w:t xml:space="preserve"> [</w:t>
+      </w:r>
+      <w:hyperlink r:id="rId13">
+        <w:r>
+          <w:rPr>
+            <w:color w:val="0000EE"/>
+            <w:u w:val="single"/>
+            <w:sz w:val="18"/>
+          </w:rPr>
+          <w:t>preprint</w:t>
+        </w:r>
+      </w:hyperlink>
+      <w:r>
+        <w:rPr>
+          <w:sz w:val="18"/>
+        </w:rPr>
+        <w:t>]</w:t>
+      </w:r>
     </w:p>
     <w:p>
       <w:pPr>
@@ -258,7 +296,7 @@
       <w:r>
         <w:t xml:space="preserve"> </w:t>
       </w:r>
-      <w:hyperlink r:id="rId12">
+      <w:hyperlink r:id="rId14">
         <w:r>
           <w:rPr>
             <w:color w:val="0000EE"/>
@@ -268,6 +306,25 @@
           <w:t>doi:10.1186/s12915-024-02101-x</w:t>
         </w:r>
       </w:hyperlink>
+      <w:r>
+        <w:t xml:space="preserve"> [</w:t>
+      </w:r>
+      <w:hyperlink r:id="rId15">
+        <w:r>
+          <w:rPr>
+            <w:color w:val="0000EE"/>
+            <w:u w:val="single"/>
+            <w:sz w:val="18"/>
+          </w:rPr>
+          <w:t>preprint</w:t>
+        </w:r>
+      </w:hyperlink>
+      <w:r>
+        <w:rPr>
+          <w:sz w:val="18"/>
+        </w:rPr>
+        <w:t>]</w:t>
+      </w:r>
     </w:p>
     <w:p>
       <w:pPr>
@@ -311,7 +368,7 @@
       <w:r>
         <w:t xml:space="preserve"> </w:t>
       </w:r>
-      <w:hyperlink r:id="rId13">
+      <w:hyperlink r:id="rId16">
         <w:r>
           <w:rPr>
             <w:color w:val="0000EE"/>
@@ -321,6 +378,25 @@
           <w:t>doi:10.1007/s10648-025-10083-7</w:t>
         </w:r>
       </w:hyperlink>
+      <w:r>
+        <w:t xml:space="preserve"> [</w:t>
+      </w:r>
+      <w:hyperlink r:id="rId17">
+        <w:r>
+          <w:rPr>
+            <w:color w:val="0000EE"/>
+            <w:u w:val="single"/>
+            <w:sz w:val="18"/>
+          </w:rPr>
+          <w:t>preprint</w:t>
+        </w:r>
+      </w:hyperlink>
+      <w:r>
+        <w:rPr>
+          <w:sz w:val="18"/>
+        </w:rPr>
+        <w:t>]</w:t>
+      </w:r>
     </w:p>
     <w:p>
       <w:pPr>
@@ -364,7 +440,7 @@
       <w:r>
         <w:t xml:space="preserve"> </w:t>
       </w:r>
-      <w:hyperlink r:id="rId14">
+      <w:hyperlink r:id="rId18">
         <w:r>
           <w:rPr>
             <w:color w:val="0000EE"/>
@@ -417,7 +493,7 @@
       <w:r>
         <w:t xml:space="preserve"> </w:t>
       </w:r>
-      <w:hyperlink r:id="rId15">
+      <w:hyperlink r:id="rId19">
         <w:r>
           <w:rPr>
             <w:color w:val="0000EE"/>
@@ -470,7 +546,7 @@
       <w:r>
         <w:t xml:space="preserve"> </w:t>
       </w:r>
-      <w:hyperlink r:id="rId16">
+      <w:hyperlink r:id="rId20">
         <w:r>
           <w:rPr>
             <w:color w:val="0000EE"/>
@@ -480,6 +556,25 @@
           <w:t>doi:10.1162/jocn_a_02087</w:t>
         </w:r>
       </w:hyperlink>
+      <w:r>
+        <w:t xml:space="preserve"> [</w:t>
+      </w:r>
+      <w:hyperlink r:id="rId21">
+        <w:r>
+          <w:rPr>
+            <w:color w:val="0000EE"/>
+            <w:u w:val="single"/>
+            <w:sz w:val="18"/>
+          </w:rPr>
+          <w:t>preprint</w:t>
+        </w:r>
+      </w:hyperlink>
+      <w:r>
+        <w:rPr>
+          <w:sz w:val="18"/>
+        </w:rPr>
+        <w:t>]</w:t>
+      </w:r>
     </w:p>
     <w:p>
       <w:pPr>
@@ -526,7 +621,7 @@
       <w:r>
         <w:t xml:space="preserve"> </w:t>
       </w:r>
-      <w:hyperlink r:id="rId17">
+      <w:hyperlink r:id="rId22">
         <w:r>
           <w:rPr>
             <w:color w:val="0000EE"/>
@@ -536,6 +631,25 @@
           <w:t>doi:10.1162/imag_a_00103</w:t>
         </w:r>
       </w:hyperlink>
+      <w:r>
+        <w:t xml:space="preserve"> [</w:t>
+      </w:r>
+      <w:hyperlink r:id="rId23">
+        <w:r>
+          <w:rPr>
+            <w:color w:val="0000EE"/>
+            <w:u w:val="single"/>
+            <w:sz w:val="18"/>
+          </w:rPr>
+          <w:t>preprint</w:t>
+        </w:r>
+      </w:hyperlink>
+      <w:r>
+        <w:rPr>
+          <w:sz w:val="18"/>
+        </w:rPr>
+        <w:t>]</w:t>
+      </w:r>
     </w:p>
     <w:p>
       <w:pPr>
@@ -579,7 +693,7 @@
       <w:r>
         <w:t xml:space="preserve"> </w:t>
       </w:r>
-      <w:hyperlink r:id="rId18">
+      <w:hyperlink r:id="rId24">
         <w:r>
           <w:rPr>
             <w:color w:val="0000EE"/>
@@ -632,7 +746,7 @@
       <w:r>
         <w:t xml:space="preserve"> </w:t>
       </w:r>
-      <w:hyperlink r:id="rId19">
+      <w:hyperlink r:id="rId25">
         <w:r>
           <w:rPr>
             <w:color w:val="0000EE"/>
@@ -642,6 +756,25 @@
           <w:t>doi:10.1098/rsos.230513</w:t>
         </w:r>
       </w:hyperlink>
+      <w:r>
+        <w:t xml:space="preserve"> [</w:t>
+      </w:r>
+      <w:hyperlink r:id="rId26">
+        <w:r>
+          <w:rPr>
+            <w:color w:val="0000EE"/>
+            <w:u w:val="single"/>
+            <w:sz w:val="18"/>
+          </w:rPr>
+          <w:t>preprint</w:t>
+        </w:r>
+      </w:hyperlink>
+      <w:r>
+        <w:rPr>
+          <w:sz w:val="18"/>
+        </w:rPr>
+        <w:t>]</w:t>
+      </w:r>
     </w:p>
     <w:p>
       <w:pPr>
@@ -728,7 +861,7 @@
       <w:r>
         <w:t xml:space="preserve"> </w:t>
       </w:r>
-      <w:hyperlink r:id="rId20">
+      <w:hyperlink r:id="rId27">
         <w:r>
           <w:rPr>
             <w:color w:val="0000EE"/>
@@ -738,6 +871,25 @@
           <w:t>doi:10.1098/rsos.240125</w:t>
         </w:r>
       </w:hyperlink>
+      <w:r>
+        <w:t xml:space="preserve"> [</w:t>
+      </w:r>
+      <w:hyperlink r:id="rId28">
+        <w:r>
+          <w:rPr>
+            <w:color w:val="0000EE"/>
+            <w:u w:val="single"/>
+            <w:sz w:val="18"/>
+          </w:rPr>
+          <w:t>preprint</w:t>
+        </w:r>
+      </w:hyperlink>
+      <w:r>
+        <w:rPr>
+          <w:sz w:val="18"/>
+        </w:rPr>
+        <w:t>]</w:t>
+      </w:r>
     </w:p>
     <w:p>
       <w:pPr>
@@ -784,7 +936,7 @@
       <w:r>
         <w:t xml:space="preserve"> </w:t>
       </w:r>
-      <w:hyperlink r:id="rId21">
+      <w:hyperlink r:id="rId29">
         <w:r>
           <w:rPr>
             <w:color w:val="0000EE"/>
@@ -840,7 +992,7 @@
       <w:r>
         <w:t xml:space="preserve"> </w:t>
       </w:r>
-      <w:hyperlink r:id="rId22">
+      <w:hyperlink r:id="rId30">
         <w:r>
           <w:rPr>
             <w:color w:val="0000EE"/>
@@ -896,7 +1048,7 @@
       <w:r>
         <w:t xml:space="preserve"> </w:t>
       </w:r>
-      <w:hyperlink r:id="rId23">
+      <w:hyperlink r:id="rId31">
         <w:r>
           <w:rPr>
             <w:color w:val="0000EE"/>
@@ -906,6 +1058,25 @@
           <w:t>doi:10.1001/jamanetworkopen.2024.48601</w:t>
         </w:r>
       </w:hyperlink>
+      <w:r>
+        <w:t xml:space="preserve"> [</w:t>
+      </w:r>
+      <w:hyperlink r:id="rId32">
+        <w:r>
+          <w:rPr>
+            <w:color w:val="0000EE"/>
+            <w:u w:val="single"/>
+            <w:sz w:val="18"/>
+          </w:rPr>
+          <w:t>preprint</w:t>
+        </w:r>
+      </w:hyperlink>
+      <w:r>
+        <w:rPr>
+          <w:sz w:val="18"/>
+        </w:rPr>
+        <w:t>]</w:t>
+      </w:r>
     </w:p>
     <w:p>
       <w:pPr>
@@ -952,7 +1123,7 @@
       <w:r>
         <w:t xml:space="preserve"> </w:t>
       </w:r>
-      <w:hyperlink r:id="rId24">
+      <w:hyperlink r:id="rId33">
         <w:r>
           <w:rPr>
             <w:color w:val="0000EE"/>
@@ -1008,7 +1179,7 @@
       <w:r>
         <w:t xml:space="preserve"> </w:t>
       </w:r>
-      <w:hyperlink r:id="rId25">
+      <w:hyperlink r:id="rId34">
         <w:r>
           <w:rPr>
             <w:color w:val="0000EE"/>
@@ -1018,6 +1189,25 @@
           <w:t>doi:10.1016/j.paid.2022.111925</w:t>
         </w:r>
       </w:hyperlink>
+      <w:r>
+        <w:t xml:space="preserve"> [</w:t>
+      </w:r>
+      <w:hyperlink r:id="rId35">
+        <w:r>
+          <w:rPr>
+            <w:color w:val="0000EE"/>
+            <w:u w:val="single"/>
+            <w:sz w:val="18"/>
+          </w:rPr>
+          <w:t>preprint</w:t>
+        </w:r>
+      </w:hyperlink>
+      <w:r>
+        <w:rPr>
+          <w:sz w:val="18"/>
+        </w:rPr>
+        <w:t>]</w:t>
+      </w:r>
     </w:p>
     <w:p>
       <w:pPr>
@@ -1064,7 +1254,7 @@
       <w:r>
         <w:t xml:space="preserve"> </w:t>
       </w:r>
-      <w:hyperlink r:id="rId26">
+      <w:hyperlink r:id="rId36">
         <w:r>
           <w:rPr>
             <w:color w:val="0000EE"/>
@@ -1120,7 +1310,7 @@
       <w:r>
         <w:t xml:space="preserve"> </w:t>
       </w:r>
-      <w:hyperlink r:id="rId27">
+      <w:hyperlink r:id="rId37">
         <w:r>
           <w:rPr>
             <w:color w:val="0000EE"/>
@@ -1130,6 +1320,25 @@
           <w:t>doi:10.1016/j.heliyon.2023.e15746</w:t>
         </w:r>
       </w:hyperlink>
+      <w:r>
+        <w:t xml:space="preserve"> [</w:t>
+      </w:r>
+      <w:hyperlink r:id="rId38">
+        <w:r>
+          <w:rPr>
+            <w:color w:val="0000EE"/>
+            <w:u w:val="single"/>
+            <w:sz w:val="18"/>
+          </w:rPr>
+          <w:t>preprint</w:t>
+        </w:r>
+      </w:hyperlink>
+      <w:r>
+        <w:rPr>
+          <w:sz w:val="18"/>
+        </w:rPr>
+        <w:t>]</w:t>
+      </w:r>
     </w:p>
     <w:p>
       <w:pPr>
@@ -1216,7 +1425,7 @@
       <w:r>
         <w:t xml:space="preserve"> </w:t>
       </w:r>
-      <w:hyperlink r:id="rId28">
+      <w:hyperlink r:id="rId39">
         <w:r>
           <w:rPr>
             <w:color w:val="0000EE"/>
@@ -1226,6 +1435,25 @@
           <w:t>doi:10.1098/rsos.230206</w:t>
         </w:r>
       </w:hyperlink>
+      <w:r>
+        <w:t xml:space="preserve"> [</w:t>
+      </w:r>
+      <w:hyperlink r:id="rId40">
+        <w:r>
+          <w:rPr>
+            <w:color w:val="0000EE"/>
+            <w:u w:val="single"/>
+            <w:sz w:val="18"/>
+          </w:rPr>
+          <w:t>preprint</w:t>
+        </w:r>
+      </w:hyperlink>
+      <w:r>
+        <w:rPr>
+          <w:sz w:val="18"/>
+        </w:rPr>
+        <w:t>]</w:t>
+      </w:r>
     </w:p>
     <w:p>
       <w:pPr>
@@ -1269,7 +1497,7 @@
       <w:r>
         <w:t xml:space="preserve"> </w:t>
       </w:r>
-      <w:hyperlink r:id="rId29">
+      <w:hyperlink r:id="rId41">
         <w:r>
           <w:rPr>
             <w:color w:val="0000EE"/>
@@ -1322,7 +1550,7 @@
       <w:r>
         <w:t xml:space="preserve"> </w:t>
       </w:r>
-      <w:hyperlink r:id="rId30">
+      <w:hyperlink r:id="rId42">
         <w:r>
           <w:rPr>
             <w:color w:val="0000EE"/>
@@ -1332,6 +1560,25 @@
           <w:t>doi:10.31234/osf.io/kds5c</w:t>
         </w:r>
       </w:hyperlink>
+      <w:r>
+        <w:t xml:space="preserve"> [</w:t>
+      </w:r>
+      <w:hyperlink r:id="rId42">
+        <w:r>
+          <w:rPr>
+            <w:color w:val="0000EE"/>
+            <w:u w:val="single"/>
+            <w:sz w:val="18"/>
+          </w:rPr>
+          <w:t>preprint</w:t>
+        </w:r>
+      </w:hyperlink>
+      <w:r>
+        <w:rPr>
+          <w:sz w:val="18"/>
+        </w:rPr>
+        <w:t>]</w:t>
+      </w:r>
     </w:p>
     <w:p>
       <w:pPr>
@@ -1375,7 +1622,7 @@
       <w:r>
         <w:t xml:space="preserve"> </w:t>
       </w:r>
-      <w:hyperlink r:id="rId31">
+      <w:hyperlink r:id="rId43">
         <w:r>
           <w:rPr>
             <w:color w:val="0000EE"/>
@@ -1385,6 +1632,25 @@
           <w:t>doi:10.1016/j.intell.2024.101815</w:t>
         </w:r>
       </w:hyperlink>
+      <w:r>
+        <w:t xml:space="preserve"> [</w:t>
+      </w:r>
+      <w:hyperlink r:id="rId44">
+        <w:r>
+          <w:rPr>
+            <w:color w:val="0000EE"/>
+            <w:u w:val="single"/>
+            <w:sz w:val="18"/>
+          </w:rPr>
+          <w:t>preprint</w:t>
+        </w:r>
+      </w:hyperlink>
+      <w:r>
+        <w:rPr>
+          <w:sz w:val="18"/>
+        </w:rPr>
+        <w:t>]</w:t>
+      </w:r>
     </w:p>
     <w:p>
       <w:pPr>
@@ -1431,7 +1697,7 @@
       <w:r>
         <w:t xml:space="preserve"> </w:t>
       </w:r>
-      <w:hyperlink r:id="rId32">
+      <w:hyperlink r:id="rId45">
         <w:r>
           <w:rPr>
             <w:color w:val="0000EE"/>
@@ -1441,6 +1707,25 @@
           <w:t>doi:10.1016/j.paid.2021.111268</w:t>
         </w:r>
       </w:hyperlink>
+      <w:r>
+        <w:t xml:space="preserve"> [</w:t>
+      </w:r>
+      <w:hyperlink r:id="rId46">
+        <w:r>
+          <w:rPr>
+            <w:color w:val="0000EE"/>
+            <w:u w:val="single"/>
+            <w:sz w:val="18"/>
+          </w:rPr>
+          <w:t>preprint</w:t>
+        </w:r>
+      </w:hyperlink>
+      <w:r>
+        <w:rPr>
+          <w:sz w:val="18"/>
+        </w:rPr>
+        <w:t>]</w:t>
+      </w:r>
     </w:p>
     <w:p>
       <w:pPr>
@@ -1484,7 +1769,7 @@
       <w:r>
         <w:t xml:space="preserve"> </w:t>
       </w:r>
-      <w:hyperlink r:id="rId33">
+      <w:hyperlink r:id="rId47">
         <w:r>
           <w:rPr>
             <w:color w:val="0000EE"/>
@@ -1494,6 +1779,25 @@
           <w:t>doi:10.1016/j.paid.2021.111520</w:t>
         </w:r>
       </w:hyperlink>
+      <w:r>
+        <w:t xml:space="preserve"> [</w:t>
+      </w:r>
+      <w:hyperlink r:id="rId48">
+        <w:r>
+          <w:rPr>
+            <w:color w:val="0000EE"/>
+            <w:u w:val="single"/>
+            <w:sz w:val="18"/>
+          </w:rPr>
+          <w:t>preprint</w:t>
+        </w:r>
+      </w:hyperlink>
+      <w:r>
+        <w:rPr>
+          <w:sz w:val="18"/>
+        </w:rPr>
+        <w:t>]</w:t>
+      </w:r>
     </w:p>
     <w:p>
       <w:pPr>
@@ -1540,7 +1844,7 @@
       <w:r>
         <w:t xml:space="preserve"> </w:t>
       </w:r>
-      <w:hyperlink r:id="rId34">
+      <w:hyperlink r:id="rId49">
         <w:r>
           <w:rPr>
             <w:color w:val="0000EE"/>
@@ -1550,6 +1854,25 @@
           <w:t>doi:10.1016/j.jad.2022.01.109</w:t>
         </w:r>
       </w:hyperlink>
+      <w:r>
+        <w:t xml:space="preserve"> [</w:t>
+      </w:r>
+      <w:hyperlink r:id="rId50">
+        <w:r>
+          <w:rPr>
+            <w:color w:val="0000EE"/>
+            <w:u w:val="single"/>
+            <w:sz w:val="18"/>
+          </w:rPr>
+          <w:t>preprint</w:t>
+        </w:r>
+      </w:hyperlink>
+      <w:r>
+        <w:rPr>
+          <w:sz w:val="18"/>
+        </w:rPr>
+        <w:t>]</w:t>
+      </w:r>
     </w:p>
     <w:p>
       <w:pPr>
@@ -1587,7 +1910,7 @@
       <w:r>
         <w:t xml:space="preserve"> </w:t>
       </w:r>
-      <w:hyperlink r:id="rId35">
+      <w:hyperlink r:id="rId51">
         <w:r>
           <w:rPr>
             <w:color w:val="0000EE"/>
@@ -1643,7 +1966,7 @@
       <w:r>
         <w:t xml:space="preserve"> </w:t>
       </w:r>
-      <w:hyperlink r:id="rId36">
+      <w:hyperlink r:id="rId52">
         <w:r>
           <w:rPr>
             <w:color w:val="0000EE"/>
@@ -1690,7 +2013,7 @@
       <w:r>
         <w:t xml:space="preserve"> </w:t>
       </w:r>
-      <w:hyperlink r:id="rId37">
+      <w:hyperlink r:id="rId53">
         <w:r>
           <w:rPr>
             <w:color w:val="0000EE"/>
@@ -1700,6 +2023,25 @@
           <w:t>doi:10.1073/pnas.2111091119</w:t>
         </w:r>
       </w:hyperlink>
+      <w:r>
+        <w:t xml:space="preserve"> [</w:t>
+      </w:r>
+      <w:hyperlink r:id="rId54">
+        <w:r>
+          <w:rPr>
+            <w:color w:val="0000EE"/>
+            <w:u w:val="single"/>
+            <w:sz w:val="18"/>
+          </w:rPr>
+          <w:t>preprint</w:t>
+        </w:r>
+      </w:hyperlink>
+      <w:r>
+        <w:rPr>
+          <w:sz w:val="18"/>
+        </w:rPr>
+        <w:t>]</w:t>
+      </w:r>
     </w:p>
     <w:p>
       <w:pPr>
@@ -1746,7 +2088,7 @@
       <w:r>
         <w:t xml:space="preserve"> </w:t>
       </w:r>
-      <w:hyperlink r:id="rId38">
+      <w:hyperlink r:id="rId55">
         <w:r>
           <w:rPr>
             <w:color w:val="0000EE"/>
@@ -1756,6 +2098,25 @@
           <w:t>doi:10.1186/s12887-022-03349-4</w:t>
         </w:r>
       </w:hyperlink>
+      <w:r>
+        <w:t xml:space="preserve"> [</w:t>
+      </w:r>
+      <w:hyperlink r:id="rId56">
+        <w:r>
+          <w:rPr>
+            <w:color w:val="0000EE"/>
+            <w:u w:val="single"/>
+            <w:sz w:val="18"/>
+          </w:rPr>
+          <w:t>preprint</w:t>
+        </w:r>
+      </w:hyperlink>
+      <w:r>
+        <w:rPr>
+          <w:sz w:val="18"/>
+        </w:rPr>
+        <w:t>]</w:t>
+      </w:r>
     </w:p>
     <w:p>
       <w:pPr>
@@ -1802,7 +2163,7 @@
       <w:r>
         <w:t xml:space="preserve"> </w:t>
       </w:r>
-      <w:hyperlink r:id="rId39">
+      <w:hyperlink r:id="rId57">
         <w:r>
           <w:rPr>
             <w:color w:val="0000EE"/>
@@ -1858,7 +2219,7 @@
       <w:r>
         <w:t xml:space="preserve"> </w:t>
       </w:r>
-      <w:hyperlink r:id="rId40">
+      <w:hyperlink r:id="rId58">
         <w:r>
           <w:rPr>
             <w:color w:val="0000EE"/>
@@ -1914,7 +2275,7 @@
       <w:r>
         <w:t xml:space="preserve"> </w:t>
       </w:r>
-      <w:hyperlink r:id="rId41">
+      <w:hyperlink r:id="rId59">
         <w:r>
           <w:rPr>
             <w:color w:val="0000EE"/>
@@ -1924,6 +2285,25 @@
           <w:t>doi:10.1016/j.jad.2022.08.003</w:t>
         </w:r>
       </w:hyperlink>
+      <w:r>
+        <w:t xml:space="preserve"> [</w:t>
+      </w:r>
+      <w:hyperlink r:id="rId60">
+        <w:r>
+          <w:rPr>
+            <w:color w:val="0000EE"/>
+            <w:u w:val="single"/>
+            <w:sz w:val="18"/>
+          </w:rPr>
+          <w:t>preprint</w:t>
+        </w:r>
+      </w:hyperlink>
+      <w:r>
+        <w:rPr>
+          <w:sz w:val="18"/>
+        </w:rPr>
+        <w:t>]</w:t>
+      </w:r>
     </w:p>
     <w:p>
       <w:pPr>
@@ -1970,7 +2350,7 @@
       <w:r>
         <w:t xml:space="preserve"> </w:t>
       </w:r>
-      <w:hyperlink r:id="rId42">
+      <w:hyperlink r:id="rId61">
         <w:r>
           <w:rPr>
             <w:color w:val="0000EE"/>
@@ -1980,6 +2360,25 @@
           <w:t>doi:10.1186/s41231-022-00130-8</w:t>
         </w:r>
       </w:hyperlink>
+      <w:r>
+        <w:t xml:space="preserve"> [</w:t>
+      </w:r>
+      <w:hyperlink r:id="rId62">
+        <w:r>
+          <w:rPr>
+            <w:color w:val="0000EE"/>
+            <w:u w:val="single"/>
+            <w:sz w:val="18"/>
+          </w:rPr>
+          <w:t>preprint</w:t>
+        </w:r>
+      </w:hyperlink>
+      <w:r>
+        <w:rPr>
+          <w:sz w:val="18"/>
+        </w:rPr>
+        <w:t>]</w:t>
+      </w:r>
     </w:p>
     <w:p>
       <w:pPr>
@@ -2023,7 +2422,7 @@
       <w:r>
         <w:t xml:space="preserve"> </w:t>
       </w:r>
-      <w:hyperlink r:id="rId43">
+      <w:hyperlink r:id="rId63">
         <w:r>
           <w:rPr>
             <w:color w:val="0000EE"/>
@@ -2033,6 +2432,25 @@
           <w:t>doi:10.1016/j.intell.2022.101706</w:t>
         </w:r>
       </w:hyperlink>
+      <w:r>
+        <w:t xml:space="preserve"> [</w:t>
+      </w:r>
+      <w:hyperlink r:id="rId64">
+        <w:r>
+          <w:rPr>
+            <w:color w:val="0000EE"/>
+            <w:u w:val="single"/>
+            <w:sz w:val="18"/>
+          </w:rPr>
+          <w:t>preprint</w:t>
+        </w:r>
+      </w:hyperlink>
+      <w:r>
+        <w:rPr>
+          <w:sz w:val="18"/>
+        </w:rPr>
+        <w:t>]</w:t>
+      </w:r>
     </w:p>
     <w:p>
       <w:pPr>
@@ -2079,7 +2497,7 @@
       <w:r>
         <w:t xml:space="preserve"> </w:t>
       </w:r>
-      <w:hyperlink r:id="rId44">
+      <w:hyperlink r:id="rId65">
         <w:r>
           <w:rPr>
             <w:color w:val="0000EE"/>
@@ -2089,6 +2507,25 @@
           <w:t>doi:10.1371/journal.pone.0297216</w:t>
         </w:r>
       </w:hyperlink>
+      <w:r>
+        <w:t xml:space="preserve"> [</w:t>
+      </w:r>
+      <w:hyperlink r:id="rId66">
+        <w:r>
+          <w:rPr>
+            <w:color w:val="0000EE"/>
+            <w:u w:val="single"/>
+            <w:sz w:val="18"/>
+          </w:rPr>
+          <w:t>preprint</w:t>
+        </w:r>
+      </w:hyperlink>
+      <w:r>
+        <w:rPr>
+          <w:sz w:val="18"/>
+        </w:rPr>
+        <w:t>]</w:t>
+      </w:r>
     </w:p>
     <w:p>
       <w:pPr>
@@ -2135,7 +2572,7 @@
       <w:r>
         <w:t xml:space="preserve"> </w:t>
       </w:r>
-      <w:hyperlink r:id="rId45">
+      <w:hyperlink r:id="rId67">
         <w:r>
           <w:rPr>
             <w:color w:val="0000EE"/>
@@ -2145,6 +2582,25 @@
           <w:t>doi:10.1111/psyp.13688</w:t>
         </w:r>
       </w:hyperlink>
+      <w:r>
+        <w:t xml:space="preserve"> [</w:t>
+      </w:r>
+      <w:hyperlink r:id="rId68">
+        <w:r>
+          <w:rPr>
+            <w:color w:val="0000EE"/>
+            <w:u w:val="single"/>
+            <w:sz w:val="18"/>
+          </w:rPr>
+          <w:t>preprint</w:t>
+        </w:r>
+      </w:hyperlink>
+      <w:r>
+        <w:rPr>
+          <w:sz w:val="18"/>
+        </w:rPr>
+        <w:t>]</w:t>
+      </w:r>
     </w:p>
     <w:p>
       <w:pPr>
@@ -2188,7 +2644,7 @@
       <w:r>
         <w:t xml:space="preserve"> </w:t>
       </w:r>
-      <w:hyperlink r:id="rId46">
+      <w:hyperlink r:id="rId69">
         <w:r>
           <w:rPr>
             <w:color w:val="0000EE"/>
@@ -2198,6 +2654,25 @@
           <w:t>doi:10.1038/s41587-020-00768-5</w:t>
         </w:r>
       </w:hyperlink>
+      <w:r>
+        <w:t xml:space="preserve"> [</w:t>
+      </w:r>
+      <w:hyperlink r:id="rId70">
+        <w:r>
+          <w:rPr>
+            <w:color w:val="0000EE"/>
+            <w:u w:val="single"/>
+            <w:sz w:val="18"/>
+          </w:rPr>
+          <w:t>preprint</w:t>
+        </w:r>
+      </w:hyperlink>
+      <w:r>
+        <w:rPr>
+          <w:sz w:val="18"/>
+        </w:rPr>
+        <w:t>]</w:t>
+      </w:r>
     </w:p>
     <w:p>
       <w:pPr>
@@ -2244,7 +2719,7 @@
       <w:r>
         <w:t xml:space="preserve"> </w:t>
       </w:r>
-      <w:hyperlink r:id="rId47">
+      <w:hyperlink r:id="rId71">
         <w:r>
           <w:rPr>
             <w:color w:val="0000EE"/>
@@ -2254,6 +2729,25 @@
           <w:t>doi:10.1016/j.cortex.2021.03.013</w:t>
         </w:r>
       </w:hyperlink>
+      <w:r>
+        <w:t xml:space="preserve"> [</w:t>
+      </w:r>
+      <w:hyperlink r:id="rId72">
+        <w:r>
+          <w:rPr>
+            <w:color w:val="0000EE"/>
+            <w:u w:val="single"/>
+            <w:sz w:val="18"/>
+          </w:rPr>
+          <w:t>preprint</w:t>
+        </w:r>
+      </w:hyperlink>
+      <w:r>
+        <w:rPr>
+          <w:sz w:val="18"/>
+        </w:rPr>
+        <w:t>]</w:t>
+      </w:r>
     </w:p>
     <w:p>
       <w:pPr>
@@ -2291,7 +2785,7 @@
       <w:r>
         <w:t xml:space="preserve"> </w:t>
       </w:r>
-      <w:hyperlink r:id="rId48">
+      <w:hyperlink r:id="rId73">
         <w:r>
           <w:rPr>
             <w:color w:val="0000EE"/>
@@ -2301,6 +2795,25 @@
           <w:t>doi:10.1016/j.neuron.2021.04.001</w:t>
         </w:r>
       </w:hyperlink>
+      <w:r>
+        <w:t xml:space="preserve"> [</w:t>
+      </w:r>
+      <w:hyperlink r:id="rId74">
+        <w:r>
+          <w:rPr>
+            <w:color w:val="0000EE"/>
+            <w:u w:val="single"/>
+            <w:sz w:val="18"/>
+          </w:rPr>
+          <w:t>preprint</w:t>
+        </w:r>
+      </w:hyperlink>
+      <w:r>
+        <w:rPr>
+          <w:sz w:val="18"/>
+        </w:rPr>
+        <w:t>]</w:t>
+      </w:r>
     </w:p>
     <w:p>
       <w:pPr>
@@ -2347,7 +2860,7 @@
       <w:r>
         <w:t xml:space="preserve"> </w:t>
       </w:r>
-      <w:hyperlink r:id="rId49">
+      <w:hyperlink r:id="rId75">
         <w:r>
           <w:rPr>
             <w:color w:val="0000EE"/>
@@ -2357,6 +2870,25 @@
           <w:t>doi:10.1038/s41431-021-00893-y</w:t>
         </w:r>
       </w:hyperlink>
+      <w:r>
+        <w:t xml:space="preserve"> [</w:t>
+      </w:r>
+      <w:hyperlink r:id="rId76">
+        <w:r>
+          <w:rPr>
+            <w:color w:val="0000EE"/>
+            <w:u w:val="single"/>
+            <w:sz w:val="18"/>
+          </w:rPr>
+          <w:t>preprint</w:t>
+        </w:r>
+      </w:hyperlink>
+      <w:r>
+        <w:rPr>
+          <w:sz w:val="18"/>
+        </w:rPr>
+        <w:t>]</w:t>
+      </w:r>
     </w:p>
     <w:p>
       <w:pPr>
@@ -2403,7 +2935,7 @@
       <w:r>
         <w:t xml:space="preserve"> </w:t>
       </w:r>
-      <w:hyperlink r:id="rId50">
+      <w:hyperlink r:id="rId77">
         <w:r>
           <w:rPr>
             <w:color w:val="0000EE"/>
@@ -2413,6 +2945,25 @@
           <w:t>doi:10.1016/j.obhdp.2021.02.003</w:t>
         </w:r>
       </w:hyperlink>
+      <w:r>
+        <w:t xml:space="preserve"> [</w:t>
+      </w:r>
+      <w:hyperlink r:id="rId78">
+        <w:r>
+          <w:rPr>
+            <w:color w:val="0000EE"/>
+            <w:u w:val="single"/>
+            <w:sz w:val="18"/>
+          </w:rPr>
+          <w:t>preprint</w:t>
+        </w:r>
+      </w:hyperlink>
+      <w:r>
+        <w:rPr>
+          <w:sz w:val="18"/>
+        </w:rPr>
+        <w:t>]</w:t>
+      </w:r>
     </w:p>
     <w:p>
       <w:pPr>
@@ -2459,7 +3010,7 @@
       <w:r>
         <w:t xml:space="preserve"> </w:t>
       </w:r>
-      <w:hyperlink r:id="rId51">
+      <w:hyperlink r:id="rId79">
         <w:r>
           <w:rPr>
             <w:color w:val="0000EE"/>
@@ -2515,7 +3066,7 @@
       <w:r>
         <w:t xml:space="preserve"> </w:t>
       </w:r>
-      <w:hyperlink r:id="rId52">
+      <w:hyperlink r:id="rId80">
         <w:r>
           <w:rPr>
             <w:color w:val="0000EE"/>
@@ -2525,6 +3076,41 @@
           <w:t>doi:10.1038/s41562-021-01173-x</w:t>
         </w:r>
       </w:hyperlink>
+      <w:r>
+        <w:t xml:space="preserve"> [</w:t>
+      </w:r>
+      <w:hyperlink r:id="rId81">
+        <w:r>
+          <w:rPr>
+            <w:color w:val="0000EE"/>
+            <w:u w:val="single"/>
+            <w:sz w:val="18"/>
+          </w:rPr>
+          <w:t>preprint</w:t>
+        </w:r>
+      </w:hyperlink>
+      <w:r>
+        <w:rPr>
+          <w:sz w:val="18"/>
+        </w:rPr>
+        <w:t xml:space="preserve"> | </w:t>
+      </w:r>
+      <w:hyperlink r:id="rId82">
+        <w:r>
+          <w:rPr>
+            <w:color w:val="0000EE"/>
+            <w:u w:val="single"/>
+            <w:sz w:val="18"/>
+          </w:rPr>
+          <w:t>correction</w:t>
+        </w:r>
+      </w:hyperlink>
+      <w:r>
+        <w:rPr>
+          <w:sz w:val="18"/>
+        </w:rPr>
+        <w:t>]</w:t>
+      </w:r>
     </w:p>
     <w:p>
       <w:pPr>
@@ -2571,7 +3157,7 @@
       <w:r>
         <w:t xml:space="preserve"> </w:t>
       </w:r>
-      <w:hyperlink r:id="rId53">
+      <w:hyperlink r:id="rId83">
         <w:r>
           <w:rPr>
             <w:color w:val="0000EE"/>
@@ -2624,7 +3210,7 @@
       <w:r>
         <w:t xml:space="preserve"> </w:t>
       </w:r>
-      <w:hyperlink r:id="rId54">
+      <w:hyperlink r:id="rId84">
         <w:r>
           <w:rPr>
             <w:color w:val="0000EE"/>
@@ -2634,6 +3220,25 @@
           <w:t>doi:10.1186/s40359-021-00653-z</w:t>
         </w:r>
       </w:hyperlink>
+      <w:r>
+        <w:t xml:space="preserve"> [</w:t>
+      </w:r>
+      <w:hyperlink r:id="rId85">
+        <w:r>
+          <w:rPr>
+            <w:color w:val="0000EE"/>
+            <w:u w:val="single"/>
+            <w:sz w:val="18"/>
+          </w:rPr>
+          <w:t>preprint</w:t>
+        </w:r>
+      </w:hyperlink>
+      <w:r>
+        <w:rPr>
+          <w:sz w:val="18"/>
+        </w:rPr>
+        <w:t>]</w:t>
+      </w:r>
     </w:p>
     <w:p>
       <w:pPr>
@@ -2680,7 +3285,7 @@
       <w:r>
         <w:t xml:space="preserve"> </w:t>
       </w:r>
-      <w:hyperlink r:id="rId55">
+      <w:hyperlink r:id="rId86">
         <w:r>
           <w:rPr>
             <w:color w:val="0000EE"/>
@@ -2690,6 +3295,25 @@
           <w:t>doi:10.7554/eLife.72185</w:t>
         </w:r>
       </w:hyperlink>
+      <w:r>
+        <w:t xml:space="preserve"> [</w:t>
+      </w:r>
+      <w:hyperlink r:id="rId87">
+        <w:r>
+          <w:rPr>
+            <w:color w:val="0000EE"/>
+            <w:u w:val="single"/>
+            <w:sz w:val="18"/>
+          </w:rPr>
+          <w:t>preprint</w:t>
+        </w:r>
+      </w:hyperlink>
+      <w:r>
+        <w:rPr>
+          <w:sz w:val="18"/>
+        </w:rPr>
+        <w:t>]</w:t>
+      </w:r>
     </w:p>
     <w:p>
       <w:pPr>
@@ -2736,7 +3360,7 @@
       <w:r>
         <w:t xml:space="preserve"> </w:t>
       </w:r>
-      <w:hyperlink r:id="rId56">
+      <w:hyperlink r:id="rId88">
         <w:r>
           <w:rPr>
             <w:color w:val="0000EE"/>
@@ -2792,7 +3416,7 @@
       <w:r>
         <w:t xml:space="preserve"> </w:t>
       </w:r>
-      <w:hyperlink r:id="rId57">
+      <w:hyperlink r:id="rId89">
         <w:r>
           <w:rPr>
             <w:color w:val="0000EE"/>
@@ -2802,6 +3426,25 @@
           <w:t>doi:10.1080/23743603.2020.1756239</w:t>
         </w:r>
       </w:hyperlink>
+      <w:r>
+        <w:t xml:space="preserve"> [</w:t>
+      </w:r>
+      <w:hyperlink r:id="rId90">
+        <w:r>
+          <w:rPr>
+            <w:color w:val="0000EE"/>
+            <w:u w:val="single"/>
+            <w:sz w:val="18"/>
+          </w:rPr>
+          <w:t>preprint</w:t>
+        </w:r>
+      </w:hyperlink>
+      <w:r>
+        <w:rPr>
+          <w:sz w:val="18"/>
+        </w:rPr>
+        <w:t>]</w:t>
+      </w:r>
     </w:p>
     <w:p>
       <w:pPr>
@@ -2848,7 +3491,7 @@
       <w:r>
         <w:t xml:space="preserve"> </w:t>
       </w:r>
-      <w:hyperlink r:id="rId58">
+      <w:hyperlink r:id="rId91">
         <w:r>
           <w:rPr>
             <w:color w:val="0000EE"/>
@@ -2858,6 +3501,25 @@
           <w:t>doi:10.1038/s41586-020-2314-9</w:t>
         </w:r>
       </w:hyperlink>
+      <w:r>
+        <w:t xml:space="preserve"> [</w:t>
+      </w:r>
+      <w:hyperlink r:id="rId92">
+        <w:r>
+          <w:rPr>
+            <w:color w:val="0000EE"/>
+            <w:u w:val="single"/>
+            <w:sz w:val="18"/>
+          </w:rPr>
+          <w:t>preprint</w:t>
+        </w:r>
+      </w:hyperlink>
+      <w:r>
+        <w:rPr>
+          <w:sz w:val="18"/>
+        </w:rPr>
+        <w:t>]</w:t>
+      </w:r>
     </w:p>
     <w:p>
       <w:pPr>
@@ -2895,7 +3557,7 @@
       <w:r>
         <w:t xml:space="preserve"> </w:t>
       </w:r>
-      <w:hyperlink r:id="rId59">
+      <w:hyperlink r:id="rId93">
         <w:r>
           <w:rPr>
             <w:color w:val="0000EE"/>
@@ -2948,7 +3610,7 @@
       <w:r>
         <w:t xml:space="preserve"> </w:t>
       </w:r>
-      <w:hyperlink r:id="rId60">
+      <w:hyperlink r:id="rId94">
         <w:r>
           <w:rPr>
             <w:color w:val="0000EE"/>
@@ -2958,6 +3620,25 @@
           <w:t>doi:10.1038/s41598-020-74489-9</w:t>
         </w:r>
       </w:hyperlink>
+      <w:r>
+        <w:t xml:space="preserve"> [</w:t>
+      </w:r>
+      <w:hyperlink r:id="rId95">
+        <w:r>
+          <w:rPr>
+            <w:color w:val="0000EE"/>
+            <w:u w:val="single"/>
+            <w:sz w:val="18"/>
+          </w:rPr>
+          <w:t>preprint</w:t>
+        </w:r>
+      </w:hyperlink>
+      <w:r>
+        <w:rPr>
+          <w:sz w:val="18"/>
+        </w:rPr>
+        <w:t>]</w:t>
+      </w:r>
     </w:p>
     <w:p>
       <w:pPr>
@@ -3004,7 +3685,7 @@
       <w:r>
         <w:t xml:space="preserve"> </w:t>
       </w:r>
-      <w:hyperlink r:id="rId61">
+      <w:hyperlink r:id="rId96">
         <w:r>
           <w:rPr>
             <w:color w:val="0000EE"/>
@@ -3014,6 +3695,25 @@
           <w:t>doi:10.1002/osp4.473</w:t>
         </w:r>
       </w:hyperlink>
+      <w:r>
+        <w:t xml:space="preserve"> [</w:t>
+      </w:r>
+      <w:hyperlink r:id="rId97">
+        <w:r>
+          <w:rPr>
+            <w:color w:val="0000EE"/>
+            <w:u w:val="single"/>
+            <w:sz w:val="18"/>
+          </w:rPr>
+          <w:t>preprint</w:t>
+        </w:r>
+      </w:hyperlink>
+      <w:r>
+        <w:rPr>
+          <w:sz w:val="18"/>
+        </w:rPr>
+        <w:t>]</w:t>
+      </w:r>
     </w:p>
     <w:p>
       <w:pPr>
@@ -3051,7 +3751,7 @@
       <w:r>
         <w:t xml:space="preserve"> </w:t>
       </w:r>
-      <w:hyperlink r:id="rId59">
+      <w:hyperlink r:id="rId93">
         <w:r>
           <w:rPr>
             <w:color w:val="0000EE"/>
@@ -3107,7 +3807,7 @@
       <w:r>
         <w:t xml:space="preserve"> </w:t>
       </w:r>
-      <w:hyperlink r:id="rId62">
+      <w:hyperlink r:id="rId98">
         <w:r>
           <w:rPr>
             <w:color w:val="0000EE"/>
@@ -3117,6 +3817,25 @@
           <w:t>doi:10.1162/netn_a_00186</w:t>
         </w:r>
       </w:hyperlink>
+      <w:r>
+        <w:t xml:space="preserve"> [</w:t>
+      </w:r>
+      <w:hyperlink r:id="rId99">
+        <w:r>
+          <w:rPr>
+            <w:color w:val="0000EE"/>
+            <w:u w:val="single"/>
+            <w:sz w:val="18"/>
+          </w:rPr>
+          <w:t>preprint</w:t>
+        </w:r>
+      </w:hyperlink>
+      <w:r>
+        <w:rPr>
+          <w:sz w:val="18"/>
+        </w:rPr>
+        <w:t>]</w:t>
+      </w:r>
     </w:p>
     <w:p>
       <w:pPr>
@@ -3163,7 +3882,7 @@
       <w:r>
         <w:t xml:space="preserve"> </w:t>
       </w:r>
-      <w:hyperlink r:id="rId63">
+      <w:hyperlink r:id="rId100">
         <w:r>
           <w:rPr>
             <w:color w:val="0000EE"/>
@@ -3173,6 +3892,25 @@
           <w:t>doi:10.1098/rsos.181704</w:t>
         </w:r>
       </w:hyperlink>
+      <w:r>
+        <w:t xml:space="preserve"> [</w:t>
+      </w:r>
+      <w:hyperlink r:id="rId101">
+        <w:r>
+          <w:rPr>
+            <w:color w:val="0000EE"/>
+            <w:u w:val="single"/>
+            <w:sz w:val="18"/>
+          </w:rPr>
+          <w:t>preprint</w:t>
+        </w:r>
+      </w:hyperlink>
+      <w:r>
+        <w:rPr>
+          <w:sz w:val="18"/>
+        </w:rPr>
+        <w:t>]</w:t>
+      </w:r>
     </w:p>
     <w:p>
       <w:pPr>
@@ -3219,7 +3957,7 @@
       <w:r>
         <w:t xml:space="preserve"> </w:t>
       </w:r>
-      <w:hyperlink r:id="rId64">
+      <w:hyperlink r:id="rId102">
         <w:r>
           <w:rPr>
             <w:color w:val="0000EE"/>
@@ -3275,7 +4013,7 @@
       <w:r>
         <w:t xml:space="preserve"> </w:t>
       </w:r>
-      <w:hyperlink r:id="rId65">
+      <w:hyperlink r:id="rId103">
         <w:r>
           <w:rPr>
             <w:color w:val="0000EE"/>
@@ -3331,7 +4069,7 @@
       <w:r>
         <w:t xml:space="preserve"> </w:t>
       </w:r>
-      <w:hyperlink r:id="rId66">
+      <w:hyperlink r:id="rId104">
         <w:r>
           <w:rPr>
             <w:color w:val="0000EE"/>
@@ -3341,6 +4079,41 @@
           <w:t>doi:10.1038/s41562-018-0311-x</w:t>
         </w:r>
       </w:hyperlink>
+      <w:r>
+        <w:t xml:space="preserve"> [</w:t>
+      </w:r>
+      <w:hyperlink r:id="rId105">
+        <w:r>
+          <w:rPr>
+            <w:color w:val="0000EE"/>
+            <w:u w:val="single"/>
+            <w:sz w:val="18"/>
+          </w:rPr>
+          <w:t>preprint</w:t>
+        </w:r>
+      </w:hyperlink>
+      <w:r>
+        <w:rPr>
+          <w:sz w:val="18"/>
+        </w:rPr>
+        <w:t xml:space="preserve"> | </w:t>
+      </w:r>
+      <w:hyperlink r:id="rId106">
+        <w:r>
+          <w:rPr>
+            <w:color w:val="0000EE"/>
+            <w:u w:val="single"/>
+            <w:sz w:val="18"/>
+          </w:rPr>
+          <w:t>data</w:t>
+        </w:r>
+      </w:hyperlink>
+      <w:r>
+        <w:rPr>
+          <w:sz w:val="18"/>
+        </w:rPr>
+        <w:t>]</w:t>
+      </w:r>
     </w:p>
     <w:p>
       <w:pPr>
@@ -3387,7 +4160,7 @@
       <w:r>
         <w:t xml:space="preserve"> </w:t>
       </w:r>
-      <w:hyperlink r:id="rId67">
+      <w:hyperlink r:id="rId107">
         <w:r>
           <w:rPr>
             <w:color w:val="0000EE"/>
@@ -3397,6 +4170,25 @@
           <w:t>doi:10.1016/j.trf.2018.10.008</w:t>
         </w:r>
       </w:hyperlink>
+      <w:r>
+        <w:t xml:space="preserve"> [</w:t>
+      </w:r>
+      <w:hyperlink r:id="rId108">
+        <w:r>
+          <w:rPr>
+            <w:color w:val="0000EE"/>
+            <w:u w:val="single"/>
+            <w:sz w:val="18"/>
+          </w:rPr>
+          <w:t>preprint</w:t>
+        </w:r>
+      </w:hyperlink>
+      <w:r>
+        <w:rPr>
+          <w:sz w:val="18"/>
+        </w:rPr>
+        <w:t>]</w:t>
+      </w:r>
     </w:p>
     <w:p>
       <w:pPr>
@@ -3440,7 +4232,7 @@
       <w:r>
         <w:t xml:space="preserve"> </w:t>
       </w:r>
-      <w:hyperlink r:id="rId68">
+      <w:hyperlink r:id="rId109">
         <w:r>
           <w:rPr>
             <w:color w:val="0000EE"/>
@@ -3450,6 +4242,25 @@
           <w:t>doi:10.15694/mep.2018.0000255.1</w:t>
         </w:r>
       </w:hyperlink>
+      <w:r>
+        <w:t xml:space="preserve"> [</w:t>
+      </w:r>
+      <w:hyperlink r:id="rId110">
+        <w:r>
+          <w:rPr>
+            <w:color w:val="0000EE"/>
+            <w:u w:val="single"/>
+            <w:sz w:val="18"/>
+          </w:rPr>
+          <w:t>preprint</w:t>
+        </w:r>
+      </w:hyperlink>
+      <w:r>
+        <w:rPr>
+          <w:sz w:val="18"/>
+        </w:rPr>
+        <w:t>]</w:t>
+      </w:r>
     </w:p>
     <w:p>
       <w:pPr>
@@ -3505,7 +4316,7 @@
       <w:r>
         <w:t xml:space="preserve"> </w:t>
       </w:r>
-      <w:hyperlink r:id="rId69">
+      <w:hyperlink r:id="rId111">
         <w:r>
           <w:rPr>
             <w:color w:val="0000EE"/>
@@ -3515,6 +4326,25 @@
           <w:t>doi:10.1177/21582440241292826</w:t>
         </w:r>
       </w:hyperlink>
+      <w:r>
+        <w:t xml:space="preserve"> [</w:t>
+      </w:r>
+      <w:hyperlink r:id="rId112">
+        <w:r>
+          <w:rPr>
+            <w:color w:val="0000EE"/>
+            <w:u w:val="single"/>
+            <w:sz w:val="18"/>
+          </w:rPr>
+          <w:t>preprint</w:t>
+        </w:r>
+      </w:hyperlink>
+      <w:r>
+        <w:rPr>
+          <w:sz w:val="18"/>
+        </w:rPr>
+        <w:t>]</w:t>
+      </w:r>
     </w:p>
     <w:p>
       <w:pPr>
@@ -3561,7 +4391,7 @@
       <w:r>
         <w:t xml:space="preserve"> </w:t>
       </w:r>
-      <w:hyperlink r:id="rId70">
+      <w:hyperlink r:id="rId113">
         <w:r>
           <w:rPr>
             <w:color w:val="0000EE"/>
@@ -3571,6 +4401,25 @@
           <w:t>doi:10.1016/j.heliyon.2023.e21458</w:t>
         </w:r>
       </w:hyperlink>
+      <w:r>
+        <w:t xml:space="preserve"> [</w:t>
+      </w:r>
+      <w:hyperlink r:id="rId114">
+        <w:r>
+          <w:rPr>
+            <w:color w:val="0000EE"/>
+            <w:u w:val="single"/>
+            <w:sz w:val="18"/>
+          </w:rPr>
+          <w:t>preprint</w:t>
+        </w:r>
+      </w:hyperlink>
+      <w:r>
+        <w:rPr>
+          <w:sz w:val="18"/>
+        </w:rPr>
+        <w:t>]</w:t>
+      </w:r>
     </w:p>
     <w:p>
       <w:pPr>
@@ -3617,7 +4466,7 @@
       <w:r>
         <w:t xml:space="preserve"> </w:t>
       </w:r>
-      <w:hyperlink r:id="rId71">
+      <w:hyperlink r:id="rId115">
         <w:r>
           <w:rPr>
             <w:color w:val="0000EE"/>
@@ -3627,6 +4476,41 @@
           <w:t>doi:10.1192/bjo.2022.559</w:t>
         </w:r>
       </w:hyperlink>
+      <w:r>
+        <w:t xml:space="preserve"> [</w:t>
+      </w:r>
+      <w:hyperlink r:id="rId116">
+        <w:r>
+          <w:rPr>
+            <w:color w:val="0000EE"/>
+            <w:u w:val="single"/>
+            <w:sz w:val="18"/>
+          </w:rPr>
+          <w:t>preprint</w:t>
+        </w:r>
+      </w:hyperlink>
+      <w:r>
+        <w:rPr>
+          <w:sz w:val="18"/>
+        </w:rPr>
+        <w:t xml:space="preserve"> | </w:t>
+      </w:r>
+      <w:hyperlink r:id="rId117">
+        <w:r>
+          <w:rPr>
+            <w:color w:val="0000EE"/>
+            <w:u w:val="single"/>
+            <w:sz w:val="18"/>
+          </w:rPr>
+          <w:t>correction</w:t>
+        </w:r>
+      </w:hyperlink>
+      <w:r>
+        <w:rPr>
+          <w:sz w:val="18"/>
+        </w:rPr>
+        <w:t>]</w:t>
+      </w:r>
     </w:p>
     <w:sectPr>
       <w:pgSz w:w="12240" w:h="15840"/>

</xml_diff>

<commit_message>
Consistent 11pt font size throughout publication list
</commit_message>
<xml_diff>
--- a/output/cancerfonden_publist.docx
+++ b/output/cancerfonden_publist.docx
@@ -74,7 +74,7 @@
           <w:rPr>
             <w:color w:val="0000EE"/>
             <w:u w:val="single"/>
-            <w:sz w:val="18"/>
+            <w:sz w:val="22"/>
           </w:rPr>
           <w:t>doi:10.1016/j.freeradbiomed.2006.04.031</w:t>
         </w:r>
@@ -87,15 +87,12 @@
           <w:rPr>
             <w:color w:val="0000EE"/>
             <w:u w:val="single"/>
-            <w:sz w:val="18"/>
+            <w:sz w:val="22"/>
           </w:rPr>
           <w:t>preprint</w:t>
         </w:r>
       </w:hyperlink>
       <w:r>
-        <w:rPr>
-          <w:sz w:val="18"/>
-        </w:rPr>
         <w:t>]</w:t>
       </w:r>
     </w:p>
@@ -173,7 +170,7 @@
           <w:rPr>
             <w:color w:val="0000EE"/>
             <w:u w:val="single"/>
-            <w:sz w:val="18"/>
+            <w:sz w:val="22"/>
           </w:rPr>
           <w:t>doi:10.1016/j.intell.2025.101985</w:t>
         </w:r>
@@ -226,7 +223,7 @@
           <w:rPr>
             <w:color w:val="0000EE"/>
             <w:u w:val="single"/>
-            <w:sz w:val="18"/>
+            <w:sz w:val="22"/>
           </w:rPr>
           <w:t>doi:10.1016/j.jclinepi.2025.111710</w:t>
         </w:r>
@@ -239,15 +236,12 @@
           <w:rPr>
             <w:color w:val="0000EE"/>
             <w:u w:val="single"/>
-            <w:sz w:val="18"/>
+            <w:sz w:val="22"/>
           </w:rPr>
           <w:t>preprint</w:t>
         </w:r>
       </w:hyperlink>
       <w:r>
-        <w:rPr>
-          <w:sz w:val="18"/>
-        </w:rPr>
         <w:t>]</w:t>
       </w:r>
     </w:p>
@@ -301,7 +295,7 @@
           <w:rPr>
             <w:color w:val="0000EE"/>
             <w:u w:val="single"/>
-            <w:sz w:val="18"/>
+            <w:sz w:val="22"/>
           </w:rPr>
           <w:t>doi:10.1186/s12915-024-02101-x</w:t>
         </w:r>
@@ -314,15 +308,12 @@
           <w:rPr>
             <w:color w:val="0000EE"/>
             <w:u w:val="single"/>
-            <w:sz w:val="18"/>
+            <w:sz w:val="22"/>
           </w:rPr>
           <w:t>preprint</w:t>
         </w:r>
       </w:hyperlink>
       <w:r>
-        <w:rPr>
-          <w:sz w:val="18"/>
-        </w:rPr>
         <w:t>]</w:t>
       </w:r>
     </w:p>
@@ -373,7 +364,7 @@
           <w:rPr>
             <w:color w:val="0000EE"/>
             <w:u w:val="single"/>
-            <w:sz w:val="18"/>
+            <w:sz w:val="22"/>
           </w:rPr>
           <w:t>doi:10.1007/s10648-025-10083-7</w:t>
         </w:r>
@@ -386,15 +377,12 @@
           <w:rPr>
             <w:color w:val="0000EE"/>
             <w:u w:val="single"/>
-            <w:sz w:val="18"/>
+            <w:sz w:val="22"/>
           </w:rPr>
           <w:t>preprint</w:t>
         </w:r>
       </w:hyperlink>
       <w:r>
-        <w:rPr>
-          <w:sz w:val="18"/>
-        </w:rPr>
         <w:t>]</w:t>
       </w:r>
     </w:p>
@@ -445,7 +433,7 @@
           <w:rPr>
             <w:color w:val="0000EE"/>
             <w:u w:val="single"/>
-            <w:sz w:val="18"/>
+            <w:sz w:val="22"/>
           </w:rPr>
           <w:t>doi:10.1016/j.actpsy.2025.105562</w:t>
         </w:r>
@@ -498,7 +486,7 @@
           <w:rPr>
             <w:color w:val="0000EE"/>
             <w:u w:val="single"/>
-            <w:sz w:val="18"/>
+            <w:sz w:val="22"/>
           </w:rPr>
           <w:t>doi:10.12688/openreseurope.20782.1</w:t>
         </w:r>
@@ -551,7 +539,7 @@
           <w:rPr>
             <w:color w:val="0000EE"/>
             <w:u w:val="single"/>
-            <w:sz w:val="18"/>
+            <w:sz w:val="22"/>
           </w:rPr>
           <w:t>doi:10.1162/jocn_a_02087</w:t>
         </w:r>
@@ -564,15 +552,12 @@
           <w:rPr>
             <w:color w:val="0000EE"/>
             <w:u w:val="single"/>
-            <w:sz w:val="18"/>
+            <w:sz w:val="22"/>
           </w:rPr>
           <w:t>preprint</w:t>
         </w:r>
       </w:hyperlink>
       <w:r>
-        <w:rPr>
-          <w:sz w:val="18"/>
-        </w:rPr>
         <w:t>]</w:t>
       </w:r>
     </w:p>
@@ -626,7 +611,7 @@
           <w:rPr>
             <w:color w:val="0000EE"/>
             <w:u w:val="single"/>
-            <w:sz w:val="18"/>
+            <w:sz w:val="22"/>
           </w:rPr>
           <w:t>doi:10.1162/imag_a_00103</w:t>
         </w:r>
@@ -639,15 +624,12 @@
           <w:rPr>
             <w:color w:val="0000EE"/>
             <w:u w:val="single"/>
-            <w:sz w:val="18"/>
+            <w:sz w:val="22"/>
           </w:rPr>
           <w:t>preprint</w:t>
         </w:r>
       </w:hyperlink>
       <w:r>
-        <w:rPr>
-          <w:sz w:val="18"/>
-        </w:rPr>
         <w:t>]</w:t>
       </w:r>
     </w:p>
@@ -698,7 +680,7 @@
           <w:rPr>
             <w:color w:val="0000EE"/>
             <w:u w:val="single"/>
-            <w:sz w:val="18"/>
+            <w:sz w:val="22"/>
           </w:rPr>
           <w:t>doi:10.1038/s41591-024-02879-x</w:t>
         </w:r>
@@ -751,7 +733,7 @@
           <w:rPr>
             <w:color w:val="0000EE"/>
             <w:u w:val="single"/>
-            <w:sz w:val="18"/>
+            <w:sz w:val="22"/>
           </w:rPr>
           <w:t>doi:10.1098/rsos.230513</w:t>
         </w:r>
@@ -764,15 +746,12 @@
           <w:rPr>
             <w:color w:val="0000EE"/>
             <w:u w:val="single"/>
-            <w:sz w:val="18"/>
+            <w:sz w:val="22"/>
           </w:rPr>
           <w:t>preprint</w:t>
         </w:r>
       </w:hyperlink>
       <w:r>
-        <w:rPr>
-          <w:sz w:val="18"/>
-        </w:rPr>
         <w:t>]</w:t>
       </w:r>
     </w:p>
@@ -866,7 +845,7 @@
           <w:rPr>
             <w:color w:val="0000EE"/>
             <w:u w:val="single"/>
-            <w:sz w:val="18"/>
+            <w:sz w:val="22"/>
           </w:rPr>
           <w:t>doi:10.1098/rsos.240125</w:t>
         </w:r>
@@ -879,15 +858,12 @@
           <w:rPr>
             <w:color w:val="0000EE"/>
             <w:u w:val="single"/>
-            <w:sz w:val="18"/>
+            <w:sz w:val="22"/>
           </w:rPr>
           <w:t>preprint</w:t>
         </w:r>
       </w:hyperlink>
       <w:r>
-        <w:rPr>
-          <w:sz w:val="18"/>
-        </w:rPr>
         <w:t>]</w:t>
       </w:r>
     </w:p>
@@ -941,7 +917,7 @@
           <w:rPr>
             <w:color w:val="0000EE"/>
             <w:u w:val="single"/>
-            <w:sz w:val="18"/>
+            <w:sz w:val="22"/>
           </w:rPr>
           <w:t>doi:10.1038/s41562-024-01941-5</w:t>
         </w:r>
@@ -997,7 +973,7 @@
           <w:rPr>
             <w:color w:val="0000EE"/>
             <w:u w:val="single"/>
-            <w:sz w:val="18"/>
+            <w:sz w:val="22"/>
           </w:rPr>
           <w:t>doi:10.1038/s41597-024-03865-1</w:t>
         </w:r>
@@ -1053,7 +1029,7 @@
           <w:rPr>
             <w:color w:val="0000EE"/>
             <w:u w:val="single"/>
-            <w:sz w:val="18"/>
+            <w:sz w:val="22"/>
           </w:rPr>
           <w:t>doi:10.1001/jamanetworkopen.2024.48601</w:t>
         </w:r>
@@ -1066,15 +1042,12 @@
           <w:rPr>
             <w:color w:val="0000EE"/>
             <w:u w:val="single"/>
-            <w:sz w:val="18"/>
+            <w:sz w:val="22"/>
           </w:rPr>
           <w:t>preprint</w:t>
         </w:r>
       </w:hyperlink>
       <w:r>
-        <w:rPr>
-          <w:sz w:val="18"/>
-        </w:rPr>
         <w:t>]</w:t>
       </w:r>
     </w:p>
@@ -1128,7 +1101,7 @@
           <w:rPr>
             <w:color w:val="0000EE"/>
             <w:u w:val="single"/>
-            <w:sz w:val="18"/>
+            <w:sz w:val="22"/>
           </w:rPr>
           <w:t>doi:10.1111/sjop.13087</w:t>
         </w:r>
@@ -1184,7 +1157,7 @@
           <w:rPr>
             <w:color w:val="0000EE"/>
             <w:u w:val="single"/>
-            <w:sz w:val="18"/>
+            <w:sz w:val="22"/>
           </w:rPr>
           <w:t>doi:10.1016/j.paid.2022.111925</w:t>
         </w:r>
@@ -1197,15 +1170,12 @@
           <w:rPr>
             <w:color w:val="0000EE"/>
             <w:u w:val="single"/>
-            <w:sz w:val="18"/>
+            <w:sz w:val="22"/>
           </w:rPr>
           <w:t>preprint</w:t>
         </w:r>
       </w:hyperlink>
       <w:r>
-        <w:rPr>
-          <w:sz w:val="18"/>
-        </w:rPr>
         <w:t>]</w:t>
       </w:r>
     </w:p>
@@ -1259,7 +1229,7 @@
           <w:rPr>
             <w:color w:val="0000EE"/>
             <w:u w:val="single"/>
-            <w:sz w:val="18"/>
+            <w:sz w:val="22"/>
           </w:rPr>
           <w:t>doi:10.1038/s41597-022-01811-7</w:t>
         </w:r>
@@ -1315,7 +1285,7 @@
           <w:rPr>
             <w:color w:val="0000EE"/>
             <w:u w:val="single"/>
-            <w:sz w:val="18"/>
+            <w:sz w:val="22"/>
           </w:rPr>
           <w:t>doi:10.1016/j.heliyon.2023.e15746</w:t>
         </w:r>
@@ -1328,15 +1298,12 @@
           <w:rPr>
             <w:color w:val="0000EE"/>
             <w:u w:val="single"/>
-            <w:sz w:val="18"/>
+            <w:sz w:val="22"/>
           </w:rPr>
           <w:t>preprint</w:t>
         </w:r>
       </w:hyperlink>
       <w:r>
-        <w:rPr>
-          <w:sz w:val="18"/>
-        </w:rPr>
         <w:t>]</w:t>
       </w:r>
     </w:p>
@@ -1430,7 +1397,7 @@
           <w:rPr>
             <w:color w:val="0000EE"/>
             <w:u w:val="single"/>
-            <w:sz w:val="18"/>
+            <w:sz w:val="22"/>
           </w:rPr>
           <w:t>doi:10.1098/rsos.230206</w:t>
         </w:r>
@@ -1443,15 +1410,12 @@
           <w:rPr>
             <w:color w:val="0000EE"/>
             <w:u w:val="single"/>
-            <w:sz w:val="18"/>
+            <w:sz w:val="22"/>
           </w:rPr>
           <w:t>preprint</w:t>
         </w:r>
       </w:hyperlink>
       <w:r>
-        <w:rPr>
-          <w:sz w:val="18"/>
-        </w:rPr>
         <w:t>]</w:t>
       </w:r>
     </w:p>
@@ -1502,7 +1466,7 @@
           <w:rPr>
             <w:color w:val="0000EE"/>
             <w:u w:val="single"/>
-            <w:sz w:val="18"/>
+            <w:sz w:val="22"/>
           </w:rPr>
           <w:t>doi:10.1016/j.heliyon.2023.e20397</w:t>
         </w:r>
@@ -1555,7 +1519,7 @@
           <w:rPr>
             <w:color w:val="0000EE"/>
             <w:u w:val="single"/>
-            <w:sz w:val="18"/>
+            <w:sz w:val="22"/>
           </w:rPr>
           <w:t>doi:10.31234/osf.io/kds5c</w:t>
         </w:r>
@@ -1568,15 +1532,12 @@
           <w:rPr>
             <w:color w:val="0000EE"/>
             <w:u w:val="single"/>
-            <w:sz w:val="18"/>
+            <w:sz w:val="22"/>
           </w:rPr>
           <w:t>preprint</w:t>
         </w:r>
       </w:hyperlink>
       <w:r>
-        <w:rPr>
-          <w:sz w:val="18"/>
-        </w:rPr>
         <w:t>]</w:t>
       </w:r>
     </w:p>
@@ -1627,7 +1588,7 @@
           <w:rPr>
             <w:color w:val="0000EE"/>
             <w:u w:val="single"/>
-            <w:sz w:val="18"/>
+            <w:sz w:val="22"/>
           </w:rPr>
           <w:t>doi:10.1016/j.intell.2024.101815</w:t>
         </w:r>
@@ -1640,15 +1601,12 @@
           <w:rPr>
             <w:color w:val="0000EE"/>
             <w:u w:val="single"/>
-            <w:sz w:val="18"/>
+            <w:sz w:val="22"/>
           </w:rPr>
           <w:t>preprint</w:t>
         </w:r>
       </w:hyperlink>
       <w:r>
-        <w:rPr>
-          <w:sz w:val="18"/>
-        </w:rPr>
         <w:t>]</w:t>
       </w:r>
     </w:p>
@@ -1702,7 +1660,7 @@
           <w:rPr>
             <w:color w:val="0000EE"/>
             <w:u w:val="single"/>
-            <w:sz w:val="18"/>
+            <w:sz w:val="22"/>
           </w:rPr>
           <w:t>doi:10.1016/j.paid.2021.111268</w:t>
         </w:r>
@@ -1715,15 +1673,12 @@
           <w:rPr>
             <w:color w:val="0000EE"/>
             <w:u w:val="single"/>
-            <w:sz w:val="18"/>
+            <w:sz w:val="22"/>
           </w:rPr>
           <w:t>preprint</w:t>
         </w:r>
       </w:hyperlink>
       <w:r>
-        <w:rPr>
-          <w:sz w:val="18"/>
-        </w:rPr>
         <w:t>]</w:t>
       </w:r>
     </w:p>
@@ -1774,7 +1729,7 @@
           <w:rPr>
             <w:color w:val="0000EE"/>
             <w:u w:val="single"/>
-            <w:sz w:val="18"/>
+            <w:sz w:val="22"/>
           </w:rPr>
           <w:t>doi:10.1016/j.paid.2021.111520</w:t>
         </w:r>
@@ -1787,15 +1742,12 @@
           <w:rPr>
             <w:color w:val="0000EE"/>
             <w:u w:val="single"/>
-            <w:sz w:val="18"/>
+            <w:sz w:val="22"/>
           </w:rPr>
           <w:t>preprint</w:t>
         </w:r>
       </w:hyperlink>
       <w:r>
-        <w:rPr>
-          <w:sz w:val="18"/>
-        </w:rPr>
         <w:t>]</w:t>
       </w:r>
     </w:p>
@@ -1849,7 +1801,7 @@
           <w:rPr>
             <w:color w:val="0000EE"/>
             <w:u w:val="single"/>
-            <w:sz w:val="18"/>
+            <w:sz w:val="22"/>
           </w:rPr>
           <w:t>doi:10.1016/j.jad.2022.01.109</w:t>
         </w:r>
@@ -1862,15 +1814,12 @@
           <w:rPr>
             <w:color w:val="0000EE"/>
             <w:u w:val="single"/>
-            <w:sz w:val="18"/>
+            <w:sz w:val="22"/>
           </w:rPr>
           <w:t>preprint</w:t>
         </w:r>
       </w:hyperlink>
       <w:r>
-        <w:rPr>
-          <w:sz w:val="18"/>
-        </w:rPr>
         <w:t>]</w:t>
       </w:r>
     </w:p>
@@ -1915,7 +1864,7 @@
           <w:rPr>
             <w:color w:val="0000EE"/>
             <w:u w:val="single"/>
-            <w:sz w:val="18"/>
+            <w:sz w:val="22"/>
           </w:rPr>
           <w:t>doi:10.1073/pnas.2120377119</w:t>
         </w:r>
@@ -1971,7 +1920,7 @@
           <w:rPr>
             <w:color w:val="0000EE"/>
             <w:u w:val="single"/>
-            <w:sz w:val="18"/>
+            <w:sz w:val="22"/>
           </w:rPr>
           <w:t>doi:10.3389/fnins.2022.871228</w:t>
         </w:r>
@@ -2018,7 +1967,7 @@
           <w:rPr>
             <w:color w:val="0000EE"/>
             <w:u w:val="single"/>
-            <w:sz w:val="18"/>
+            <w:sz w:val="22"/>
           </w:rPr>
           <w:t>doi:10.1073/pnas.2111091119</w:t>
         </w:r>
@@ -2031,15 +1980,12 @@
           <w:rPr>
             <w:color w:val="0000EE"/>
             <w:u w:val="single"/>
-            <w:sz w:val="18"/>
+            <w:sz w:val="22"/>
           </w:rPr>
           <w:t>preprint</w:t>
         </w:r>
       </w:hyperlink>
       <w:r>
-        <w:rPr>
-          <w:sz w:val="18"/>
-        </w:rPr>
         <w:t>]</w:t>
       </w:r>
     </w:p>
@@ -2093,7 +2039,7 @@
           <w:rPr>
             <w:color w:val="0000EE"/>
             <w:u w:val="single"/>
-            <w:sz w:val="18"/>
+            <w:sz w:val="22"/>
           </w:rPr>
           <w:t>doi:10.1186/s12887-022-03349-4</w:t>
         </w:r>
@@ -2106,15 +2052,12 @@
           <w:rPr>
             <w:color w:val="0000EE"/>
             <w:u w:val="single"/>
-            <w:sz w:val="18"/>
+            <w:sz w:val="22"/>
           </w:rPr>
           <w:t>preprint</w:t>
         </w:r>
       </w:hyperlink>
       <w:r>
-        <w:rPr>
-          <w:sz w:val="18"/>
-        </w:rPr>
         <w:t>]</w:t>
       </w:r>
     </w:p>
@@ -2168,7 +2111,7 @@
           <w:rPr>
             <w:color w:val="0000EE"/>
             <w:u w:val="single"/>
-            <w:sz w:val="18"/>
+            <w:sz w:val="22"/>
           </w:rPr>
           <w:t>doi:10.1007/s42761-022-00128-3</w:t>
         </w:r>
@@ -2224,7 +2167,7 @@
           <w:rPr>
             <w:color w:val="0000EE"/>
             <w:u w:val="single"/>
-            <w:sz w:val="18"/>
+            <w:sz w:val="22"/>
           </w:rPr>
           <w:t>doi:10.1080/2153599X.2022.2070255</w:t>
         </w:r>
@@ -2280,7 +2223,7 @@
           <w:rPr>
             <w:color w:val="0000EE"/>
             <w:u w:val="single"/>
-            <w:sz w:val="18"/>
+            <w:sz w:val="22"/>
           </w:rPr>
           <w:t>doi:10.1016/j.jad.2022.08.003</w:t>
         </w:r>
@@ -2293,15 +2236,12 @@
           <w:rPr>
             <w:color w:val="0000EE"/>
             <w:u w:val="single"/>
-            <w:sz w:val="18"/>
+            <w:sz w:val="22"/>
           </w:rPr>
           <w:t>preprint</w:t>
         </w:r>
       </w:hyperlink>
       <w:r>
-        <w:rPr>
-          <w:sz w:val="18"/>
-        </w:rPr>
         <w:t>]</w:t>
       </w:r>
     </w:p>
@@ -2355,7 +2295,7 @@
           <w:rPr>
             <w:color w:val="0000EE"/>
             <w:u w:val="single"/>
-            <w:sz w:val="18"/>
+            <w:sz w:val="22"/>
           </w:rPr>
           <w:t>doi:10.1186/s41231-022-00130-8</w:t>
         </w:r>
@@ -2368,15 +2308,12 @@
           <w:rPr>
             <w:color w:val="0000EE"/>
             <w:u w:val="single"/>
-            <w:sz w:val="18"/>
+            <w:sz w:val="22"/>
           </w:rPr>
           <w:t>preprint</w:t>
         </w:r>
       </w:hyperlink>
       <w:r>
-        <w:rPr>
-          <w:sz w:val="18"/>
-        </w:rPr>
         <w:t>]</w:t>
       </w:r>
     </w:p>
@@ -2427,7 +2364,7 @@
           <w:rPr>
             <w:color w:val="0000EE"/>
             <w:u w:val="single"/>
-            <w:sz w:val="18"/>
+            <w:sz w:val="22"/>
           </w:rPr>
           <w:t>doi:10.1016/j.intell.2022.101706</w:t>
         </w:r>
@@ -2440,15 +2377,12 @@
           <w:rPr>
             <w:color w:val="0000EE"/>
             <w:u w:val="single"/>
-            <w:sz w:val="18"/>
+            <w:sz w:val="22"/>
           </w:rPr>
           <w:t>preprint</w:t>
         </w:r>
       </w:hyperlink>
       <w:r>
-        <w:rPr>
-          <w:sz w:val="18"/>
-        </w:rPr>
         <w:t>]</w:t>
       </w:r>
     </w:p>
@@ -2502,7 +2436,7 @@
           <w:rPr>
             <w:color w:val="0000EE"/>
             <w:u w:val="single"/>
-            <w:sz w:val="18"/>
+            <w:sz w:val="22"/>
           </w:rPr>
           <w:t>doi:10.1371/journal.pone.0297216</w:t>
         </w:r>
@@ -2515,15 +2449,12 @@
           <w:rPr>
             <w:color w:val="0000EE"/>
             <w:u w:val="single"/>
-            <w:sz w:val="18"/>
+            <w:sz w:val="22"/>
           </w:rPr>
           <w:t>preprint</w:t>
         </w:r>
       </w:hyperlink>
       <w:r>
-        <w:rPr>
-          <w:sz w:val="18"/>
-        </w:rPr>
         <w:t>]</w:t>
       </w:r>
     </w:p>
@@ -2577,7 +2508,7 @@
           <w:rPr>
             <w:color w:val="0000EE"/>
             <w:u w:val="single"/>
-            <w:sz w:val="18"/>
+            <w:sz w:val="22"/>
           </w:rPr>
           <w:t>doi:10.1111/psyp.13688</w:t>
         </w:r>
@@ -2590,15 +2521,12 @@
           <w:rPr>
             <w:color w:val="0000EE"/>
             <w:u w:val="single"/>
-            <w:sz w:val="18"/>
+            <w:sz w:val="22"/>
           </w:rPr>
           <w:t>preprint</w:t>
         </w:r>
       </w:hyperlink>
       <w:r>
-        <w:rPr>
-          <w:sz w:val="18"/>
-        </w:rPr>
         <w:t>]</w:t>
       </w:r>
     </w:p>
@@ -2649,7 +2577,7 @@
           <w:rPr>
             <w:color w:val="0000EE"/>
             <w:u w:val="single"/>
-            <w:sz w:val="18"/>
+            <w:sz w:val="22"/>
           </w:rPr>
           <w:t>doi:10.1038/s41587-020-00768-5</w:t>
         </w:r>
@@ -2662,15 +2590,12 @@
           <w:rPr>
             <w:color w:val="0000EE"/>
             <w:u w:val="single"/>
-            <w:sz w:val="18"/>
+            <w:sz w:val="22"/>
           </w:rPr>
           <w:t>preprint</w:t>
         </w:r>
       </w:hyperlink>
       <w:r>
-        <w:rPr>
-          <w:sz w:val="18"/>
-        </w:rPr>
         <w:t>]</w:t>
       </w:r>
     </w:p>
@@ -2724,7 +2649,7 @@
           <w:rPr>
             <w:color w:val="0000EE"/>
             <w:u w:val="single"/>
-            <w:sz w:val="18"/>
+            <w:sz w:val="22"/>
           </w:rPr>
           <w:t>doi:10.1016/j.cortex.2021.03.013</w:t>
         </w:r>
@@ -2737,15 +2662,12 @@
           <w:rPr>
             <w:color w:val="0000EE"/>
             <w:u w:val="single"/>
-            <w:sz w:val="18"/>
+            <w:sz w:val="22"/>
           </w:rPr>
           <w:t>preprint</w:t>
         </w:r>
       </w:hyperlink>
       <w:r>
-        <w:rPr>
-          <w:sz w:val="18"/>
-        </w:rPr>
         <w:t>]</w:t>
       </w:r>
     </w:p>
@@ -2790,7 +2712,7 @@
           <w:rPr>
             <w:color w:val="0000EE"/>
             <w:u w:val="single"/>
-            <w:sz w:val="18"/>
+            <w:sz w:val="22"/>
           </w:rPr>
           <w:t>doi:10.1016/j.neuron.2021.04.001</w:t>
         </w:r>
@@ -2803,15 +2725,12 @@
           <w:rPr>
             <w:color w:val="0000EE"/>
             <w:u w:val="single"/>
-            <w:sz w:val="18"/>
+            <w:sz w:val="22"/>
           </w:rPr>
           <w:t>preprint</w:t>
         </w:r>
       </w:hyperlink>
       <w:r>
-        <w:rPr>
-          <w:sz w:val="18"/>
-        </w:rPr>
         <w:t>]</w:t>
       </w:r>
     </w:p>
@@ -2865,7 +2784,7 @@
           <w:rPr>
             <w:color w:val="0000EE"/>
             <w:u w:val="single"/>
-            <w:sz w:val="18"/>
+            <w:sz w:val="22"/>
           </w:rPr>
           <w:t>doi:10.1038/s41431-021-00893-y</w:t>
         </w:r>
@@ -2878,15 +2797,12 @@
           <w:rPr>
             <w:color w:val="0000EE"/>
             <w:u w:val="single"/>
-            <w:sz w:val="18"/>
+            <w:sz w:val="22"/>
           </w:rPr>
           <w:t>preprint</w:t>
         </w:r>
       </w:hyperlink>
       <w:r>
-        <w:rPr>
-          <w:sz w:val="18"/>
-        </w:rPr>
         <w:t>]</w:t>
       </w:r>
     </w:p>
@@ -2940,7 +2856,7 @@
           <w:rPr>
             <w:color w:val="0000EE"/>
             <w:u w:val="single"/>
-            <w:sz w:val="18"/>
+            <w:sz w:val="22"/>
           </w:rPr>
           <w:t>doi:10.1016/j.obhdp.2021.02.003</w:t>
         </w:r>
@@ -2953,15 +2869,12 @@
           <w:rPr>
             <w:color w:val="0000EE"/>
             <w:u w:val="single"/>
-            <w:sz w:val="18"/>
+            <w:sz w:val="22"/>
           </w:rPr>
           <w:t>preprint</w:t>
         </w:r>
       </w:hyperlink>
       <w:r>
-        <w:rPr>
-          <w:sz w:val="18"/>
-        </w:rPr>
         <w:t>]</w:t>
       </w:r>
     </w:p>
@@ -3015,7 +2928,7 @@
           <w:rPr>
             <w:color w:val="0000EE"/>
             <w:u w:val="single"/>
-            <w:sz w:val="18"/>
+            <w:sz w:val="22"/>
           </w:rPr>
           <w:t>doi:10.1111/jsr.13347</w:t>
         </w:r>
@@ -3071,7 +2984,7 @@
           <w:rPr>
             <w:color w:val="0000EE"/>
             <w:u w:val="single"/>
-            <w:sz w:val="18"/>
+            <w:sz w:val="22"/>
           </w:rPr>
           <w:t>doi:10.1038/s41562-021-01173-x</w:t>
         </w:r>
@@ -3084,15 +2997,12 @@
           <w:rPr>
             <w:color w:val="0000EE"/>
             <w:u w:val="single"/>
-            <w:sz w:val="18"/>
+            <w:sz w:val="22"/>
           </w:rPr>
           <w:t>preprint</w:t>
         </w:r>
       </w:hyperlink>
       <w:r>
-        <w:rPr>
-          <w:sz w:val="18"/>
-        </w:rPr>
         <w:t xml:space="preserve"> | </w:t>
       </w:r>
       <w:hyperlink r:id="rId82">
@@ -3100,15 +3010,12 @@
           <w:rPr>
             <w:color w:val="0000EE"/>
             <w:u w:val="single"/>
-            <w:sz w:val="18"/>
+            <w:sz w:val="22"/>
           </w:rPr>
           <w:t>correction</w:t>
         </w:r>
       </w:hyperlink>
       <w:r>
-        <w:rPr>
-          <w:sz w:val="18"/>
-        </w:rPr>
         <w:t>]</w:t>
       </w:r>
     </w:p>
@@ -3162,7 +3069,7 @@
           <w:rPr>
             <w:color w:val="0000EE"/>
             <w:u w:val="single"/>
-            <w:sz w:val="18"/>
+            <w:sz w:val="22"/>
           </w:rPr>
           <w:t>doi:10.12688/wellcomeopenres.16378.2</w:t>
         </w:r>
@@ -3215,7 +3122,7 @@
           <w:rPr>
             <w:color w:val="0000EE"/>
             <w:u w:val="single"/>
-            <w:sz w:val="18"/>
+            <w:sz w:val="22"/>
           </w:rPr>
           <w:t>doi:10.1186/s40359-021-00653-z</w:t>
         </w:r>
@@ -3228,15 +3135,12 @@
           <w:rPr>
             <w:color w:val="0000EE"/>
             <w:u w:val="single"/>
-            <w:sz w:val="18"/>
+            <w:sz w:val="22"/>
           </w:rPr>
           <w:t>preprint</w:t>
         </w:r>
       </w:hyperlink>
       <w:r>
-        <w:rPr>
-          <w:sz w:val="18"/>
-        </w:rPr>
         <w:t>]</w:t>
       </w:r>
     </w:p>
@@ -3290,7 +3194,7 @@
           <w:rPr>
             <w:color w:val="0000EE"/>
             <w:u w:val="single"/>
-            <w:sz w:val="18"/>
+            <w:sz w:val="22"/>
           </w:rPr>
           <w:t>doi:10.7554/eLife.72185</w:t>
         </w:r>
@@ -3303,15 +3207,12 @@
           <w:rPr>
             <w:color w:val="0000EE"/>
             <w:u w:val="single"/>
-            <w:sz w:val="18"/>
+            <w:sz w:val="22"/>
           </w:rPr>
           <w:t>preprint</w:t>
         </w:r>
       </w:hyperlink>
       <w:r>
-        <w:rPr>
-          <w:sz w:val="18"/>
-        </w:rPr>
         <w:t>]</w:t>
       </w:r>
     </w:p>
@@ -3365,7 +3266,7 @@
           <w:rPr>
             <w:color w:val="0000EE"/>
             <w:u w:val="single"/>
-            <w:sz w:val="18"/>
+            <w:sz w:val="22"/>
           </w:rPr>
           <w:t>doi:10.2147/NSS.S240493</w:t>
         </w:r>
@@ -3421,7 +3322,7 @@
           <w:rPr>
             <w:color w:val="0000EE"/>
             <w:u w:val="single"/>
-            <w:sz w:val="18"/>
+            <w:sz w:val="22"/>
           </w:rPr>
           <w:t>doi:10.1080/23743603.2020.1756239</w:t>
         </w:r>
@@ -3434,15 +3335,12 @@
           <w:rPr>
             <w:color w:val="0000EE"/>
             <w:u w:val="single"/>
-            <w:sz w:val="18"/>
+            <w:sz w:val="22"/>
           </w:rPr>
           <w:t>preprint</w:t>
         </w:r>
       </w:hyperlink>
       <w:r>
-        <w:rPr>
-          <w:sz w:val="18"/>
-        </w:rPr>
         <w:t>]</w:t>
       </w:r>
     </w:p>
@@ -3496,7 +3394,7 @@
           <w:rPr>
             <w:color w:val="0000EE"/>
             <w:u w:val="single"/>
-            <w:sz w:val="18"/>
+            <w:sz w:val="22"/>
           </w:rPr>
           <w:t>doi:10.1038/s41586-020-2314-9</w:t>
         </w:r>
@@ -3509,15 +3407,12 @@
           <w:rPr>
             <w:color w:val="0000EE"/>
             <w:u w:val="single"/>
-            <w:sz w:val="18"/>
+            <w:sz w:val="22"/>
           </w:rPr>
           <w:t>preprint</w:t>
         </w:r>
       </w:hyperlink>
       <w:r>
-        <w:rPr>
-          <w:sz w:val="18"/>
-        </w:rPr>
         <w:t>]</w:t>
       </w:r>
     </w:p>
@@ -3562,7 +3457,7 @@
           <w:rPr>
             <w:color w:val="0000EE"/>
             <w:u w:val="single"/>
-            <w:sz w:val="18"/>
+            <w:sz w:val="22"/>
           </w:rPr>
           <w:t>doi:10.1016/j.obhdp.2020.07.002</w:t>
         </w:r>
@@ -3615,7 +3510,7 @@
           <w:rPr>
             <w:color w:val="0000EE"/>
             <w:u w:val="single"/>
-            <w:sz w:val="18"/>
+            <w:sz w:val="22"/>
           </w:rPr>
           <w:t>doi:10.1038/s41598-020-74489-9</w:t>
         </w:r>
@@ -3628,15 +3523,12 @@
           <w:rPr>
             <w:color w:val="0000EE"/>
             <w:u w:val="single"/>
-            <w:sz w:val="18"/>
+            <w:sz w:val="22"/>
           </w:rPr>
           <w:t>preprint</w:t>
         </w:r>
       </w:hyperlink>
       <w:r>
-        <w:rPr>
-          <w:sz w:val="18"/>
-        </w:rPr>
         <w:t>]</w:t>
       </w:r>
     </w:p>
@@ -3690,7 +3582,7 @@
           <w:rPr>
             <w:color w:val="0000EE"/>
             <w:u w:val="single"/>
-            <w:sz w:val="18"/>
+            <w:sz w:val="22"/>
           </w:rPr>
           <w:t>doi:10.1002/osp4.473</w:t>
         </w:r>
@@ -3703,15 +3595,12 @@
           <w:rPr>
             <w:color w:val="0000EE"/>
             <w:u w:val="single"/>
-            <w:sz w:val="18"/>
+            <w:sz w:val="22"/>
           </w:rPr>
           <w:t>preprint</w:t>
         </w:r>
       </w:hyperlink>
       <w:r>
-        <w:rPr>
-          <w:sz w:val="18"/>
-        </w:rPr>
         <w:t>]</w:t>
       </w:r>
     </w:p>
@@ -3756,7 +3645,7 @@
           <w:rPr>
             <w:color w:val="0000EE"/>
             <w:u w:val="single"/>
-            <w:sz w:val="18"/>
+            <w:sz w:val="22"/>
           </w:rPr>
           <w:t>doi:10.1016/j.obhdp.2020.07.002</w:t>
         </w:r>
@@ -3812,7 +3701,7 @@
           <w:rPr>
             <w:color w:val="0000EE"/>
             <w:u w:val="single"/>
-            <w:sz w:val="18"/>
+            <w:sz w:val="22"/>
           </w:rPr>
           <w:t>doi:10.1162/netn_a_00186</w:t>
         </w:r>
@@ -3825,15 +3714,12 @@
           <w:rPr>
             <w:color w:val="0000EE"/>
             <w:u w:val="single"/>
-            <w:sz w:val="18"/>
+            <w:sz w:val="22"/>
           </w:rPr>
           <w:t>preprint</w:t>
         </w:r>
       </w:hyperlink>
       <w:r>
-        <w:rPr>
-          <w:sz w:val="18"/>
-        </w:rPr>
         <w:t>]</w:t>
       </w:r>
     </w:p>
@@ -3887,7 +3773,7 @@
           <w:rPr>
             <w:color w:val="0000EE"/>
             <w:u w:val="single"/>
-            <w:sz w:val="18"/>
+            <w:sz w:val="22"/>
           </w:rPr>
           <w:t>doi:10.1098/rsos.181704</w:t>
         </w:r>
@@ -3900,15 +3786,12 @@
           <w:rPr>
             <w:color w:val="0000EE"/>
             <w:u w:val="single"/>
-            <w:sz w:val="18"/>
+            <w:sz w:val="22"/>
           </w:rPr>
           <w:t>preprint</w:t>
         </w:r>
       </w:hyperlink>
       <w:r>
-        <w:rPr>
-          <w:sz w:val="18"/>
-        </w:rPr>
         <w:t>]</w:t>
       </w:r>
     </w:p>
@@ -3962,7 +3845,7 @@
           <w:rPr>
             <w:color w:val="0000EE"/>
             <w:u w:val="single"/>
-            <w:sz w:val="18"/>
+            <w:sz w:val="22"/>
           </w:rPr>
           <w:t>doi:10.1177/2058739219844357</w:t>
         </w:r>
@@ -4018,7 +3901,7 @@
           <w:rPr>
             <w:color w:val="0000EE"/>
             <w:u w:val="single"/>
-            <w:sz w:val="18"/>
+            <w:sz w:val="22"/>
           </w:rPr>
           <w:t>doi:10.1038/s41398-019-0668-2</w:t>
         </w:r>
@@ -4074,7 +3957,7 @@
           <w:rPr>
             <w:color w:val="0000EE"/>
             <w:u w:val="single"/>
-            <w:sz w:val="18"/>
+            <w:sz w:val="22"/>
           </w:rPr>
           <w:t>doi:10.1038/s41562-018-0311-x</w:t>
         </w:r>
@@ -4087,15 +3970,12 @@
           <w:rPr>
             <w:color w:val="0000EE"/>
             <w:u w:val="single"/>
-            <w:sz w:val="18"/>
+            <w:sz w:val="22"/>
           </w:rPr>
           <w:t>preprint</w:t>
         </w:r>
       </w:hyperlink>
       <w:r>
-        <w:rPr>
-          <w:sz w:val="18"/>
-        </w:rPr>
         <w:t xml:space="preserve"> | </w:t>
       </w:r>
       <w:hyperlink r:id="rId106">
@@ -4103,15 +3983,12 @@
           <w:rPr>
             <w:color w:val="0000EE"/>
             <w:u w:val="single"/>
-            <w:sz w:val="18"/>
+            <w:sz w:val="22"/>
           </w:rPr>
           <w:t>data</w:t>
         </w:r>
       </w:hyperlink>
       <w:r>
-        <w:rPr>
-          <w:sz w:val="18"/>
-        </w:rPr>
         <w:t>]</w:t>
       </w:r>
     </w:p>
@@ -4165,7 +4042,7 @@
           <w:rPr>
             <w:color w:val="0000EE"/>
             <w:u w:val="single"/>
-            <w:sz w:val="18"/>
+            <w:sz w:val="22"/>
           </w:rPr>
           <w:t>doi:10.1016/j.trf.2018.10.008</w:t>
         </w:r>
@@ -4178,15 +4055,12 @@
           <w:rPr>
             <w:color w:val="0000EE"/>
             <w:u w:val="single"/>
-            <w:sz w:val="18"/>
+            <w:sz w:val="22"/>
           </w:rPr>
           <w:t>preprint</w:t>
         </w:r>
       </w:hyperlink>
       <w:r>
-        <w:rPr>
-          <w:sz w:val="18"/>
-        </w:rPr>
         <w:t>]</w:t>
       </w:r>
     </w:p>
@@ -4237,7 +4111,7 @@
           <w:rPr>
             <w:color w:val="0000EE"/>
             <w:u w:val="single"/>
-            <w:sz w:val="18"/>
+            <w:sz w:val="22"/>
           </w:rPr>
           <w:t>doi:10.15694/mep.2018.0000255.1</w:t>
         </w:r>
@@ -4250,15 +4124,12 @@
           <w:rPr>
             <w:color w:val="0000EE"/>
             <w:u w:val="single"/>
-            <w:sz w:val="18"/>
+            <w:sz w:val="22"/>
           </w:rPr>
           <w:t>preprint</w:t>
         </w:r>
       </w:hyperlink>
       <w:r>
-        <w:rPr>
-          <w:sz w:val="18"/>
-        </w:rPr>
         <w:t>]</w:t>
       </w:r>
     </w:p>
@@ -4321,7 +4192,7 @@
           <w:rPr>
             <w:color w:val="0000EE"/>
             <w:u w:val="single"/>
-            <w:sz w:val="18"/>
+            <w:sz w:val="22"/>
           </w:rPr>
           <w:t>doi:10.1177/21582440241292826</w:t>
         </w:r>
@@ -4334,15 +4205,12 @@
           <w:rPr>
             <w:color w:val="0000EE"/>
             <w:u w:val="single"/>
-            <w:sz w:val="18"/>
+            <w:sz w:val="22"/>
           </w:rPr>
           <w:t>preprint</w:t>
         </w:r>
       </w:hyperlink>
       <w:r>
-        <w:rPr>
-          <w:sz w:val="18"/>
-        </w:rPr>
         <w:t>]</w:t>
       </w:r>
     </w:p>
@@ -4396,7 +4264,7 @@
           <w:rPr>
             <w:color w:val="0000EE"/>
             <w:u w:val="single"/>
-            <w:sz w:val="18"/>
+            <w:sz w:val="22"/>
           </w:rPr>
           <w:t>doi:10.1016/j.heliyon.2023.e21458</w:t>
         </w:r>
@@ -4409,15 +4277,12 @@
           <w:rPr>
             <w:color w:val="0000EE"/>
             <w:u w:val="single"/>
-            <w:sz w:val="18"/>
+            <w:sz w:val="22"/>
           </w:rPr>
           <w:t>preprint</w:t>
         </w:r>
       </w:hyperlink>
       <w:r>
-        <w:rPr>
-          <w:sz w:val="18"/>
-        </w:rPr>
         <w:t>]</w:t>
       </w:r>
     </w:p>
@@ -4471,7 +4336,7 @@
           <w:rPr>
             <w:color w:val="0000EE"/>
             <w:u w:val="single"/>
-            <w:sz w:val="18"/>
+            <w:sz w:val="22"/>
           </w:rPr>
           <w:t>doi:10.1192/bjo.2022.559</w:t>
         </w:r>
@@ -4484,15 +4349,12 @@
           <w:rPr>
             <w:color w:val="0000EE"/>
             <w:u w:val="single"/>
-            <w:sz w:val="18"/>
+            <w:sz w:val="22"/>
           </w:rPr>
           <w:t>preprint</w:t>
         </w:r>
       </w:hyperlink>
       <w:r>
-        <w:rPr>
-          <w:sz w:val="18"/>
-        </w:rPr>
         <w:t xml:space="preserve"> | </w:t>
       </w:r>
       <w:hyperlink r:id="rId117">
@@ -4500,15 +4362,12 @@
           <w:rPr>
             <w:color w:val="0000EE"/>
             <w:u w:val="single"/>
-            <w:sz w:val="18"/>
+            <w:sz w:val="22"/>
           </w:rPr>
           <w:t>correction</w:t>
         </w:r>
       </w:hyperlink>
       <w:r>
-        <w:rPr>
-          <w:sz w:val="18"/>
-        </w:rPr>
         <w:t>]</w:t>
       </w:r>
     </w:p>

</xml_diff>